<commit_message>
Keep the Front Desk table from splitting across pages
Linen Card (206621) and Towel Hanger Card (206822) were landing on
separate pages with a repeated header row between them. Marks every
Front Desk row cantSplit and sets keepNext on all rows but the last,
plus on the FRONT DESK heading and its subtitle, so the section prints
as one block.

Co-Authored-By: Claude Opus 5 <noreply@anthropic.com>
Claude-Session: https://claude.ai/code/session_0138rT731u9moyu7f3GNkj4g
</commit_message>
<xml_diff>
--- a/Elm_Housekeeping_Inventory.docx
+++ b/Elm_Housekeeping_Inventory.docx
@@ -6603,6 +6603,7 @@
     </w:tbl>
     <w:p>
       <w:pPr>
+        <w:keepNext/>
         <w:spacing w:after="60" w:before="280"/>
       </w:pPr>
       <w:r>
@@ -6643,6 +6644,7 @@
     </w:p>
     <w:p>
       <w:pPr>
+        <w:keepNext/>
         <w:spacing w:after="120"/>
       </w:pPr>
       <w:r>
@@ -6677,6 +6679,7 @@
       </w:tblGrid>
       <w:tr>
         <w:trPr>
+          <w:cantSplit/>
           <w:tblHeader/>
         </w:trPr>
         <w:tc>
@@ -6692,6 +6695,7 @@
           </w:tcPr>
           <w:p>
             <w:pPr>
+              <w:keepNext/>
               <w:jc w:val="left"/>
             </w:pPr>
             <w:r>
@@ -6720,6 +6724,7 @@
           </w:tcPr>
           <w:p>
             <w:pPr>
+              <w:keepNext/>
               <w:jc w:val="left"/>
             </w:pPr>
             <w:r>
@@ -6748,6 +6753,7 @@
           </w:tcPr>
           <w:p>
             <w:pPr>
+              <w:keepNext/>
               <w:jc w:val="center"/>
             </w:pPr>
             <w:r>
@@ -6776,6 +6782,7 @@
           </w:tcPr>
           <w:p>
             <w:pPr>
+              <w:keepNext/>
               <w:jc w:val="center"/>
             </w:pPr>
             <w:r>
@@ -6793,6 +6800,9 @@
         </w:tc>
       </w:tr>
       <w:tr>
+        <w:trPr>
+          <w:cantSplit/>
+        </w:trPr>
         <w:tc>
           <w:tcPr>
             <w:tcW w:type="dxa" w:w="1400"/>
@@ -6805,6 +6815,7 @@
           </w:tcPr>
           <w:p>
             <w:pPr>
+              <w:keepNext/>
               <w:jc w:val="left"/>
             </w:pPr>
             <w:r>
@@ -6832,6 +6843,7 @@
           </w:tcPr>
           <w:p>
             <w:pPr>
+              <w:keepNext/>
               <w:jc w:val="left"/>
             </w:pPr>
             <w:r>
@@ -6859,6 +6871,7 @@
           </w:tcPr>
           <w:p>
             <w:pPr>
+              <w:keepNext/>
               <w:jc w:val="left"/>
             </w:pPr>
             <w:r>
@@ -6886,6 +6899,7 @@
           </w:tcPr>
           <w:p>
             <w:pPr>
+              <w:keepNext/>
               <w:jc w:val="left"/>
             </w:pPr>
             <w:r>
@@ -6903,6 +6917,9 @@
         </w:tc>
       </w:tr>
       <w:tr>
+        <w:trPr>
+          <w:cantSplit/>
+        </w:trPr>
         <w:tc>
           <w:tcPr>
             <w:tcW w:type="dxa" w:w="1400"/>
@@ -6916,6 +6933,7 @@
           </w:tcPr>
           <w:p>
             <w:pPr>
+              <w:keepNext/>
               <w:jc w:val="left"/>
             </w:pPr>
             <w:r>
@@ -6944,6 +6962,7 @@
           </w:tcPr>
           <w:p>
             <w:pPr>
+              <w:keepNext/>
               <w:jc w:val="left"/>
             </w:pPr>
             <w:r>
@@ -6972,6 +6991,7 @@
           </w:tcPr>
           <w:p>
             <w:pPr>
+              <w:keepNext/>
               <w:jc w:val="left"/>
             </w:pPr>
             <w:r>
@@ -7000,6 +7020,7 @@
           </w:tcPr>
           <w:p>
             <w:pPr>
+              <w:keepNext/>
               <w:jc w:val="left"/>
             </w:pPr>
             <w:r>
@@ -7017,6 +7038,9 @@
         </w:tc>
       </w:tr>
       <w:tr>
+        <w:trPr>
+          <w:cantSplit/>
+        </w:trPr>
         <w:tc>
           <w:tcPr>
             <w:tcW w:type="dxa" w:w="1400"/>
@@ -7029,6 +7053,7 @@
           </w:tcPr>
           <w:p>
             <w:pPr>
+              <w:keepNext/>
               <w:jc w:val="left"/>
             </w:pPr>
             <w:r>
@@ -7056,6 +7081,7 @@
           </w:tcPr>
           <w:p>
             <w:pPr>
+              <w:keepNext/>
               <w:jc w:val="left"/>
             </w:pPr>
             <w:r>
@@ -7083,6 +7109,7 @@
           </w:tcPr>
           <w:p>
             <w:pPr>
+              <w:keepNext/>
               <w:jc w:val="left"/>
             </w:pPr>
             <w:r>
@@ -7110,6 +7137,7 @@
           </w:tcPr>
           <w:p>
             <w:pPr>
+              <w:keepNext/>
               <w:jc w:val="left"/>
             </w:pPr>
             <w:r>
@@ -7127,6 +7155,9 @@
         </w:tc>
       </w:tr>
       <w:tr>
+        <w:trPr>
+          <w:cantSplit/>
+        </w:trPr>
         <w:tc>
           <w:tcPr>
             <w:tcW w:type="dxa" w:w="1400"/>
@@ -7140,6 +7171,7 @@
           </w:tcPr>
           <w:p>
             <w:pPr>
+              <w:keepNext/>
               <w:jc w:val="left"/>
             </w:pPr>
             <w:r>
@@ -7168,6 +7200,7 @@
           </w:tcPr>
           <w:p>
             <w:pPr>
+              <w:keepNext/>
               <w:jc w:val="left"/>
             </w:pPr>
             <w:r>
@@ -7196,6 +7229,7 @@
           </w:tcPr>
           <w:p>
             <w:pPr>
+              <w:keepNext/>
               <w:jc w:val="left"/>
             </w:pPr>
             <w:r>
@@ -7224,6 +7258,7 @@
           </w:tcPr>
           <w:p>
             <w:pPr>
+              <w:keepNext/>
               <w:jc w:val="left"/>
             </w:pPr>
             <w:r>
@@ -7241,6 +7276,9 @@
         </w:tc>
       </w:tr>
       <w:tr>
+        <w:trPr>
+          <w:cantSplit/>
+        </w:trPr>
         <w:tc>
           <w:tcPr>
             <w:tcW w:type="dxa" w:w="1400"/>

</xml_diff>

<commit_message>
Move the Commercial Steam/Mist Iron beside the other iron; add cups to Front Desk
- 180327 Commercial Steam/Mist Iron moves out of Front Desk and sits
  directly under 183995 Retractable Cord Iron in Coffee/Room Supplies,
  with a Spanish description added for the section's third column.
- 208267 Unwrapped 9 Oz Plastic Cup added to the Front Desk list (it
  also remains in Coffee/Room Supplies).
- Re-applied the Front Desk keep-together settings after the row edits.

Co-Authored-By: Claude Opus 5 <noreply@anthropic.com>
Claude-Session: https://claude.ai/code/session_0138rT731u9moyu7f3GNkj4g
</commit_message>
<xml_diff>
--- a/Elm_Housekeeping_Inventory.docx
+++ b/Elm_Housekeeping_Inventory.docx
@@ -5630,6 +5630,146 @@
         <w:tc>
           <w:tcPr>
             <w:tcW w:type="dxa" w:w="1200"/>
+            <w:shd w:fill="F5F7FA" w:color="auto" w:val="clear"/>
+            <w:tcMar>
+              <w:top w:type="dxa" w:w="60"/>
+              <w:left w:type="dxa" w:w="90"/>
+              <w:bottom w:type="dxa" w:w="60"/>
+              <w:right w:type="dxa" w:w="90"/>
+            </w:tcMar>
+          </w:tcPr>
+          <w:p>
+            <w:pPr>
+              <w:jc w:val="left"/>
+            </w:pPr>
+            <w:r>
+              <w:rPr>
+                <w:rFonts w:ascii="Calibri" w:cs="Calibri" w:eastAsia="Calibri" w:hAnsi="Calibri"/>
+                <w:b w:val="false"/>
+                <w:bCs w:val="false"/>
+                <w:color w:val="000000"/>
+                <w:sz w:val="17"/>
+                <w:szCs w:val="17"/>
+              </w:rPr>
+              <w:t>180327</w:t>
+            </w:r>
+          </w:p>
+        </w:tc>
+        <w:tc>
+          <w:tcPr>
+            <w:tcW w:type="dxa" w:w="3800"/>
+            <w:shd w:fill="F5F7FA" w:color="auto" w:val="clear"/>
+            <w:tcMar>
+              <w:top w:type="dxa" w:w="60"/>
+              <w:left w:type="dxa" w:w="90"/>
+              <w:bottom w:type="dxa" w:w="60"/>
+              <w:right w:type="dxa" w:w="90"/>
+            </w:tcMar>
+          </w:tcPr>
+          <w:p>
+            <w:pPr>
+              <w:jc w:val="left"/>
+            </w:pPr>
+            <w:r>
+              <w:rPr>
+                <w:rFonts w:ascii="Calibri" w:cs="Calibri" w:eastAsia="Calibri" w:hAnsi="Calibri"/>
+                <w:b w:val="false"/>
+                <w:bCs w:val="false"/>
+                <w:color w:val="000000"/>
+                <w:sz w:val="17"/>
+                <w:szCs w:val="17"/>
+              </w:rPr>
+              <w:t>Commercial Steam/Mist Iron, White/Blue</w:t>
+            </w:r>
+          </w:p>
+        </w:tc>
+        <w:tc>
+          <w:tcPr>
+            <w:tcW w:type="dxa" w:w="3800"/>
+            <w:shd w:fill="F5F7FA" w:color="auto" w:val="clear"/>
+            <w:tcMar>
+              <w:top w:type="dxa" w:w="60"/>
+              <w:left w:type="dxa" w:w="90"/>
+              <w:bottom w:type="dxa" w:w="60"/>
+              <w:right w:type="dxa" w:w="90"/>
+            </w:tcMar>
+          </w:tcPr>
+          <w:p>
+            <w:pPr>
+              <w:jc w:val="left"/>
+            </w:pPr>
+            <w:r>
+              <w:rPr>
+                <w:rFonts w:ascii="Calibri" w:cs="Calibri" w:eastAsia="Calibri" w:hAnsi="Calibri"/>
+                <w:b w:val="false"/>
+                <w:bCs w:val="false"/>
+                <w:color w:val="000000"/>
+                <w:sz w:val="17"/>
+                <w:szCs w:val="17"/>
+              </w:rPr>
+              <w:t>Plancha comercial de vapor/rocío, blanca/azul</w:t>
+            </w:r>
+          </w:p>
+        </w:tc>
+        <w:tc>
+          <w:tcPr>
+            <w:tcW w:type="dxa" w:w="800"/>
+            <w:shd w:fill="F5F7FA" w:color="auto" w:val="clear"/>
+            <w:tcMar>
+              <w:top w:type="dxa" w:w="60"/>
+              <w:left w:type="dxa" w:w="90"/>
+              <w:bottom w:type="dxa" w:w="60"/>
+              <w:right w:type="dxa" w:w="90"/>
+            </w:tcMar>
+          </w:tcPr>
+          <w:p>
+            <w:pPr>
+              <w:jc w:val="left"/>
+            </w:pPr>
+            <w:r>
+              <w:rPr>
+                <w:rFonts w:ascii="Calibri" w:cs="Calibri" w:eastAsia="Calibri" w:hAnsi="Calibri"/>
+                <w:b w:val="false"/>
+                <w:bCs w:val="false"/>
+                <w:color w:val="000000"/>
+                <w:sz w:val="18"/>
+                <w:szCs w:val="18"/>
+              </w:rPr>
+            </w:r>
+          </w:p>
+        </w:tc>
+        <w:tc>
+          <w:tcPr>
+            <w:tcW w:type="dxa" w:w="800"/>
+            <w:shd w:fill="F5F7FA" w:color="auto" w:val="clear"/>
+            <w:tcMar>
+              <w:top w:type="dxa" w:w="60"/>
+              <w:left w:type="dxa" w:w="90"/>
+              <w:bottom w:type="dxa" w:w="60"/>
+              <w:right w:type="dxa" w:w="90"/>
+            </w:tcMar>
+          </w:tcPr>
+          <w:p>
+            <w:pPr>
+              <w:jc w:val="left"/>
+            </w:pPr>
+            <w:r>
+              <w:rPr>
+                <w:rFonts w:ascii="Calibri" w:cs="Calibri" w:eastAsia="Calibri" w:hAnsi="Calibri"/>
+                <w:b w:val="false"/>
+                <w:bCs w:val="false"/>
+                <w:color w:val="000000"/>
+                <w:sz w:val="18"/>
+                <w:szCs w:val="18"/>
+              </w:rPr>
+            </w:r>
+          </w:p>
+        </w:tc>
+      </w:tr>
+      <w:tr>
+        <w:tc>
+          <w:tcPr>
+            <w:tcW w:type="dxa" w:w="1200"/>
             <w:tcMar>
               <w:top w:type="dxa" w:w="60"/>
               <w:left w:type="dxa" w:w="90"/>
@@ -7044,6 +7184,7 @@
         <w:tc>
           <w:tcPr>
             <w:tcW w:type="dxa" w:w="1400"/>
+            <w:shd w:fill="F5F7FA" w:color="auto" w:val="clear"/>
             <w:tcMar>
               <w:top w:type="dxa" w:w="60"/>
               <w:left w:type="dxa" w:w="90"/>
@@ -7065,13 +7206,14 @@
                 <w:sz w:val="17"/>
                 <w:szCs w:val="17"/>
               </w:rPr>
-              <w:t xml:space="preserve">180327</w:t>
+              <w:t xml:space="preserve">206621</w:t>
             </w:r>
           </w:p>
         </w:tc>
         <w:tc>
           <w:tcPr>
             <w:tcW w:type="dxa" w:w="7200"/>
+            <w:shd w:fill="F5F7FA" w:color="auto" w:val="clear"/>
             <w:tcMar>
               <w:top w:type="dxa" w:w="60"/>
               <w:left w:type="dxa" w:w="90"/>
@@ -7093,13 +7235,14 @@
                 <w:sz w:val="17"/>
                 <w:szCs w:val="17"/>
               </w:rPr>
-              <w:t xml:space="preserve">Commercial Steam/Mist Iron, White/Blue</w:t>
+              <w:t xml:space="preserve">Linen Card 4 X 9, Case Of 100</w:t>
             </w:r>
           </w:p>
         </w:tc>
         <w:tc>
           <w:tcPr>
             <w:tcW w:type="dxa" w:w="900"/>
+            <w:shd w:fill="F5F7FA" w:color="auto" w:val="clear"/>
             <w:tcMar>
               <w:top w:type="dxa" w:w="60"/>
               <w:left w:type="dxa" w:w="90"/>
@@ -7128,6 +7271,7 @@
         <w:tc>
           <w:tcPr>
             <w:tcW w:type="dxa" w:w="900"/>
+            <w:shd w:fill="F5F7FA" w:color="auto" w:val="clear"/>
             <w:tcMar>
               <w:top w:type="dxa" w:w="60"/>
               <w:left w:type="dxa" w:w="90"/>
@@ -7161,7 +7305,6 @@
         <w:tc>
           <w:tcPr>
             <w:tcW w:type="dxa" w:w="1400"/>
-            <w:shd w:fill="F5F7FA" w:color="auto" w:val="clear"/>
             <w:tcMar>
               <w:top w:type="dxa" w:w="60"/>
               <w:left w:type="dxa" w:w="90"/>
@@ -7183,14 +7326,13 @@
                 <w:sz w:val="17"/>
                 <w:szCs w:val="17"/>
               </w:rPr>
-              <w:t xml:space="preserve">206621</w:t>
+              <w:t xml:space="preserve">206822</w:t>
             </w:r>
           </w:p>
         </w:tc>
         <w:tc>
           <w:tcPr>
             <w:tcW w:type="dxa" w:w="7200"/>
-            <w:shd w:fill="F5F7FA" w:color="auto" w:val="clear"/>
             <w:tcMar>
               <w:top w:type="dxa" w:w="60"/>
               <w:left w:type="dxa" w:w="90"/>
@@ -7212,14 +7354,13 @@
                 <w:sz w:val="17"/>
                 <w:szCs w:val="17"/>
               </w:rPr>
-              <w:t xml:space="preserve">Linen Card 4 X 9, Case Of 100</w:t>
+              <w:t xml:space="preserve">Towel Hanger Card 4 X 10, Case Of 100</w:t>
             </w:r>
           </w:p>
         </w:tc>
         <w:tc>
           <w:tcPr>
             <w:tcW w:type="dxa" w:w="900"/>
-            <w:shd w:fill="F5F7FA" w:color="auto" w:val="clear"/>
             <w:tcMar>
               <w:top w:type="dxa" w:w="60"/>
               <w:left w:type="dxa" w:w="90"/>
@@ -7248,7 +7389,6 @@
         <w:tc>
           <w:tcPr>
             <w:tcW w:type="dxa" w:w="900"/>
-            <w:shd w:fill="F5F7FA" w:color="auto" w:val="clear"/>
             <w:tcMar>
               <w:top w:type="dxa" w:w="60"/>
               <w:left w:type="dxa" w:w="90"/>
@@ -7302,7 +7442,7 @@
                 <w:sz w:val="17"/>
                 <w:szCs w:val="17"/>
               </w:rPr>
-              <w:t xml:space="preserve">206822</w:t>
+              <w:t>208267</w:t>
             </w:r>
           </w:p>
         </w:tc>
@@ -7329,7 +7469,7 @@
                 <w:sz w:val="17"/>
                 <w:szCs w:val="17"/>
               </w:rPr>
-              <w:t xml:space="preserve">Towel Hanger Card 4 X 10, Case Of 100</w:t>
+              <w:t>Unwrapped 9 Oz Plastic Cup, Case Of 2500</w:t>
             </w:r>
           </w:p>
         </w:tc>
@@ -7356,7 +7496,6 @@
                 <w:sz w:val="18"/>
                 <w:szCs w:val="18"/>
               </w:rPr>
-              <w:t xml:space="preserve"/>
             </w:r>
           </w:p>
         </w:tc>
@@ -7383,7 +7522,6 @@
                 <w:sz w:val="18"/>
                 <w:szCs w:val="18"/>
               </w:rPr>
-              <w:t xml:space="preserve"/>
             </w:r>
           </w:p>
         </w:tc>

</xml_diff>

<commit_message>
Add the three items missing against the master housekeeping list
Diffed every part number against Elm_Updaded_Hskpng_list:
- 497380 and 759558 Coffee-Mate liquid creamers added to Front Desk
- 204167 Ecolab 66 Heavy Duty Alkaline Bathroom Cleaner added beside
  the 73 acid cleaner in the Ecolab wall-dispenser section

Co-Authored-By: Claude Opus 5 <noreply@anthropic.com>
Claude-Session: https://claude.ai/code/session_0138rT731u9moyu7f3GNkj4g
</commit_message>
<xml_diff>
--- a/Elm_Housekeeping_Inventory.docx
+++ b/Elm_Housekeeping_Inventory.docx
@@ -2709,6 +2709,141 @@
         <w:tc>
           <w:tcPr>
             <w:tcW w:type="dxa" w:w="1200"/>
+            <w:tcMar>
+              <w:top w:type="dxa" w:w="60"/>
+              <w:left w:type="dxa" w:w="90"/>
+              <w:bottom w:type="dxa" w:w="60"/>
+              <w:right w:type="dxa" w:w="90"/>
+            </w:tcMar>
+          </w:tcPr>
+          <w:p>
+            <w:pPr>
+              <w:jc w:val="left"/>
+            </w:pPr>
+            <w:r>
+              <w:rPr>
+                <w:rFonts w:ascii="Calibri" w:cs="Calibri" w:eastAsia="Calibri" w:hAnsi="Calibri"/>
+                <w:b w:val="false"/>
+                <w:bCs w:val="false"/>
+                <w:color w:val="000000"/>
+                <w:sz w:val="17"/>
+                <w:szCs w:val="17"/>
+              </w:rPr>
+              <w:t>204167</w:t>
+            </w:r>
+          </w:p>
+        </w:tc>
+        <w:tc>
+          <w:tcPr>
+            <w:tcW w:type="dxa" w:w="3800"/>
+            <w:tcMar>
+              <w:top w:type="dxa" w:w="60"/>
+              <w:left w:type="dxa" w:w="90"/>
+              <w:bottom w:type="dxa" w:w="60"/>
+              <w:right w:type="dxa" w:w="90"/>
+            </w:tcMar>
+          </w:tcPr>
+          <w:p>
+            <w:pPr>
+              <w:jc w:val="left"/>
+            </w:pPr>
+            <w:r>
+              <w:rPr>
+                <w:rFonts w:ascii="Calibri" w:cs="Calibri" w:eastAsia="Calibri" w:hAnsi="Calibri"/>
+                <w:b w:val="false"/>
+                <w:bCs w:val="false"/>
+                <w:color w:val="000000"/>
+                <w:sz w:val="17"/>
+                <w:szCs w:val="17"/>
+              </w:rPr>
+              <w:t>66 Heavy Duty Alkaline Bathroom Cleaner - 2.5 Gal  (wall dispenser)</w:t>
+            </w:r>
+          </w:p>
+        </w:tc>
+        <w:tc>
+          <w:tcPr>
+            <w:tcW w:type="dxa" w:w="3800"/>
+            <w:tcMar>
+              <w:top w:type="dxa" w:w="60"/>
+              <w:left w:type="dxa" w:w="90"/>
+              <w:bottom w:type="dxa" w:w="60"/>
+              <w:right w:type="dxa" w:w="90"/>
+            </w:tcMar>
+          </w:tcPr>
+          <w:p>
+            <w:pPr>
+              <w:jc w:val="left"/>
+            </w:pPr>
+            <w:r>
+              <w:rPr>
+                <w:rFonts w:ascii="Calibri" w:cs="Calibri" w:eastAsia="Calibri" w:hAnsi="Calibri"/>
+                <w:b w:val="false"/>
+                <w:bCs w:val="false"/>
+                <w:color w:val="000000"/>
+                <w:sz w:val="17"/>
+                <w:szCs w:val="17"/>
+              </w:rPr>
+              <w:t>66 Heavy Duty Alkaline Bathroom Cleaner - 2.5 gal (dispensador de pared) — baños, limpieza fuerte</w:t>
+            </w:r>
+          </w:p>
+        </w:tc>
+        <w:tc>
+          <w:tcPr>
+            <w:tcW w:type="dxa" w:w="800"/>
+            <w:tcMar>
+              <w:top w:type="dxa" w:w="60"/>
+              <w:left w:type="dxa" w:w="90"/>
+              <w:bottom w:type="dxa" w:w="60"/>
+              <w:right w:type="dxa" w:w="90"/>
+            </w:tcMar>
+          </w:tcPr>
+          <w:p>
+            <w:pPr>
+              <w:jc w:val="left"/>
+            </w:pPr>
+            <w:r>
+              <w:rPr>
+                <w:rFonts w:ascii="Calibri" w:cs="Calibri" w:eastAsia="Calibri" w:hAnsi="Calibri"/>
+                <w:b w:val="false"/>
+                <w:bCs w:val="false"/>
+                <w:color w:val="000000"/>
+                <w:sz w:val="18"/>
+                <w:szCs w:val="18"/>
+              </w:rPr>
+            </w:r>
+          </w:p>
+        </w:tc>
+        <w:tc>
+          <w:tcPr>
+            <w:tcW w:type="dxa" w:w="800"/>
+            <w:tcMar>
+              <w:top w:type="dxa" w:w="60"/>
+              <w:left w:type="dxa" w:w="90"/>
+              <w:bottom w:type="dxa" w:w="60"/>
+              <w:right w:type="dxa" w:w="90"/>
+            </w:tcMar>
+          </w:tcPr>
+          <w:p>
+            <w:pPr>
+              <w:jc w:val="left"/>
+            </w:pPr>
+            <w:r>
+              <w:rPr>
+                <w:rFonts w:ascii="Calibri" w:cs="Calibri" w:eastAsia="Calibri" w:hAnsi="Calibri"/>
+                <w:b w:val="false"/>
+                <w:bCs w:val="false"/>
+                <w:color w:val="000000"/>
+                <w:sz w:val="18"/>
+                <w:szCs w:val="18"/>
+              </w:rPr>
+            </w:r>
+          </w:p>
+        </w:tc>
+      </w:tr>
+      <w:tr>
+        <w:tc>
+          <w:tcPr>
+            <w:tcW w:type="dxa" w:w="1200"/>
             <w:shd w:fill="F5F7FA" w:color="auto" w:val="clear"/>
             <w:tcMar>
               <w:top w:type="dxa" w:w="60"/>
@@ -7431,6 +7566,7 @@
           </w:tcPr>
           <w:p>
             <w:pPr>
+              <w:keepNext/>
               <w:jc w:val="left"/>
             </w:pPr>
             <w:r>
@@ -7458,6 +7594,7 @@
           </w:tcPr>
           <w:p>
             <w:pPr>
+              <w:keepNext/>
               <w:jc w:val="left"/>
             </w:pPr>
             <w:r>
@@ -7470,6 +7607,234 @@
                 <w:szCs w:val="17"/>
               </w:rPr>
               <w:t>Unwrapped 9 Oz Plastic Cup, Case Of 2500</w:t>
+            </w:r>
+          </w:p>
+        </w:tc>
+        <w:tc>
+          <w:tcPr>
+            <w:tcW w:type="dxa" w:w="900"/>
+            <w:tcMar>
+              <w:top w:type="dxa" w:w="60"/>
+              <w:left w:type="dxa" w:w="90"/>
+              <w:bottom w:type="dxa" w:w="60"/>
+              <w:right w:type="dxa" w:w="90"/>
+            </w:tcMar>
+          </w:tcPr>
+          <w:p>
+            <w:pPr>
+              <w:keepNext/>
+              <w:jc w:val="left"/>
+            </w:pPr>
+            <w:r>
+              <w:rPr>
+                <w:rFonts w:ascii="Calibri" w:cs="Calibri" w:eastAsia="Calibri" w:hAnsi="Calibri"/>
+                <w:b w:val="false"/>
+                <w:bCs w:val="false"/>
+                <w:color w:val="000000"/>
+                <w:sz w:val="18"/>
+                <w:szCs w:val="18"/>
+              </w:rPr>
+            </w:r>
+          </w:p>
+        </w:tc>
+        <w:tc>
+          <w:tcPr>
+            <w:tcW w:type="dxa" w:w="900"/>
+            <w:tcMar>
+              <w:top w:type="dxa" w:w="60"/>
+              <w:left w:type="dxa" w:w="90"/>
+              <w:bottom w:type="dxa" w:w="60"/>
+              <w:right w:type="dxa" w:w="90"/>
+            </w:tcMar>
+          </w:tcPr>
+          <w:p>
+            <w:pPr>
+              <w:keepNext/>
+              <w:jc w:val="left"/>
+            </w:pPr>
+            <w:r>
+              <w:rPr>
+                <w:rFonts w:ascii="Calibri" w:cs="Calibri" w:eastAsia="Calibri" w:hAnsi="Calibri"/>
+                <w:b w:val="false"/>
+                <w:bCs w:val="false"/>
+                <w:color w:val="000000"/>
+                <w:sz w:val="18"/>
+                <w:szCs w:val="18"/>
+              </w:rPr>
+            </w:r>
+          </w:p>
+        </w:tc>
+      </w:tr>
+      <w:tr>
+        <w:trPr>
+          <w:cantSplit/>
+        </w:trPr>
+        <w:tc>
+          <w:tcPr>
+            <w:tcW w:type="dxa" w:w="1400"/>
+            <w:tcMar>
+              <w:top w:type="dxa" w:w="60"/>
+              <w:left w:type="dxa" w:w="90"/>
+              <w:bottom w:type="dxa" w:w="60"/>
+              <w:right w:type="dxa" w:w="90"/>
+            </w:tcMar>
+          </w:tcPr>
+          <w:p>
+            <w:pPr>
+              <w:keepNext/>
+              <w:jc w:val="left"/>
+            </w:pPr>
+            <w:r>
+              <w:rPr>
+                <w:rFonts w:ascii="Calibri" w:cs="Calibri" w:eastAsia="Calibri" w:hAnsi="Calibri"/>
+                <w:b w:val="false"/>
+                <w:bCs w:val="false"/>
+                <w:color w:val="000000"/>
+                <w:sz w:val="17"/>
+                <w:szCs w:val="17"/>
+              </w:rPr>
+              <w:t>497380</w:t>
+            </w:r>
+          </w:p>
+        </w:tc>
+        <w:tc>
+          <w:tcPr>
+            <w:tcW w:type="dxa" w:w="7200"/>
+            <w:tcMar>
+              <w:top w:type="dxa" w:w="60"/>
+              <w:left w:type="dxa" w:w="90"/>
+              <w:bottom w:type="dxa" w:w="60"/>
+              <w:right w:type="dxa" w:w="90"/>
+            </w:tcMar>
+          </w:tcPr>
+          <w:p>
+            <w:pPr>
+              <w:keepNext/>
+              <w:jc w:val="left"/>
+            </w:pPr>
+            <w:r>
+              <w:rPr>
+                <w:rFonts w:ascii="Calibri" w:cs="Calibri" w:eastAsia="Calibri" w:hAnsi="Calibri"/>
+                <w:b w:val="false"/>
+                <w:bCs w:val="false"/>
+                <w:color w:val="000000"/>
+                <w:sz w:val="17"/>
+                <w:szCs w:val="17"/>
+              </w:rPr>
+              <w:t>Coffee-Mate Original Mini Cup Liquid Coffee Creamer, 360-Pack</w:t>
+            </w:r>
+          </w:p>
+        </w:tc>
+        <w:tc>
+          <w:tcPr>
+            <w:tcW w:type="dxa" w:w="900"/>
+            <w:tcMar>
+              <w:top w:type="dxa" w:w="60"/>
+              <w:left w:type="dxa" w:w="90"/>
+              <w:bottom w:type="dxa" w:w="60"/>
+              <w:right w:type="dxa" w:w="90"/>
+            </w:tcMar>
+          </w:tcPr>
+          <w:p>
+            <w:pPr>
+              <w:keepNext/>
+              <w:jc w:val="left"/>
+            </w:pPr>
+            <w:r>
+              <w:rPr>
+                <w:rFonts w:ascii="Calibri" w:cs="Calibri" w:eastAsia="Calibri" w:hAnsi="Calibri"/>
+                <w:b w:val="false"/>
+                <w:bCs w:val="false"/>
+                <w:color w:val="000000"/>
+                <w:sz w:val="18"/>
+                <w:szCs w:val="18"/>
+              </w:rPr>
+            </w:r>
+          </w:p>
+        </w:tc>
+        <w:tc>
+          <w:tcPr>
+            <w:tcW w:type="dxa" w:w="900"/>
+            <w:tcMar>
+              <w:top w:type="dxa" w:w="60"/>
+              <w:left w:type="dxa" w:w="90"/>
+              <w:bottom w:type="dxa" w:w="60"/>
+              <w:right w:type="dxa" w:w="90"/>
+            </w:tcMar>
+          </w:tcPr>
+          <w:p>
+            <w:pPr>
+              <w:keepNext/>
+              <w:jc w:val="left"/>
+            </w:pPr>
+            <w:r>
+              <w:rPr>
+                <w:rFonts w:ascii="Calibri" w:cs="Calibri" w:eastAsia="Calibri" w:hAnsi="Calibri"/>
+                <w:b w:val="false"/>
+                <w:bCs w:val="false"/>
+                <w:color w:val="000000"/>
+                <w:sz w:val="18"/>
+                <w:szCs w:val="18"/>
+              </w:rPr>
+            </w:r>
+          </w:p>
+        </w:tc>
+      </w:tr>
+      <w:tr>
+        <w:trPr>
+          <w:cantSplit/>
+        </w:trPr>
+        <w:tc>
+          <w:tcPr>
+            <w:tcW w:type="dxa" w:w="1400"/>
+            <w:tcMar>
+              <w:top w:type="dxa" w:w="60"/>
+              <w:left w:type="dxa" w:w="90"/>
+              <w:bottom w:type="dxa" w:w="60"/>
+              <w:right w:type="dxa" w:w="90"/>
+            </w:tcMar>
+          </w:tcPr>
+          <w:p>
+            <w:pPr>
+              <w:jc w:val="left"/>
+            </w:pPr>
+            <w:r>
+              <w:rPr>
+                <w:rFonts w:ascii="Calibri" w:cs="Calibri" w:eastAsia="Calibri" w:hAnsi="Calibri"/>
+                <w:b w:val="false"/>
+                <w:bCs w:val="false"/>
+                <w:color w:val="000000"/>
+                <w:sz w:val="17"/>
+                <w:szCs w:val="17"/>
+              </w:rPr>
+              <w:t>759558</w:t>
+            </w:r>
+          </w:p>
+        </w:tc>
+        <w:tc>
+          <w:tcPr>
+            <w:tcW w:type="dxa" w:w="7200"/>
+            <w:tcMar>
+              <w:top w:type="dxa" w:w="60"/>
+              <w:left w:type="dxa" w:w="90"/>
+              <w:bottom w:type="dxa" w:w="60"/>
+              <w:right w:type="dxa" w:w="90"/>
+            </w:tcMar>
+          </w:tcPr>
+          <w:p>
+            <w:pPr>
+              <w:jc w:val="left"/>
+            </w:pPr>
+            <w:r>
+              <w:rPr>
+                <w:rFonts w:ascii="Calibri" w:cs="Calibri" w:eastAsia="Calibri" w:hAnsi="Calibri"/>
+                <w:b w:val="false"/>
+                <w:bCs w:val="false"/>
+                <w:color w:val="000000"/>
+                <w:sz w:val="17"/>
+                <w:szCs w:val="17"/>
+              </w:rPr>
+              <w:t>Coffee-Mate French Vanilla Mini Cup Liquid Creamer, Case Of 180</w:t>
             </w:r>
           </w:p>
         </w:tc>

</xml_diff>

<commit_message>
Add a Branding section and make Front Desk bilingual
- New BRANDING / Marca section holds the linen card (206621) and towel
  hanger card (206822), moved out of Front Desk, plus placeholder rows
  for a Do Not Disturb hanger and a pet-in-room sign pending part #s.
- Front Desk rebuilt as a five-column bilingual table matching the other
  sections, with Spanish descriptions for all its items.
- 208267 removed from Coffee/Room Supplies; it is counted at the front
  desk only.

Co-Authored-By: Claude Opus 5 <noreply@anthropic.com>
Claude-Session: https://claude.ai/code/session_0138rT731u9moyu7f3GNkj4g
</commit_message>
<xml_diff>
--- a/Elm_Housekeeping_Inventory.docx
+++ b/Elm_Housekeeping_Inventory.docx
@@ -5344,148 +5344,6 @@
         <w:tc>
           <w:tcPr>
             <w:tcW w:type="dxa" w:w="1200"/>
-            <w:shd w:fill="F5F7FA" w:color="auto" w:val="clear"/>
-            <w:tcMar>
-              <w:top w:type="dxa" w:w="60"/>
-              <w:left w:type="dxa" w:w="90"/>
-              <w:bottom w:type="dxa" w:w="60"/>
-              <w:right w:type="dxa" w:w="90"/>
-            </w:tcMar>
-          </w:tcPr>
-          <w:p>
-            <w:pPr>
-              <w:jc w:val="left"/>
-            </w:pPr>
-            <w:r>
-              <w:rPr>
-                <w:rFonts w:ascii="Calibri" w:cs="Calibri" w:eastAsia="Calibri" w:hAnsi="Calibri"/>
-                <w:b w:val="false"/>
-                <w:bCs w:val="false"/>
-                <w:color w:val="000000"/>
-                <w:sz w:val="17"/>
-                <w:szCs w:val="17"/>
-              </w:rPr>
-              <w:t xml:space="preserve">208267</w:t>
-            </w:r>
-          </w:p>
-        </w:tc>
-        <w:tc>
-          <w:tcPr>
-            <w:tcW w:type="dxa" w:w="3800"/>
-            <w:shd w:fill="F5F7FA" w:color="auto" w:val="clear"/>
-            <w:tcMar>
-              <w:top w:type="dxa" w:w="60"/>
-              <w:left w:type="dxa" w:w="90"/>
-              <w:bottom w:type="dxa" w:w="60"/>
-              <w:right w:type="dxa" w:w="90"/>
-            </w:tcMar>
-          </w:tcPr>
-          <w:p>
-            <w:pPr>
-              <w:jc w:val="left"/>
-            </w:pPr>
-            <w:r>
-              <w:rPr>
-                <w:rFonts w:ascii="Calibri" w:cs="Calibri" w:eastAsia="Calibri" w:hAnsi="Calibri"/>
-                <w:b w:val="false"/>
-                <w:bCs w:val="false"/>
-                <w:color w:val="000000"/>
-                <w:sz w:val="17"/>
-                <w:szCs w:val="17"/>
-              </w:rPr>
-              <w:t xml:space="preserve">Unwrapped 9 Oz Plastic Cup, Case Of 2500</w:t>
-            </w:r>
-          </w:p>
-        </w:tc>
-        <w:tc>
-          <w:tcPr>
-            <w:tcW w:type="dxa" w:w="3800"/>
-            <w:shd w:fill="F5F7FA" w:color="auto" w:val="clear"/>
-            <w:tcMar>
-              <w:top w:type="dxa" w:w="60"/>
-              <w:left w:type="dxa" w:w="90"/>
-              <w:bottom w:type="dxa" w:w="60"/>
-              <w:right w:type="dxa" w:w="90"/>
-            </w:tcMar>
-          </w:tcPr>
-          <w:p>
-            <w:pPr>
-              <w:jc w:val="left"/>
-            </w:pPr>
-            <w:r>
-              <w:rPr>
-                <w:rFonts w:ascii="Calibri" w:cs="Calibri" w:eastAsia="Calibri" w:hAnsi="Calibri"/>
-                <w:b w:val="false"/>
-                <w:bCs w:val="false"/>
-                <w:color w:val="000000"/>
-                <w:sz w:val="17"/>
-                <w:szCs w:val="17"/>
-              </w:rPr>
-              <w:t xml:space="preserve">Vaso plástico sin envoltura 9 oz, caja de 2500</w:t>
-            </w:r>
-          </w:p>
-        </w:tc>
-        <w:tc>
-          <w:tcPr>
-            <w:tcW w:type="dxa" w:w="800"/>
-            <w:shd w:fill="F5F7FA" w:color="auto" w:val="clear"/>
-            <w:tcMar>
-              <w:top w:type="dxa" w:w="60"/>
-              <w:left w:type="dxa" w:w="90"/>
-              <w:bottom w:type="dxa" w:w="60"/>
-              <w:right w:type="dxa" w:w="90"/>
-            </w:tcMar>
-          </w:tcPr>
-          <w:p>
-            <w:pPr>
-              <w:jc w:val="left"/>
-            </w:pPr>
-            <w:r>
-              <w:rPr>
-                <w:rFonts w:ascii="Calibri" w:cs="Calibri" w:eastAsia="Calibri" w:hAnsi="Calibri"/>
-                <w:b w:val="false"/>
-                <w:bCs w:val="false"/>
-                <w:color w:val="000000"/>
-                <w:sz w:val="18"/>
-                <w:szCs w:val="18"/>
-              </w:rPr>
-              <w:t xml:space="preserve"/>
-            </w:r>
-          </w:p>
-        </w:tc>
-        <w:tc>
-          <w:tcPr>
-            <w:tcW w:type="dxa" w:w="800"/>
-            <w:shd w:fill="F5F7FA" w:color="auto" w:val="clear"/>
-            <w:tcMar>
-              <w:top w:type="dxa" w:w="60"/>
-              <w:left w:type="dxa" w:w="90"/>
-              <w:bottom w:type="dxa" w:w="60"/>
-              <w:right w:type="dxa" w:w="90"/>
-            </w:tcMar>
-          </w:tcPr>
-          <w:p>
-            <w:pPr>
-              <w:jc w:val="left"/>
-            </w:pPr>
-            <w:r>
-              <w:rPr>
-                <w:rFonts w:ascii="Calibri" w:cs="Calibri" w:eastAsia="Calibri" w:hAnsi="Calibri"/>
-                <w:b w:val="false"/>
-                <w:bCs w:val="false"/>
-                <w:color w:val="000000"/>
-                <w:sz w:val="18"/>
-                <w:szCs w:val="18"/>
-              </w:rPr>
-              <w:t xml:space="preserve"/>
-            </w:r>
-          </w:p>
-        </w:tc>
-      </w:tr>
-      <w:tr>
-        <w:tc>
-          <w:tcPr>
-            <w:tcW w:type="dxa" w:w="1200"/>
             <w:tcMar>
               <w:top w:type="dxa" w:w="60"/>
               <w:left w:type="dxa" w:w="90"/>
@@ -6947,10 +6805,11 @@
         </w:tblBorders>
       </w:tblPr>
       <w:tblGrid>
-        <w:gridCol w:w="1400"/>
-        <w:gridCol w:w="7200"/>
-        <w:gridCol w:w="900"/>
-        <w:gridCol w:w="900"/>
+        <w:gridCol w:w="1200"/>
+        <w:gridCol w:w="3800"/>
+        <w:gridCol w:w="3800"/>
+        <w:gridCol w:w="800"/>
+        <w:gridCol w:w="800"/>
       </w:tblGrid>
       <w:tr>
         <w:trPr>
@@ -6959,7 +6818,7 @@
         </w:trPr>
         <w:tc>
           <w:tcPr>
-            <w:tcW w:type="dxa" w:w="1400"/>
+            <w:tcW w:type="dxa" w:w="1200"/>
             <w:shd w:fill="1F3A5F" w:color="auto" w:val="clear"/>
             <w:tcMar>
               <w:top w:type="dxa" w:w="60"/>
@@ -6982,13 +6841,13 @@
                 <w:sz w:val="18"/>
                 <w:szCs w:val="18"/>
               </w:rPr>
-              <w:t xml:space="preserve">Part #</w:t>
-            </w:r>
-          </w:p>
-        </w:tc>
-        <w:tc>
-          <w:tcPr>
-            <w:tcW w:type="dxa" w:w="7200"/>
+              <w:t>Part #</w:t>
+            </w:r>
+          </w:p>
+        </w:tc>
+        <w:tc>
+          <w:tcPr>
+            <w:tcW w:type="dxa" w:w="3800"/>
             <w:shd w:fill="1F3A5F" w:color="auto" w:val="clear"/>
             <w:tcMar>
               <w:top w:type="dxa" w:w="60"/>
@@ -7011,13 +6870,13 @@
                 <w:sz w:val="18"/>
                 <w:szCs w:val="18"/>
               </w:rPr>
-              <w:t xml:space="preserve">Item (English)</w:t>
-            </w:r>
-          </w:p>
-        </w:tc>
-        <w:tc>
-          <w:tcPr>
-            <w:tcW w:type="dxa" w:w="900"/>
+              <w:t>Item (English)</w:t>
+            </w:r>
+          </w:p>
+        </w:tc>
+        <w:tc>
+          <w:tcPr>
+            <w:tcW w:type="dxa" w:w="3800"/>
             <w:shd w:fill="1F3A5F" w:color="auto" w:val="clear"/>
             <w:tcMar>
               <w:top w:type="dxa" w:w="60"/>
@@ -7029,7 +6888,7 @@
           <w:p>
             <w:pPr>
               <w:keepNext/>
-              <w:jc w:val="center"/>
+              <w:jc w:val="left"/>
             </w:pPr>
             <w:r>
               <w:rPr>
@@ -7040,13 +6899,13 @@
                 <w:sz w:val="18"/>
                 <w:szCs w:val="18"/>
               </w:rPr>
-              <w:t xml:space="preserve">Par</w:t>
-            </w:r>
-          </w:p>
-        </w:tc>
-        <w:tc>
-          <w:tcPr>
-            <w:tcW w:type="dxa" w:w="900"/>
+              <w:t>Artículo (Español)</w:t>
+            </w:r>
+          </w:p>
+        </w:tc>
+        <w:tc>
+          <w:tcPr>
+            <w:tcW w:type="dxa" w:w="800"/>
             <w:shd w:fill="1F3A5F" w:color="auto" w:val="clear"/>
             <w:tcMar>
               <w:top w:type="dxa" w:w="60"/>
@@ -7069,7 +6928,36 @@
                 <w:sz w:val="18"/>
                 <w:szCs w:val="18"/>
               </w:rPr>
-              <w:t xml:space="preserve">Have</w:t>
+              <w:t>Par</w:t>
+            </w:r>
+          </w:p>
+        </w:tc>
+        <w:tc>
+          <w:tcPr>
+            <w:tcW w:type="dxa" w:w="800"/>
+            <w:shd w:fill="1F3A5F" w:color="auto" w:val="clear"/>
+            <w:tcMar>
+              <w:top w:type="dxa" w:w="60"/>
+              <w:left w:type="dxa" w:w="90"/>
+              <w:bottom w:type="dxa" w:w="60"/>
+              <w:right w:type="dxa" w:w="90"/>
+            </w:tcMar>
+          </w:tcPr>
+          <w:p>
+            <w:pPr>
+              <w:keepNext/>
+              <w:jc w:val="center"/>
+            </w:pPr>
+            <w:r>
+              <w:rPr>
+                <w:rFonts w:ascii="Calibri" w:cs="Calibri" w:eastAsia="Calibri" w:hAnsi="Calibri"/>
+                <w:b/>
+                <w:bCs/>
+                <w:color w:val="FFFFFF"/>
+                <w:sz w:val="18"/>
+                <w:szCs w:val="18"/>
+              </w:rPr>
+              <w:t>Tiene</w:t>
             </w:r>
           </w:p>
         </w:tc>
@@ -7080,7 +6968,7 @@
         </w:trPr>
         <w:tc>
           <w:tcPr>
-            <w:tcW w:type="dxa" w:w="1400"/>
+            <w:tcW w:type="dxa" w:w="1200"/>
             <w:tcMar>
               <w:top w:type="dxa" w:w="60"/>
               <w:left w:type="dxa" w:w="90"/>
@@ -7102,13 +6990,13 @@
                 <w:sz w:val="17"/>
                 <w:szCs w:val="17"/>
               </w:rPr>
-              <w:t xml:space="preserve">757774</w:t>
-            </w:r>
-          </w:p>
-        </w:tc>
-        <w:tc>
-          <w:tcPr>
-            <w:tcW w:type="dxa" w:w="7200"/>
+              <w:t>757774</w:t>
+            </w:r>
+          </w:p>
+        </w:tc>
+        <w:tc>
+          <w:tcPr>
+            <w:tcW w:type="dxa" w:w="3800"/>
             <w:tcMar>
               <w:top w:type="dxa" w:w="60"/>
               <w:left w:type="dxa" w:w="90"/>
@@ -7130,13 +7018,13 @@
                 <w:sz w:val="17"/>
                 <w:szCs w:val="17"/>
               </w:rPr>
-              <w:t xml:space="preserve">Key Folders, Case Of 500</w:t>
-            </w:r>
-          </w:p>
-        </w:tc>
-        <w:tc>
-          <w:tcPr>
-            <w:tcW w:type="dxa" w:w="900"/>
+              <w:t>Key Folders, Case Of 500</w:t>
+            </w:r>
+          </w:p>
+        </w:tc>
+        <w:tc>
+          <w:tcPr>
+            <w:tcW w:type="dxa" w:w="3800"/>
             <w:tcMar>
               <w:top w:type="dxa" w:w="60"/>
               <w:left w:type="dxa" w:w="90"/>
@@ -7155,16 +7043,16 @@
                 <w:b w:val="false"/>
                 <w:bCs w:val="false"/>
                 <w:color w:val="000000"/>
-                <w:sz w:val="18"/>
-                <w:szCs w:val="18"/>
-              </w:rPr>
-              <w:t xml:space="preserve"/>
-            </w:r>
-          </w:p>
-        </w:tc>
-        <w:tc>
-          <w:tcPr>
-            <w:tcW w:type="dxa" w:w="900"/>
+                <w:sz w:val="17"/>
+                <w:szCs w:val="17"/>
+              </w:rPr>
+              <w:t>Carpetas porta-llaves, caja de 500</w:t>
+            </w:r>
+          </w:p>
+        </w:tc>
+        <w:tc>
+          <w:tcPr>
+            <w:tcW w:type="dxa" w:w="800"/>
             <w:tcMar>
               <w:top w:type="dxa" w:w="60"/>
               <w:left w:type="dxa" w:w="90"/>
@@ -7186,7 +7074,33 @@
                 <w:sz w:val="18"/>
                 <w:szCs w:val="18"/>
               </w:rPr>
-              <w:t xml:space="preserve"/>
+            </w:r>
+          </w:p>
+        </w:tc>
+        <w:tc>
+          <w:tcPr>
+            <w:tcW w:type="dxa" w:w="800"/>
+            <w:tcMar>
+              <w:top w:type="dxa" w:w="60"/>
+              <w:left w:type="dxa" w:w="90"/>
+              <w:bottom w:type="dxa" w:w="60"/>
+              <w:right w:type="dxa" w:w="90"/>
+            </w:tcMar>
+          </w:tcPr>
+          <w:p>
+            <w:pPr>
+              <w:keepNext/>
+              <w:jc w:val="left"/>
+            </w:pPr>
+            <w:r>
+              <w:rPr>
+                <w:rFonts w:ascii="Calibri" w:cs="Calibri" w:eastAsia="Calibri" w:hAnsi="Calibri"/>
+                <w:b w:val="false"/>
+                <w:bCs w:val="false"/>
+                <w:color w:val="000000"/>
+                <w:sz w:val="18"/>
+                <w:szCs w:val="18"/>
+              </w:rPr>
             </w:r>
           </w:p>
         </w:tc>
@@ -7197,8 +7111,7 @@
         </w:trPr>
         <w:tc>
           <w:tcPr>
-            <w:tcW w:type="dxa" w:w="1400"/>
-            <w:shd w:fill="F5F7FA" w:color="auto" w:val="clear"/>
+            <w:tcW w:type="dxa" w:w="1200"/>
             <w:tcMar>
               <w:top w:type="dxa" w:w="60"/>
               <w:left w:type="dxa" w:w="90"/>
@@ -7220,14 +7133,13 @@
                 <w:sz w:val="17"/>
                 <w:szCs w:val="17"/>
               </w:rPr>
-              <w:t xml:space="preserve">355292</w:t>
-            </w:r>
-          </w:p>
-        </w:tc>
-        <w:tc>
-          <w:tcPr>
-            <w:tcW w:type="dxa" w:w="7200"/>
-            <w:shd w:fill="F5F7FA" w:color="auto" w:val="clear"/>
+              <w:t>355292</w:t>
+            </w:r>
+          </w:p>
+        </w:tc>
+        <w:tc>
+          <w:tcPr>
+            <w:tcW w:type="dxa" w:w="3800"/>
             <w:tcMar>
               <w:top w:type="dxa" w:w="60"/>
               <w:left w:type="dxa" w:w="90"/>
@@ -7249,14 +7161,13 @@
                 <w:sz w:val="17"/>
                 <w:szCs w:val="17"/>
               </w:rPr>
-              <w:t xml:space="preserve">Medium Breakfast Coffee Pack 2.5oz, Case Of 100</w:t>
-            </w:r>
-          </w:p>
-        </w:tc>
-        <w:tc>
-          <w:tcPr>
-            <w:tcW w:type="dxa" w:w="900"/>
-            <w:shd w:fill="F5F7FA" w:color="auto" w:val="clear"/>
+              <w:t>Medium Breakfast Coffee Pack 2.5oz, Case Of 100</w:t>
+            </w:r>
+          </w:p>
+        </w:tc>
+        <w:tc>
+          <w:tcPr>
+            <w:tcW w:type="dxa" w:w="3800"/>
             <w:tcMar>
               <w:top w:type="dxa" w:w="60"/>
               <w:left w:type="dxa" w:w="90"/>
@@ -7275,17 +7186,16 @@
                 <w:b w:val="false"/>
                 <w:bCs w:val="false"/>
                 <w:color w:val="000000"/>
-                <w:sz w:val="18"/>
-                <w:szCs w:val="18"/>
-              </w:rPr>
-              <w:t xml:space="preserve"/>
-            </w:r>
-          </w:p>
-        </w:tc>
-        <w:tc>
-          <w:tcPr>
-            <w:tcW w:type="dxa" w:w="900"/>
-            <w:shd w:fill="F5F7FA" w:color="auto" w:val="clear"/>
+                <w:sz w:val="17"/>
+                <w:szCs w:val="17"/>
+              </w:rPr>
+              <w:t>Paquete de café tostado medio 2.5 oz, caja de 100</w:t>
+            </w:r>
+          </w:p>
+        </w:tc>
+        <w:tc>
+          <w:tcPr>
+            <w:tcW w:type="dxa" w:w="800"/>
             <w:tcMar>
               <w:top w:type="dxa" w:w="60"/>
               <w:left w:type="dxa" w:w="90"/>
@@ -7307,7 +7217,33 @@
                 <w:sz w:val="18"/>
                 <w:szCs w:val="18"/>
               </w:rPr>
-              <w:t xml:space="preserve"/>
+            </w:r>
+          </w:p>
+        </w:tc>
+        <w:tc>
+          <w:tcPr>
+            <w:tcW w:type="dxa" w:w="800"/>
+            <w:tcMar>
+              <w:top w:type="dxa" w:w="60"/>
+              <w:left w:type="dxa" w:w="90"/>
+              <w:bottom w:type="dxa" w:w="60"/>
+              <w:right w:type="dxa" w:w="90"/>
+            </w:tcMar>
+          </w:tcPr>
+          <w:p>
+            <w:pPr>
+              <w:keepNext/>
+              <w:jc w:val="left"/>
+            </w:pPr>
+            <w:r>
+              <w:rPr>
+                <w:rFonts w:ascii="Calibri" w:cs="Calibri" w:eastAsia="Calibri" w:hAnsi="Calibri"/>
+                <w:b w:val="false"/>
+                <w:bCs w:val="false"/>
+                <w:color w:val="000000"/>
+                <w:sz w:val="18"/>
+                <w:szCs w:val="18"/>
+              </w:rPr>
             </w:r>
           </w:p>
         </w:tc>
@@ -7318,8 +7254,7 @@
         </w:trPr>
         <w:tc>
           <w:tcPr>
-            <w:tcW w:type="dxa" w:w="1400"/>
-            <w:shd w:fill="F5F7FA" w:color="auto" w:val="clear"/>
+            <w:tcW w:type="dxa" w:w="1200"/>
             <w:tcMar>
               <w:top w:type="dxa" w:w="60"/>
               <w:left w:type="dxa" w:w="90"/>
@@ -7341,14 +7276,13 @@
                 <w:sz w:val="17"/>
                 <w:szCs w:val="17"/>
               </w:rPr>
-              <w:t xml:space="preserve">206621</w:t>
-            </w:r>
-          </w:p>
-        </w:tc>
-        <w:tc>
-          <w:tcPr>
-            <w:tcW w:type="dxa" w:w="7200"/>
-            <w:shd w:fill="F5F7FA" w:color="auto" w:val="clear"/>
+              <w:t>208267</w:t>
+            </w:r>
+          </w:p>
+        </w:tc>
+        <w:tc>
+          <w:tcPr>
+            <w:tcW w:type="dxa" w:w="3800"/>
             <w:tcMar>
               <w:top w:type="dxa" w:w="60"/>
               <w:left w:type="dxa" w:w="90"/>
@@ -7370,14 +7304,13 @@
                 <w:sz w:val="17"/>
                 <w:szCs w:val="17"/>
               </w:rPr>
-              <w:t xml:space="preserve">Linen Card 4 X 9, Case Of 100</w:t>
-            </w:r>
-          </w:p>
-        </w:tc>
-        <w:tc>
-          <w:tcPr>
-            <w:tcW w:type="dxa" w:w="900"/>
-            <w:shd w:fill="F5F7FA" w:color="auto" w:val="clear"/>
+              <w:t>Unwrapped 9 Oz Plastic Cup, Case Of 2500</w:t>
+            </w:r>
+          </w:p>
+        </w:tc>
+        <w:tc>
+          <w:tcPr>
+            <w:tcW w:type="dxa" w:w="3800"/>
             <w:tcMar>
               <w:top w:type="dxa" w:w="60"/>
               <w:left w:type="dxa" w:w="90"/>
@@ -7396,17 +7329,16 @@
                 <w:b w:val="false"/>
                 <w:bCs w:val="false"/>
                 <w:color w:val="000000"/>
-                <w:sz w:val="18"/>
-                <w:szCs w:val="18"/>
-              </w:rPr>
-              <w:t xml:space="preserve"/>
-            </w:r>
-          </w:p>
-        </w:tc>
-        <w:tc>
-          <w:tcPr>
-            <w:tcW w:type="dxa" w:w="900"/>
-            <w:shd w:fill="F5F7FA" w:color="auto" w:val="clear"/>
+                <w:sz w:val="17"/>
+                <w:szCs w:val="17"/>
+              </w:rPr>
+              <w:t>Vaso plástico sin envoltura 9 oz, caja de 2500</w:t>
+            </w:r>
+          </w:p>
+        </w:tc>
+        <w:tc>
+          <w:tcPr>
+            <w:tcW w:type="dxa" w:w="800"/>
             <w:tcMar>
               <w:top w:type="dxa" w:w="60"/>
               <w:left w:type="dxa" w:w="90"/>
@@ -7428,7 +7360,33 @@
                 <w:sz w:val="18"/>
                 <w:szCs w:val="18"/>
               </w:rPr>
-              <w:t xml:space="preserve"/>
+            </w:r>
+          </w:p>
+        </w:tc>
+        <w:tc>
+          <w:tcPr>
+            <w:tcW w:type="dxa" w:w="800"/>
+            <w:tcMar>
+              <w:top w:type="dxa" w:w="60"/>
+              <w:left w:type="dxa" w:w="90"/>
+              <w:bottom w:type="dxa" w:w="60"/>
+              <w:right w:type="dxa" w:w="90"/>
+            </w:tcMar>
+          </w:tcPr>
+          <w:p>
+            <w:pPr>
+              <w:keepNext/>
+              <w:jc w:val="left"/>
+            </w:pPr>
+            <w:r>
+              <w:rPr>
+                <w:rFonts w:ascii="Calibri" w:cs="Calibri" w:eastAsia="Calibri" w:hAnsi="Calibri"/>
+                <w:b w:val="false"/>
+                <w:bCs w:val="false"/>
+                <w:color w:val="000000"/>
+                <w:sz w:val="18"/>
+                <w:szCs w:val="18"/>
+              </w:rPr>
             </w:r>
           </w:p>
         </w:tc>
@@ -7439,7 +7397,7 @@
         </w:trPr>
         <w:tc>
           <w:tcPr>
-            <w:tcW w:type="dxa" w:w="1400"/>
+            <w:tcW w:type="dxa" w:w="1200"/>
             <w:tcMar>
               <w:top w:type="dxa" w:w="60"/>
               <w:left w:type="dxa" w:w="90"/>
@@ -7461,13 +7419,13 @@
                 <w:sz w:val="17"/>
                 <w:szCs w:val="17"/>
               </w:rPr>
-              <w:t xml:space="preserve">206822</w:t>
-            </w:r>
-          </w:p>
-        </w:tc>
-        <w:tc>
-          <w:tcPr>
-            <w:tcW w:type="dxa" w:w="7200"/>
+              <w:t>497380</w:t>
+            </w:r>
+          </w:p>
+        </w:tc>
+        <w:tc>
+          <w:tcPr>
+            <w:tcW w:type="dxa" w:w="3800"/>
             <w:tcMar>
               <w:top w:type="dxa" w:w="60"/>
               <w:left w:type="dxa" w:w="90"/>
@@ -7489,13 +7447,13 @@
                 <w:sz w:val="17"/>
                 <w:szCs w:val="17"/>
               </w:rPr>
-              <w:t xml:space="preserve">Towel Hanger Card 4 X 10, Case Of 100</w:t>
-            </w:r>
-          </w:p>
-        </w:tc>
-        <w:tc>
-          <w:tcPr>
-            <w:tcW w:type="dxa" w:w="900"/>
+              <w:t>Coffee-Mate Original Mini Cup Liquid Coffee Creamer, 360-Pack</w:t>
+            </w:r>
+          </w:p>
+        </w:tc>
+        <w:tc>
+          <w:tcPr>
+            <w:tcW w:type="dxa" w:w="3800"/>
             <w:tcMar>
               <w:top w:type="dxa" w:w="60"/>
               <w:left w:type="dxa" w:w="90"/>
@@ -7514,16 +7472,16 @@
                 <w:b w:val="false"/>
                 <w:bCs w:val="false"/>
                 <w:color w:val="000000"/>
-                <w:sz w:val="18"/>
-                <w:szCs w:val="18"/>
-              </w:rPr>
-              <w:t xml:space="preserve"/>
-            </w:r>
-          </w:p>
-        </w:tc>
-        <w:tc>
-          <w:tcPr>
-            <w:tcW w:type="dxa" w:w="900"/>
+                <w:sz w:val="17"/>
+                <w:szCs w:val="17"/>
+              </w:rPr>
+              <w:t>Crema líquida Coffee-Mate original en vasitos, paquete de 360</w:t>
+            </w:r>
+          </w:p>
+        </w:tc>
+        <w:tc>
+          <w:tcPr>
+            <w:tcW w:type="dxa" w:w="800"/>
             <w:tcMar>
               <w:top w:type="dxa" w:w="60"/>
               <w:left w:type="dxa" w:w="90"/>
@@ -7545,7 +7503,33 @@
                 <w:sz w:val="18"/>
                 <w:szCs w:val="18"/>
               </w:rPr>
-              <w:t xml:space="preserve"/>
+            </w:r>
+          </w:p>
+        </w:tc>
+        <w:tc>
+          <w:tcPr>
+            <w:tcW w:type="dxa" w:w="800"/>
+            <w:tcMar>
+              <w:top w:type="dxa" w:w="60"/>
+              <w:left w:type="dxa" w:w="90"/>
+              <w:bottom w:type="dxa" w:w="60"/>
+              <w:right w:type="dxa" w:w="90"/>
+            </w:tcMar>
+          </w:tcPr>
+          <w:p>
+            <w:pPr>
+              <w:keepNext/>
+              <w:jc w:val="left"/>
+            </w:pPr>
+            <w:r>
+              <w:rPr>
+                <w:rFonts w:ascii="Calibri" w:cs="Calibri" w:eastAsia="Calibri" w:hAnsi="Calibri"/>
+                <w:b w:val="false"/>
+                <w:bCs w:val="false"/>
+                <w:color w:val="000000"/>
+                <w:sz w:val="18"/>
+                <w:szCs w:val="18"/>
+              </w:rPr>
             </w:r>
           </w:p>
         </w:tc>
@@ -7556,7 +7540,201 @@
         </w:trPr>
         <w:tc>
           <w:tcPr>
-            <w:tcW w:type="dxa" w:w="1400"/>
+            <w:tcW w:type="dxa" w:w="1200"/>
+            <w:tcMar>
+              <w:top w:type="dxa" w:w="60"/>
+              <w:left w:type="dxa" w:w="90"/>
+              <w:bottom w:type="dxa" w:w="60"/>
+              <w:right w:type="dxa" w:w="90"/>
+            </w:tcMar>
+          </w:tcPr>
+          <w:p>
+            <w:pPr>
+              <w:jc w:val="left"/>
+            </w:pPr>
+            <w:r>
+              <w:rPr>
+                <w:rFonts w:ascii="Calibri" w:cs="Calibri" w:eastAsia="Calibri" w:hAnsi="Calibri"/>
+                <w:b w:val="false"/>
+                <w:bCs w:val="false"/>
+                <w:color w:val="000000"/>
+                <w:sz w:val="17"/>
+                <w:szCs w:val="17"/>
+              </w:rPr>
+              <w:t>759558</w:t>
+            </w:r>
+          </w:p>
+        </w:tc>
+        <w:tc>
+          <w:tcPr>
+            <w:tcW w:type="dxa" w:w="3800"/>
+            <w:tcMar>
+              <w:top w:type="dxa" w:w="60"/>
+              <w:left w:type="dxa" w:w="90"/>
+              <w:bottom w:type="dxa" w:w="60"/>
+              <w:right w:type="dxa" w:w="90"/>
+            </w:tcMar>
+          </w:tcPr>
+          <w:p>
+            <w:pPr>
+              <w:jc w:val="left"/>
+            </w:pPr>
+            <w:r>
+              <w:rPr>
+                <w:rFonts w:ascii="Calibri" w:cs="Calibri" w:eastAsia="Calibri" w:hAnsi="Calibri"/>
+                <w:b w:val="false"/>
+                <w:bCs w:val="false"/>
+                <w:color w:val="000000"/>
+                <w:sz w:val="17"/>
+                <w:szCs w:val="17"/>
+              </w:rPr>
+              <w:t>Coffee-Mate French Vanilla Mini Cup Liquid Creamer, Case Of 180</w:t>
+            </w:r>
+          </w:p>
+        </w:tc>
+        <w:tc>
+          <w:tcPr>
+            <w:tcW w:type="dxa" w:w="3800"/>
+            <w:tcMar>
+              <w:top w:type="dxa" w:w="60"/>
+              <w:left w:type="dxa" w:w="90"/>
+              <w:bottom w:type="dxa" w:w="60"/>
+              <w:right w:type="dxa" w:w="90"/>
+            </w:tcMar>
+          </w:tcPr>
+          <w:p>
+            <w:pPr>
+              <w:jc w:val="left"/>
+            </w:pPr>
+            <w:r>
+              <w:rPr>
+                <w:rFonts w:ascii="Calibri" w:cs="Calibri" w:eastAsia="Calibri" w:hAnsi="Calibri"/>
+                <w:b w:val="false"/>
+                <w:bCs w:val="false"/>
+                <w:color w:val="000000"/>
+                <w:sz w:val="17"/>
+                <w:szCs w:val="17"/>
+              </w:rPr>
+              <w:t>Crema líquida Coffee-Mate vainilla francesa en vasitos, caja de 180</w:t>
+            </w:r>
+          </w:p>
+        </w:tc>
+        <w:tc>
+          <w:tcPr>
+            <w:tcW w:type="dxa" w:w="800"/>
+            <w:tcMar>
+              <w:top w:type="dxa" w:w="60"/>
+              <w:left w:type="dxa" w:w="90"/>
+              <w:bottom w:type="dxa" w:w="60"/>
+              <w:right w:type="dxa" w:w="90"/>
+            </w:tcMar>
+          </w:tcPr>
+          <w:p>
+            <w:pPr>
+              <w:jc w:val="left"/>
+            </w:pPr>
+            <w:r>
+              <w:rPr>
+                <w:rFonts w:ascii="Calibri" w:cs="Calibri" w:eastAsia="Calibri" w:hAnsi="Calibri"/>
+                <w:b w:val="false"/>
+                <w:bCs w:val="false"/>
+                <w:color w:val="000000"/>
+                <w:sz w:val="18"/>
+                <w:szCs w:val="18"/>
+              </w:rPr>
+            </w:r>
+          </w:p>
+        </w:tc>
+        <w:tc>
+          <w:tcPr>
+            <w:tcW w:type="dxa" w:w="800"/>
+            <w:tcMar>
+              <w:top w:type="dxa" w:w="60"/>
+              <w:left w:type="dxa" w:w="90"/>
+              <w:bottom w:type="dxa" w:w="60"/>
+              <w:right w:type="dxa" w:w="90"/>
+            </w:tcMar>
+          </w:tcPr>
+          <w:p>
+            <w:pPr>
+              <w:jc w:val="left"/>
+            </w:pPr>
+            <w:r>
+              <w:rPr>
+                <w:rFonts w:ascii="Calibri" w:cs="Calibri" w:eastAsia="Calibri" w:hAnsi="Calibri"/>
+                <w:b w:val="false"/>
+                <w:bCs w:val="false"/>
+                <w:color w:val="000000"/>
+                <w:sz w:val="18"/>
+                <w:szCs w:val="18"/>
+              </w:rPr>
+            </w:r>
+          </w:p>
+        </w:tc>
+      </w:tr>
+    </w:tbl>
+    <w:p>
+      <w:pPr>
+        <w:keepNext/>
+        <w:spacing w:after="60" w:before="280"/>
+      </w:pPr>
+      <w:r>
+        <w:rPr>
+          <w:rFonts w:ascii="Calibri" w:cs="Calibri" w:eastAsia="Calibri" w:hAnsi="Calibri"/>
+          <w:b/>
+          <w:bCs/>
+          <w:color w:val="2E6B4F"/>
+          <w:sz w:val="24"/>
+          <w:szCs w:val="24"/>
+        </w:rPr>
+        <w:t xml:space="preserve">BRANDING   /   Marca</w:t>
+      </w:r>
+    </w:p>
+    <w:p>
+      <w:pPr>
+        <w:keepNext/>
+        <w:spacing w:after="120"/>
+      </w:pPr>
+      <w:r>
+        <w:rPr>
+          <w:rFonts w:ascii="Calibri" w:cs="Calibri" w:eastAsia="Calibri" w:hAnsi="Calibri"/>
+          <w:i/>
+          <w:iCs/>
+          <w:color w:val="555555"/>
+          <w:sz w:val="19"/>
+          <w:szCs w:val="19"/>
+        </w:rPr>
+        <w:t xml:space="preserve">Printed guest-room cards and door signs.  /  Tarjetas impresas y letreros para la puerta.</w:t>
+      </w:r>
+    </w:p>
+    <w:tbl>
+      <w:tblPr>
+        <w:tblW w:type="dxa" w:w="10400"/>
+        <w:tblBorders>
+          <w:top w:val="single" w:color="auto" w:sz="4"/>
+          <w:left w:val="single" w:color="auto" w:sz="4"/>
+          <w:bottom w:val="single" w:color="auto" w:sz="4"/>
+          <w:right w:val="single" w:color="auto" w:sz="4"/>
+          <w:insideH w:val="single" w:color="auto" w:sz="4"/>
+          <w:insideV w:val="single" w:color="auto" w:sz="4"/>
+        </w:tblBorders>
+      </w:tblPr>
+      <w:tblGrid>
+        <w:gridCol w:w="1200"/>
+        <w:gridCol w:w="3800"/>
+        <w:gridCol w:w="3800"/>
+        <w:gridCol w:w="800"/>
+        <w:gridCol w:w="800"/>
+      </w:tblGrid>
+      <w:tr>
+        <w:trPr>
+          <w:cantSplit/>
+          <w:tblHeader/>
+        </w:trPr>
+        <w:tc>
+          <w:tcPr>
+            <w:tcW w:type="dxa" w:w="1200"/>
+            <w:shd w:fill="1F3A5F" w:color="auto" w:val="clear"/>
             <w:tcMar>
               <w:top w:type="dxa" w:w="60"/>
               <w:left w:type="dxa" w:w="90"/>
@@ -7572,19 +7750,20 @@
             <w:r>
               <w:rPr>
                 <w:rFonts w:ascii="Calibri" w:cs="Calibri" w:eastAsia="Calibri" w:hAnsi="Calibri"/>
-                <w:b w:val="false"/>
-                <w:bCs w:val="false"/>
-                <w:color w:val="000000"/>
-                <w:sz w:val="17"/>
-                <w:szCs w:val="17"/>
-              </w:rPr>
-              <w:t>208267</w:t>
-            </w:r>
-          </w:p>
-        </w:tc>
-        <w:tc>
-          <w:tcPr>
-            <w:tcW w:type="dxa" w:w="7200"/>
+                <w:b/>
+                <w:bCs/>
+                <w:color w:val="FFFFFF"/>
+                <w:sz w:val="18"/>
+                <w:szCs w:val="18"/>
+              </w:rPr>
+              <w:t>Part #</w:t>
+            </w:r>
+          </w:p>
+        </w:tc>
+        <w:tc>
+          <w:tcPr>
+            <w:tcW w:type="dxa" w:w="3800"/>
+            <w:shd w:fill="1F3A5F" w:color="auto" w:val="clear"/>
             <w:tcMar>
               <w:top w:type="dxa" w:w="60"/>
               <w:left w:type="dxa" w:w="90"/>
@@ -7600,19 +7779,20 @@
             <w:r>
               <w:rPr>
                 <w:rFonts w:ascii="Calibri" w:cs="Calibri" w:eastAsia="Calibri" w:hAnsi="Calibri"/>
-                <w:b w:val="false"/>
-                <w:bCs w:val="false"/>
-                <w:color w:val="000000"/>
-                <w:sz w:val="17"/>
-                <w:szCs w:val="17"/>
-              </w:rPr>
-              <w:t>Unwrapped 9 Oz Plastic Cup, Case Of 2500</w:t>
-            </w:r>
-          </w:p>
-        </w:tc>
-        <w:tc>
-          <w:tcPr>
-            <w:tcW w:type="dxa" w:w="900"/>
+                <w:b/>
+                <w:bCs/>
+                <w:color w:val="FFFFFF"/>
+                <w:sz w:val="18"/>
+                <w:szCs w:val="18"/>
+              </w:rPr>
+              <w:t>Item (English)</w:t>
+            </w:r>
+          </w:p>
+        </w:tc>
+        <w:tc>
+          <w:tcPr>
+            <w:tcW w:type="dxa" w:w="3800"/>
+            <w:shd w:fill="1F3A5F" w:color="auto" w:val="clear"/>
             <w:tcMar>
               <w:top w:type="dxa" w:w="60"/>
               <w:left w:type="dxa" w:w="90"/>
@@ -7628,18 +7808,20 @@
             <w:r>
               <w:rPr>
                 <w:rFonts w:ascii="Calibri" w:cs="Calibri" w:eastAsia="Calibri" w:hAnsi="Calibri"/>
-                <w:b w:val="false"/>
-                <w:bCs w:val="false"/>
-                <w:color w:val="000000"/>
-                <w:sz w:val="18"/>
-                <w:szCs w:val="18"/>
-              </w:rPr>
-            </w:r>
-          </w:p>
-        </w:tc>
-        <w:tc>
-          <w:tcPr>
-            <w:tcW w:type="dxa" w:w="900"/>
+                <w:b/>
+                <w:bCs/>
+                <w:color w:val="FFFFFF"/>
+                <w:sz w:val="18"/>
+                <w:szCs w:val="18"/>
+              </w:rPr>
+              <w:t>Artículo (Español)</w:t>
+            </w:r>
+          </w:p>
+        </w:tc>
+        <w:tc>
+          <w:tcPr>
+            <w:tcW w:type="dxa" w:w="800"/>
+            <w:shd w:fill="1F3A5F" w:color="auto" w:val="clear"/>
             <w:tcMar>
               <w:top w:type="dxa" w:w="60"/>
               <w:left w:type="dxa" w:w="90"/>
@@ -7650,17 +7832,47 @@
           <w:p>
             <w:pPr>
               <w:keepNext/>
-              <w:jc w:val="left"/>
-            </w:pPr>
-            <w:r>
-              <w:rPr>
-                <w:rFonts w:ascii="Calibri" w:cs="Calibri" w:eastAsia="Calibri" w:hAnsi="Calibri"/>
-                <w:b w:val="false"/>
-                <w:bCs w:val="false"/>
-                <w:color w:val="000000"/>
-                <w:sz w:val="18"/>
-                <w:szCs w:val="18"/>
-              </w:rPr>
+              <w:jc w:val="center"/>
+            </w:pPr>
+            <w:r>
+              <w:rPr>
+                <w:rFonts w:ascii="Calibri" w:cs="Calibri" w:eastAsia="Calibri" w:hAnsi="Calibri"/>
+                <w:b/>
+                <w:bCs/>
+                <w:color w:val="FFFFFF"/>
+                <w:sz w:val="18"/>
+                <w:szCs w:val="18"/>
+              </w:rPr>
+              <w:t>Par</w:t>
+            </w:r>
+          </w:p>
+        </w:tc>
+        <w:tc>
+          <w:tcPr>
+            <w:tcW w:type="dxa" w:w="800"/>
+            <w:shd w:fill="1F3A5F" w:color="auto" w:val="clear"/>
+            <w:tcMar>
+              <w:top w:type="dxa" w:w="60"/>
+              <w:left w:type="dxa" w:w="90"/>
+              <w:bottom w:type="dxa" w:w="60"/>
+              <w:right w:type="dxa" w:w="90"/>
+            </w:tcMar>
+          </w:tcPr>
+          <w:p>
+            <w:pPr>
+              <w:keepNext/>
+              <w:jc w:val="center"/>
+            </w:pPr>
+            <w:r>
+              <w:rPr>
+                <w:rFonts w:ascii="Calibri" w:cs="Calibri" w:eastAsia="Calibri" w:hAnsi="Calibri"/>
+                <w:b/>
+                <w:bCs/>
+                <w:color w:val="FFFFFF"/>
+                <w:sz w:val="18"/>
+                <w:szCs w:val="18"/>
+              </w:rPr>
+              <w:t>Tiene</w:t>
             </w:r>
           </w:p>
         </w:tc>
@@ -7671,7 +7883,7 @@
         </w:trPr>
         <w:tc>
           <w:tcPr>
-            <w:tcW w:type="dxa" w:w="1400"/>
+            <w:tcW w:type="dxa" w:w="1200"/>
             <w:tcMar>
               <w:top w:type="dxa" w:w="60"/>
               <w:left w:type="dxa" w:w="90"/>
@@ -7693,13 +7905,13 @@
                 <w:sz w:val="17"/>
                 <w:szCs w:val="17"/>
               </w:rPr>
-              <w:t>497380</w:t>
-            </w:r>
-          </w:p>
-        </w:tc>
-        <w:tc>
-          <w:tcPr>
-            <w:tcW w:type="dxa" w:w="7200"/>
+              <w:t>206621</w:t>
+            </w:r>
+          </w:p>
+        </w:tc>
+        <w:tc>
+          <w:tcPr>
+            <w:tcW w:type="dxa" w:w="3800"/>
             <w:tcMar>
               <w:top w:type="dxa" w:w="60"/>
               <w:left w:type="dxa" w:w="90"/>
@@ -7721,13 +7933,13 @@
                 <w:sz w:val="17"/>
                 <w:szCs w:val="17"/>
               </w:rPr>
-              <w:t>Coffee-Mate Original Mini Cup Liquid Coffee Creamer, 360-Pack</w:t>
-            </w:r>
-          </w:p>
-        </w:tc>
-        <w:tc>
-          <w:tcPr>
-            <w:tcW w:type="dxa" w:w="900"/>
+              <w:t>Linen Card 4 X 9, Case Of 100</w:t>
+            </w:r>
+          </w:p>
+        </w:tc>
+        <w:tc>
+          <w:tcPr>
+            <w:tcW w:type="dxa" w:w="3800"/>
             <w:tcMar>
               <w:top w:type="dxa" w:w="60"/>
               <w:left w:type="dxa" w:w="90"/>
@@ -7746,15 +7958,43 @@
                 <w:b w:val="false"/>
                 <w:bCs w:val="false"/>
                 <w:color w:val="000000"/>
-                <w:sz w:val="18"/>
-                <w:szCs w:val="18"/>
-              </w:rPr>
-            </w:r>
-          </w:p>
-        </w:tc>
-        <w:tc>
-          <w:tcPr>
-            <w:tcW w:type="dxa" w:w="900"/>
+                <w:sz w:val="17"/>
+                <w:szCs w:val="17"/>
+              </w:rPr>
+              <w:t>Tarjeta de cambio de sábanas 4 x 9, caja de 100</w:t>
+            </w:r>
+          </w:p>
+        </w:tc>
+        <w:tc>
+          <w:tcPr>
+            <w:tcW w:type="dxa" w:w="800"/>
+            <w:tcMar>
+              <w:top w:type="dxa" w:w="60"/>
+              <w:left w:type="dxa" w:w="90"/>
+              <w:bottom w:type="dxa" w:w="60"/>
+              <w:right w:type="dxa" w:w="90"/>
+            </w:tcMar>
+          </w:tcPr>
+          <w:p>
+            <w:pPr>
+              <w:keepNext/>
+              <w:jc w:val="left"/>
+            </w:pPr>
+            <w:r>
+              <w:rPr>
+                <w:rFonts w:ascii="Calibri" w:cs="Calibri" w:eastAsia="Calibri" w:hAnsi="Calibri"/>
+                <w:b w:val="false"/>
+                <w:bCs w:val="false"/>
+                <w:color w:val="000000"/>
+                <w:sz w:val="18"/>
+                <w:szCs w:val="18"/>
+              </w:rPr>
+            </w:r>
+          </w:p>
+        </w:tc>
+        <w:tc>
+          <w:tcPr>
+            <w:tcW w:type="dxa" w:w="800"/>
             <w:tcMar>
               <w:top w:type="dxa" w:w="60"/>
               <w:left w:type="dxa" w:w="90"/>
@@ -7786,87 +8026,398 @@
         </w:trPr>
         <w:tc>
           <w:tcPr>
-            <w:tcW w:type="dxa" w:w="1400"/>
-            <w:tcMar>
-              <w:top w:type="dxa" w:w="60"/>
-              <w:left w:type="dxa" w:w="90"/>
-              <w:bottom w:type="dxa" w:w="60"/>
-              <w:right w:type="dxa" w:w="90"/>
-            </w:tcMar>
-          </w:tcPr>
-          <w:p>
-            <w:pPr>
-              <w:jc w:val="left"/>
-            </w:pPr>
-            <w:r>
-              <w:rPr>
-                <w:rFonts w:ascii="Calibri" w:cs="Calibri" w:eastAsia="Calibri" w:hAnsi="Calibri"/>
-                <w:b w:val="false"/>
-                <w:bCs w:val="false"/>
-                <w:color w:val="000000"/>
-                <w:sz w:val="17"/>
-                <w:szCs w:val="17"/>
-              </w:rPr>
-              <w:t>759558</w:t>
-            </w:r>
-          </w:p>
-        </w:tc>
-        <w:tc>
-          <w:tcPr>
-            <w:tcW w:type="dxa" w:w="7200"/>
-            <w:tcMar>
-              <w:top w:type="dxa" w:w="60"/>
-              <w:left w:type="dxa" w:w="90"/>
-              <w:bottom w:type="dxa" w:w="60"/>
-              <w:right w:type="dxa" w:w="90"/>
-            </w:tcMar>
-          </w:tcPr>
-          <w:p>
-            <w:pPr>
-              <w:jc w:val="left"/>
-            </w:pPr>
-            <w:r>
-              <w:rPr>
-                <w:rFonts w:ascii="Calibri" w:cs="Calibri" w:eastAsia="Calibri" w:hAnsi="Calibri"/>
-                <w:b w:val="false"/>
-                <w:bCs w:val="false"/>
-                <w:color w:val="000000"/>
-                <w:sz w:val="17"/>
-                <w:szCs w:val="17"/>
-              </w:rPr>
-              <w:t>Coffee-Mate French Vanilla Mini Cup Liquid Creamer, Case Of 180</w:t>
-            </w:r>
-          </w:p>
-        </w:tc>
-        <w:tc>
-          <w:tcPr>
-            <w:tcW w:type="dxa" w:w="900"/>
-            <w:tcMar>
-              <w:top w:type="dxa" w:w="60"/>
-              <w:left w:type="dxa" w:w="90"/>
-              <w:bottom w:type="dxa" w:w="60"/>
-              <w:right w:type="dxa" w:w="90"/>
-            </w:tcMar>
-          </w:tcPr>
-          <w:p>
-            <w:pPr>
-              <w:jc w:val="left"/>
-            </w:pPr>
-            <w:r>
-              <w:rPr>
-                <w:rFonts w:ascii="Calibri" w:cs="Calibri" w:eastAsia="Calibri" w:hAnsi="Calibri"/>
-                <w:b w:val="false"/>
-                <w:bCs w:val="false"/>
-                <w:color w:val="000000"/>
-                <w:sz w:val="18"/>
-                <w:szCs w:val="18"/>
-              </w:rPr>
-            </w:r>
-          </w:p>
-        </w:tc>
-        <w:tc>
-          <w:tcPr>
-            <w:tcW w:type="dxa" w:w="900"/>
+            <w:tcW w:type="dxa" w:w="1200"/>
+            <w:tcMar>
+              <w:top w:type="dxa" w:w="60"/>
+              <w:left w:type="dxa" w:w="90"/>
+              <w:bottom w:type="dxa" w:w="60"/>
+              <w:right w:type="dxa" w:w="90"/>
+            </w:tcMar>
+          </w:tcPr>
+          <w:p>
+            <w:pPr>
+              <w:keepNext/>
+              <w:jc w:val="left"/>
+            </w:pPr>
+            <w:r>
+              <w:rPr>
+                <w:rFonts w:ascii="Calibri" w:cs="Calibri" w:eastAsia="Calibri" w:hAnsi="Calibri"/>
+                <w:b w:val="false"/>
+                <w:bCs w:val="false"/>
+                <w:color w:val="000000"/>
+                <w:sz w:val="17"/>
+                <w:szCs w:val="17"/>
+              </w:rPr>
+              <w:t>206822</w:t>
+            </w:r>
+          </w:p>
+        </w:tc>
+        <w:tc>
+          <w:tcPr>
+            <w:tcW w:type="dxa" w:w="3800"/>
+            <w:tcMar>
+              <w:top w:type="dxa" w:w="60"/>
+              <w:left w:type="dxa" w:w="90"/>
+              <w:bottom w:type="dxa" w:w="60"/>
+              <w:right w:type="dxa" w:w="90"/>
+            </w:tcMar>
+          </w:tcPr>
+          <w:p>
+            <w:pPr>
+              <w:keepNext/>
+              <w:jc w:val="left"/>
+            </w:pPr>
+            <w:r>
+              <w:rPr>
+                <w:rFonts w:ascii="Calibri" w:cs="Calibri" w:eastAsia="Calibri" w:hAnsi="Calibri"/>
+                <w:b w:val="false"/>
+                <w:bCs w:val="false"/>
+                <w:color w:val="000000"/>
+                <w:sz w:val="17"/>
+                <w:szCs w:val="17"/>
+              </w:rPr>
+              <w:t>Towel Hanger Card 4 X 10, Case Of 100</w:t>
+            </w:r>
+          </w:p>
+        </w:tc>
+        <w:tc>
+          <w:tcPr>
+            <w:tcW w:type="dxa" w:w="3800"/>
+            <w:tcMar>
+              <w:top w:type="dxa" w:w="60"/>
+              <w:left w:type="dxa" w:w="90"/>
+              <w:bottom w:type="dxa" w:w="60"/>
+              <w:right w:type="dxa" w:w="90"/>
+            </w:tcMar>
+          </w:tcPr>
+          <w:p>
+            <w:pPr>
+              <w:keepNext/>
+              <w:jc w:val="left"/>
+            </w:pPr>
+            <w:r>
+              <w:rPr>
+                <w:rFonts w:ascii="Calibri" w:cs="Calibri" w:eastAsia="Calibri" w:hAnsi="Calibri"/>
+                <w:b w:val="false"/>
+                <w:bCs w:val="false"/>
+                <w:color w:val="000000"/>
+                <w:sz w:val="17"/>
+                <w:szCs w:val="17"/>
+              </w:rPr>
+              <w:t>Tarjeta para colgar las toallas 4 x 10, caja de 100</w:t>
+            </w:r>
+          </w:p>
+        </w:tc>
+        <w:tc>
+          <w:tcPr>
+            <w:tcW w:type="dxa" w:w="800"/>
+            <w:tcMar>
+              <w:top w:type="dxa" w:w="60"/>
+              <w:left w:type="dxa" w:w="90"/>
+              <w:bottom w:type="dxa" w:w="60"/>
+              <w:right w:type="dxa" w:w="90"/>
+            </w:tcMar>
+          </w:tcPr>
+          <w:p>
+            <w:pPr>
+              <w:keepNext/>
+              <w:jc w:val="left"/>
+            </w:pPr>
+            <w:r>
+              <w:rPr>
+                <w:rFonts w:ascii="Calibri" w:cs="Calibri" w:eastAsia="Calibri" w:hAnsi="Calibri"/>
+                <w:b w:val="false"/>
+                <w:bCs w:val="false"/>
+                <w:color w:val="000000"/>
+                <w:sz w:val="18"/>
+                <w:szCs w:val="18"/>
+              </w:rPr>
+            </w:r>
+          </w:p>
+        </w:tc>
+        <w:tc>
+          <w:tcPr>
+            <w:tcW w:type="dxa" w:w="800"/>
+            <w:tcMar>
+              <w:top w:type="dxa" w:w="60"/>
+              <w:left w:type="dxa" w:w="90"/>
+              <w:bottom w:type="dxa" w:w="60"/>
+              <w:right w:type="dxa" w:w="90"/>
+            </w:tcMar>
+          </w:tcPr>
+          <w:p>
+            <w:pPr>
+              <w:keepNext/>
+              <w:jc w:val="left"/>
+            </w:pPr>
+            <w:r>
+              <w:rPr>
+                <w:rFonts w:ascii="Calibri" w:cs="Calibri" w:eastAsia="Calibri" w:hAnsi="Calibri"/>
+                <w:b w:val="false"/>
+                <w:bCs w:val="false"/>
+                <w:color w:val="000000"/>
+                <w:sz w:val="18"/>
+                <w:szCs w:val="18"/>
+              </w:rPr>
+            </w:r>
+          </w:p>
+        </w:tc>
+      </w:tr>
+      <w:tr>
+        <w:trPr>
+          <w:cantSplit/>
+        </w:trPr>
+        <w:tc>
+          <w:tcPr>
+            <w:tcW w:type="dxa" w:w="1200"/>
+            <w:tcMar>
+              <w:top w:type="dxa" w:w="60"/>
+              <w:left w:type="dxa" w:w="90"/>
+              <w:bottom w:type="dxa" w:w="60"/>
+              <w:right w:type="dxa" w:w="90"/>
+            </w:tcMar>
+          </w:tcPr>
+          <w:p>
+            <w:pPr>
+              <w:keepNext/>
+              <w:jc w:val="left"/>
+            </w:pPr>
+            <w:r>
+              <w:rPr>
+                <w:rFonts w:ascii="Calibri" w:cs="Calibri" w:eastAsia="Calibri" w:hAnsi="Calibri"/>
+                <w:b w:val="false"/>
+                <w:bCs w:val="false"/>
+                <w:color w:val="000000"/>
+                <w:sz w:val="17"/>
+                <w:szCs w:val="17"/>
+              </w:rPr>
+            </w:r>
+          </w:p>
+        </w:tc>
+        <w:tc>
+          <w:tcPr>
+            <w:tcW w:type="dxa" w:w="3800"/>
+            <w:tcMar>
+              <w:top w:type="dxa" w:w="60"/>
+              <w:left w:type="dxa" w:w="90"/>
+              <w:bottom w:type="dxa" w:w="60"/>
+              <w:right w:type="dxa" w:w="90"/>
+            </w:tcMar>
+          </w:tcPr>
+          <w:p>
+            <w:pPr>
+              <w:keepNext/>
+              <w:jc w:val="left"/>
+            </w:pPr>
+            <w:r>
+              <w:rPr>
+                <w:rFonts w:ascii="Calibri" w:cs="Calibri" w:eastAsia="Calibri" w:hAnsi="Calibri"/>
+                <w:b w:val="false"/>
+                <w:bCs w:val="false"/>
+                <w:color w:val="000000"/>
+                <w:sz w:val="17"/>
+                <w:szCs w:val="17"/>
+              </w:rPr>
+              <w:t>Do Not Disturb door hanger  — part # TBD</w:t>
+            </w:r>
+          </w:p>
+        </w:tc>
+        <w:tc>
+          <w:tcPr>
+            <w:tcW w:type="dxa" w:w="3800"/>
+            <w:tcMar>
+              <w:top w:type="dxa" w:w="60"/>
+              <w:left w:type="dxa" w:w="90"/>
+              <w:bottom w:type="dxa" w:w="60"/>
+              <w:right w:type="dxa" w:w="90"/>
+            </w:tcMar>
+          </w:tcPr>
+          <w:p>
+            <w:pPr>
+              <w:keepNext/>
+              <w:jc w:val="left"/>
+            </w:pPr>
+            <w:r>
+              <w:rPr>
+                <w:rFonts w:ascii="Calibri" w:cs="Calibri" w:eastAsia="Calibri" w:hAnsi="Calibri"/>
+                <w:b w:val="false"/>
+                <w:bCs w:val="false"/>
+                <w:color w:val="000000"/>
+                <w:sz w:val="17"/>
+                <w:szCs w:val="17"/>
+              </w:rPr>
+              <w:t>Letrero de No Molestar para la puerta — falta el número de parte</w:t>
+            </w:r>
+          </w:p>
+        </w:tc>
+        <w:tc>
+          <w:tcPr>
+            <w:tcW w:type="dxa" w:w="800"/>
+            <w:tcMar>
+              <w:top w:type="dxa" w:w="60"/>
+              <w:left w:type="dxa" w:w="90"/>
+              <w:bottom w:type="dxa" w:w="60"/>
+              <w:right w:type="dxa" w:w="90"/>
+            </w:tcMar>
+          </w:tcPr>
+          <w:p>
+            <w:pPr>
+              <w:keepNext/>
+              <w:jc w:val="left"/>
+            </w:pPr>
+            <w:r>
+              <w:rPr>
+                <w:rFonts w:ascii="Calibri" w:cs="Calibri" w:eastAsia="Calibri" w:hAnsi="Calibri"/>
+                <w:b w:val="false"/>
+                <w:bCs w:val="false"/>
+                <w:color w:val="000000"/>
+                <w:sz w:val="18"/>
+                <w:szCs w:val="18"/>
+              </w:rPr>
+            </w:r>
+          </w:p>
+        </w:tc>
+        <w:tc>
+          <w:tcPr>
+            <w:tcW w:type="dxa" w:w="800"/>
+            <w:tcMar>
+              <w:top w:type="dxa" w:w="60"/>
+              <w:left w:type="dxa" w:w="90"/>
+              <w:bottom w:type="dxa" w:w="60"/>
+              <w:right w:type="dxa" w:w="90"/>
+            </w:tcMar>
+          </w:tcPr>
+          <w:p>
+            <w:pPr>
+              <w:keepNext/>
+              <w:jc w:val="left"/>
+            </w:pPr>
+            <w:r>
+              <w:rPr>
+                <w:rFonts w:ascii="Calibri" w:cs="Calibri" w:eastAsia="Calibri" w:hAnsi="Calibri"/>
+                <w:b w:val="false"/>
+                <w:bCs w:val="false"/>
+                <w:color w:val="000000"/>
+                <w:sz w:val="18"/>
+                <w:szCs w:val="18"/>
+              </w:rPr>
+            </w:r>
+          </w:p>
+        </w:tc>
+      </w:tr>
+      <w:tr>
+        <w:trPr>
+          <w:cantSplit/>
+        </w:trPr>
+        <w:tc>
+          <w:tcPr>
+            <w:tcW w:type="dxa" w:w="1200"/>
+            <w:tcMar>
+              <w:top w:type="dxa" w:w="60"/>
+              <w:left w:type="dxa" w:w="90"/>
+              <w:bottom w:type="dxa" w:w="60"/>
+              <w:right w:type="dxa" w:w="90"/>
+            </w:tcMar>
+          </w:tcPr>
+          <w:p>
+            <w:pPr>
+              <w:jc w:val="left"/>
+            </w:pPr>
+            <w:r>
+              <w:rPr>
+                <w:rFonts w:ascii="Calibri" w:cs="Calibri" w:eastAsia="Calibri" w:hAnsi="Calibri"/>
+                <w:b w:val="false"/>
+                <w:bCs w:val="false"/>
+                <w:color w:val="000000"/>
+                <w:sz w:val="17"/>
+                <w:szCs w:val="17"/>
+              </w:rPr>
+            </w:r>
+          </w:p>
+        </w:tc>
+        <w:tc>
+          <w:tcPr>
+            <w:tcW w:type="dxa" w:w="3800"/>
+            <w:tcMar>
+              <w:top w:type="dxa" w:w="60"/>
+              <w:left w:type="dxa" w:w="90"/>
+              <w:bottom w:type="dxa" w:w="60"/>
+              <w:right w:type="dxa" w:w="90"/>
+            </w:tcMar>
+          </w:tcPr>
+          <w:p>
+            <w:pPr>
+              <w:jc w:val="left"/>
+            </w:pPr>
+            <w:r>
+              <w:rPr>
+                <w:rFonts w:ascii="Calibri" w:cs="Calibri" w:eastAsia="Calibri" w:hAnsi="Calibri"/>
+                <w:b w:val="false"/>
+                <w:bCs w:val="false"/>
+                <w:color w:val="000000"/>
+                <w:sz w:val="17"/>
+                <w:szCs w:val="17"/>
+              </w:rPr>
+              <w:t>Pet-in-room door sign  — part # TBD</w:t>
+            </w:r>
+          </w:p>
+        </w:tc>
+        <w:tc>
+          <w:tcPr>
+            <w:tcW w:type="dxa" w:w="3800"/>
+            <w:tcMar>
+              <w:top w:type="dxa" w:w="60"/>
+              <w:left w:type="dxa" w:w="90"/>
+              <w:bottom w:type="dxa" w:w="60"/>
+              <w:right w:type="dxa" w:w="90"/>
+            </w:tcMar>
+          </w:tcPr>
+          <w:p>
+            <w:pPr>
+              <w:jc w:val="left"/>
+            </w:pPr>
+            <w:r>
+              <w:rPr>
+                <w:rFonts w:ascii="Calibri" w:cs="Calibri" w:eastAsia="Calibri" w:hAnsi="Calibri"/>
+                <w:b w:val="false"/>
+                <w:bCs w:val="false"/>
+                <w:color w:val="000000"/>
+                <w:sz w:val="17"/>
+                <w:szCs w:val="17"/>
+              </w:rPr>
+              <w:t>Letrero de mascota en la habitación — falta el número de parte</w:t>
+            </w:r>
+          </w:p>
+        </w:tc>
+        <w:tc>
+          <w:tcPr>
+            <w:tcW w:type="dxa" w:w="800"/>
+            <w:tcMar>
+              <w:top w:type="dxa" w:w="60"/>
+              <w:left w:type="dxa" w:w="90"/>
+              <w:bottom w:type="dxa" w:w="60"/>
+              <w:right w:type="dxa" w:w="90"/>
+            </w:tcMar>
+          </w:tcPr>
+          <w:p>
+            <w:pPr>
+              <w:jc w:val="left"/>
+            </w:pPr>
+            <w:r>
+              <w:rPr>
+                <w:rFonts w:ascii="Calibri" w:cs="Calibri" w:eastAsia="Calibri" w:hAnsi="Calibri"/>
+                <w:b w:val="false"/>
+                <w:bCs w:val="false"/>
+                <w:color w:val="000000"/>
+                <w:sz w:val="18"/>
+                <w:szCs w:val="18"/>
+              </w:rPr>
+            </w:r>
+          </w:p>
+        </w:tc>
+        <w:tc>
+          <w:tcPr>
+            <w:tcW w:type="dxa" w:w="800"/>
             <w:tcMar>
               <w:top w:type="dxa" w:w="60"/>
               <w:left w:type="dxa" w:w="90"/>

</xml_diff>

<commit_message>
Group all ironing equipment into one section
New IRONING / Planchado section after the laundry room holds both irons
(183995, 180327) and both boards (109926, 213702), pulled out of
Cleaning & Laundry and Coffee/Room Supplies, plus placeholder rows for a
garment steamer and an ADA accessible board pending part numbers.

Co-Authored-By: Claude Opus 5 <noreply@anthropic.com>
Claude-Session: https://claude.ai/code/session_0138rT731u9moyu7f3GNkj4g
</commit_message>
<xml_diff>
--- a/Elm_Housekeeping_Inventory.docx
+++ b/Elm_Housekeeping_Inventory.docx
@@ -114,6 +114,7 @@
       </w:tblGrid>
       <w:tr>
         <w:trPr>
+          <w:cantSplit/>
           <w:tblHeader/>
         </w:trPr>
         <w:tc>
@@ -129,6 +130,7 @@
           </w:tcPr>
           <w:p>
             <w:pPr>
+              <w:keepNext/>
               <w:jc w:val="left"/>
             </w:pPr>
             <w:r>
@@ -157,6 +159,7 @@
           </w:tcPr>
           <w:p>
             <w:pPr>
+              <w:keepNext/>
               <w:jc w:val="left"/>
             </w:pPr>
             <w:r>
@@ -185,6 +188,7 @@
           </w:tcPr>
           <w:p>
             <w:pPr>
+              <w:keepNext/>
               <w:jc w:val="left"/>
             </w:pPr>
             <w:r>
@@ -213,6 +217,7 @@
           </w:tcPr>
           <w:p>
             <w:pPr>
+              <w:keepNext/>
               <w:jc w:val="center"/>
             </w:pPr>
             <w:r>
@@ -241,6 +246,7 @@
           </w:tcPr>
           <w:p>
             <w:pPr>
+              <w:keepNext/>
               <w:jc w:val="center"/>
             </w:pPr>
             <w:r>
@@ -258,6 +264,9 @@
         </w:tc>
       </w:tr>
       <w:tr>
+        <w:trPr>
+          <w:cantSplit/>
+        </w:trPr>
         <w:tc>
           <w:tcPr>
             <w:tcW w:type="dxa" w:w="1200"/>
@@ -270,6 +279,7 @@
           </w:tcPr>
           <w:p>
             <w:pPr>
+              <w:keepNext/>
               <w:jc w:val="left"/>
             </w:pPr>
             <w:r>
@@ -297,6 +307,7 @@
           </w:tcPr>
           <w:p>
             <w:pPr>
+              <w:keepNext/>
               <w:jc w:val="left"/>
             </w:pPr>
             <w:r>
@@ -324,6 +335,7 @@
           </w:tcPr>
           <w:p>
             <w:pPr>
+              <w:keepNext/>
               <w:jc w:val="left"/>
             </w:pPr>
             <w:r>
@@ -351,33 +363,35 @@
           </w:tcPr>
           <w:p>
             <w:pPr>
-              <w:jc w:val="left"/>
-            </w:pPr>
-            <w:r>
-              <w:rPr>
-                <w:rFonts w:ascii="Calibri" w:cs="Calibri" w:eastAsia="Calibri" w:hAnsi="Calibri"/>
-                <w:b w:val="false"/>
-                <w:bCs w:val="false"/>
-                <w:color w:val="000000"/>
-                <w:sz w:val="18"/>
-                <w:szCs w:val="18"/>
-              </w:rPr>
-              <w:t xml:space="preserve"/>
-            </w:r>
-          </w:p>
-        </w:tc>
-        <w:tc>
-          <w:tcPr>
-            <w:tcW w:type="dxa" w:w="800"/>
-            <w:tcMar>
-              <w:top w:type="dxa" w:w="60"/>
-              <w:left w:type="dxa" w:w="90"/>
-              <w:bottom w:type="dxa" w:w="60"/>
-              <w:right w:type="dxa" w:w="90"/>
-            </w:tcMar>
-          </w:tcPr>
-          <w:p>
-            <w:pPr>
+              <w:keepNext/>
+              <w:jc w:val="left"/>
+            </w:pPr>
+            <w:r>
+              <w:rPr>
+                <w:rFonts w:ascii="Calibri" w:cs="Calibri" w:eastAsia="Calibri" w:hAnsi="Calibri"/>
+                <w:b w:val="false"/>
+                <w:bCs w:val="false"/>
+                <w:color w:val="000000"/>
+                <w:sz w:val="18"/>
+                <w:szCs w:val="18"/>
+              </w:rPr>
+              <w:t xml:space="preserve"/>
+            </w:r>
+          </w:p>
+        </w:tc>
+        <w:tc>
+          <w:tcPr>
+            <w:tcW w:type="dxa" w:w="800"/>
+            <w:tcMar>
+              <w:top w:type="dxa" w:w="60"/>
+              <w:left w:type="dxa" w:w="90"/>
+              <w:bottom w:type="dxa" w:w="60"/>
+              <w:right w:type="dxa" w:w="90"/>
+            </w:tcMar>
+          </w:tcPr>
+          <w:p>
+            <w:pPr>
+              <w:keepNext/>
               <w:jc w:val="left"/>
             </w:pPr>
             <w:r>
@@ -395,6 +409,9 @@
         </w:tc>
       </w:tr>
       <w:tr>
+        <w:trPr>
+          <w:cantSplit/>
+        </w:trPr>
         <w:tc>
           <w:tcPr>
             <w:tcW w:type="dxa" w:w="1200"/>
@@ -408,6 +425,7 @@
           </w:tcPr>
           <w:p>
             <w:pPr>
+              <w:keepNext/>
               <w:jc w:val="left"/>
             </w:pPr>
             <w:r>
@@ -436,6 +454,7 @@
           </w:tcPr>
           <w:p>
             <w:pPr>
+              <w:keepNext/>
               <w:jc w:val="left"/>
             </w:pPr>
             <w:r>
@@ -464,6 +483,7 @@
           </w:tcPr>
           <w:p>
             <w:pPr>
+              <w:keepNext/>
               <w:jc w:val="left"/>
             </w:pPr>
             <w:r>
@@ -492,6 +512,7 @@
           </w:tcPr>
           <w:p>
             <w:pPr>
+              <w:keepNext/>
               <w:jc w:val="left"/>
             </w:pPr>
             <w:r>
@@ -520,6 +541,7 @@
           </w:tcPr>
           <w:p>
             <w:pPr>
+              <w:keepNext/>
               <w:jc w:val="left"/>
             </w:pPr>
             <w:r>
@@ -537,6 +559,9 @@
         </w:tc>
       </w:tr>
       <w:tr>
+        <w:trPr>
+          <w:cantSplit/>
+        </w:trPr>
         <w:tc>
           <w:tcPr>
             <w:tcW w:type="dxa" w:w="1200"/>
@@ -549,6 +574,7 @@
           </w:tcPr>
           <w:p>
             <w:pPr>
+              <w:keepNext/>
               <w:jc w:val="left"/>
             </w:pPr>
             <w:r>
@@ -576,6 +602,7 @@
           </w:tcPr>
           <w:p>
             <w:pPr>
+              <w:keepNext/>
               <w:jc w:val="left"/>
             </w:pPr>
             <w:r>
@@ -603,6 +630,7 @@
           </w:tcPr>
           <w:p>
             <w:pPr>
+              <w:keepNext/>
               <w:jc w:val="left"/>
             </w:pPr>
             <w:r>
@@ -630,33 +658,35 @@
           </w:tcPr>
           <w:p>
             <w:pPr>
-              <w:jc w:val="left"/>
-            </w:pPr>
-            <w:r>
-              <w:rPr>
-                <w:rFonts w:ascii="Calibri" w:cs="Calibri" w:eastAsia="Calibri" w:hAnsi="Calibri"/>
-                <w:b w:val="false"/>
-                <w:bCs w:val="false"/>
-                <w:color w:val="000000"/>
-                <w:sz w:val="18"/>
-                <w:szCs w:val="18"/>
-              </w:rPr>
-              <w:t xml:space="preserve"/>
-            </w:r>
-          </w:p>
-        </w:tc>
-        <w:tc>
-          <w:tcPr>
-            <w:tcW w:type="dxa" w:w="800"/>
-            <w:tcMar>
-              <w:top w:type="dxa" w:w="60"/>
-              <w:left w:type="dxa" w:w="90"/>
-              <w:bottom w:type="dxa" w:w="60"/>
-              <w:right w:type="dxa" w:w="90"/>
-            </w:tcMar>
-          </w:tcPr>
-          <w:p>
-            <w:pPr>
+              <w:keepNext/>
+              <w:jc w:val="left"/>
+            </w:pPr>
+            <w:r>
+              <w:rPr>
+                <w:rFonts w:ascii="Calibri" w:cs="Calibri" w:eastAsia="Calibri" w:hAnsi="Calibri"/>
+                <w:b w:val="false"/>
+                <w:bCs w:val="false"/>
+                <w:color w:val="000000"/>
+                <w:sz w:val="18"/>
+                <w:szCs w:val="18"/>
+              </w:rPr>
+              <w:t xml:space="preserve"/>
+            </w:r>
+          </w:p>
+        </w:tc>
+        <w:tc>
+          <w:tcPr>
+            <w:tcW w:type="dxa" w:w="800"/>
+            <w:tcMar>
+              <w:top w:type="dxa" w:w="60"/>
+              <w:left w:type="dxa" w:w="90"/>
+              <w:bottom w:type="dxa" w:w="60"/>
+              <w:right w:type="dxa" w:w="90"/>
+            </w:tcMar>
+          </w:tcPr>
+          <w:p>
+            <w:pPr>
+              <w:keepNext/>
               <w:jc w:val="left"/>
             </w:pPr>
             <w:r>
@@ -674,6 +704,9 @@
         </w:tc>
       </w:tr>
       <w:tr>
+        <w:trPr>
+          <w:cantSplit/>
+        </w:trPr>
         <w:tc>
           <w:tcPr>
             <w:tcW w:type="dxa" w:w="1200"/>
@@ -687,6 +720,7 @@
           </w:tcPr>
           <w:p>
             <w:pPr>
+              <w:keepNext/>
               <w:jc w:val="left"/>
             </w:pPr>
             <w:r>
@@ -715,6 +749,7 @@
           </w:tcPr>
           <w:p>
             <w:pPr>
+              <w:keepNext/>
               <w:jc w:val="left"/>
             </w:pPr>
             <w:r>
@@ -743,6 +778,7 @@
           </w:tcPr>
           <w:p>
             <w:pPr>
+              <w:keepNext/>
               <w:jc w:val="left"/>
             </w:pPr>
             <w:r>
@@ -771,6 +807,7 @@
           </w:tcPr>
           <w:p>
             <w:pPr>
+              <w:keepNext/>
               <w:jc w:val="left"/>
             </w:pPr>
             <w:r>
@@ -799,6 +836,7 @@
           </w:tcPr>
           <w:p>
             <w:pPr>
+              <w:keepNext/>
               <w:jc w:val="left"/>
             </w:pPr>
             <w:r>
@@ -816,285 +854,9 @@
         </w:tc>
       </w:tr>
       <w:tr>
-        <w:tc>
-          <w:tcPr>
-            <w:tcW w:type="dxa" w:w="1200"/>
-            <w:tcMar>
-              <w:top w:type="dxa" w:w="60"/>
-              <w:left w:type="dxa" w:w="90"/>
-              <w:bottom w:type="dxa" w:w="60"/>
-              <w:right w:type="dxa" w:w="90"/>
-            </w:tcMar>
-          </w:tcPr>
-          <w:p>
-            <w:pPr>
-              <w:jc w:val="left"/>
-            </w:pPr>
-            <w:r>
-              <w:rPr>
-                <w:rFonts w:ascii="Calibri" w:cs="Calibri" w:eastAsia="Calibri" w:hAnsi="Calibri"/>
-                <w:b w:val="false"/>
-                <w:bCs w:val="false"/>
-                <w:color w:val="000000"/>
-                <w:sz w:val="17"/>
-                <w:szCs w:val="17"/>
-              </w:rPr>
-              <w:t xml:space="preserve">109926</w:t>
-            </w:r>
-          </w:p>
-        </w:tc>
-        <w:tc>
-          <w:tcPr>
-            <w:tcW w:type="dxa" w:w="3800"/>
-            <w:tcMar>
-              <w:top w:type="dxa" w:w="60"/>
-              <w:left w:type="dxa" w:w="90"/>
-              <w:bottom w:type="dxa" w:w="60"/>
-              <w:right w:type="dxa" w:w="90"/>
-            </w:tcMar>
-          </w:tcPr>
-          <w:p>
-            <w:pPr>
-              <w:jc w:val="left"/>
-            </w:pPr>
-            <w:r>
-              <w:rPr>
-                <w:rFonts w:ascii="Calibri" w:cs="Calibri" w:eastAsia="Calibri" w:hAnsi="Calibri"/>
-                <w:b w:val="false"/>
-                <w:bCs w:val="false"/>
-                <w:color w:val="000000"/>
-                <w:sz w:val="17"/>
-                <w:szCs w:val="17"/>
-              </w:rPr>
-              <w:t xml:space="preserve">Full Size T-Leg Ironing Board, Charcoal Pad And Cover, 4/Cs</w:t>
-            </w:r>
-          </w:p>
-        </w:tc>
-        <w:tc>
-          <w:tcPr>
-            <w:tcW w:type="dxa" w:w="3800"/>
-            <w:tcMar>
-              <w:top w:type="dxa" w:w="60"/>
-              <w:left w:type="dxa" w:w="90"/>
-              <w:bottom w:type="dxa" w:w="60"/>
-              <w:right w:type="dxa" w:w="90"/>
-            </w:tcMar>
-          </w:tcPr>
-          <w:p>
-            <w:pPr>
-              <w:jc w:val="left"/>
-            </w:pPr>
-            <w:r>
-              <w:rPr>
-                <w:rFonts w:ascii="Calibri" w:cs="Calibri" w:eastAsia="Calibri" w:hAnsi="Calibri"/>
-                <w:b w:val="false"/>
-                <w:bCs w:val="false"/>
-                <w:color w:val="000000"/>
-                <w:sz w:val="17"/>
-                <w:szCs w:val="17"/>
-              </w:rPr>
-              <w:t xml:space="preserve">Tabla de planchar completa con patas en T, incluye forro y funda, caja de 4</w:t>
-            </w:r>
-          </w:p>
-        </w:tc>
-        <w:tc>
-          <w:tcPr>
-            <w:tcW w:type="dxa" w:w="800"/>
-            <w:tcMar>
-              <w:top w:type="dxa" w:w="60"/>
-              <w:left w:type="dxa" w:w="90"/>
-              <w:bottom w:type="dxa" w:w="60"/>
-              <w:right w:type="dxa" w:w="90"/>
-            </w:tcMar>
-          </w:tcPr>
-          <w:p>
-            <w:pPr>
-              <w:jc w:val="left"/>
-            </w:pPr>
-            <w:r>
-              <w:rPr>
-                <w:rFonts w:ascii="Calibri" w:cs="Calibri" w:eastAsia="Calibri" w:hAnsi="Calibri"/>
-                <w:b w:val="false"/>
-                <w:bCs w:val="false"/>
-                <w:color w:val="000000"/>
-                <w:sz w:val="18"/>
-                <w:szCs w:val="18"/>
-              </w:rPr>
-              <w:t xml:space="preserve"/>
-            </w:r>
-          </w:p>
-        </w:tc>
-        <w:tc>
-          <w:tcPr>
-            <w:tcW w:type="dxa" w:w="800"/>
-            <w:tcMar>
-              <w:top w:type="dxa" w:w="60"/>
-              <w:left w:type="dxa" w:w="90"/>
-              <w:bottom w:type="dxa" w:w="60"/>
-              <w:right w:type="dxa" w:w="90"/>
-            </w:tcMar>
-          </w:tcPr>
-          <w:p>
-            <w:pPr>
-              <w:jc w:val="left"/>
-            </w:pPr>
-            <w:r>
-              <w:rPr>
-                <w:rFonts w:ascii="Calibri" w:cs="Calibri" w:eastAsia="Calibri" w:hAnsi="Calibri"/>
-                <w:b w:val="false"/>
-                <w:bCs w:val="false"/>
-                <w:color w:val="000000"/>
-                <w:sz w:val="18"/>
-                <w:szCs w:val="18"/>
-              </w:rPr>
-              <w:t xml:space="preserve"/>
-            </w:r>
-          </w:p>
-        </w:tc>
-      </w:tr>
-      <w:tr>
-        <w:tc>
-          <w:tcPr>
-            <w:tcW w:type="dxa" w:w="1200"/>
-            <w:shd w:fill="F5F7FA" w:color="auto" w:val="clear"/>
-            <w:tcMar>
-              <w:top w:type="dxa" w:w="60"/>
-              <w:left w:type="dxa" w:w="90"/>
-              <w:bottom w:type="dxa" w:w="60"/>
-              <w:right w:type="dxa" w:w="90"/>
-            </w:tcMar>
-          </w:tcPr>
-          <w:p>
-            <w:pPr>
-              <w:jc w:val="left"/>
-            </w:pPr>
-            <w:r>
-              <w:rPr>
-                <w:rFonts w:ascii="Calibri" w:cs="Calibri" w:eastAsia="Calibri" w:hAnsi="Calibri"/>
-                <w:b w:val="false"/>
-                <w:bCs w:val="false"/>
-                <w:color w:val="000000"/>
-                <w:sz w:val="17"/>
-                <w:szCs w:val="17"/>
-              </w:rPr>
-              <w:t xml:space="preserve">213702</w:t>
-            </w:r>
-          </w:p>
-        </w:tc>
-        <w:tc>
-          <w:tcPr>
-            <w:tcW w:type="dxa" w:w="3800"/>
-            <w:shd w:fill="F5F7FA" w:color="auto" w:val="clear"/>
-            <w:tcMar>
-              <w:top w:type="dxa" w:w="60"/>
-              <w:left w:type="dxa" w:w="90"/>
-              <w:bottom w:type="dxa" w:w="60"/>
-              <w:right w:type="dxa" w:w="90"/>
-            </w:tcMar>
-          </w:tcPr>
-          <w:p>
-            <w:pPr>
-              <w:jc w:val="left"/>
-            </w:pPr>
-            <w:r>
-              <w:rPr>
-                <w:rFonts w:ascii="Calibri" w:cs="Calibri" w:eastAsia="Calibri" w:hAnsi="Calibri"/>
-                <w:b w:val="false"/>
-                <w:bCs w:val="false"/>
-                <w:color w:val="000000"/>
-                <w:sz w:val="17"/>
-                <w:szCs w:val="17"/>
-              </w:rPr>
-              <w:t xml:space="preserve">Ironing Board Pad And Cover, Case Of 12</w:t>
-            </w:r>
-          </w:p>
-        </w:tc>
-        <w:tc>
-          <w:tcPr>
-            <w:tcW w:type="dxa" w:w="3800"/>
-            <w:shd w:fill="F5F7FA" w:color="auto" w:val="clear"/>
-            <w:tcMar>
-              <w:top w:type="dxa" w:w="60"/>
-              <w:left w:type="dxa" w:w="90"/>
-              <w:bottom w:type="dxa" w:w="60"/>
-              <w:right w:type="dxa" w:w="90"/>
-            </w:tcMar>
-          </w:tcPr>
-          <w:p>
-            <w:pPr>
-              <w:jc w:val="left"/>
-            </w:pPr>
-            <w:r>
-              <w:rPr>
-                <w:rFonts w:ascii="Calibri" w:cs="Calibri" w:eastAsia="Calibri" w:hAnsi="Calibri"/>
-                <w:b w:val="false"/>
-                <w:bCs w:val="false"/>
-                <w:color w:val="000000"/>
-                <w:sz w:val="17"/>
-                <w:szCs w:val="17"/>
-              </w:rPr>
-              <w:t xml:space="preserve">Forro y funda de repuesto para tabla de planchar, caja de 12</w:t>
-            </w:r>
-          </w:p>
-        </w:tc>
-        <w:tc>
-          <w:tcPr>
-            <w:tcW w:type="dxa" w:w="800"/>
-            <w:shd w:fill="F5F7FA" w:color="auto" w:val="clear"/>
-            <w:tcMar>
-              <w:top w:type="dxa" w:w="60"/>
-              <w:left w:type="dxa" w:w="90"/>
-              <w:bottom w:type="dxa" w:w="60"/>
-              <w:right w:type="dxa" w:w="90"/>
-            </w:tcMar>
-          </w:tcPr>
-          <w:p>
-            <w:pPr>
-              <w:jc w:val="left"/>
-            </w:pPr>
-            <w:r>
-              <w:rPr>
-                <w:rFonts w:ascii="Calibri" w:cs="Calibri" w:eastAsia="Calibri" w:hAnsi="Calibri"/>
-                <w:b w:val="false"/>
-                <w:bCs w:val="false"/>
-                <w:color w:val="000000"/>
-                <w:sz w:val="18"/>
-                <w:szCs w:val="18"/>
-              </w:rPr>
-              <w:t xml:space="preserve"/>
-            </w:r>
-          </w:p>
-        </w:tc>
-        <w:tc>
-          <w:tcPr>
-            <w:tcW w:type="dxa" w:w="800"/>
-            <w:shd w:fill="F5F7FA" w:color="auto" w:val="clear"/>
-            <w:tcMar>
-              <w:top w:type="dxa" w:w="60"/>
-              <w:left w:type="dxa" w:w="90"/>
-              <w:bottom w:type="dxa" w:w="60"/>
-              <w:right w:type="dxa" w:w="90"/>
-            </w:tcMar>
-          </w:tcPr>
-          <w:p>
-            <w:pPr>
-              <w:jc w:val="left"/>
-            </w:pPr>
-            <w:r>
-              <w:rPr>
-                <w:rFonts w:ascii="Calibri" w:cs="Calibri" w:eastAsia="Calibri" w:hAnsi="Calibri"/>
-                <w:b w:val="false"/>
-                <w:bCs w:val="false"/>
-                <w:color w:val="000000"/>
-                <w:sz w:val="18"/>
-                <w:szCs w:val="18"/>
-              </w:rPr>
-              <w:t xml:space="preserve"/>
-            </w:r>
-          </w:p>
-        </w:tc>
-      </w:tr>
-      <w:tr>
+        <w:trPr>
+          <w:cantSplit/>
+        </w:trPr>
         <w:tc>
           <w:tcPr>
             <w:tcW w:type="dxa" w:w="1200"/>
@@ -3133,6 +2895,1060 @@
           <w:sz w:val="24"/>
           <w:szCs w:val="24"/>
         </w:rPr>
+        <w:t xml:space="preserve">IRONING   /   Planchado</w:t>
+      </w:r>
+    </w:p>
+    <w:p>
+      <w:pPr>
+        <w:spacing w:after="120" w:before="280"/>
+      </w:pPr>
+      <w:r>
+        <w:rPr>
+          <w:rFonts w:ascii="Calibri" w:cs="Calibri" w:eastAsia="Calibri" w:hAnsi="Calibri"/>
+          <w:b/>
+          <w:bCs/>
+          <w:color w:val="1F3A5F"/>
+          <w:sz w:val="24"/>
+          <w:szCs w:val="24"/>
+        </w:rPr>
+        <w:t xml:space="preserve">Irons, steamers and boards — kept together.  /  Planchas, vaporizadores y tablas — todo junto.</w:t>
+      </w:r>
+    </w:p>
+    <w:tbl>
+      <w:tblPr>
+        <w:tblW w:type="dxa" w:w="10400"/>
+        <w:tblBorders>
+          <w:top w:val="single" w:color="auto" w:sz="4"/>
+          <w:left w:val="single" w:color="auto" w:sz="4"/>
+          <w:bottom w:val="single" w:color="auto" w:sz="4"/>
+          <w:right w:val="single" w:color="auto" w:sz="4"/>
+          <w:insideH w:val="single" w:color="auto" w:sz="4"/>
+          <w:insideV w:val="single" w:color="auto" w:sz="4"/>
+        </w:tblBorders>
+      </w:tblPr>
+      <w:tblGrid>
+        <w:gridCol w:w="1200"/>
+        <w:gridCol w:w="3800"/>
+        <w:gridCol w:w="3800"/>
+        <w:gridCol w:w="800"/>
+        <w:gridCol w:w="800"/>
+      </w:tblGrid>
+      <w:tr>
+        <w:trPr>
+          <w:cantSplit/>
+          <w:tblHeader/>
+        </w:trPr>
+        <w:tc>
+          <w:tcPr>
+            <w:tcW w:type="dxa" w:w="1200"/>
+            <w:shd w:fill="1F3A5F" w:color="auto" w:val="clear"/>
+            <w:tcMar>
+              <w:top w:type="dxa" w:w="60"/>
+              <w:left w:type="dxa" w:w="90"/>
+              <w:bottom w:type="dxa" w:w="60"/>
+              <w:right w:type="dxa" w:w="90"/>
+            </w:tcMar>
+          </w:tcPr>
+          <w:p>
+            <w:pPr>
+              <w:keepNext/>
+              <w:jc w:val="left"/>
+            </w:pPr>
+            <w:r>
+              <w:rPr>
+                <w:rFonts w:ascii="Calibri" w:cs="Calibri" w:eastAsia="Calibri" w:hAnsi="Calibri"/>
+                <w:b/>
+                <w:bCs/>
+                <w:color w:val="FFFFFF"/>
+                <w:sz w:val="18"/>
+                <w:szCs w:val="18"/>
+              </w:rPr>
+              <w:t>Part #</w:t>
+            </w:r>
+          </w:p>
+        </w:tc>
+        <w:tc>
+          <w:tcPr>
+            <w:tcW w:type="dxa" w:w="3800"/>
+            <w:shd w:fill="1F3A5F" w:color="auto" w:val="clear"/>
+            <w:tcMar>
+              <w:top w:type="dxa" w:w="60"/>
+              <w:left w:type="dxa" w:w="90"/>
+              <w:bottom w:type="dxa" w:w="60"/>
+              <w:right w:type="dxa" w:w="90"/>
+            </w:tcMar>
+          </w:tcPr>
+          <w:p>
+            <w:pPr>
+              <w:keepNext/>
+              <w:jc w:val="left"/>
+            </w:pPr>
+            <w:r>
+              <w:rPr>
+                <w:rFonts w:ascii="Calibri" w:cs="Calibri" w:eastAsia="Calibri" w:hAnsi="Calibri"/>
+                <w:b/>
+                <w:bCs/>
+                <w:color w:val="FFFFFF"/>
+                <w:sz w:val="18"/>
+                <w:szCs w:val="18"/>
+              </w:rPr>
+              <w:t>Item (English)</w:t>
+            </w:r>
+          </w:p>
+        </w:tc>
+        <w:tc>
+          <w:tcPr>
+            <w:tcW w:type="dxa" w:w="3800"/>
+            <w:shd w:fill="1F3A5F" w:color="auto" w:val="clear"/>
+            <w:tcMar>
+              <w:top w:type="dxa" w:w="60"/>
+              <w:left w:type="dxa" w:w="90"/>
+              <w:bottom w:type="dxa" w:w="60"/>
+              <w:right w:type="dxa" w:w="90"/>
+            </w:tcMar>
+          </w:tcPr>
+          <w:p>
+            <w:pPr>
+              <w:keepNext/>
+              <w:jc w:val="left"/>
+            </w:pPr>
+            <w:r>
+              <w:rPr>
+                <w:rFonts w:ascii="Calibri" w:cs="Calibri" w:eastAsia="Calibri" w:hAnsi="Calibri"/>
+                <w:b/>
+                <w:bCs/>
+                <w:color w:val="FFFFFF"/>
+                <w:sz w:val="18"/>
+                <w:szCs w:val="18"/>
+              </w:rPr>
+              <w:t>Artículo (Español)</w:t>
+            </w:r>
+          </w:p>
+        </w:tc>
+        <w:tc>
+          <w:tcPr>
+            <w:tcW w:type="dxa" w:w="800"/>
+            <w:shd w:fill="1F3A5F" w:color="auto" w:val="clear"/>
+            <w:tcMar>
+              <w:top w:type="dxa" w:w="60"/>
+              <w:left w:type="dxa" w:w="90"/>
+              <w:bottom w:type="dxa" w:w="60"/>
+              <w:right w:type="dxa" w:w="90"/>
+            </w:tcMar>
+          </w:tcPr>
+          <w:p>
+            <w:pPr>
+              <w:keepNext/>
+              <w:jc w:val="center"/>
+            </w:pPr>
+            <w:r>
+              <w:rPr>
+                <w:rFonts w:ascii="Calibri" w:cs="Calibri" w:eastAsia="Calibri" w:hAnsi="Calibri"/>
+                <w:b/>
+                <w:bCs/>
+                <w:color w:val="FFFFFF"/>
+                <w:sz w:val="18"/>
+                <w:szCs w:val="18"/>
+              </w:rPr>
+              <w:t>Par</w:t>
+            </w:r>
+          </w:p>
+        </w:tc>
+        <w:tc>
+          <w:tcPr>
+            <w:tcW w:type="dxa" w:w="800"/>
+            <w:shd w:fill="1F3A5F" w:color="auto" w:val="clear"/>
+            <w:tcMar>
+              <w:top w:type="dxa" w:w="60"/>
+              <w:left w:type="dxa" w:w="90"/>
+              <w:bottom w:type="dxa" w:w="60"/>
+              <w:right w:type="dxa" w:w="90"/>
+            </w:tcMar>
+          </w:tcPr>
+          <w:p>
+            <w:pPr>
+              <w:keepNext/>
+              <w:jc w:val="center"/>
+            </w:pPr>
+            <w:r>
+              <w:rPr>
+                <w:rFonts w:ascii="Calibri" w:cs="Calibri" w:eastAsia="Calibri" w:hAnsi="Calibri"/>
+                <w:b/>
+                <w:bCs/>
+                <w:color w:val="FFFFFF"/>
+                <w:sz w:val="18"/>
+                <w:szCs w:val="18"/>
+              </w:rPr>
+              <w:t>Tiene</w:t>
+            </w:r>
+          </w:p>
+        </w:tc>
+      </w:tr>
+      <w:tr>
+        <w:trPr>
+          <w:cantSplit/>
+        </w:trPr>
+        <w:tc>
+          <w:tcPr>
+            <w:tcW w:type="dxa" w:w="1200"/>
+            <w:tcMar>
+              <w:top w:type="dxa" w:w="60"/>
+              <w:left w:type="dxa" w:w="90"/>
+              <w:bottom w:type="dxa" w:w="60"/>
+              <w:right w:type="dxa" w:w="90"/>
+            </w:tcMar>
+          </w:tcPr>
+          <w:p>
+            <w:pPr>
+              <w:keepNext/>
+              <w:jc w:val="left"/>
+            </w:pPr>
+            <w:r>
+              <w:rPr>
+                <w:rFonts w:ascii="Calibri" w:cs="Calibri" w:eastAsia="Calibri" w:hAnsi="Calibri"/>
+                <w:b w:val="false"/>
+                <w:bCs w:val="false"/>
+                <w:color w:val="000000"/>
+                <w:sz w:val="17"/>
+                <w:szCs w:val="17"/>
+              </w:rPr>
+              <w:t>183995</w:t>
+            </w:r>
+          </w:p>
+        </w:tc>
+        <w:tc>
+          <w:tcPr>
+            <w:tcW w:type="dxa" w:w="3800"/>
+            <w:tcMar>
+              <w:top w:type="dxa" w:w="60"/>
+              <w:left w:type="dxa" w:w="90"/>
+              <w:bottom w:type="dxa" w:w="60"/>
+              <w:right w:type="dxa" w:w="90"/>
+            </w:tcMar>
+          </w:tcPr>
+          <w:p>
+            <w:pPr>
+              <w:keepNext/>
+              <w:jc w:val="left"/>
+            </w:pPr>
+            <w:r>
+              <w:rPr>
+                <w:rFonts w:ascii="Calibri" w:cs="Calibri" w:eastAsia="Calibri" w:hAnsi="Calibri"/>
+                <w:b w:val="false"/>
+                <w:bCs w:val="false"/>
+                <w:color w:val="000000"/>
+                <w:sz w:val="17"/>
+                <w:szCs w:val="17"/>
+              </w:rPr>
+              <w:t>Retractable Cord Iron 1100 Watt, Black</w:t>
+            </w:r>
+          </w:p>
+        </w:tc>
+        <w:tc>
+          <w:tcPr>
+            <w:tcW w:type="dxa" w:w="3800"/>
+            <w:tcMar>
+              <w:top w:type="dxa" w:w="60"/>
+              <w:left w:type="dxa" w:w="90"/>
+              <w:bottom w:type="dxa" w:w="60"/>
+              <w:right w:type="dxa" w:w="90"/>
+            </w:tcMar>
+          </w:tcPr>
+          <w:p>
+            <w:pPr>
+              <w:keepNext/>
+              <w:jc w:val="left"/>
+            </w:pPr>
+            <w:r>
+              <w:rPr>
+                <w:rFonts w:ascii="Calibri" w:cs="Calibri" w:eastAsia="Calibri" w:hAnsi="Calibri"/>
+                <w:b w:val="false"/>
+                <w:bCs w:val="false"/>
+                <w:color w:val="000000"/>
+                <w:sz w:val="17"/>
+                <w:szCs w:val="17"/>
+              </w:rPr>
+              <w:t>Plancha con cable retráctil 1100 W, negra</w:t>
+            </w:r>
+          </w:p>
+        </w:tc>
+        <w:tc>
+          <w:tcPr>
+            <w:tcW w:type="dxa" w:w="800"/>
+            <w:tcMar>
+              <w:top w:type="dxa" w:w="60"/>
+              <w:left w:type="dxa" w:w="90"/>
+              <w:bottom w:type="dxa" w:w="60"/>
+              <w:right w:type="dxa" w:w="90"/>
+            </w:tcMar>
+          </w:tcPr>
+          <w:p>
+            <w:pPr>
+              <w:keepNext/>
+              <w:jc w:val="left"/>
+            </w:pPr>
+            <w:r>
+              <w:rPr>
+                <w:rFonts w:ascii="Calibri" w:cs="Calibri" w:eastAsia="Calibri" w:hAnsi="Calibri"/>
+                <w:b w:val="false"/>
+                <w:bCs w:val="false"/>
+                <w:color w:val="000000"/>
+                <w:sz w:val="18"/>
+                <w:szCs w:val="18"/>
+              </w:rPr>
+            </w:r>
+          </w:p>
+        </w:tc>
+        <w:tc>
+          <w:tcPr>
+            <w:tcW w:type="dxa" w:w="800"/>
+            <w:tcMar>
+              <w:top w:type="dxa" w:w="60"/>
+              <w:left w:type="dxa" w:w="90"/>
+              <w:bottom w:type="dxa" w:w="60"/>
+              <w:right w:type="dxa" w:w="90"/>
+            </w:tcMar>
+          </w:tcPr>
+          <w:p>
+            <w:pPr>
+              <w:keepNext/>
+              <w:jc w:val="left"/>
+            </w:pPr>
+            <w:r>
+              <w:rPr>
+                <w:rFonts w:ascii="Calibri" w:cs="Calibri" w:eastAsia="Calibri" w:hAnsi="Calibri"/>
+                <w:b w:val="false"/>
+                <w:bCs w:val="false"/>
+                <w:color w:val="000000"/>
+                <w:sz w:val="18"/>
+                <w:szCs w:val="18"/>
+              </w:rPr>
+            </w:r>
+          </w:p>
+        </w:tc>
+      </w:tr>
+      <w:tr>
+        <w:trPr>
+          <w:cantSplit/>
+        </w:trPr>
+        <w:tc>
+          <w:tcPr>
+            <w:tcW w:type="dxa" w:w="1200"/>
+            <w:tcMar>
+              <w:top w:type="dxa" w:w="60"/>
+              <w:left w:type="dxa" w:w="90"/>
+              <w:bottom w:type="dxa" w:w="60"/>
+              <w:right w:type="dxa" w:w="90"/>
+            </w:tcMar>
+          </w:tcPr>
+          <w:p>
+            <w:pPr>
+              <w:keepNext/>
+              <w:jc w:val="left"/>
+            </w:pPr>
+            <w:r>
+              <w:rPr>
+                <w:rFonts w:ascii="Calibri" w:cs="Calibri" w:eastAsia="Calibri" w:hAnsi="Calibri"/>
+                <w:b w:val="false"/>
+                <w:bCs w:val="false"/>
+                <w:color w:val="000000"/>
+                <w:sz w:val="17"/>
+                <w:szCs w:val="17"/>
+              </w:rPr>
+              <w:t>180327</w:t>
+            </w:r>
+          </w:p>
+        </w:tc>
+        <w:tc>
+          <w:tcPr>
+            <w:tcW w:type="dxa" w:w="3800"/>
+            <w:tcMar>
+              <w:top w:type="dxa" w:w="60"/>
+              <w:left w:type="dxa" w:w="90"/>
+              <w:bottom w:type="dxa" w:w="60"/>
+              <w:right w:type="dxa" w:w="90"/>
+            </w:tcMar>
+          </w:tcPr>
+          <w:p>
+            <w:pPr>
+              <w:keepNext/>
+              <w:jc w:val="left"/>
+            </w:pPr>
+            <w:r>
+              <w:rPr>
+                <w:rFonts w:ascii="Calibri" w:cs="Calibri" w:eastAsia="Calibri" w:hAnsi="Calibri"/>
+                <w:b w:val="false"/>
+                <w:bCs w:val="false"/>
+                <w:color w:val="000000"/>
+                <w:sz w:val="17"/>
+                <w:szCs w:val="17"/>
+              </w:rPr>
+              <w:t>Commercial Steam/Mist Iron, White/Blue</w:t>
+            </w:r>
+          </w:p>
+        </w:tc>
+        <w:tc>
+          <w:tcPr>
+            <w:tcW w:type="dxa" w:w="3800"/>
+            <w:tcMar>
+              <w:top w:type="dxa" w:w="60"/>
+              <w:left w:type="dxa" w:w="90"/>
+              <w:bottom w:type="dxa" w:w="60"/>
+              <w:right w:type="dxa" w:w="90"/>
+            </w:tcMar>
+          </w:tcPr>
+          <w:p>
+            <w:pPr>
+              <w:keepNext/>
+              <w:jc w:val="left"/>
+            </w:pPr>
+            <w:r>
+              <w:rPr>
+                <w:rFonts w:ascii="Calibri" w:cs="Calibri" w:eastAsia="Calibri" w:hAnsi="Calibri"/>
+                <w:b w:val="false"/>
+                <w:bCs w:val="false"/>
+                <w:color w:val="000000"/>
+                <w:sz w:val="17"/>
+                <w:szCs w:val="17"/>
+              </w:rPr>
+              <w:t>Plancha comercial de vapor/rocío, blanca/azul</w:t>
+            </w:r>
+          </w:p>
+        </w:tc>
+        <w:tc>
+          <w:tcPr>
+            <w:tcW w:type="dxa" w:w="800"/>
+            <w:tcMar>
+              <w:top w:type="dxa" w:w="60"/>
+              <w:left w:type="dxa" w:w="90"/>
+              <w:bottom w:type="dxa" w:w="60"/>
+              <w:right w:type="dxa" w:w="90"/>
+            </w:tcMar>
+          </w:tcPr>
+          <w:p>
+            <w:pPr>
+              <w:keepNext/>
+              <w:jc w:val="left"/>
+            </w:pPr>
+            <w:r>
+              <w:rPr>
+                <w:rFonts w:ascii="Calibri" w:cs="Calibri" w:eastAsia="Calibri" w:hAnsi="Calibri"/>
+                <w:b w:val="false"/>
+                <w:bCs w:val="false"/>
+                <w:color w:val="000000"/>
+                <w:sz w:val="18"/>
+                <w:szCs w:val="18"/>
+              </w:rPr>
+            </w:r>
+          </w:p>
+        </w:tc>
+        <w:tc>
+          <w:tcPr>
+            <w:tcW w:type="dxa" w:w="800"/>
+            <w:tcMar>
+              <w:top w:type="dxa" w:w="60"/>
+              <w:left w:type="dxa" w:w="90"/>
+              <w:bottom w:type="dxa" w:w="60"/>
+              <w:right w:type="dxa" w:w="90"/>
+            </w:tcMar>
+          </w:tcPr>
+          <w:p>
+            <w:pPr>
+              <w:keepNext/>
+              <w:jc w:val="left"/>
+            </w:pPr>
+            <w:r>
+              <w:rPr>
+                <w:rFonts w:ascii="Calibri" w:cs="Calibri" w:eastAsia="Calibri" w:hAnsi="Calibri"/>
+                <w:b w:val="false"/>
+                <w:bCs w:val="false"/>
+                <w:color w:val="000000"/>
+                <w:sz w:val="18"/>
+                <w:szCs w:val="18"/>
+              </w:rPr>
+            </w:r>
+          </w:p>
+        </w:tc>
+      </w:tr>
+      <w:tr>
+        <w:trPr>
+          <w:cantSplit/>
+        </w:trPr>
+        <w:tc>
+          <w:tcPr>
+            <w:tcW w:type="dxa" w:w="1200"/>
+            <w:tcMar>
+              <w:top w:type="dxa" w:w="60"/>
+              <w:left w:type="dxa" w:w="90"/>
+              <w:bottom w:type="dxa" w:w="60"/>
+              <w:right w:type="dxa" w:w="90"/>
+            </w:tcMar>
+          </w:tcPr>
+          <w:p>
+            <w:pPr>
+              <w:keepNext/>
+              <w:jc w:val="left"/>
+            </w:pPr>
+            <w:r>
+              <w:rPr>
+                <w:rFonts w:ascii="Calibri" w:cs="Calibri" w:eastAsia="Calibri" w:hAnsi="Calibri"/>
+                <w:b w:val="false"/>
+                <w:bCs w:val="false"/>
+                <w:color w:val="000000"/>
+                <w:sz w:val="17"/>
+                <w:szCs w:val="17"/>
+              </w:rPr>
+            </w:r>
+          </w:p>
+        </w:tc>
+        <w:tc>
+          <w:tcPr>
+            <w:tcW w:type="dxa" w:w="3800"/>
+            <w:tcMar>
+              <w:top w:type="dxa" w:w="60"/>
+              <w:left w:type="dxa" w:w="90"/>
+              <w:bottom w:type="dxa" w:w="60"/>
+              <w:right w:type="dxa" w:w="90"/>
+            </w:tcMar>
+          </w:tcPr>
+          <w:p>
+            <w:pPr>
+              <w:keepNext/>
+              <w:jc w:val="left"/>
+            </w:pPr>
+            <w:r>
+              <w:rPr>
+                <w:rFonts w:ascii="Calibri" w:cs="Calibri" w:eastAsia="Calibri" w:hAnsi="Calibri"/>
+                <w:b w:val="false"/>
+                <w:bCs w:val="false"/>
+                <w:color w:val="000000"/>
+                <w:sz w:val="17"/>
+                <w:szCs w:val="17"/>
+              </w:rPr>
+              <w:t>Garment steamer  — part # TBD</w:t>
+            </w:r>
+          </w:p>
+        </w:tc>
+        <w:tc>
+          <w:tcPr>
+            <w:tcW w:type="dxa" w:w="3800"/>
+            <w:tcMar>
+              <w:top w:type="dxa" w:w="60"/>
+              <w:left w:type="dxa" w:w="90"/>
+              <w:bottom w:type="dxa" w:w="60"/>
+              <w:right w:type="dxa" w:w="90"/>
+            </w:tcMar>
+          </w:tcPr>
+          <w:p>
+            <w:pPr>
+              <w:keepNext/>
+              <w:jc w:val="left"/>
+            </w:pPr>
+            <w:r>
+              <w:rPr>
+                <w:rFonts w:ascii="Calibri" w:cs="Calibri" w:eastAsia="Calibri" w:hAnsi="Calibri"/>
+                <w:b w:val="false"/>
+                <w:bCs w:val="false"/>
+                <w:color w:val="000000"/>
+                <w:sz w:val="17"/>
+                <w:szCs w:val="17"/>
+              </w:rPr>
+              <w:t>Vaporizador de ropa — falta el número de parte</w:t>
+            </w:r>
+          </w:p>
+        </w:tc>
+        <w:tc>
+          <w:tcPr>
+            <w:tcW w:type="dxa" w:w="800"/>
+            <w:tcMar>
+              <w:top w:type="dxa" w:w="60"/>
+              <w:left w:type="dxa" w:w="90"/>
+              <w:bottom w:type="dxa" w:w="60"/>
+              <w:right w:type="dxa" w:w="90"/>
+            </w:tcMar>
+          </w:tcPr>
+          <w:p>
+            <w:pPr>
+              <w:keepNext/>
+              <w:jc w:val="left"/>
+            </w:pPr>
+            <w:r>
+              <w:rPr>
+                <w:rFonts w:ascii="Calibri" w:cs="Calibri" w:eastAsia="Calibri" w:hAnsi="Calibri"/>
+                <w:b w:val="false"/>
+                <w:bCs w:val="false"/>
+                <w:color w:val="000000"/>
+                <w:sz w:val="18"/>
+                <w:szCs w:val="18"/>
+              </w:rPr>
+            </w:r>
+          </w:p>
+        </w:tc>
+        <w:tc>
+          <w:tcPr>
+            <w:tcW w:type="dxa" w:w="800"/>
+            <w:tcMar>
+              <w:top w:type="dxa" w:w="60"/>
+              <w:left w:type="dxa" w:w="90"/>
+              <w:bottom w:type="dxa" w:w="60"/>
+              <w:right w:type="dxa" w:w="90"/>
+            </w:tcMar>
+          </w:tcPr>
+          <w:p>
+            <w:pPr>
+              <w:keepNext/>
+              <w:jc w:val="left"/>
+            </w:pPr>
+            <w:r>
+              <w:rPr>
+                <w:rFonts w:ascii="Calibri" w:cs="Calibri" w:eastAsia="Calibri" w:hAnsi="Calibri"/>
+                <w:b w:val="false"/>
+                <w:bCs w:val="false"/>
+                <w:color w:val="000000"/>
+                <w:sz w:val="18"/>
+                <w:szCs w:val="18"/>
+              </w:rPr>
+            </w:r>
+          </w:p>
+        </w:tc>
+      </w:tr>
+      <w:tr>
+        <w:trPr>
+          <w:cantSplit/>
+        </w:trPr>
+        <w:tc>
+          <w:tcPr>
+            <w:tcW w:type="dxa" w:w="1200"/>
+            <w:tcMar>
+              <w:top w:type="dxa" w:w="60"/>
+              <w:left w:type="dxa" w:w="90"/>
+              <w:bottom w:type="dxa" w:w="60"/>
+              <w:right w:type="dxa" w:w="90"/>
+            </w:tcMar>
+          </w:tcPr>
+          <w:p>
+            <w:pPr>
+              <w:keepNext/>
+              <w:jc w:val="left"/>
+            </w:pPr>
+            <w:r>
+              <w:rPr>
+                <w:rFonts w:ascii="Calibri" w:cs="Calibri" w:eastAsia="Calibri" w:hAnsi="Calibri"/>
+                <w:b w:val="false"/>
+                <w:bCs w:val="false"/>
+                <w:color w:val="000000"/>
+                <w:sz w:val="17"/>
+                <w:szCs w:val="17"/>
+              </w:rPr>
+              <w:t>109926</w:t>
+            </w:r>
+          </w:p>
+        </w:tc>
+        <w:tc>
+          <w:tcPr>
+            <w:tcW w:type="dxa" w:w="3800"/>
+            <w:tcMar>
+              <w:top w:type="dxa" w:w="60"/>
+              <w:left w:type="dxa" w:w="90"/>
+              <w:bottom w:type="dxa" w:w="60"/>
+              <w:right w:type="dxa" w:w="90"/>
+            </w:tcMar>
+          </w:tcPr>
+          <w:p>
+            <w:pPr>
+              <w:keepNext/>
+              <w:jc w:val="left"/>
+            </w:pPr>
+            <w:r>
+              <w:rPr>
+                <w:rFonts w:ascii="Calibri" w:cs="Calibri" w:eastAsia="Calibri" w:hAnsi="Calibri"/>
+                <w:b w:val="false"/>
+                <w:bCs w:val="false"/>
+                <w:color w:val="000000"/>
+                <w:sz w:val="17"/>
+                <w:szCs w:val="17"/>
+              </w:rPr>
+              <w:t>Full Size T-Leg Ironing Board, Charcoal Pad And Cover, 4/Cs</w:t>
+            </w:r>
+          </w:p>
+        </w:tc>
+        <w:tc>
+          <w:tcPr>
+            <w:tcW w:type="dxa" w:w="3800"/>
+            <w:tcMar>
+              <w:top w:type="dxa" w:w="60"/>
+              <w:left w:type="dxa" w:w="90"/>
+              <w:bottom w:type="dxa" w:w="60"/>
+              <w:right w:type="dxa" w:w="90"/>
+            </w:tcMar>
+          </w:tcPr>
+          <w:p>
+            <w:pPr>
+              <w:keepNext/>
+              <w:jc w:val="left"/>
+            </w:pPr>
+            <w:r>
+              <w:rPr>
+                <w:rFonts w:ascii="Calibri" w:cs="Calibri" w:eastAsia="Calibri" w:hAnsi="Calibri"/>
+                <w:b w:val="false"/>
+                <w:bCs w:val="false"/>
+                <w:color w:val="000000"/>
+                <w:sz w:val="17"/>
+                <w:szCs w:val="17"/>
+              </w:rPr>
+              <w:t>Tabla de planchar completa con patas en T, incluye forro y funda, caja de 4</w:t>
+            </w:r>
+          </w:p>
+        </w:tc>
+        <w:tc>
+          <w:tcPr>
+            <w:tcW w:type="dxa" w:w="800"/>
+            <w:tcMar>
+              <w:top w:type="dxa" w:w="60"/>
+              <w:left w:type="dxa" w:w="90"/>
+              <w:bottom w:type="dxa" w:w="60"/>
+              <w:right w:type="dxa" w:w="90"/>
+            </w:tcMar>
+          </w:tcPr>
+          <w:p>
+            <w:pPr>
+              <w:keepNext/>
+              <w:jc w:val="left"/>
+            </w:pPr>
+            <w:r>
+              <w:rPr>
+                <w:rFonts w:ascii="Calibri" w:cs="Calibri" w:eastAsia="Calibri" w:hAnsi="Calibri"/>
+                <w:b w:val="false"/>
+                <w:bCs w:val="false"/>
+                <w:color w:val="000000"/>
+                <w:sz w:val="18"/>
+                <w:szCs w:val="18"/>
+              </w:rPr>
+            </w:r>
+          </w:p>
+        </w:tc>
+        <w:tc>
+          <w:tcPr>
+            <w:tcW w:type="dxa" w:w="800"/>
+            <w:tcMar>
+              <w:top w:type="dxa" w:w="60"/>
+              <w:left w:type="dxa" w:w="90"/>
+              <w:bottom w:type="dxa" w:w="60"/>
+              <w:right w:type="dxa" w:w="90"/>
+            </w:tcMar>
+          </w:tcPr>
+          <w:p>
+            <w:pPr>
+              <w:keepNext/>
+              <w:jc w:val="left"/>
+            </w:pPr>
+            <w:r>
+              <w:rPr>
+                <w:rFonts w:ascii="Calibri" w:cs="Calibri" w:eastAsia="Calibri" w:hAnsi="Calibri"/>
+                <w:b w:val="false"/>
+                <w:bCs w:val="false"/>
+                <w:color w:val="000000"/>
+                <w:sz w:val="18"/>
+                <w:szCs w:val="18"/>
+              </w:rPr>
+            </w:r>
+          </w:p>
+        </w:tc>
+      </w:tr>
+      <w:tr>
+        <w:trPr>
+          <w:cantSplit/>
+        </w:trPr>
+        <w:tc>
+          <w:tcPr>
+            <w:tcW w:type="dxa" w:w="1200"/>
+            <w:tcMar>
+              <w:top w:type="dxa" w:w="60"/>
+              <w:left w:type="dxa" w:w="90"/>
+              <w:bottom w:type="dxa" w:w="60"/>
+              <w:right w:type="dxa" w:w="90"/>
+            </w:tcMar>
+          </w:tcPr>
+          <w:p>
+            <w:pPr>
+              <w:keepNext/>
+              <w:jc w:val="left"/>
+            </w:pPr>
+            <w:r>
+              <w:rPr>
+                <w:rFonts w:ascii="Calibri" w:cs="Calibri" w:eastAsia="Calibri" w:hAnsi="Calibri"/>
+                <w:b w:val="false"/>
+                <w:bCs w:val="false"/>
+                <w:color w:val="000000"/>
+                <w:sz w:val="17"/>
+                <w:szCs w:val="17"/>
+              </w:rPr>
+            </w:r>
+          </w:p>
+        </w:tc>
+        <w:tc>
+          <w:tcPr>
+            <w:tcW w:type="dxa" w:w="3800"/>
+            <w:tcMar>
+              <w:top w:type="dxa" w:w="60"/>
+              <w:left w:type="dxa" w:w="90"/>
+              <w:bottom w:type="dxa" w:w="60"/>
+              <w:right w:type="dxa" w:w="90"/>
+            </w:tcMar>
+          </w:tcPr>
+          <w:p>
+            <w:pPr>
+              <w:keepNext/>
+              <w:jc w:val="left"/>
+            </w:pPr>
+            <w:r>
+              <w:rPr>
+                <w:rFonts w:ascii="Calibri" w:cs="Calibri" w:eastAsia="Calibri" w:hAnsi="Calibri"/>
+                <w:b w:val="false"/>
+                <w:bCs w:val="false"/>
+                <w:color w:val="000000"/>
+                <w:sz w:val="17"/>
+                <w:szCs w:val="17"/>
+              </w:rPr>
+              <w:t>ADA accessible ironing board  — part # TBD</w:t>
+            </w:r>
+          </w:p>
+        </w:tc>
+        <w:tc>
+          <w:tcPr>
+            <w:tcW w:type="dxa" w:w="3800"/>
+            <w:tcMar>
+              <w:top w:type="dxa" w:w="60"/>
+              <w:left w:type="dxa" w:w="90"/>
+              <w:bottom w:type="dxa" w:w="60"/>
+              <w:right w:type="dxa" w:w="90"/>
+            </w:tcMar>
+          </w:tcPr>
+          <w:p>
+            <w:pPr>
+              <w:keepNext/>
+              <w:jc w:val="left"/>
+            </w:pPr>
+            <w:r>
+              <w:rPr>
+                <w:rFonts w:ascii="Calibri" w:cs="Calibri" w:eastAsia="Calibri" w:hAnsi="Calibri"/>
+                <w:b w:val="false"/>
+                <w:bCs w:val="false"/>
+                <w:color w:val="000000"/>
+                <w:sz w:val="17"/>
+                <w:szCs w:val="17"/>
+              </w:rPr>
+              <w:t>Tabla de planchar ADA (accesible, más baja) — falta el número de parte</w:t>
+            </w:r>
+          </w:p>
+        </w:tc>
+        <w:tc>
+          <w:tcPr>
+            <w:tcW w:type="dxa" w:w="800"/>
+            <w:tcMar>
+              <w:top w:type="dxa" w:w="60"/>
+              <w:left w:type="dxa" w:w="90"/>
+              <w:bottom w:type="dxa" w:w="60"/>
+              <w:right w:type="dxa" w:w="90"/>
+            </w:tcMar>
+          </w:tcPr>
+          <w:p>
+            <w:pPr>
+              <w:keepNext/>
+              <w:jc w:val="left"/>
+            </w:pPr>
+            <w:r>
+              <w:rPr>
+                <w:rFonts w:ascii="Calibri" w:cs="Calibri" w:eastAsia="Calibri" w:hAnsi="Calibri"/>
+                <w:b w:val="false"/>
+                <w:bCs w:val="false"/>
+                <w:color w:val="000000"/>
+                <w:sz w:val="18"/>
+                <w:szCs w:val="18"/>
+              </w:rPr>
+            </w:r>
+          </w:p>
+        </w:tc>
+        <w:tc>
+          <w:tcPr>
+            <w:tcW w:type="dxa" w:w="800"/>
+            <w:tcMar>
+              <w:top w:type="dxa" w:w="60"/>
+              <w:left w:type="dxa" w:w="90"/>
+              <w:bottom w:type="dxa" w:w="60"/>
+              <w:right w:type="dxa" w:w="90"/>
+            </w:tcMar>
+          </w:tcPr>
+          <w:p>
+            <w:pPr>
+              <w:keepNext/>
+              <w:jc w:val="left"/>
+            </w:pPr>
+            <w:r>
+              <w:rPr>
+                <w:rFonts w:ascii="Calibri" w:cs="Calibri" w:eastAsia="Calibri" w:hAnsi="Calibri"/>
+                <w:b w:val="false"/>
+                <w:bCs w:val="false"/>
+                <w:color w:val="000000"/>
+                <w:sz w:val="18"/>
+                <w:szCs w:val="18"/>
+              </w:rPr>
+            </w:r>
+          </w:p>
+        </w:tc>
+      </w:tr>
+      <w:tr>
+        <w:trPr>
+          <w:cantSplit/>
+        </w:trPr>
+        <w:tc>
+          <w:tcPr>
+            <w:tcW w:type="dxa" w:w="1200"/>
+            <w:tcMar>
+              <w:top w:type="dxa" w:w="60"/>
+              <w:left w:type="dxa" w:w="90"/>
+              <w:bottom w:type="dxa" w:w="60"/>
+              <w:right w:type="dxa" w:w="90"/>
+            </w:tcMar>
+          </w:tcPr>
+          <w:p>
+            <w:pPr>
+              <w:jc w:val="left"/>
+            </w:pPr>
+            <w:r>
+              <w:rPr>
+                <w:rFonts w:ascii="Calibri" w:cs="Calibri" w:eastAsia="Calibri" w:hAnsi="Calibri"/>
+                <w:b w:val="false"/>
+                <w:bCs w:val="false"/>
+                <w:color w:val="000000"/>
+                <w:sz w:val="17"/>
+                <w:szCs w:val="17"/>
+              </w:rPr>
+              <w:t>213702</w:t>
+            </w:r>
+          </w:p>
+        </w:tc>
+        <w:tc>
+          <w:tcPr>
+            <w:tcW w:type="dxa" w:w="3800"/>
+            <w:tcMar>
+              <w:top w:type="dxa" w:w="60"/>
+              <w:left w:type="dxa" w:w="90"/>
+              <w:bottom w:type="dxa" w:w="60"/>
+              <w:right w:type="dxa" w:w="90"/>
+            </w:tcMar>
+          </w:tcPr>
+          <w:p>
+            <w:pPr>
+              <w:jc w:val="left"/>
+            </w:pPr>
+            <w:r>
+              <w:rPr>
+                <w:rFonts w:ascii="Calibri" w:cs="Calibri" w:eastAsia="Calibri" w:hAnsi="Calibri"/>
+                <w:b w:val="false"/>
+                <w:bCs w:val="false"/>
+                <w:color w:val="000000"/>
+                <w:sz w:val="17"/>
+                <w:szCs w:val="17"/>
+              </w:rPr>
+              <w:t>Ironing Board Pad And Cover, Case Of 12</w:t>
+            </w:r>
+          </w:p>
+        </w:tc>
+        <w:tc>
+          <w:tcPr>
+            <w:tcW w:type="dxa" w:w="3800"/>
+            <w:tcMar>
+              <w:top w:type="dxa" w:w="60"/>
+              <w:left w:type="dxa" w:w="90"/>
+              <w:bottom w:type="dxa" w:w="60"/>
+              <w:right w:type="dxa" w:w="90"/>
+            </w:tcMar>
+          </w:tcPr>
+          <w:p>
+            <w:pPr>
+              <w:jc w:val="left"/>
+            </w:pPr>
+            <w:r>
+              <w:rPr>
+                <w:rFonts w:ascii="Calibri" w:cs="Calibri" w:eastAsia="Calibri" w:hAnsi="Calibri"/>
+                <w:b w:val="false"/>
+                <w:bCs w:val="false"/>
+                <w:color w:val="000000"/>
+                <w:sz w:val="17"/>
+                <w:szCs w:val="17"/>
+              </w:rPr>
+              <w:t>Forro y funda de repuesto para tabla de planchar, caja de 12</w:t>
+            </w:r>
+          </w:p>
+        </w:tc>
+        <w:tc>
+          <w:tcPr>
+            <w:tcW w:type="dxa" w:w="800"/>
+            <w:tcMar>
+              <w:top w:type="dxa" w:w="60"/>
+              <w:left w:type="dxa" w:w="90"/>
+              <w:bottom w:type="dxa" w:w="60"/>
+              <w:right w:type="dxa" w:w="90"/>
+            </w:tcMar>
+          </w:tcPr>
+          <w:p>
+            <w:pPr>
+              <w:jc w:val="left"/>
+            </w:pPr>
+            <w:r>
+              <w:rPr>
+                <w:rFonts w:ascii="Calibri" w:cs="Calibri" w:eastAsia="Calibri" w:hAnsi="Calibri"/>
+                <w:b w:val="false"/>
+                <w:bCs w:val="false"/>
+                <w:color w:val="000000"/>
+                <w:sz w:val="18"/>
+                <w:szCs w:val="18"/>
+              </w:rPr>
+            </w:r>
+          </w:p>
+        </w:tc>
+        <w:tc>
+          <w:tcPr>
+            <w:tcW w:type="dxa" w:w="800"/>
+            <w:tcMar>
+              <w:top w:type="dxa" w:w="60"/>
+              <w:left w:type="dxa" w:w="90"/>
+              <w:bottom w:type="dxa" w:w="60"/>
+              <w:right w:type="dxa" w:w="90"/>
+            </w:tcMar>
+          </w:tcPr>
+          <w:p>
+            <w:pPr>
+              <w:jc w:val="left"/>
+            </w:pPr>
+            <w:r>
+              <w:rPr>
+                <w:rFonts w:ascii="Calibri" w:cs="Calibri" w:eastAsia="Calibri" w:hAnsi="Calibri"/>
+                <w:b w:val="false"/>
+                <w:bCs w:val="false"/>
+                <w:color w:val="000000"/>
+                <w:sz w:val="18"/>
+                <w:szCs w:val="18"/>
+              </w:rPr>
+            </w:r>
+          </w:p>
+        </w:tc>
+      </w:tr>
+    </w:tbl>
+    <w:p>
+      <w:pPr>
+        <w:spacing w:after="120" w:before="280"/>
+      </w:pPr>
+      <w:r>
+        <w:rPr>
+          <w:rFonts w:ascii="Calibri" w:cs="Calibri" w:eastAsia="Calibri" w:hAnsi="Calibri"/>
+          <w:b/>
+          <w:bCs/>
+          <w:color w:val="1F3A5F"/>
+          <w:sz w:val="24"/>
+          <w:szCs w:val="24"/>
+        </w:rPr>
         <w:t xml:space="preserve">PERSONAL CARE &amp; HAIR CARE</w:t>
       </w:r>
       <w:r>
@@ -4502,6 +5318,7 @@
       </w:tblGrid>
       <w:tr>
         <w:trPr>
+          <w:cantSplit/>
           <w:tblHeader/>
         </w:trPr>
         <w:tc>
@@ -4517,6 +5334,7 @@
           </w:tcPr>
           <w:p>
             <w:pPr>
+              <w:keepNext/>
               <w:jc w:val="left"/>
             </w:pPr>
             <w:r>
@@ -4545,6 +5363,7 @@
           </w:tcPr>
           <w:p>
             <w:pPr>
+              <w:keepNext/>
               <w:jc w:val="left"/>
             </w:pPr>
             <w:r>
@@ -4573,6 +5392,7 @@
           </w:tcPr>
           <w:p>
             <w:pPr>
+              <w:keepNext/>
               <w:jc w:val="left"/>
             </w:pPr>
             <w:r>
@@ -4601,6 +5421,7 @@
           </w:tcPr>
           <w:p>
             <w:pPr>
+              <w:keepNext/>
               <w:jc w:val="center"/>
             </w:pPr>
             <w:r>
@@ -4629,6 +5450,7 @@
           </w:tcPr>
           <w:p>
             <w:pPr>
+              <w:keepNext/>
               <w:jc w:val="center"/>
             </w:pPr>
             <w:r>
@@ -4646,6 +5468,9 @@
         </w:tc>
       </w:tr>
       <w:tr>
+        <w:trPr>
+          <w:cantSplit/>
+        </w:trPr>
         <w:tc>
           <w:tcPr>
             <w:tcW w:type="dxa" w:w="1200"/>
@@ -4658,6 +5483,7 @@
           </w:tcPr>
           <w:p>
             <w:pPr>
+              <w:keepNext/>
               <w:jc w:val="left"/>
             </w:pPr>
             <w:r>
@@ -4685,6 +5511,7 @@
           </w:tcPr>
           <w:p>
             <w:pPr>
+              <w:keepNext/>
               <w:jc w:val="left"/>
             </w:pPr>
             <w:r>
@@ -4712,6 +5539,7 @@
           </w:tcPr>
           <w:p>
             <w:pPr>
+              <w:keepNext/>
               <w:jc w:val="left"/>
             </w:pPr>
             <w:r>
@@ -4739,33 +5567,35 @@
           </w:tcPr>
           <w:p>
             <w:pPr>
-              <w:jc w:val="left"/>
-            </w:pPr>
-            <w:r>
-              <w:rPr>
-                <w:rFonts w:ascii="Calibri" w:cs="Calibri" w:eastAsia="Calibri" w:hAnsi="Calibri"/>
-                <w:b w:val="false"/>
-                <w:bCs w:val="false"/>
-                <w:color w:val="000000"/>
-                <w:sz w:val="18"/>
-                <w:szCs w:val="18"/>
-              </w:rPr>
-              <w:t xml:space="preserve"/>
-            </w:r>
-          </w:p>
-        </w:tc>
-        <w:tc>
-          <w:tcPr>
-            <w:tcW w:type="dxa" w:w="800"/>
-            <w:tcMar>
-              <w:top w:type="dxa" w:w="60"/>
-              <w:left w:type="dxa" w:w="90"/>
-              <w:bottom w:type="dxa" w:w="60"/>
-              <w:right w:type="dxa" w:w="90"/>
-            </w:tcMar>
-          </w:tcPr>
-          <w:p>
-            <w:pPr>
+              <w:keepNext/>
+              <w:jc w:val="left"/>
+            </w:pPr>
+            <w:r>
+              <w:rPr>
+                <w:rFonts w:ascii="Calibri" w:cs="Calibri" w:eastAsia="Calibri" w:hAnsi="Calibri"/>
+                <w:b w:val="false"/>
+                <w:bCs w:val="false"/>
+                <w:color w:val="000000"/>
+                <w:sz w:val="18"/>
+                <w:szCs w:val="18"/>
+              </w:rPr>
+              <w:t xml:space="preserve"/>
+            </w:r>
+          </w:p>
+        </w:tc>
+        <w:tc>
+          <w:tcPr>
+            <w:tcW w:type="dxa" w:w="800"/>
+            <w:tcMar>
+              <w:top w:type="dxa" w:w="60"/>
+              <w:left w:type="dxa" w:w="90"/>
+              <w:bottom w:type="dxa" w:w="60"/>
+              <w:right w:type="dxa" w:w="90"/>
+            </w:tcMar>
+          </w:tcPr>
+          <w:p>
+            <w:pPr>
+              <w:keepNext/>
               <w:jc w:val="left"/>
             </w:pPr>
             <w:r>
@@ -4783,6 +5613,9 @@
         </w:tc>
       </w:tr>
       <w:tr>
+        <w:trPr>
+          <w:cantSplit/>
+        </w:trPr>
         <w:tc>
           <w:tcPr>
             <w:tcW w:type="dxa" w:w="1200"/>
@@ -4796,6 +5629,7 @@
           </w:tcPr>
           <w:p>
             <w:pPr>
+              <w:keepNext/>
               <w:jc w:val="left"/>
             </w:pPr>
             <w:r>
@@ -4824,6 +5658,7 @@
           </w:tcPr>
           <w:p>
             <w:pPr>
+              <w:keepNext/>
               <w:jc w:val="left"/>
             </w:pPr>
             <w:r>
@@ -4852,6 +5687,7 @@
           </w:tcPr>
           <w:p>
             <w:pPr>
+              <w:keepNext/>
               <w:jc w:val="left"/>
             </w:pPr>
             <w:r>
@@ -4880,6 +5716,7 @@
           </w:tcPr>
           <w:p>
             <w:pPr>
+              <w:keepNext/>
               <w:jc w:val="left"/>
             </w:pPr>
             <w:r>
@@ -4908,6 +5745,7 @@
           </w:tcPr>
           <w:p>
             <w:pPr>
+              <w:keepNext/>
               <w:jc w:val="left"/>
             </w:pPr>
             <w:r>
@@ -4925,6 +5763,9 @@
         </w:tc>
       </w:tr>
       <w:tr>
+        <w:trPr>
+          <w:cantSplit/>
+        </w:trPr>
         <w:tc>
           <w:tcPr>
             <w:tcW w:type="dxa" w:w="1200"/>
@@ -4937,6 +5778,7 @@
           </w:tcPr>
           <w:p>
             <w:pPr>
+              <w:keepNext/>
               <w:jc w:val="left"/>
             </w:pPr>
             <w:r>
@@ -4964,6 +5806,7 @@
           </w:tcPr>
           <w:p>
             <w:pPr>
+              <w:keepNext/>
               <w:jc w:val="left"/>
             </w:pPr>
             <w:r>
@@ -4991,6 +5834,7 @@
           </w:tcPr>
           <w:p>
             <w:pPr>
+              <w:keepNext/>
               <w:jc w:val="left"/>
             </w:pPr>
             <w:r>
@@ -5018,33 +5862,35 @@
           </w:tcPr>
           <w:p>
             <w:pPr>
-              <w:jc w:val="left"/>
-            </w:pPr>
-            <w:r>
-              <w:rPr>
-                <w:rFonts w:ascii="Calibri" w:cs="Calibri" w:eastAsia="Calibri" w:hAnsi="Calibri"/>
-                <w:b w:val="false"/>
-                <w:bCs w:val="false"/>
-                <w:color w:val="000000"/>
-                <w:sz w:val="18"/>
-                <w:szCs w:val="18"/>
-              </w:rPr>
-              <w:t xml:space="preserve"/>
-            </w:r>
-          </w:p>
-        </w:tc>
-        <w:tc>
-          <w:tcPr>
-            <w:tcW w:type="dxa" w:w="800"/>
-            <w:tcMar>
-              <w:top w:type="dxa" w:w="60"/>
-              <w:left w:type="dxa" w:w="90"/>
-              <w:bottom w:type="dxa" w:w="60"/>
-              <w:right w:type="dxa" w:w="90"/>
-            </w:tcMar>
-          </w:tcPr>
-          <w:p>
-            <w:pPr>
+              <w:keepNext/>
+              <w:jc w:val="left"/>
+            </w:pPr>
+            <w:r>
+              <w:rPr>
+                <w:rFonts w:ascii="Calibri" w:cs="Calibri" w:eastAsia="Calibri" w:hAnsi="Calibri"/>
+                <w:b w:val="false"/>
+                <w:bCs w:val="false"/>
+                <w:color w:val="000000"/>
+                <w:sz w:val="18"/>
+                <w:szCs w:val="18"/>
+              </w:rPr>
+              <w:t xml:space="preserve"/>
+            </w:r>
+          </w:p>
+        </w:tc>
+        <w:tc>
+          <w:tcPr>
+            <w:tcW w:type="dxa" w:w="800"/>
+            <w:tcMar>
+              <w:top w:type="dxa" w:w="60"/>
+              <w:left w:type="dxa" w:w="90"/>
+              <w:bottom w:type="dxa" w:w="60"/>
+              <w:right w:type="dxa" w:w="90"/>
+            </w:tcMar>
+          </w:tcPr>
+          <w:p>
+            <w:pPr>
+              <w:keepNext/>
               <w:jc w:val="left"/>
             </w:pPr>
             <w:r>
@@ -5062,6 +5908,9 @@
         </w:tc>
       </w:tr>
       <w:tr>
+        <w:trPr>
+          <w:cantSplit/>
+        </w:trPr>
         <w:tc>
           <w:tcPr>
             <w:tcW w:type="dxa" w:w="1200"/>
@@ -5075,6 +5924,7 @@
           </w:tcPr>
           <w:p>
             <w:pPr>
+              <w:keepNext/>
               <w:jc w:val="left"/>
             </w:pPr>
             <w:r>
@@ -5103,6 +5953,7 @@
           </w:tcPr>
           <w:p>
             <w:pPr>
+              <w:keepNext/>
               <w:jc w:val="left"/>
             </w:pPr>
             <w:r>
@@ -5131,6 +5982,7 @@
           </w:tcPr>
           <w:p>
             <w:pPr>
+              <w:keepNext/>
               <w:jc w:val="left"/>
             </w:pPr>
             <w:r>
@@ -5159,6 +6011,7 @@
           </w:tcPr>
           <w:p>
             <w:pPr>
+              <w:keepNext/>
               <w:jc w:val="left"/>
             </w:pPr>
             <w:r>
@@ -5187,6 +6040,7 @@
           </w:tcPr>
           <w:p>
             <w:pPr>
+              <w:keepNext/>
               <w:jc w:val="left"/>
             </w:pPr>
             <w:r>
@@ -5204,6 +6058,9 @@
         </w:tc>
       </w:tr>
       <w:tr>
+        <w:trPr>
+          <w:cantSplit/>
+        </w:trPr>
         <w:tc>
           <w:tcPr>
             <w:tcW w:type="dxa" w:w="1200"/>
@@ -5216,6 +6073,7 @@
           </w:tcPr>
           <w:p>
             <w:pPr>
+              <w:keepNext/>
               <w:jc w:val="left"/>
             </w:pPr>
             <w:r>
@@ -5243,6 +6101,7 @@
           </w:tcPr>
           <w:p>
             <w:pPr>
+              <w:keepNext/>
               <w:jc w:val="left"/>
             </w:pPr>
             <w:r>
@@ -5270,6 +6129,7 @@
           </w:tcPr>
           <w:p>
             <w:pPr>
+              <w:keepNext/>
               <w:jc w:val="left"/>
             </w:pPr>
             <w:r>
@@ -5297,33 +6157,35 @@
           </w:tcPr>
           <w:p>
             <w:pPr>
-              <w:jc w:val="left"/>
-            </w:pPr>
-            <w:r>
-              <w:rPr>
-                <w:rFonts w:ascii="Calibri" w:cs="Calibri" w:eastAsia="Calibri" w:hAnsi="Calibri"/>
-                <w:b w:val="false"/>
-                <w:bCs w:val="false"/>
-                <w:color w:val="000000"/>
-                <w:sz w:val="18"/>
-                <w:szCs w:val="18"/>
-              </w:rPr>
-              <w:t xml:space="preserve"/>
-            </w:r>
-          </w:p>
-        </w:tc>
-        <w:tc>
-          <w:tcPr>
-            <w:tcW w:type="dxa" w:w="800"/>
-            <w:tcMar>
-              <w:top w:type="dxa" w:w="60"/>
-              <w:left w:type="dxa" w:w="90"/>
-              <w:bottom w:type="dxa" w:w="60"/>
-              <w:right w:type="dxa" w:w="90"/>
-            </w:tcMar>
-          </w:tcPr>
-          <w:p>
-            <w:pPr>
+              <w:keepNext/>
+              <w:jc w:val="left"/>
+            </w:pPr>
+            <w:r>
+              <w:rPr>
+                <w:rFonts w:ascii="Calibri" w:cs="Calibri" w:eastAsia="Calibri" w:hAnsi="Calibri"/>
+                <w:b w:val="false"/>
+                <w:bCs w:val="false"/>
+                <w:color w:val="000000"/>
+                <w:sz w:val="18"/>
+                <w:szCs w:val="18"/>
+              </w:rPr>
+              <w:t xml:space="preserve"/>
+            </w:r>
+          </w:p>
+        </w:tc>
+        <w:tc>
+          <w:tcPr>
+            <w:tcW w:type="dxa" w:w="800"/>
+            <w:tcMar>
+              <w:top w:type="dxa" w:w="60"/>
+              <w:left w:type="dxa" w:w="90"/>
+              <w:bottom w:type="dxa" w:w="60"/>
+              <w:right w:type="dxa" w:w="90"/>
+            </w:tcMar>
+          </w:tcPr>
+          <w:p>
+            <w:pPr>
+              <w:keepNext/>
               <w:jc w:val="left"/>
             </w:pPr>
             <w:r>
@@ -5341,6 +6203,9 @@
         </w:tc>
       </w:tr>
       <w:tr>
+        <w:trPr>
+          <w:cantSplit/>
+        </w:trPr>
         <w:tc>
           <w:tcPr>
             <w:tcW w:type="dxa" w:w="1200"/>
@@ -5353,6 +6218,7 @@
           </w:tcPr>
           <w:p>
             <w:pPr>
+              <w:keepNext/>
               <w:jc w:val="left"/>
             </w:pPr>
             <w:r>
@@ -5380,6 +6246,7 @@
           </w:tcPr>
           <w:p>
             <w:pPr>
+              <w:keepNext/>
               <w:jc w:val="left"/>
             </w:pPr>
             <w:r>
@@ -5407,6 +6274,7 @@
           </w:tcPr>
           <w:p>
             <w:pPr>
+              <w:keepNext/>
               <w:jc w:val="left"/>
             </w:pPr>
             <w:r>
@@ -5434,33 +6302,35 @@
           </w:tcPr>
           <w:p>
             <w:pPr>
-              <w:jc w:val="left"/>
-            </w:pPr>
-            <w:r>
-              <w:rPr>
-                <w:rFonts w:ascii="Calibri" w:cs="Calibri" w:eastAsia="Calibri" w:hAnsi="Calibri"/>
-                <w:b w:val="false"/>
-                <w:bCs w:val="false"/>
-                <w:color w:val="000000"/>
-                <w:sz w:val="18"/>
-                <w:szCs w:val="18"/>
-              </w:rPr>
-              <w:t xml:space="preserve"/>
-            </w:r>
-          </w:p>
-        </w:tc>
-        <w:tc>
-          <w:tcPr>
-            <w:tcW w:type="dxa" w:w="800"/>
-            <w:tcMar>
-              <w:top w:type="dxa" w:w="60"/>
-              <w:left w:type="dxa" w:w="90"/>
-              <w:bottom w:type="dxa" w:w="60"/>
-              <w:right w:type="dxa" w:w="90"/>
-            </w:tcMar>
-          </w:tcPr>
-          <w:p>
-            <w:pPr>
+              <w:keepNext/>
+              <w:jc w:val="left"/>
+            </w:pPr>
+            <w:r>
+              <w:rPr>
+                <w:rFonts w:ascii="Calibri" w:cs="Calibri" w:eastAsia="Calibri" w:hAnsi="Calibri"/>
+                <w:b w:val="false"/>
+                <w:bCs w:val="false"/>
+                <w:color w:val="000000"/>
+                <w:sz w:val="18"/>
+                <w:szCs w:val="18"/>
+              </w:rPr>
+              <w:t xml:space="preserve"/>
+            </w:r>
+          </w:p>
+        </w:tc>
+        <w:tc>
+          <w:tcPr>
+            <w:tcW w:type="dxa" w:w="800"/>
+            <w:tcMar>
+              <w:top w:type="dxa" w:w="60"/>
+              <w:left w:type="dxa" w:w="90"/>
+              <w:bottom w:type="dxa" w:w="60"/>
+              <w:right w:type="dxa" w:w="90"/>
+            </w:tcMar>
+          </w:tcPr>
+          <w:p>
+            <w:pPr>
+              <w:keepNext/>
               <w:jc w:val="left"/>
             </w:pPr>
             <w:r>
@@ -5478,6 +6348,154 @@
         </w:tc>
       </w:tr>
       <w:tr>
+        <w:trPr>
+          <w:cantSplit/>
+        </w:trPr>
+        <w:tc>
+          <w:tcPr>
+            <w:tcW w:type="dxa" w:w="1200"/>
+            <w:tcMar>
+              <w:top w:type="dxa" w:w="60"/>
+              <w:left w:type="dxa" w:w="90"/>
+              <w:bottom w:type="dxa" w:w="60"/>
+              <w:right w:type="dxa" w:w="90"/>
+            </w:tcMar>
+          </w:tcPr>
+          <w:p>
+            <w:pPr>
+              <w:keepNext/>
+              <w:jc w:val="left"/>
+            </w:pPr>
+            <w:r>
+              <w:rPr>
+                <w:rFonts w:ascii="Calibri" w:cs="Calibri" w:eastAsia="Calibri" w:hAnsi="Calibri"/>
+                <w:b w:val="false"/>
+                <w:bCs w:val="false"/>
+                <w:color w:val="000000"/>
+                <w:sz w:val="17"/>
+                <w:szCs w:val="17"/>
+              </w:rPr>
+              <w:t xml:space="preserve">759270</w:t>
+            </w:r>
+          </w:p>
+        </w:tc>
+        <w:tc>
+          <w:tcPr>
+            <w:tcW w:type="dxa" w:w="3800"/>
+            <w:tcMar>
+              <w:top w:type="dxa" w:w="60"/>
+              <w:left w:type="dxa" w:w="90"/>
+              <w:bottom w:type="dxa" w:w="60"/>
+              <w:right w:type="dxa" w:w="90"/>
+            </w:tcMar>
+          </w:tcPr>
+          <w:p>
+            <w:pPr>
+              <w:keepNext/>
+              <w:jc w:val="left"/>
+            </w:pPr>
+            <w:r>
+              <w:rPr>
+                <w:rFonts w:ascii="Calibri" w:cs="Calibri" w:eastAsia="Calibri" w:hAnsi="Calibri"/>
+                <w:b w:val="false"/>
+                <w:bCs w:val="false"/>
+                <w:color w:val="000000"/>
+                <w:sz w:val="17"/>
+                <w:szCs w:val="17"/>
+              </w:rPr>
+              <w:t xml:space="preserve">17 X 1/2 Standard Hook Male Hanger, Dark Wood, Pkg Of 100</w:t>
+            </w:r>
+          </w:p>
+        </w:tc>
+        <w:tc>
+          <w:tcPr>
+            <w:tcW w:type="dxa" w:w="3800"/>
+            <w:tcMar>
+              <w:top w:type="dxa" w:w="60"/>
+              <w:left w:type="dxa" w:w="90"/>
+              <w:bottom w:type="dxa" w:w="60"/>
+              <w:right w:type="dxa" w:w="90"/>
+            </w:tcMar>
+          </w:tcPr>
+          <w:p>
+            <w:pPr>
+              <w:keepNext/>
+              <w:jc w:val="left"/>
+            </w:pPr>
+            <w:r>
+              <w:rPr>
+                <w:rFonts w:ascii="Calibri" w:cs="Calibri" w:eastAsia="Calibri" w:hAnsi="Calibri"/>
+                <w:b w:val="false"/>
+                <w:bCs w:val="false"/>
+                <w:color w:val="000000"/>
+                <w:sz w:val="17"/>
+                <w:szCs w:val="17"/>
+              </w:rPr>
+              <w:t xml:space="preserve">Gancho de madera oscura con perno fijo (macho) 17 pulg., paq. de 100</w:t>
+            </w:r>
+          </w:p>
+        </w:tc>
+        <w:tc>
+          <w:tcPr>
+            <w:tcW w:type="dxa" w:w="800"/>
+            <w:tcMar>
+              <w:top w:type="dxa" w:w="60"/>
+              <w:left w:type="dxa" w:w="90"/>
+              <w:bottom w:type="dxa" w:w="60"/>
+              <w:right w:type="dxa" w:w="90"/>
+            </w:tcMar>
+          </w:tcPr>
+          <w:p>
+            <w:pPr>
+              <w:keepNext/>
+              <w:jc w:val="left"/>
+            </w:pPr>
+            <w:r>
+              <w:rPr>
+                <w:rFonts w:ascii="Calibri" w:cs="Calibri" w:eastAsia="Calibri" w:hAnsi="Calibri"/>
+                <w:b w:val="false"/>
+                <w:bCs w:val="false"/>
+                <w:color w:val="000000"/>
+                <w:sz w:val="18"/>
+                <w:szCs w:val="18"/>
+              </w:rPr>
+              <w:t xml:space="preserve"/>
+            </w:r>
+          </w:p>
+        </w:tc>
+        <w:tc>
+          <w:tcPr>
+            <w:tcW w:type="dxa" w:w="800"/>
+            <w:tcMar>
+              <w:top w:type="dxa" w:w="60"/>
+              <w:left w:type="dxa" w:w="90"/>
+              <w:bottom w:type="dxa" w:w="60"/>
+              <w:right w:type="dxa" w:w="90"/>
+            </w:tcMar>
+          </w:tcPr>
+          <w:p>
+            <w:pPr>
+              <w:keepNext/>
+              <w:jc w:val="left"/>
+            </w:pPr>
+            <w:r>
+              <w:rPr>
+                <w:rFonts w:ascii="Calibri" w:cs="Calibri" w:eastAsia="Calibri" w:hAnsi="Calibri"/>
+                <w:b w:val="false"/>
+                <w:bCs w:val="false"/>
+                <w:color w:val="000000"/>
+                <w:sz w:val="18"/>
+                <w:szCs w:val="18"/>
+              </w:rPr>
+              <w:t xml:space="preserve"/>
+            </w:r>
+          </w:p>
+        </w:tc>
+      </w:tr>
+      <w:tr>
+        <w:trPr>
+          <w:cantSplit/>
+        </w:trPr>
         <w:tc>
           <w:tcPr>
             <w:tcW w:type="dxa" w:w="1200"/>
@@ -5491,18 +6509,19 @@
           </w:tcPr>
           <w:p>
             <w:pPr>
-              <w:jc w:val="left"/>
-            </w:pPr>
-            <w:r>
-              <w:rPr>
-                <w:rFonts w:ascii="Calibri" w:cs="Calibri" w:eastAsia="Calibri" w:hAnsi="Calibri"/>
-                <w:b w:val="false"/>
-                <w:bCs w:val="false"/>
-                <w:color w:val="000000"/>
-                <w:sz w:val="17"/>
-                <w:szCs w:val="17"/>
-              </w:rPr>
-              <w:t xml:space="preserve">183995</w:t>
+              <w:keepNext/>
+              <w:jc w:val="left"/>
+            </w:pPr>
+            <w:r>
+              <w:rPr>
+                <w:rFonts w:ascii="Calibri" w:cs="Calibri" w:eastAsia="Calibri" w:hAnsi="Calibri"/>
+                <w:b w:val="false"/>
+                <w:bCs w:val="false"/>
+                <w:color w:val="000000"/>
+                <w:sz w:val="17"/>
+                <w:szCs w:val="17"/>
+              </w:rPr>
+              <w:t xml:space="preserve">759255</w:t>
             </w:r>
           </w:p>
         </w:tc>
@@ -5519,18 +6538,19 @@
           </w:tcPr>
           <w:p>
             <w:pPr>
-              <w:jc w:val="left"/>
-            </w:pPr>
-            <w:r>
-              <w:rPr>
-                <w:rFonts w:ascii="Calibri" w:cs="Calibri" w:eastAsia="Calibri" w:hAnsi="Calibri"/>
-                <w:b w:val="false"/>
-                <w:bCs w:val="false"/>
-                <w:color w:val="000000"/>
-                <w:sz w:val="17"/>
-                <w:szCs w:val="17"/>
-              </w:rPr>
-              <w:t xml:space="preserve">Retractable Cord Iron 1100 Watt, Black</w:t>
+              <w:keepNext/>
+              <w:jc w:val="left"/>
+            </w:pPr>
+            <w:r>
+              <w:rPr>
+                <w:rFonts w:ascii="Calibri" w:cs="Calibri" w:eastAsia="Calibri" w:hAnsi="Calibri"/>
+                <w:b w:val="false"/>
+                <w:bCs w:val="false"/>
+                <w:color w:val="000000"/>
+                <w:sz w:val="17"/>
+                <w:szCs w:val="17"/>
+              </w:rPr>
+              <w:t xml:space="preserve">18 X 1/2 Standard Hook Female Hanger, Natural Wood, Pkg Of 100</w:t>
             </w:r>
           </w:p>
         </w:tc>
@@ -5547,18 +6567,19 @@
           </w:tcPr>
           <w:p>
             <w:pPr>
-              <w:jc w:val="left"/>
-            </w:pPr>
-            <w:r>
-              <w:rPr>
-                <w:rFonts w:ascii="Calibri" w:cs="Calibri" w:eastAsia="Calibri" w:hAnsi="Calibri"/>
-                <w:b w:val="false"/>
-                <w:bCs w:val="false"/>
-                <w:color w:val="000000"/>
-                <w:sz w:val="17"/>
-                <w:szCs w:val="17"/>
-              </w:rPr>
-              <w:t xml:space="preserve">Plancha con cable retráctil 1100 W, negra</w:t>
+              <w:keepNext/>
+              <w:jc w:val="left"/>
+            </w:pPr>
+            <w:r>
+              <w:rPr>
+                <w:rFonts w:ascii="Calibri" w:cs="Calibri" w:eastAsia="Calibri" w:hAnsi="Calibri"/>
+                <w:b w:val="false"/>
+                <w:bCs w:val="false"/>
+                <w:color w:val="000000"/>
+                <w:sz w:val="17"/>
+                <w:szCs w:val="17"/>
+              </w:rPr>
+              <w:t xml:space="preserve">Gancho de madera natural con argolla (hembra) 18 pulg., paq. de 100</w:t>
             </w:r>
           </w:p>
         </w:tc>
@@ -5575,6 +6596,7 @@
           </w:tcPr>
           <w:p>
             <w:pPr>
+              <w:keepNext/>
               <w:jc w:val="left"/>
             </w:pPr>
             <w:r>
@@ -5603,6 +6625,7 @@
           </w:tcPr>
           <w:p>
             <w:pPr>
+              <w:keepNext/>
               <w:jc w:val="left"/>
             </w:pPr>
             <w:r>
@@ -5620,6 +6643,154 @@
         </w:tc>
       </w:tr>
       <w:tr>
+        <w:trPr>
+          <w:cantSplit/>
+        </w:trPr>
+        <w:tc>
+          <w:tcPr>
+            <w:tcW w:type="dxa" w:w="1200"/>
+            <w:tcMar>
+              <w:top w:type="dxa" w:w="60"/>
+              <w:left w:type="dxa" w:w="90"/>
+              <w:bottom w:type="dxa" w:w="60"/>
+              <w:right w:type="dxa" w:w="90"/>
+            </w:tcMar>
+          </w:tcPr>
+          <w:p>
+            <w:pPr>
+              <w:keepNext/>
+              <w:jc w:val="left"/>
+            </w:pPr>
+            <w:r>
+              <w:rPr>
+                <w:rFonts w:ascii="Calibri" w:cs="Calibri" w:eastAsia="Calibri" w:hAnsi="Calibri"/>
+                <w:b w:val="false"/>
+                <w:bCs w:val="false"/>
+                <w:color w:val="000000"/>
+                <w:sz w:val="17"/>
+                <w:szCs w:val="17"/>
+              </w:rPr>
+              <w:t xml:space="preserve">759250</w:t>
+            </w:r>
+          </w:p>
+        </w:tc>
+        <w:tc>
+          <w:tcPr>
+            <w:tcW w:type="dxa" w:w="3800"/>
+            <w:tcMar>
+              <w:top w:type="dxa" w:w="60"/>
+              <w:left w:type="dxa" w:w="90"/>
+              <w:bottom w:type="dxa" w:w="60"/>
+              <w:right w:type="dxa" w:w="90"/>
+            </w:tcMar>
+          </w:tcPr>
+          <w:p>
+            <w:pPr>
+              <w:keepNext/>
+              <w:jc w:val="left"/>
+            </w:pPr>
+            <w:r>
+              <w:rPr>
+                <w:rFonts w:ascii="Calibri" w:cs="Calibri" w:eastAsia="Calibri" w:hAnsi="Calibri"/>
+                <w:b w:val="false"/>
+                <w:bCs w:val="false"/>
+                <w:color w:val="000000"/>
+                <w:sz w:val="17"/>
+                <w:szCs w:val="17"/>
+              </w:rPr>
+              <w:t xml:space="preserve">18 X 1/2 Standard Hook Male Hanger, Natural Wood, Pkg Of 100</w:t>
+            </w:r>
+          </w:p>
+        </w:tc>
+        <w:tc>
+          <w:tcPr>
+            <w:tcW w:type="dxa" w:w="3800"/>
+            <w:tcMar>
+              <w:top w:type="dxa" w:w="60"/>
+              <w:left w:type="dxa" w:w="90"/>
+              <w:bottom w:type="dxa" w:w="60"/>
+              <w:right w:type="dxa" w:w="90"/>
+            </w:tcMar>
+          </w:tcPr>
+          <w:p>
+            <w:pPr>
+              <w:keepNext/>
+              <w:jc w:val="left"/>
+            </w:pPr>
+            <w:r>
+              <w:rPr>
+                <w:rFonts w:ascii="Calibri" w:cs="Calibri" w:eastAsia="Calibri" w:hAnsi="Calibri"/>
+                <w:b w:val="false"/>
+                <w:bCs w:val="false"/>
+                <w:color w:val="000000"/>
+                <w:sz w:val="17"/>
+                <w:szCs w:val="17"/>
+              </w:rPr>
+              <w:t xml:space="preserve">Gancho de madera natural con perno fijo (macho) 18 pulg., paq. de 100</w:t>
+            </w:r>
+          </w:p>
+        </w:tc>
+        <w:tc>
+          <w:tcPr>
+            <w:tcW w:type="dxa" w:w="800"/>
+            <w:tcMar>
+              <w:top w:type="dxa" w:w="60"/>
+              <w:left w:type="dxa" w:w="90"/>
+              <w:bottom w:type="dxa" w:w="60"/>
+              <w:right w:type="dxa" w:w="90"/>
+            </w:tcMar>
+          </w:tcPr>
+          <w:p>
+            <w:pPr>
+              <w:keepNext/>
+              <w:jc w:val="left"/>
+            </w:pPr>
+            <w:r>
+              <w:rPr>
+                <w:rFonts w:ascii="Calibri" w:cs="Calibri" w:eastAsia="Calibri" w:hAnsi="Calibri"/>
+                <w:b w:val="false"/>
+                <w:bCs w:val="false"/>
+                <w:color w:val="000000"/>
+                <w:sz w:val="18"/>
+                <w:szCs w:val="18"/>
+              </w:rPr>
+              <w:t xml:space="preserve"/>
+            </w:r>
+          </w:p>
+        </w:tc>
+        <w:tc>
+          <w:tcPr>
+            <w:tcW w:type="dxa" w:w="800"/>
+            <w:tcMar>
+              <w:top w:type="dxa" w:w="60"/>
+              <w:left w:type="dxa" w:w="90"/>
+              <w:bottom w:type="dxa" w:w="60"/>
+              <w:right w:type="dxa" w:w="90"/>
+            </w:tcMar>
+          </w:tcPr>
+          <w:p>
+            <w:pPr>
+              <w:keepNext/>
+              <w:jc w:val="left"/>
+            </w:pPr>
+            <w:r>
+              <w:rPr>
+                <w:rFonts w:ascii="Calibri" w:cs="Calibri" w:eastAsia="Calibri" w:hAnsi="Calibri"/>
+                <w:b w:val="false"/>
+                <w:bCs w:val="false"/>
+                <w:color w:val="000000"/>
+                <w:sz w:val="18"/>
+                <w:szCs w:val="18"/>
+              </w:rPr>
+              <w:t xml:space="preserve"/>
+            </w:r>
+          </w:p>
+        </w:tc>
+      </w:tr>
+      <w:tr>
+        <w:trPr>
+          <w:cantSplit/>
+        </w:trPr>
         <w:tc>
           <w:tcPr>
             <w:tcW w:type="dxa" w:w="1200"/>
@@ -5633,18 +6804,19 @@
           </w:tcPr>
           <w:p>
             <w:pPr>
-              <w:jc w:val="left"/>
-            </w:pPr>
-            <w:r>
-              <w:rPr>
-                <w:rFonts w:ascii="Calibri" w:cs="Calibri" w:eastAsia="Calibri" w:hAnsi="Calibri"/>
-                <w:b w:val="false"/>
-                <w:bCs w:val="false"/>
-                <w:color w:val="000000"/>
-                <w:sz w:val="17"/>
-                <w:szCs w:val="17"/>
-              </w:rPr>
-              <w:t>180327</w:t>
+              <w:keepNext/>
+              <w:jc w:val="left"/>
+            </w:pPr>
+            <w:r>
+              <w:rPr>
+                <w:rFonts w:ascii="Calibri" w:cs="Calibri" w:eastAsia="Calibri" w:hAnsi="Calibri"/>
+                <w:b w:val="false"/>
+                <w:bCs w:val="false"/>
+                <w:color w:val="000000"/>
+                <w:sz w:val="17"/>
+                <w:szCs w:val="17"/>
+              </w:rPr>
+              <w:t xml:space="preserve">357248</w:t>
             </w:r>
           </w:p>
         </w:tc>
@@ -5661,18 +6833,19 @@
           </w:tcPr>
           <w:p>
             <w:pPr>
-              <w:jc w:val="left"/>
-            </w:pPr>
-            <w:r>
-              <w:rPr>
-                <w:rFonts w:ascii="Calibri" w:cs="Calibri" w:eastAsia="Calibri" w:hAnsi="Calibri"/>
-                <w:b w:val="false"/>
-                <w:bCs w:val="false"/>
-                <w:color w:val="000000"/>
-                <w:sz w:val="17"/>
-                <w:szCs w:val="17"/>
-              </w:rPr>
-              <w:t>Commercial Steam/Mist Iron, White/Blue</w:t>
+              <w:keepNext/>
+              <w:jc w:val="left"/>
+            </w:pPr>
+            <w:r>
+              <w:rPr>
+                <w:rFonts w:ascii="Calibri" w:cs="Calibri" w:eastAsia="Calibri" w:hAnsi="Calibri"/>
+                <w:b w:val="false"/>
+                <w:bCs w:val="false"/>
+                <w:color w:val="000000"/>
+                <w:sz w:val="17"/>
+                <w:szCs w:val="17"/>
+              </w:rPr>
+              <w:t xml:space="preserve">Memo Pad, Case Of 500</w:t>
             </w:r>
           </w:p>
         </w:tc>
@@ -5689,18 +6862,19 @@
           </w:tcPr>
           <w:p>
             <w:pPr>
-              <w:jc w:val="left"/>
-            </w:pPr>
-            <w:r>
-              <w:rPr>
-                <w:rFonts w:ascii="Calibri" w:cs="Calibri" w:eastAsia="Calibri" w:hAnsi="Calibri"/>
-                <w:b w:val="false"/>
-                <w:bCs w:val="false"/>
-                <w:color w:val="000000"/>
-                <w:sz w:val="17"/>
-                <w:szCs w:val="17"/>
-              </w:rPr>
-              <w:t>Plancha comercial de vapor/rocío, blanca/azul</w:t>
+              <w:keepNext/>
+              <w:jc w:val="left"/>
+            </w:pPr>
+            <w:r>
+              <w:rPr>
+                <w:rFonts w:ascii="Calibri" w:cs="Calibri" w:eastAsia="Calibri" w:hAnsi="Calibri"/>
+                <w:b w:val="false"/>
+                <w:bCs w:val="false"/>
+                <w:color w:val="000000"/>
+                <w:sz w:val="17"/>
+                <w:szCs w:val="17"/>
+              </w:rPr>
+              <w:t xml:space="preserve">Bloc de notas, caja de 500</w:t>
             </w:r>
           </w:p>
         </w:tc>
@@ -5717,17 +6891,19 @@
           </w:tcPr>
           <w:p>
             <w:pPr>
-              <w:jc w:val="left"/>
-            </w:pPr>
-            <w:r>
-              <w:rPr>
-                <w:rFonts w:ascii="Calibri" w:cs="Calibri" w:eastAsia="Calibri" w:hAnsi="Calibri"/>
-                <w:b w:val="false"/>
-                <w:bCs w:val="false"/>
-                <w:color w:val="000000"/>
-                <w:sz w:val="18"/>
-                <w:szCs w:val="18"/>
-              </w:rPr>
+              <w:keepNext/>
+              <w:jc w:val="left"/>
+            </w:pPr>
+            <w:r>
+              <w:rPr>
+                <w:rFonts w:ascii="Calibri" w:cs="Calibri" w:eastAsia="Calibri" w:hAnsi="Calibri"/>
+                <w:b w:val="false"/>
+                <w:bCs w:val="false"/>
+                <w:color w:val="000000"/>
+                <w:sz w:val="18"/>
+                <w:szCs w:val="18"/>
+              </w:rPr>
+              <w:t xml:space="preserve"/>
             </w:r>
           </w:p>
         </w:tc>
@@ -5744,22 +6920,27 @@
           </w:tcPr>
           <w:p>
             <w:pPr>
-              <w:jc w:val="left"/>
-            </w:pPr>
-            <w:r>
-              <w:rPr>
-                <w:rFonts w:ascii="Calibri" w:cs="Calibri" w:eastAsia="Calibri" w:hAnsi="Calibri"/>
-                <w:b w:val="false"/>
-                <w:bCs w:val="false"/>
-                <w:color w:val="000000"/>
-                <w:sz w:val="18"/>
-                <w:szCs w:val="18"/>
-              </w:rPr>
+              <w:keepNext/>
+              <w:jc w:val="left"/>
+            </w:pPr>
+            <w:r>
+              <w:rPr>
+                <w:rFonts w:ascii="Calibri" w:cs="Calibri" w:eastAsia="Calibri" w:hAnsi="Calibri"/>
+                <w:b w:val="false"/>
+                <w:bCs w:val="false"/>
+                <w:color w:val="000000"/>
+                <w:sz w:val="18"/>
+                <w:szCs w:val="18"/>
+              </w:rPr>
+              <w:t xml:space="preserve"/>
             </w:r>
           </w:p>
         </w:tc>
       </w:tr>
       <w:tr>
+        <w:trPr>
+          <w:cantSplit/>
+        </w:trPr>
         <w:tc>
           <w:tcPr>
             <w:tcW w:type="dxa" w:w="1200"/>
@@ -5772,114 +6953,119 @@
           </w:tcPr>
           <w:p>
             <w:pPr>
-              <w:jc w:val="left"/>
-            </w:pPr>
-            <w:r>
-              <w:rPr>
-                <w:rFonts w:ascii="Calibri" w:cs="Calibri" w:eastAsia="Calibri" w:hAnsi="Calibri"/>
-                <w:b w:val="false"/>
-                <w:bCs w:val="false"/>
-                <w:color w:val="000000"/>
-                <w:sz w:val="17"/>
-                <w:szCs w:val="17"/>
-              </w:rPr>
-              <w:t xml:space="preserve">759270</w:t>
-            </w:r>
-          </w:p>
-        </w:tc>
-        <w:tc>
-          <w:tcPr>
-            <w:tcW w:type="dxa" w:w="3800"/>
-            <w:tcMar>
-              <w:top w:type="dxa" w:w="60"/>
-              <w:left w:type="dxa" w:w="90"/>
-              <w:bottom w:type="dxa" w:w="60"/>
-              <w:right w:type="dxa" w:w="90"/>
-            </w:tcMar>
-          </w:tcPr>
-          <w:p>
-            <w:pPr>
-              <w:jc w:val="left"/>
-            </w:pPr>
-            <w:r>
-              <w:rPr>
-                <w:rFonts w:ascii="Calibri" w:cs="Calibri" w:eastAsia="Calibri" w:hAnsi="Calibri"/>
-                <w:b w:val="false"/>
-                <w:bCs w:val="false"/>
-                <w:color w:val="000000"/>
-                <w:sz w:val="17"/>
-                <w:szCs w:val="17"/>
-              </w:rPr>
-              <w:t xml:space="preserve">17 X 1/2 Standard Hook Male Hanger, Dark Wood, Pkg Of 100</w:t>
-            </w:r>
-          </w:p>
-        </w:tc>
-        <w:tc>
-          <w:tcPr>
-            <w:tcW w:type="dxa" w:w="3800"/>
-            <w:tcMar>
-              <w:top w:type="dxa" w:w="60"/>
-              <w:left w:type="dxa" w:w="90"/>
-              <w:bottom w:type="dxa" w:w="60"/>
-              <w:right w:type="dxa" w:w="90"/>
-            </w:tcMar>
-          </w:tcPr>
-          <w:p>
-            <w:pPr>
-              <w:jc w:val="left"/>
-            </w:pPr>
-            <w:r>
-              <w:rPr>
-                <w:rFonts w:ascii="Calibri" w:cs="Calibri" w:eastAsia="Calibri" w:hAnsi="Calibri"/>
-                <w:b w:val="false"/>
-                <w:bCs w:val="false"/>
-                <w:color w:val="000000"/>
-                <w:sz w:val="17"/>
-                <w:szCs w:val="17"/>
-              </w:rPr>
-              <w:t xml:space="preserve">Gancho de madera oscura con perno fijo (macho) 17 pulg., paq. de 100</w:t>
-            </w:r>
-          </w:p>
-        </w:tc>
-        <w:tc>
-          <w:tcPr>
-            <w:tcW w:type="dxa" w:w="800"/>
-            <w:tcMar>
-              <w:top w:type="dxa" w:w="60"/>
-              <w:left w:type="dxa" w:w="90"/>
-              <w:bottom w:type="dxa" w:w="60"/>
-              <w:right w:type="dxa" w:w="90"/>
-            </w:tcMar>
-          </w:tcPr>
-          <w:p>
-            <w:pPr>
-              <w:jc w:val="left"/>
-            </w:pPr>
-            <w:r>
-              <w:rPr>
-                <w:rFonts w:ascii="Calibri" w:cs="Calibri" w:eastAsia="Calibri" w:hAnsi="Calibri"/>
-                <w:b w:val="false"/>
-                <w:bCs w:val="false"/>
-                <w:color w:val="000000"/>
-                <w:sz w:val="18"/>
-                <w:szCs w:val="18"/>
-              </w:rPr>
-              <w:t xml:space="preserve"/>
-            </w:r>
-          </w:p>
-        </w:tc>
-        <w:tc>
-          <w:tcPr>
-            <w:tcW w:type="dxa" w:w="800"/>
-            <w:tcMar>
-              <w:top w:type="dxa" w:w="60"/>
-              <w:left w:type="dxa" w:w="90"/>
-              <w:bottom w:type="dxa" w:w="60"/>
-              <w:right w:type="dxa" w:w="90"/>
-            </w:tcMar>
-          </w:tcPr>
-          <w:p>
-            <w:pPr>
+              <w:keepNext/>
+              <w:jc w:val="left"/>
+            </w:pPr>
+            <w:r>
+              <w:rPr>
+                <w:rFonts w:ascii="Calibri" w:cs="Calibri" w:eastAsia="Calibri" w:hAnsi="Calibri"/>
+                <w:b w:val="false"/>
+                <w:bCs w:val="false"/>
+                <w:color w:val="000000"/>
+                <w:sz w:val="17"/>
+                <w:szCs w:val="17"/>
+              </w:rPr>
+              <w:t xml:space="preserve">751733</w:t>
+            </w:r>
+          </w:p>
+        </w:tc>
+        <w:tc>
+          <w:tcPr>
+            <w:tcW w:type="dxa" w:w="3800"/>
+            <w:tcMar>
+              <w:top w:type="dxa" w:w="60"/>
+              <w:left w:type="dxa" w:w="90"/>
+              <w:bottom w:type="dxa" w:w="60"/>
+              <w:right w:type="dxa" w:w="90"/>
+            </w:tcMar>
+          </w:tcPr>
+          <w:p>
+            <w:pPr>
+              <w:keepNext/>
+              <w:jc w:val="left"/>
+            </w:pPr>
+            <w:r>
+              <w:rPr>
+                <w:rFonts w:ascii="Calibri" w:cs="Calibri" w:eastAsia="Calibri" w:hAnsi="Calibri"/>
+                <w:b w:val="false"/>
+                <w:bCs w:val="false"/>
+                <w:color w:val="000000"/>
+                <w:sz w:val="17"/>
+                <w:szCs w:val="17"/>
+              </w:rPr>
+              <w:t xml:space="preserve">Pen, Case Of 500</w:t>
+            </w:r>
+          </w:p>
+        </w:tc>
+        <w:tc>
+          <w:tcPr>
+            <w:tcW w:type="dxa" w:w="3800"/>
+            <w:tcMar>
+              <w:top w:type="dxa" w:w="60"/>
+              <w:left w:type="dxa" w:w="90"/>
+              <w:bottom w:type="dxa" w:w="60"/>
+              <w:right w:type="dxa" w:w="90"/>
+            </w:tcMar>
+          </w:tcPr>
+          <w:p>
+            <w:pPr>
+              <w:keepNext/>
+              <w:jc w:val="left"/>
+            </w:pPr>
+            <w:r>
+              <w:rPr>
+                <w:rFonts w:ascii="Calibri" w:cs="Calibri" w:eastAsia="Calibri" w:hAnsi="Calibri"/>
+                <w:b w:val="false"/>
+                <w:bCs w:val="false"/>
+                <w:color w:val="000000"/>
+                <w:sz w:val="17"/>
+                <w:szCs w:val="17"/>
+              </w:rPr>
+              <w:t xml:space="preserve">Bolígrafo, caja de 500</w:t>
+            </w:r>
+          </w:p>
+        </w:tc>
+        <w:tc>
+          <w:tcPr>
+            <w:tcW w:type="dxa" w:w="800"/>
+            <w:tcMar>
+              <w:top w:type="dxa" w:w="60"/>
+              <w:left w:type="dxa" w:w="90"/>
+              <w:bottom w:type="dxa" w:w="60"/>
+              <w:right w:type="dxa" w:w="90"/>
+            </w:tcMar>
+          </w:tcPr>
+          <w:p>
+            <w:pPr>
+              <w:keepNext/>
+              <w:jc w:val="left"/>
+            </w:pPr>
+            <w:r>
+              <w:rPr>
+                <w:rFonts w:ascii="Calibri" w:cs="Calibri" w:eastAsia="Calibri" w:hAnsi="Calibri"/>
+                <w:b w:val="false"/>
+                <w:bCs w:val="false"/>
+                <w:color w:val="000000"/>
+                <w:sz w:val="18"/>
+                <w:szCs w:val="18"/>
+              </w:rPr>
+              <w:t xml:space="preserve"/>
+            </w:r>
+          </w:p>
+        </w:tc>
+        <w:tc>
+          <w:tcPr>
+            <w:tcW w:type="dxa" w:w="800"/>
+            <w:tcMar>
+              <w:top w:type="dxa" w:w="60"/>
+              <w:left w:type="dxa" w:w="90"/>
+              <w:bottom w:type="dxa" w:w="60"/>
+              <w:right w:type="dxa" w:w="90"/>
+            </w:tcMar>
+          </w:tcPr>
+          <w:p>
+            <w:pPr>
+              <w:keepNext/>
               <w:jc w:val="left"/>
             </w:pPr>
             <w:r>
@@ -5897,6 +7083,9 @@
         </w:tc>
       </w:tr>
       <w:tr>
+        <w:trPr>
+          <w:cantSplit/>
+        </w:trPr>
         <w:tc>
           <w:tcPr>
             <w:tcW w:type="dxa" w:w="1200"/>
@@ -5910,18 +7099,19 @@
           </w:tcPr>
           <w:p>
             <w:pPr>
-              <w:jc w:val="left"/>
-            </w:pPr>
-            <w:r>
-              <w:rPr>
-                <w:rFonts w:ascii="Calibri" w:cs="Calibri" w:eastAsia="Calibri" w:hAnsi="Calibri"/>
-                <w:b w:val="false"/>
-                <w:bCs w:val="false"/>
-                <w:color w:val="000000"/>
-                <w:sz w:val="17"/>
-                <w:szCs w:val="17"/>
-              </w:rPr>
-              <w:t xml:space="preserve">759255</w:t>
+              <w:keepNext/>
+              <w:jc w:val="left"/>
+            </w:pPr>
+            <w:r>
+              <w:rPr>
+                <w:rFonts w:ascii="Calibri" w:cs="Calibri" w:eastAsia="Calibri" w:hAnsi="Calibri"/>
+                <w:b w:val="false"/>
+                <w:bCs w:val="false"/>
+                <w:color w:val="000000"/>
+                <w:sz w:val="17"/>
+                <w:szCs w:val="17"/>
+              </w:rPr>
+              <w:t xml:space="preserve">214847</w:t>
             </w:r>
           </w:p>
         </w:tc>
@@ -5938,18 +7128,19 @@
           </w:tcPr>
           <w:p>
             <w:pPr>
-              <w:jc w:val="left"/>
-            </w:pPr>
-            <w:r>
-              <w:rPr>
-                <w:rFonts w:ascii="Calibri" w:cs="Calibri" w:eastAsia="Calibri" w:hAnsi="Calibri"/>
-                <w:b w:val="false"/>
-                <w:bCs w:val="false"/>
-                <w:color w:val="000000"/>
-                <w:sz w:val="17"/>
-                <w:szCs w:val="17"/>
-              </w:rPr>
-              <w:t xml:space="preserve">18 X 1/2 Standard Hook Female Hanger, Natural Wood, Pkg Of 100</w:t>
+              <w:keepNext/>
+              <w:jc w:val="left"/>
+            </w:pPr>
+            <w:r>
+              <w:rPr>
+                <w:rFonts w:ascii="Calibri" w:cs="Calibri" w:eastAsia="Calibri" w:hAnsi="Calibri"/>
+                <w:b w:val="false"/>
+                <w:bCs w:val="false"/>
+                <w:color w:val="000000"/>
+                <w:sz w:val="17"/>
+                <w:szCs w:val="17"/>
+              </w:rPr>
+              <w:t xml:space="preserve">Shower Brackets, Case Of 43</w:t>
             </w:r>
           </w:p>
         </w:tc>
@@ -5966,18 +7157,19 @@
           </w:tcPr>
           <w:p>
             <w:pPr>
-              <w:jc w:val="left"/>
-            </w:pPr>
-            <w:r>
-              <w:rPr>
-                <w:rFonts w:ascii="Calibri" w:cs="Calibri" w:eastAsia="Calibri" w:hAnsi="Calibri"/>
-                <w:b w:val="false"/>
-                <w:bCs w:val="false"/>
-                <w:color w:val="000000"/>
-                <w:sz w:val="17"/>
-                <w:szCs w:val="17"/>
-              </w:rPr>
-              <w:t xml:space="preserve">Gancho de madera natural con argolla (hembra) 18 pulg., paq. de 100</w:t>
+              <w:keepNext/>
+              <w:jc w:val="left"/>
+            </w:pPr>
+            <w:r>
+              <w:rPr>
+                <w:rFonts w:ascii="Calibri" w:cs="Calibri" w:eastAsia="Calibri" w:hAnsi="Calibri"/>
+                <w:b w:val="false"/>
+                <w:bCs w:val="false"/>
+                <w:color w:val="000000"/>
+                <w:sz w:val="17"/>
+                <w:szCs w:val="17"/>
+              </w:rPr>
+              <w:t xml:space="preserve">Soportes de pared para los dispensadores de la ducha, caja de 43</w:t>
             </w:r>
           </w:p>
         </w:tc>
@@ -5994,6 +7186,7 @@
           </w:tcPr>
           <w:p>
             <w:pPr>
+              <w:keepNext/>
               <w:jc w:val="left"/>
             </w:pPr>
             <w:r>
@@ -6022,6 +7215,7 @@
           </w:tcPr>
           <w:p>
             <w:pPr>
+              <w:keepNext/>
               <w:jc w:val="left"/>
             </w:pPr>
             <w:r>
@@ -6039,564 +7233,9 @@
         </w:tc>
       </w:tr>
       <w:tr>
-        <w:tc>
-          <w:tcPr>
-            <w:tcW w:type="dxa" w:w="1200"/>
-            <w:tcMar>
-              <w:top w:type="dxa" w:w="60"/>
-              <w:left w:type="dxa" w:w="90"/>
-              <w:bottom w:type="dxa" w:w="60"/>
-              <w:right w:type="dxa" w:w="90"/>
-            </w:tcMar>
-          </w:tcPr>
-          <w:p>
-            <w:pPr>
-              <w:jc w:val="left"/>
-            </w:pPr>
-            <w:r>
-              <w:rPr>
-                <w:rFonts w:ascii="Calibri" w:cs="Calibri" w:eastAsia="Calibri" w:hAnsi="Calibri"/>
-                <w:b w:val="false"/>
-                <w:bCs w:val="false"/>
-                <w:color w:val="000000"/>
-                <w:sz w:val="17"/>
-                <w:szCs w:val="17"/>
-              </w:rPr>
-              <w:t xml:space="preserve">759250</w:t>
-            </w:r>
-          </w:p>
-        </w:tc>
-        <w:tc>
-          <w:tcPr>
-            <w:tcW w:type="dxa" w:w="3800"/>
-            <w:tcMar>
-              <w:top w:type="dxa" w:w="60"/>
-              <w:left w:type="dxa" w:w="90"/>
-              <w:bottom w:type="dxa" w:w="60"/>
-              <w:right w:type="dxa" w:w="90"/>
-            </w:tcMar>
-          </w:tcPr>
-          <w:p>
-            <w:pPr>
-              <w:jc w:val="left"/>
-            </w:pPr>
-            <w:r>
-              <w:rPr>
-                <w:rFonts w:ascii="Calibri" w:cs="Calibri" w:eastAsia="Calibri" w:hAnsi="Calibri"/>
-                <w:b w:val="false"/>
-                <w:bCs w:val="false"/>
-                <w:color w:val="000000"/>
-                <w:sz w:val="17"/>
-                <w:szCs w:val="17"/>
-              </w:rPr>
-              <w:t xml:space="preserve">18 X 1/2 Standard Hook Male Hanger, Natural Wood, Pkg Of 100</w:t>
-            </w:r>
-          </w:p>
-        </w:tc>
-        <w:tc>
-          <w:tcPr>
-            <w:tcW w:type="dxa" w:w="3800"/>
-            <w:tcMar>
-              <w:top w:type="dxa" w:w="60"/>
-              <w:left w:type="dxa" w:w="90"/>
-              <w:bottom w:type="dxa" w:w="60"/>
-              <w:right w:type="dxa" w:w="90"/>
-            </w:tcMar>
-          </w:tcPr>
-          <w:p>
-            <w:pPr>
-              <w:jc w:val="left"/>
-            </w:pPr>
-            <w:r>
-              <w:rPr>
-                <w:rFonts w:ascii="Calibri" w:cs="Calibri" w:eastAsia="Calibri" w:hAnsi="Calibri"/>
-                <w:b w:val="false"/>
-                <w:bCs w:val="false"/>
-                <w:color w:val="000000"/>
-                <w:sz w:val="17"/>
-                <w:szCs w:val="17"/>
-              </w:rPr>
-              <w:t xml:space="preserve">Gancho de madera natural con perno fijo (macho) 18 pulg., paq. de 100</w:t>
-            </w:r>
-          </w:p>
-        </w:tc>
-        <w:tc>
-          <w:tcPr>
-            <w:tcW w:type="dxa" w:w="800"/>
-            <w:tcMar>
-              <w:top w:type="dxa" w:w="60"/>
-              <w:left w:type="dxa" w:w="90"/>
-              <w:bottom w:type="dxa" w:w="60"/>
-              <w:right w:type="dxa" w:w="90"/>
-            </w:tcMar>
-          </w:tcPr>
-          <w:p>
-            <w:pPr>
-              <w:jc w:val="left"/>
-            </w:pPr>
-            <w:r>
-              <w:rPr>
-                <w:rFonts w:ascii="Calibri" w:cs="Calibri" w:eastAsia="Calibri" w:hAnsi="Calibri"/>
-                <w:b w:val="false"/>
-                <w:bCs w:val="false"/>
-                <w:color w:val="000000"/>
-                <w:sz w:val="18"/>
-                <w:szCs w:val="18"/>
-              </w:rPr>
-              <w:t xml:space="preserve"/>
-            </w:r>
-          </w:p>
-        </w:tc>
-        <w:tc>
-          <w:tcPr>
-            <w:tcW w:type="dxa" w:w="800"/>
-            <w:tcMar>
-              <w:top w:type="dxa" w:w="60"/>
-              <w:left w:type="dxa" w:w="90"/>
-              <w:bottom w:type="dxa" w:w="60"/>
-              <w:right w:type="dxa" w:w="90"/>
-            </w:tcMar>
-          </w:tcPr>
-          <w:p>
-            <w:pPr>
-              <w:jc w:val="left"/>
-            </w:pPr>
-            <w:r>
-              <w:rPr>
-                <w:rFonts w:ascii="Calibri" w:cs="Calibri" w:eastAsia="Calibri" w:hAnsi="Calibri"/>
-                <w:b w:val="false"/>
-                <w:bCs w:val="false"/>
-                <w:color w:val="000000"/>
-                <w:sz w:val="18"/>
-                <w:szCs w:val="18"/>
-              </w:rPr>
-              <w:t xml:space="preserve"/>
-            </w:r>
-          </w:p>
-        </w:tc>
-      </w:tr>
-      <w:tr>
-        <w:tc>
-          <w:tcPr>
-            <w:tcW w:type="dxa" w:w="1200"/>
-            <w:shd w:fill="F5F7FA" w:color="auto" w:val="clear"/>
-            <w:tcMar>
-              <w:top w:type="dxa" w:w="60"/>
-              <w:left w:type="dxa" w:w="90"/>
-              <w:bottom w:type="dxa" w:w="60"/>
-              <w:right w:type="dxa" w:w="90"/>
-            </w:tcMar>
-          </w:tcPr>
-          <w:p>
-            <w:pPr>
-              <w:jc w:val="left"/>
-            </w:pPr>
-            <w:r>
-              <w:rPr>
-                <w:rFonts w:ascii="Calibri" w:cs="Calibri" w:eastAsia="Calibri" w:hAnsi="Calibri"/>
-                <w:b w:val="false"/>
-                <w:bCs w:val="false"/>
-                <w:color w:val="000000"/>
-                <w:sz w:val="17"/>
-                <w:szCs w:val="17"/>
-              </w:rPr>
-              <w:t xml:space="preserve">357248</w:t>
-            </w:r>
-          </w:p>
-        </w:tc>
-        <w:tc>
-          <w:tcPr>
-            <w:tcW w:type="dxa" w:w="3800"/>
-            <w:shd w:fill="F5F7FA" w:color="auto" w:val="clear"/>
-            <w:tcMar>
-              <w:top w:type="dxa" w:w="60"/>
-              <w:left w:type="dxa" w:w="90"/>
-              <w:bottom w:type="dxa" w:w="60"/>
-              <w:right w:type="dxa" w:w="90"/>
-            </w:tcMar>
-          </w:tcPr>
-          <w:p>
-            <w:pPr>
-              <w:jc w:val="left"/>
-            </w:pPr>
-            <w:r>
-              <w:rPr>
-                <w:rFonts w:ascii="Calibri" w:cs="Calibri" w:eastAsia="Calibri" w:hAnsi="Calibri"/>
-                <w:b w:val="false"/>
-                <w:bCs w:val="false"/>
-                <w:color w:val="000000"/>
-                <w:sz w:val="17"/>
-                <w:szCs w:val="17"/>
-              </w:rPr>
-              <w:t xml:space="preserve">Memo Pad, Case Of 500</w:t>
-            </w:r>
-          </w:p>
-        </w:tc>
-        <w:tc>
-          <w:tcPr>
-            <w:tcW w:type="dxa" w:w="3800"/>
-            <w:shd w:fill="F5F7FA" w:color="auto" w:val="clear"/>
-            <w:tcMar>
-              <w:top w:type="dxa" w:w="60"/>
-              <w:left w:type="dxa" w:w="90"/>
-              <w:bottom w:type="dxa" w:w="60"/>
-              <w:right w:type="dxa" w:w="90"/>
-            </w:tcMar>
-          </w:tcPr>
-          <w:p>
-            <w:pPr>
-              <w:jc w:val="left"/>
-            </w:pPr>
-            <w:r>
-              <w:rPr>
-                <w:rFonts w:ascii="Calibri" w:cs="Calibri" w:eastAsia="Calibri" w:hAnsi="Calibri"/>
-                <w:b w:val="false"/>
-                <w:bCs w:val="false"/>
-                <w:color w:val="000000"/>
-                <w:sz w:val="17"/>
-                <w:szCs w:val="17"/>
-              </w:rPr>
-              <w:t xml:space="preserve">Bloc de notas, caja de 500</w:t>
-            </w:r>
-          </w:p>
-        </w:tc>
-        <w:tc>
-          <w:tcPr>
-            <w:tcW w:type="dxa" w:w="800"/>
-            <w:shd w:fill="F5F7FA" w:color="auto" w:val="clear"/>
-            <w:tcMar>
-              <w:top w:type="dxa" w:w="60"/>
-              <w:left w:type="dxa" w:w="90"/>
-              <w:bottom w:type="dxa" w:w="60"/>
-              <w:right w:type="dxa" w:w="90"/>
-            </w:tcMar>
-          </w:tcPr>
-          <w:p>
-            <w:pPr>
-              <w:jc w:val="left"/>
-            </w:pPr>
-            <w:r>
-              <w:rPr>
-                <w:rFonts w:ascii="Calibri" w:cs="Calibri" w:eastAsia="Calibri" w:hAnsi="Calibri"/>
-                <w:b w:val="false"/>
-                <w:bCs w:val="false"/>
-                <w:color w:val="000000"/>
-                <w:sz w:val="18"/>
-                <w:szCs w:val="18"/>
-              </w:rPr>
-              <w:t xml:space="preserve"/>
-            </w:r>
-          </w:p>
-        </w:tc>
-        <w:tc>
-          <w:tcPr>
-            <w:tcW w:type="dxa" w:w="800"/>
-            <w:shd w:fill="F5F7FA" w:color="auto" w:val="clear"/>
-            <w:tcMar>
-              <w:top w:type="dxa" w:w="60"/>
-              <w:left w:type="dxa" w:w="90"/>
-              <w:bottom w:type="dxa" w:w="60"/>
-              <w:right w:type="dxa" w:w="90"/>
-            </w:tcMar>
-          </w:tcPr>
-          <w:p>
-            <w:pPr>
-              <w:jc w:val="left"/>
-            </w:pPr>
-            <w:r>
-              <w:rPr>
-                <w:rFonts w:ascii="Calibri" w:cs="Calibri" w:eastAsia="Calibri" w:hAnsi="Calibri"/>
-                <w:b w:val="false"/>
-                <w:bCs w:val="false"/>
-                <w:color w:val="000000"/>
-                <w:sz w:val="18"/>
-                <w:szCs w:val="18"/>
-              </w:rPr>
-              <w:t xml:space="preserve"/>
-            </w:r>
-          </w:p>
-        </w:tc>
-      </w:tr>
-      <w:tr>
-        <w:tc>
-          <w:tcPr>
-            <w:tcW w:type="dxa" w:w="1200"/>
-            <w:tcMar>
-              <w:top w:type="dxa" w:w="60"/>
-              <w:left w:type="dxa" w:w="90"/>
-              <w:bottom w:type="dxa" w:w="60"/>
-              <w:right w:type="dxa" w:w="90"/>
-            </w:tcMar>
-          </w:tcPr>
-          <w:p>
-            <w:pPr>
-              <w:jc w:val="left"/>
-            </w:pPr>
-            <w:r>
-              <w:rPr>
-                <w:rFonts w:ascii="Calibri" w:cs="Calibri" w:eastAsia="Calibri" w:hAnsi="Calibri"/>
-                <w:b w:val="false"/>
-                <w:bCs w:val="false"/>
-                <w:color w:val="000000"/>
-                <w:sz w:val="17"/>
-                <w:szCs w:val="17"/>
-              </w:rPr>
-              <w:t xml:space="preserve">751733</w:t>
-            </w:r>
-          </w:p>
-        </w:tc>
-        <w:tc>
-          <w:tcPr>
-            <w:tcW w:type="dxa" w:w="3800"/>
-            <w:tcMar>
-              <w:top w:type="dxa" w:w="60"/>
-              <w:left w:type="dxa" w:w="90"/>
-              <w:bottom w:type="dxa" w:w="60"/>
-              <w:right w:type="dxa" w:w="90"/>
-            </w:tcMar>
-          </w:tcPr>
-          <w:p>
-            <w:pPr>
-              <w:jc w:val="left"/>
-            </w:pPr>
-            <w:r>
-              <w:rPr>
-                <w:rFonts w:ascii="Calibri" w:cs="Calibri" w:eastAsia="Calibri" w:hAnsi="Calibri"/>
-                <w:b w:val="false"/>
-                <w:bCs w:val="false"/>
-                <w:color w:val="000000"/>
-                <w:sz w:val="17"/>
-                <w:szCs w:val="17"/>
-              </w:rPr>
-              <w:t xml:space="preserve">Pen, Case Of 500</w:t>
-            </w:r>
-          </w:p>
-        </w:tc>
-        <w:tc>
-          <w:tcPr>
-            <w:tcW w:type="dxa" w:w="3800"/>
-            <w:tcMar>
-              <w:top w:type="dxa" w:w="60"/>
-              <w:left w:type="dxa" w:w="90"/>
-              <w:bottom w:type="dxa" w:w="60"/>
-              <w:right w:type="dxa" w:w="90"/>
-            </w:tcMar>
-          </w:tcPr>
-          <w:p>
-            <w:pPr>
-              <w:jc w:val="left"/>
-            </w:pPr>
-            <w:r>
-              <w:rPr>
-                <w:rFonts w:ascii="Calibri" w:cs="Calibri" w:eastAsia="Calibri" w:hAnsi="Calibri"/>
-                <w:b w:val="false"/>
-                <w:bCs w:val="false"/>
-                <w:color w:val="000000"/>
-                <w:sz w:val="17"/>
-                <w:szCs w:val="17"/>
-              </w:rPr>
-              <w:t xml:space="preserve">Bolígrafo, caja de 500</w:t>
-            </w:r>
-          </w:p>
-        </w:tc>
-        <w:tc>
-          <w:tcPr>
-            <w:tcW w:type="dxa" w:w="800"/>
-            <w:tcMar>
-              <w:top w:type="dxa" w:w="60"/>
-              <w:left w:type="dxa" w:w="90"/>
-              <w:bottom w:type="dxa" w:w="60"/>
-              <w:right w:type="dxa" w:w="90"/>
-            </w:tcMar>
-          </w:tcPr>
-          <w:p>
-            <w:pPr>
-              <w:jc w:val="left"/>
-            </w:pPr>
-            <w:r>
-              <w:rPr>
-                <w:rFonts w:ascii="Calibri" w:cs="Calibri" w:eastAsia="Calibri" w:hAnsi="Calibri"/>
-                <w:b w:val="false"/>
-                <w:bCs w:val="false"/>
-                <w:color w:val="000000"/>
-                <w:sz w:val="18"/>
-                <w:szCs w:val="18"/>
-              </w:rPr>
-              <w:t xml:space="preserve"/>
-            </w:r>
-          </w:p>
-        </w:tc>
-        <w:tc>
-          <w:tcPr>
-            <w:tcW w:type="dxa" w:w="800"/>
-            <w:tcMar>
-              <w:top w:type="dxa" w:w="60"/>
-              <w:left w:type="dxa" w:w="90"/>
-              <w:bottom w:type="dxa" w:w="60"/>
-              <w:right w:type="dxa" w:w="90"/>
-            </w:tcMar>
-          </w:tcPr>
-          <w:p>
-            <w:pPr>
-              <w:jc w:val="left"/>
-            </w:pPr>
-            <w:r>
-              <w:rPr>
-                <w:rFonts w:ascii="Calibri" w:cs="Calibri" w:eastAsia="Calibri" w:hAnsi="Calibri"/>
-                <w:b w:val="false"/>
-                <w:bCs w:val="false"/>
-                <w:color w:val="000000"/>
-                <w:sz w:val="18"/>
-                <w:szCs w:val="18"/>
-              </w:rPr>
-              <w:t xml:space="preserve"/>
-            </w:r>
-          </w:p>
-        </w:tc>
-      </w:tr>
-      <w:tr>
-        <w:tc>
-          <w:tcPr>
-            <w:tcW w:type="dxa" w:w="1200"/>
-            <w:shd w:fill="F5F7FA" w:color="auto" w:val="clear"/>
-            <w:tcMar>
-              <w:top w:type="dxa" w:w="60"/>
-              <w:left w:type="dxa" w:w="90"/>
-              <w:bottom w:type="dxa" w:w="60"/>
-              <w:right w:type="dxa" w:w="90"/>
-            </w:tcMar>
-          </w:tcPr>
-          <w:p>
-            <w:pPr>
-              <w:jc w:val="left"/>
-            </w:pPr>
-            <w:r>
-              <w:rPr>
-                <w:rFonts w:ascii="Calibri" w:cs="Calibri" w:eastAsia="Calibri" w:hAnsi="Calibri"/>
-                <w:b w:val="false"/>
-                <w:bCs w:val="false"/>
-                <w:color w:val="000000"/>
-                <w:sz w:val="17"/>
-                <w:szCs w:val="17"/>
-              </w:rPr>
-              <w:t xml:space="preserve">214847</w:t>
-            </w:r>
-          </w:p>
-        </w:tc>
-        <w:tc>
-          <w:tcPr>
-            <w:tcW w:type="dxa" w:w="3800"/>
-            <w:shd w:fill="F5F7FA" w:color="auto" w:val="clear"/>
-            <w:tcMar>
-              <w:top w:type="dxa" w:w="60"/>
-              <w:left w:type="dxa" w:w="90"/>
-              <w:bottom w:type="dxa" w:w="60"/>
-              <w:right w:type="dxa" w:w="90"/>
-            </w:tcMar>
-          </w:tcPr>
-          <w:p>
-            <w:pPr>
-              <w:jc w:val="left"/>
-            </w:pPr>
-            <w:r>
-              <w:rPr>
-                <w:rFonts w:ascii="Calibri" w:cs="Calibri" w:eastAsia="Calibri" w:hAnsi="Calibri"/>
-                <w:b w:val="false"/>
-                <w:bCs w:val="false"/>
-                <w:color w:val="000000"/>
-                <w:sz w:val="17"/>
-                <w:szCs w:val="17"/>
-              </w:rPr>
-              <w:t xml:space="preserve">Shower Brackets, Case Of 43</w:t>
-            </w:r>
-          </w:p>
-        </w:tc>
-        <w:tc>
-          <w:tcPr>
-            <w:tcW w:type="dxa" w:w="3800"/>
-            <w:shd w:fill="F5F7FA" w:color="auto" w:val="clear"/>
-            <w:tcMar>
-              <w:top w:type="dxa" w:w="60"/>
-              <w:left w:type="dxa" w:w="90"/>
-              <w:bottom w:type="dxa" w:w="60"/>
-              <w:right w:type="dxa" w:w="90"/>
-            </w:tcMar>
-          </w:tcPr>
-          <w:p>
-            <w:pPr>
-              <w:jc w:val="left"/>
-            </w:pPr>
-            <w:r>
-              <w:rPr>
-                <w:rFonts w:ascii="Calibri" w:cs="Calibri" w:eastAsia="Calibri" w:hAnsi="Calibri"/>
-                <w:b w:val="false"/>
-                <w:bCs w:val="false"/>
-                <w:color w:val="000000"/>
-                <w:sz w:val="17"/>
-                <w:szCs w:val="17"/>
-              </w:rPr>
-              <w:t xml:space="preserve">Soportes de pared para los dispensadores de la ducha, caja de 43</w:t>
-            </w:r>
-          </w:p>
-        </w:tc>
-        <w:tc>
-          <w:tcPr>
-            <w:tcW w:type="dxa" w:w="800"/>
-            <w:shd w:fill="F5F7FA" w:color="auto" w:val="clear"/>
-            <w:tcMar>
-              <w:top w:type="dxa" w:w="60"/>
-              <w:left w:type="dxa" w:w="90"/>
-              <w:bottom w:type="dxa" w:w="60"/>
-              <w:right w:type="dxa" w:w="90"/>
-            </w:tcMar>
-          </w:tcPr>
-          <w:p>
-            <w:pPr>
-              <w:jc w:val="left"/>
-            </w:pPr>
-            <w:r>
-              <w:rPr>
-                <w:rFonts w:ascii="Calibri" w:cs="Calibri" w:eastAsia="Calibri" w:hAnsi="Calibri"/>
-                <w:b w:val="false"/>
-                <w:bCs w:val="false"/>
-                <w:color w:val="000000"/>
-                <w:sz w:val="18"/>
-                <w:szCs w:val="18"/>
-              </w:rPr>
-              <w:t xml:space="preserve"/>
-            </w:r>
-          </w:p>
-        </w:tc>
-        <w:tc>
-          <w:tcPr>
-            <w:tcW w:type="dxa" w:w="800"/>
-            <w:shd w:fill="F5F7FA" w:color="auto" w:val="clear"/>
-            <w:tcMar>
-              <w:top w:type="dxa" w:w="60"/>
-              <w:left w:type="dxa" w:w="90"/>
-              <w:bottom w:type="dxa" w:w="60"/>
-              <w:right w:type="dxa" w:w="90"/>
-            </w:tcMar>
-          </w:tcPr>
-          <w:p>
-            <w:pPr>
-              <w:jc w:val="left"/>
-            </w:pPr>
-            <w:r>
-              <w:rPr>
-                <w:rFonts w:ascii="Calibri" w:cs="Calibri" w:eastAsia="Calibri" w:hAnsi="Calibri"/>
-                <w:b w:val="false"/>
-                <w:bCs w:val="false"/>
-                <w:color w:val="000000"/>
-                <w:sz w:val="18"/>
-                <w:szCs w:val="18"/>
-              </w:rPr>
-              <w:t xml:space="preserve"/>
-            </w:r>
-          </w:p>
-        </w:tc>
-      </w:tr>
-      <w:tr>
+        <w:trPr>
+          <w:cantSplit/>
+        </w:trPr>
         <w:tc>
           <w:tcPr>
             <w:tcW w:type="dxa" w:w="1200"/>

</xml_diff>

<commit_message>
Add guest deodorants to the bottom of the Front Desk list
Three stocked options (Old Spice Pure Sport 24, Degree Cool Rush 36,
Degree Shower Clean 36) plus the Degree 72-pack variety at the bottom,
marked OPTIONAL in both languages with the cost comparison against
buying the two 36-packs separately.

Co-Authored-By: Claude Opus 5 <noreply@anthropic.com>
Claude-Session: https://claude.ai/code/session_0138rT731u9moyu7f3GNkj4g
</commit_message>
<xml_diff>
--- a/Elm_Housekeeping_Inventory.docx
+++ b/Elm_Housekeeping_Inventory.docx
@@ -8189,6 +8189,7 @@
           </w:tcPr>
           <w:p>
             <w:pPr>
+              <w:keepNext/>
               <w:jc w:val="left"/>
             </w:pPr>
             <w:r>
@@ -8216,6 +8217,7 @@
           </w:tcPr>
           <w:p>
             <w:pPr>
+              <w:keepNext/>
               <w:jc w:val="left"/>
             </w:pPr>
             <w:r>
@@ -8243,6 +8245,7 @@
           </w:tcPr>
           <w:p>
             <w:pPr>
+              <w:keepNext/>
               <w:jc w:val="left"/>
             </w:pPr>
             <w:r>
@@ -8255,6 +8258,571 @@
                 <w:szCs w:val="17"/>
               </w:rPr>
               <w:t>Crema líquida Coffee-Mate vainilla francesa en vasitos, caja de 180</w:t>
+            </w:r>
+          </w:p>
+        </w:tc>
+        <w:tc>
+          <w:tcPr>
+            <w:tcW w:type="dxa" w:w="800"/>
+            <w:tcMar>
+              <w:top w:type="dxa" w:w="60"/>
+              <w:left w:type="dxa" w:w="90"/>
+              <w:bottom w:type="dxa" w:w="60"/>
+              <w:right w:type="dxa" w:w="90"/>
+            </w:tcMar>
+          </w:tcPr>
+          <w:p>
+            <w:pPr>
+              <w:keepNext/>
+              <w:jc w:val="left"/>
+            </w:pPr>
+            <w:r>
+              <w:rPr>
+                <w:rFonts w:ascii="Calibri" w:cs="Calibri" w:eastAsia="Calibri" w:hAnsi="Calibri"/>
+                <w:b w:val="false"/>
+                <w:bCs w:val="false"/>
+                <w:color w:val="000000"/>
+                <w:sz w:val="18"/>
+                <w:szCs w:val="18"/>
+              </w:rPr>
+            </w:r>
+          </w:p>
+        </w:tc>
+        <w:tc>
+          <w:tcPr>
+            <w:tcW w:type="dxa" w:w="800"/>
+            <w:tcMar>
+              <w:top w:type="dxa" w:w="60"/>
+              <w:left w:type="dxa" w:w="90"/>
+              <w:bottom w:type="dxa" w:w="60"/>
+              <w:right w:type="dxa" w:w="90"/>
+            </w:tcMar>
+          </w:tcPr>
+          <w:p>
+            <w:pPr>
+              <w:keepNext/>
+              <w:jc w:val="left"/>
+            </w:pPr>
+            <w:r>
+              <w:rPr>
+                <w:rFonts w:ascii="Calibri" w:cs="Calibri" w:eastAsia="Calibri" w:hAnsi="Calibri"/>
+                <w:b w:val="false"/>
+                <w:bCs w:val="false"/>
+                <w:color w:val="000000"/>
+                <w:sz w:val="18"/>
+                <w:szCs w:val="18"/>
+              </w:rPr>
+            </w:r>
+          </w:p>
+        </w:tc>
+      </w:tr>
+      <w:tr>
+        <w:trPr>
+          <w:cantSplit/>
+        </w:trPr>
+        <w:tc>
+          <w:tcPr>
+            <w:tcW w:type="dxa" w:w="1200"/>
+            <w:tcMar>
+              <w:top w:type="dxa" w:w="60"/>
+              <w:left w:type="dxa" w:w="90"/>
+              <w:bottom w:type="dxa" w:w="60"/>
+              <w:right w:type="dxa" w:w="90"/>
+            </w:tcMar>
+          </w:tcPr>
+          <w:p>
+            <w:pPr>
+              <w:keepNext/>
+              <w:jc w:val="left"/>
+            </w:pPr>
+            <w:r>
+              <w:rPr>
+                <w:rFonts w:ascii="Calibri" w:cs="Calibri" w:eastAsia="Calibri" w:hAnsi="Calibri"/>
+                <w:b w:val="false"/>
+                <w:bCs w:val="false"/>
+                <w:color w:val="000000"/>
+                <w:sz w:val="17"/>
+                <w:szCs w:val="17"/>
+              </w:rPr>
+            </w:r>
+          </w:p>
+        </w:tc>
+        <w:tc>
+          <w:tcPr>
+            <w:tcW w:type="dxa" w:w="3800"/>
+            <w:tcMar>
+              <w:top w:type="dxa" w:w="60"/>
+              <w:left w:type="dxa" w:w="90"/>
+              <w:bottom w:type="dxa" w:w="60"/>
+              <w:right w:type="dxa" w:w="90"/>
+            </w:tcMar>
+          </w:tcPr>
+          <w:p>
+            <w:pPr>
+              <w:keepNext/>
+              <w:jc w:val="left"/>
+            </w:pPr>
+            <w:r>
+              <w:rPr>
+                <w:rFonts w:ascii="Calibri" w:cs="Calibri" w:eastAsia="Calibri" w:hAnsi="Calibri"/>
+                <w:b w:val="false"/>
+                <w:bCs w:val="false"/>
+                <w:color w:val="000000"/>
+                <w:sz w:val="17"/>
+                <w:szCs w:val="17"/>
+              </w:rPr>
+              <w:t>Old Spice Pure Sport Antiperspirant, 0.5 oz travel size, Pack Of 24  (Amazon)</w:t>
+            </w:r>
+          </w:p>
+        </w:tc>
+        <w:tc>
+          <w:tcPr>
+            <w:tcW w:type="dxa" w:w="3800"/>
+            <w:tcMar>
+              <w:top w:type="dxa" w:w="60"/>
+              <w:left w:type="dxa" w:w="90"/>
+              <w:bottom w:type="dxa" w:w="60"/>
+              <w:right w:type="dxa" w:w="90"/>
+            </w:tcMar>
+          </w:tcPr>
+          <w:p>
+            <w:pPr>
+              <w:keepNext/>
+              <w:jc w:val="left"/>
+            </w:pPr>
+            <w:r>
+              <w:rPr>
+                <w:rFonts w:ascii="Calibri" w:cs="Calibri" w:eastAsia="Calibri" w:hAnsi="Calibri"/>
+                <w:b w:val="false"/>
+                <w:bCs w:val="false"/>
+                <w:color w:val="000000"/>
+                <w:sz w:val="17"/>
+                <w:szCs w:val="17"/>
+              </w:rPr>
+              <w:t>Desodorante Old Spice Pure Sport, 0.5 oz tamaño viaje, paquete de 24 (Amazon) — para hombre</w:t>
+            </w:r>
+          </w:p>
+        </w:tc>
+        <w:tc>
+          <w:tcPr>
+            <w:tcW w:type="dxa" w:w="800"/>
+            <w:tcMar>
+              <w:top w:type="dxa" w:w="60"/>
+              <w:left w:type="dxa" w:w="90"/>
+              <w:bottom w:type="dxa" w:w="60"/>
+              <w:right w:type="dxa" w:w="90"/>
+            </w:tcMar>
+          </w:tcPr>
+          <w:p>
+            <w:pPr>
+              <w:keepNext/>
+              <w:jc w:val="left"/>
+            </w:pPr>
+            <w:r>
+              <w:rPr>
+                <w:rFonts w:ascii="Calibri" w:cs="Calibri" w:eastAsia="Calibri" w:hAnsi="Calibri"/>
+                <w:b w:val="false"/>
+                <w:bCs w:val="false"/>
+                <w:color w:val="000000"/>
+                <w:sz w:val="18"/>
+                <w:szCs w:val="18"/>
+              </w:rPr>
+            </w:r>
+          </w:p>
+        </w:tc>
+        <w:tc>
+          <w:tcPr>
+            <w:tcW w:type="dxa" w:w="800"/>
+            <w:tcMar>
+              <w:top w:type="dxa" w:w="60"/>
+              <w:left w:type="dxa" w:w="90"/>
+              <w:bottom w:type="dxa" w:w="60"/>
+              <w:right w:type="dxa" w:w="90"/>
+            </w:tcMar>
+          </w:tcPr>
+          <w:p>
+            <w:pPr>
+              <w:keepNext/>
+              <w:jc w:val="left"/>
+            </w:pPr>
+            <w:r>
+              <w:rPr>
+                <w:rFonts w:ascii="Calibri" w:cs="Calibri" w:eastAsia="Calibri" w:hAnsi="Calibri"/>
+                <w:b w:val="false"/>
+                <w:bCs w:val="false"/>
+                <w:color w:val="000000"/>
+                <w:sz w:val="18"/>
+                <w:szCs w:val="18"/>
+              </w:rPr>
+            </w:r>
+          </w:p>
+        </w:tc>
+      </w:tr>
+      <w:tr>
+        <w:trPr>
+          <w:cantSplit/>
+        </w:trPr>
+        <w:tc>
+          <w:tcPr>
+            <w:tcW w:type="dxa" w:w="1200"/>
+            <w:tcMar>
+              <w:top w:type="dxa" w:w="60"/>
+              <w:left w:type="dxa" w:w="90"/>
+              <w:bottom w:type="dxa" w:w="60"/>
+              <w:right w:type="dxa" w:w="90"/>
+            </w:tcMar>
+          </w:tcPr>
+          <w:p>
+            <w:pPr>
+              <w:keepNext/>
+              <w:jc w:val="left"/>
+            </w:pPr>
+            <w:r>
+              <w:rPr>
+                <w:rFonts w:ascii="Calibri" w:cs="Calibri" w:eastAsia="Calibri" w:hAnsi="Calibri"/>
+                <w:b w:val="false"/>
+                <w:bCs w:val="false"/>
+                <w:color w:val="000000"/>
+                <w:sz w:val="17"/>
+                <w:szCs w:val="17"/>
+              </w:rPr>
+            </w:r>
+          </w:p>
+        </w:tc>
+        <w:tc>
+          <w:tcPr>
+            <w:tcW w:type="dxa" w:w="3800"/>
+            <w:tcMar>
+              <w:top w:type="dxa" w:w="60"/>
+              <w:left w:type="dxa" w:w="90"/>
+              <w:bottom w:type="dxa" w:w="60"/>
+              <w:right w:type="dxa" w:w="90"/>
+            </w:tcMar>
+          </w:tcPr>
+          <w:p>
+            <w:pPr>
+              <w:keepNext/>
+              <w:jc w:val="left"/>
+            </w:pPr>
+            <w:r>
+              <w:rPr>
+                <w:rFonts w:ascii="Calibri" w:cs="Calibri" w:eastAsia="Calibri" w:hAnsi="Calibri"/>
+                <w:b w:val="false"/>
+                <w:bCs w:val="false"/>
+                <w:color w:val="000000"/>
+                <w:sz w:val="17"/>
+                <w:szCs w:val="17"/>
+              </w:rPr>
+              <w:t>Degree Men Cool Rush Travel Deodorant, 0.5 oz, 36-Pack  (Amazon)</w:t>
+            </w:r>
+          </w:p>
+        </w:tc>
+        <w:tc>
+          <w:tcPr>
+            <w:tcW w:type="dxa" w:w="3800"/>
+            <w:tcMar>
+              <w:top w:type="dxa" w:w="60"/>
+              <w:left w:type="dxa" w:w="90"/>
+              <w:bottom w:type="dxa" w:w="60"/>
+              <w:right w:type="dxa" w:w="90"/>
+            </w:tcMar>
+          </w:tcPr>
+          <w:p>
+            <w:pPr>
+              <w:keepNext/>
+              <w:jc w:val="left"/>
+            </w:pPr>
+            <w:r>
+              <w:rPr>
+                <w:rFonts w:ascii="Calibri" w:cs="Calibri" w:eastAsia="Calibri" w:hAnsi="Calibri"/>
+                <w:b w:val="false"/>
+                <w:bCs w:val="false"/>
+                <w:color w:val="000000"/>
+                <w:sz w:val="17"/>
+                <w:szCs w:val="17"/>
+              </w:rPr>
+              <w:t>Desodorante Degree Cool Rush para hombre, 0.5 oz, paquete de 36 (Amazon)</w:t>
+            </w:r>
+          </w:p>
+        </w:tc>
+        <w:tc>
+          <w:tcPr>
+            <w:tcW w:type="dxa" w:w="800"/>
+            <w:tcMar>
+              <w:top w:type="dxa" w:w="60"/>
+              <w:left w:type="dxa" w:w="90"/>
+              <w:bottom w:type="dxa" w:w="60"/>
+              <w:right w:type="dxa" w:w="90"/>
+            </w:tcMar>
+          </w:tcPr>
+          <w:p>
+            <w:pPr>
+              <w:keepNext/>
+              <w:jc w:val="left"/>
+            </w:pPr>
+            <w:r>
+              <w:rPr>
+                <w:rFonts w:ascii="Calibri" w:cs="Calibri" w:eastAsia="Calibri" w:hAnsi="Calibri"/>
+                <w:b w:val="false"/>
+                <w:bCs w:val="false"/>
+                <w:color w:val="000000"/>
+                <w:sz w:val="18"/>
+                <w:szCs w:val="18"/>
+              </w:rPr>
+            </w:r>
+          </w:p>
+        </w:tc>
+        <w:tc>
+          <w:tcPr>
+            <w:tcW w:type="dxa" w:w="800"/>
+            <w:tcMar>
+              <w:top w:type="dxa" w:w="60"/>
+              <w:left w:type="dxa" w:w="90"/>
+              <w:bottom w:type="dxa" w:w="60"/>
+              <w:right w:type="dxa" w:w="90"/>
+            </w:tcMar>
+          </w:tcPr>
+          <w:p>
+            <w:pPr>
+              <w:keepNext/>
+              <w:jc w:val="left"/>
+            </w:pPr>
+            <w:r>
+              <w:rPr>
+                <w:rFonts w:ascii="Calibri" w:cs="Calibri" w:eastAsia="Calibri" w:hAnsi="Calibri"/>
+                <w:b w:val="false"/>
+                <w:bCs w:val="false"/>
+                <w:color w:val="000000"/>
+                <w:sz w:val="18"/>
+                <w:szCs w:val="18"/>
+              </w:rPr>
+            </w:r>
+          </w:p>
+        </w:tc>
+      </w:tr>
+      <w:tr>
+        <w:trPr>
+          <w:cantSplit/>
+        </w:trPr>
+        <w:tc>
+          <w:tcPr>
+            <w:tcW w:type="dxa" w:w="1200"/>
+            <w:tcMar>
+              <w:top w:type="dxa" w:w="60"/>
+              <w:left w:type="dxa" w:w="90"/>
+              <w:bottom w:type="dxa" w:w="60"/>
+              <w:right w:type="dxa" w:w="90"/>
+            </w:tcMar>
+          </w:tcPr>
+          <w:p>
+            <w:pPr>
+              <w:keepNext/>
+              <w:jc w:val="left"/>
+            </w:pPr>
+            <w:r>
+              <w:rPr>
+                <w:rFonts w:ascii="Calibri" w:cs="Calibri" w:eastAsia="Calibri" w:hAnsi="Calibri"/>
+                <w:b w:val="false"/>
+                <w:bCs w:val="false"/>
+                <w:color w:val="000000"/>
+                <w:sz w:val="17"/>
+                <w:szCs w:val="17"/>
+              </w:rPr>
+            </w:r>
+          </w:p>
+        </w:tc>
+        <w:tc>
+          <w:tcPr>
+            <w:tcW w:type="dxa" w:w="3800"/>
+            <w:tcMar>
+              <w:top w:type="dxa" w:w="60"/>
+              <w:left w:type="dxa" w:w="90"/>
+              <w:bottom w:type="dxa" w:w="60"/>
+              <w:right w:type="dxa" w:w="90"/>
+            </w:tcMar>
+          </w:tcPr>
+          <w:p>
+            <w:pPr>
+              <w:keepNext/>
+              <w:jc w:val="left"/>
+            </w:pPr>
+            <w:r>
+              <w:rPr>
+                <w:rFonts w:ascii="Calibri" w:cs="Calibri" w:eastAsia="Calibri" w:hAnsi="Calibri"/>
+                <w:b w:val="false"/>
+                <w:bCs w:val="false"/>
+                <w:color w:val="000000"/>
+                <w:sz w:val="17"/>
+                <w:szCs w:val="17"/>
+              </w:rPr>
+              <w:t>Degree Advanced Shower Clean Antiperspirant, 0.5 oz, 36-Count  (Amazon)</w:t>
+            </w:r>
+          </w:p>
+        </w:tc>
+        <w:tc>
+          <w:tcPr>
+            <w:tcW w:type="dxa" w:w="3800"/>
+            <w:tcMar>
+              <w:top w:type="dxa" w:w="60"/>
+              <w:left w:type="dxa" w:w="90"/>
+              <w:bottom w:type="dxa" w:w="60"/>
+              <w:right w:type="dxa" w:w="90"/>
+            </w:tcMar>
+          </w:tcPr>
+          <w:p>
+            <w:pPr>
+              <w:keepNext/>
+              <w:jc w:val="left"/>
+            </w:pPr>
+            <w:r>
+              <w:rPr>
+                <w:rFonts w:ascii="Calibri" w:cs="Calibri" w:eastAsia="Calibri" w:hAnsi="Calibri"/>
+                <w:b w:val="false"/>
+                <w:bCs w:val="false"/>
+                <w:color w:val="000000"/>
+                <w:sz w:val="17"/>
+                <w:szCs w:val="17"/>
+              </w:rPr>
+              <w:t>Desodorante Degree Shower Clean para mujer, 0.5 oz, paquete de 36 (Amazon)</w:t>
+            </w:r>
+          </w:p>
+        </w:tc>
+        <w:tc>
+          <w:tcPr>
+            <w:tcW w:type="dxa" w:w="800"/>
+            <w:tcMar>
+              <w:top w:type="dxa" w:w="60"/>
+              <w:left w:type="dxa" w:w="90"/>
+              <w:bottom w:type="dxa" w:w="60"/>
+              <w:right w:type="dxa" w:w="90"/>
+            </w:tcMar>
+          </w:tcPr>
+          <w:p>
+            <w:pPr>
+              <w:keepNext/>
+              <w:jc w:val="left"/>
+            </w:pPr>
+            <w:r>
+              <w:rPr>
+                <w:rFonts w:ascii="Calibri" w:cs="Calibri" w:eastAsia="Calibri" w:hAnsi="Calibri"/>
+                <w:b w:val="false"/>
+                <w:bCs w:val="false"/>
+                <w:color w:val="000000"/>
+                <w:sz w:val="18"/>
+                <w:szCs w:val="18"/>
+              </w:rPr>
+            </w:r>
+          </w:p>
+        </w:tc>
+        <w:tc>
+          <w:tcPr>
+            <w:tcW w:type="dxa" w:w="800"/>
+            <w:tcMar>
+              <w:top w:type="dxa" w:w="60"/>
+              <w:left w:type="dxa" w:w="90"/>
+              <w:bottom w:type="dxa" w:w="60"/>
+              <w:right w:type="dxa" w:w="90"/>
+            </w:tcMar>
+          </w:tcPr>
+          <w:p>
+            <w:pPr>
+              <w:keepNext/>
+              <w:jc w:val="left"/>
+            </w:pPr>
+            <w:r>
+              <w:rPr>
+                <w:rFonts w:ascii="Calibri" w:cs="Calibri" w:eastAsia="Calibri" w:hAnsi="Calibri"/>
+                <w:b w:val="false"/>
+                <w:bCs w:val="false"/>
+                <w:color w:val="000000"/>
+                <w:sz w:val="18"/>
+                <w:szCs w:val="18"/>
+              </w:rPr>
+            </w:r>
+          </w:p>
+        </w:tc>
+      </w:tr>
+      <w:tr>
+        <w:trPr>
+          <w:cantSplit/>
+        </w:trPr>
+        <w:tc>
+          <w:tcPr>
+            <w:tcW w:type="dxa" w:w="1200"/>
+            <w:tcMar>
+              <w:top w:type="dxa" w:w="60"/>
+              <w:left w:type="dxa" w:w="90"/>
+              <w:bottom w:type="dxa" w:w="60"/>
+              <w:right w:type="dxa" w:w="90"/>
+            </w:tcMar>
+          </w:tcPr>
+          <w:p>
+            <w:pPr>
+              <w:jc w:val="left"/>
+            </w:pPr>
+            <w:r>
+              <w:rPr>
+                <w:rFonts w:ascii="Calibri" w:cs="Calibri" w:eastAsia="Calibri" w:hAnsi="Calibri"/>
+                <w:b w:val="false"/>
+                <w:bCs w:val="false"/>
+                <w:color w:val="000000"/>
+                <w:sz w:val="17"/>
+                <w:szCs w:val="17"/>
+              </w:rPr>
+            </w:r>
+          </w:p>
+        </w:tc>
+        <w:tc>
+          <w:tcPr>
+            <w:tcW w:type="dxa" w:w="3800"/>
+            <w:tcMar>
+              <w:top w:type="dxa" w:w="60"/>
+              <w:left w:type="dxa" w:w="90"/>
+              <w:bottom w:type="dxa" w:w="60"/>
+              <w:right w:type="dxa" w:w="90"/>
+            </w:tcMar>
+          </w:tcPr>
+          <w:p>
+            <w:pPr>
+              <w:jc w:val="left"/>
+            </w:pPr>
+            <w:r>
+              <w:rPr>
+                <w:rFonts w:ascii="Calibri" w:cs="Calibri" w:eastAsia="Calibri" w:hAnsi="Calibri"/>
+                <w:b w:val="false"/>
+                <w:bCs w:val="false"/>
+                <w:color w:val="000000"/>
+                <w:sz w:val="17"/>
+                <w:szCs w:val="17"/>
+              </w:rPr>
+              <w:t>Degree Advanced Travel Variety 72-Pack, 0.5 oz — 36 Cool Rush (men) + 36 Shower Clean (women)  — OPTIONAL. One order covers both; runs about $6 more than buying the two 36-packs separately.</w:t>
+            </w:r>
+          </w:p>
+        </w:tc>
+        <w:tc>
+          <w:tcPr>
+            <w:tcW w:type="dxa" w:w="3800"/>
+            <w:tcMar>
+              <w:top w:type="dxa" w:w="60"/>
+              <w:left w:type="dxa" w:w="90"/>
+              <w:bottom w:type="dxa" w:w="60"/>
+              <w:right w:type="dxa" w:w="90"/>
+            </w:tcMar>
+          </w:tcPr>
+          <w:p>
+            <w:pPr>
+              <w:jc w:val="left"/>
+            </w:pPr>
+            <w:r>
+              <w:rPr>
+                <w:rFonts w:ascii="Calibri" w:cs="Calibri" w:eastAsia="Calibri" w:hAnsi="Calibri"/>
+                <w:b w:val="false"/>
+                <w:bCs w:val="false"/>
+                <w:color w:val="000000"/>
+                <w:sz w:val="17"/>
+                <w:szCs w:val="17"/>
+              </w:rPr>
+              <w:t>Degree Advanced variedad, paquete de 72 de 0.5 oz — 36 Cool Rush (hombre) + 36 Shower Clean (mujer) — OPCIONAL. Un solo pedido cubre los dos; cuesta como $6 más que comprar los dos paquetes de 36 por separado.</w:t>
             </w:r>
           </w:p>
         </w:tc>

</xml_diff>

<commit_message>
Fold the hotel inventory list's consumables into the count sheet
Cross-referenced Elm_Hotel_Inventory_List and added the supplies it
carries that this sheet lacked, sorted by how fast they go: toilet
paper, facial tissue, roll and multi-fold paper towels, guest-room and
40-45 gal trash bags, bathroom sponges, glass and bath cleaner, lint
rollers and refills, toilet brush, dusters, brooms, Oreck XL vacuum
bags and shower curtains.

Also fills the ADA ironing board part number (504125) from that list.
Room equipment (ice buckets, trash cans, luggage racks, alarm clocks,
vacuums, amenity and soap-dish trays) deliberately left off; those are
assets, not monthly reorders.

Co-Authored-By: Claude Opus 5 <noreply@anthropic.com>
Claude-Session: https://claude.ai/code/session_0138rT731u9moyu7f3GNkj4g
</commit_message>
<xml_diff>
--- a/Elm_Housekeeping_Inventory.docx
+++ b/Elm_Housekeeping_Inventory.docx
@@ -319,64 +319,65 @@
                 <w:sz w:val="17"/>
                 <w:szCs w:val="17"/>
               </w:rPr>
-            </w:r>
-          </w:p>
-        </w:tc>
-        <w:tc>
-          <w:tcPr>
-            <w:tcW w:type="dxa" w:w="3800"/>
-            <w:shd w:fill="F5F7FA" w:color="auto" w:val="clear"/>
-            <w:tcMar>
-              <w:top w:type="dxa" w:w="60"/>
-              <w:left w:type="dxa" w:w="90"/>
-              <w:bottom w:type="dxa" w:w="60"/>
-              <w:right w:type="dxa" w:w="90"/>
-            </w:tcMar>
-          </w:tcPr>
-          <w:p>
-            <w:pPr>
-              <w:keepNext/>
-              <w:jc w:val="left"/>
-            </w:pPr>
-            <w:r>
-              <w:rPr>
-                <w:rFonts w:ascii="Calibri" w:cs="Calibri" w:eastAsia="Calibri" w:hAnsi="Calibri"/>
-                <w:b w:val="false"/>
-                <w:bCs w:val="false"/>
-                <w:color w:val="000000"/>
-                <w:sz w:val="17"/>
-                <w:szCs w:val="17"/>
-              </w:rPr>
-              <w:t>Kitchen trash bags  — part # TBD</w:t>
-            </w:r>
-          </w:p>
-        </w:tc>
-        <w:tc>
-          <w:tcPr>
-            <w:tcW w:type="dxa" w:w="3800"/>
-            <w:shd w:fill="F5F7FA" w:color="auto" w:val="clear"/>
-            <w:tcMar>
-              <w:top w:type="dxa" w:w="60"/>
-              <w:left w:type="dxa" w:w="90"/>
-              <w:bottom w:type="dxa" w:w="60"/>
-              <w:right w:type="dxa" w:w="90"/>
-            </w:tcMar>
-          </w:tcPr>
-          <w:p>
-            <w:pPr>
-              <w:keepNext/>
-              <w:jc w:val="left"/>
-            </w:pPr>
-            <w:r>
-              <w:rPr>
-                <w:rFonts w:ascii="Calibri" w:cs="Calibri" w:eastAsia="Calibri" w:hAnsi="Calibri"/>
-                <w:b w:val="false"/>
-                <w:bCs w:val="false"/>
-                <w:color w:val="000000"/>
-                <w:sz w:val="17"/>
-                <w:szCs w:val="17"/>
-              </w:rPr>
-              <w:t>Bolsas de basura para la cocina — falta el número de parte</w:t>
+              <w:t>19885</w:t>
+            </w:r>
+          </w:p>
+        </w:tc>
+        <w:tc>
+          <w:tcPr>
+            <w:tcW w:type="dxa" w:w="3800"/>
+            <w:shd w:fill="F5F7FA" w:color="auto" w:val="clear"/>
+            <w:tcMar>
+              <w:top w:type="dxa" w:w="60"/>
+              <w:left w:type="dxa" w:w="90"/>
+              <w:bottom w:type="dxa" w:w="60"/>
+              <w:right w:type="dxa" w:w="90"/>
+            </w:tcMar>
+          </w:tcPr>
+          <w:p>
+            <w:pPr>
+              <w:keepNext/>
+              <w:jc w:val="left"/>
+            </w:pPr>
+            <w:r>
+              <w:rPr>
+                <w:rFonts w:ascii="Calibri" w:cs="Calibri" w:eastAsia="Calibri" w:hAnsi="Calibri"/>
+                <w:b w:val="false"/>
+                <w:bCs w:val="false"/>
+                <w:color w:val="000000"/>
+                <w:sz w:val="17"/>
+                <w:szCs w:val="17"/>
+              </w:rPr>
+              <w:t>Toilet Paper, case</w:t>
+            </w:r>
+          </w:p>
+        </w:tc>
+        <w:tc>
+          <w:tcPr>
+            <w:tcW w:type="dxa" w:w="3800"/>
+            <w:shd w:fill="F5F7FA" w:color="auto" w:val="clear"/>
+            <w:tcMar>
+              <w:top w:type="dxa" w:w="60"/>
+              <w:left w:type="dxa" w:w="90"/>
+              <w:bottom w:type="dxa" w:w="60"/>
+              <w:right w:type="dxa" w:w="90"/>
+            </w:tcMar>
+          </w:tcPr>
+          <w:p>
+            <w:pPr>
+              <w:keepNext/>
+              <w:jc w:val="left"/>
+            </w:pPr>
+            <w:r>
+              <w:rPr>
+                <w:rFonts w:ascii="Calibri" w:cs="Calibri" w:eastAsia="Calibri" w:hAnsi="Calibri"/>
+                <w:b w:val="false"/>
+                <w:bCs w:val="false"/>
+                <w:color w:val="000000"/>
+                <w:sz w:val="17"/>
+                <w:szCs w:val="17"/>
+              </w:rPr>
+              <w:t>Papel higiénico, caja</w:t>
             </w:r>
           </w:p>
         </w:tc>
@@ -494,36 +495,36 @@
                 <w:sz w:val="17"/>
                 <w:szCs w:val="17"/>
               </w:rPr>
-              <w:t>Housekeeping cart trash bags  — part # TBD</w:t>
-            </w:r>
-          </w:p>
-        </w:tc>
-        <w:tc>
-          <w:tcPr>
-            <w:tcW w:type="dxa" w:w="3800"/>
-            <w:shd w:fill="F5F7FA" w:color="auto" w:val="clear"/>
-            <w:tcMar>
-              <w:top w:type="dxa" w:w="60"/>
-              <w:left w:type="dxa" w:w="90"/>
-              <w:bottom w:type="dxa" w:w="60"/>
-              <w:right w:type="dxa" w:w="90"/>
-            </w:tcMar>
-          </w:tcPr>
-          <w:p>
-            <w:pPr>
-              <w:keepNext/>
-              <w:jc w:val="left"/>
-            </w:pPr>
-            <w:r>
-              <w:rPr>
-                <w:rFonts w:ascii="Calibri" w:cs="Calibri" w:eastAsia="Calibri" w:hAnsi="Calibri"/>
-                <w:b w:val="false"/>
-                <w:bCs w:val="false"/>
-                <w:color w:val="000000"/>
-                <w:sz w:val="17"/>
-                <w:szCs w:val="17"/>
-              </w:rPr>
-              <w:t>Bolsas de basura para el carrito de limpieza — falta el número de parte</w:t>
+              <w:t>Facial Tissue, case  — part # TBD</w:t>
+            </w:r>
+          </w:p>
+        </w:tc>
+        <w:tc>
+          <w:tcPr>
+            <w:tcW w:type="dxa" w:w="3800"/>
+            <w:shd w:fill="F5F7FA" w:color="auto" w:val="clear"/>
+            <w:tcMar>
+              <w:top w:type="dxa" w:w="60"/>
+              <w:left w:type="dxa" w:w="90"/>
+              <w:bottom w:type="dxa" w:w="60"/>
+              <w:right w:type="dxa" w:w="90"/>
+            </w:tcMar>
+          </w:tcPr>
+          <w:p>
+            <w:pPr>
+              <w:keepNext/>
+              <w:jc w:val="left"/>
+            </w:pPr>
+            <w:r>
+              <w:rPr>
+                <w:rFonts w:ascii="Calibri" w:cs="Calibri" w:eastAsia="Calibri" w:hAnsi="Calibri"/>
+                <w:b w:val="false"/>
+                <w:bCs w:val="false"/>
+                <w:color w:val="000000"/>
+                <w:sz w:val="17"/>
+                <w:szCs w:val="17"/>
+              </w:rPr>
+              <w:t>Pañuelos faciales (Kleenex), caja — falta el número de parte</w:t>
             </w:r>
           </w:p>
         </w:tc>
@@ -613,64 +614,65 @@
                 <w:sz w:val="17"/>
                 <w:szCs w:val="17"/>
               </w:rPr>
-            </w:r>
-          </w:p>
-        </w:tc>
-        <w:tc>
-          <w:tcPr>
-            <w:tcW w:type="dxa" w:w="3800"/>
-            <w:shd w:fill="F5F7FA" w:color="auto" w:val="clear"/>
-            <w:tcMar>
-              <w:top w:type="dxa" w:w="60"/>
-              <w:left w:type="dxa" w:w="90"/>
-              <w:bottom w:type="dxa" w:w="60"/>
-              <w:right w:type="dxa" w:w="90"/>
-            </w:tcMar>
-          </w:tcPr>
-          <w:p>
-            <w:pPr>
-              <w:keepNext/>
-              <w:jc w:val="left"/>
-            </w:pPr>
-            <w:r>
-              <w:rPr>
-                <w:rFonts w:ascii="Calibri" w:cs="Calibri" w:eastAsia="Calibri" w:hAnsi="Calibri"/>
-                <w:b w:val="false"/>
-                <w:bCs w:val="false"/>
-                <w:color w:val="000000"/>
-                <w:sz w:val="17"/>
-                <w:szCs w:val="17"/>
-              </w:rPr>
-              <w:t>Guest room trash can liners  — part # TBD</w:t>
-            </w:r>
-          </w:p>
-        </w:tc>
-        <w:tc>
-          <w:tcPr>
-            <w:tcW w:type="dxa" w:w="3800"/>
-            <w:shd w:fill="F5F7FA" w:color="auto" w:val="clear"/>
-            <w:tcMar>
-              <w:top w:type="dxa" w:w="60"/>
-              <w:left w:type="dxa" w:w="90"/>
-              <w:bottom w:type="dxa" w:w="60"/>
-              <w:right w:type="dxa" w:w="90"/>
-            </w:tcMar>
-          </w:tcPr>
-          <w:p>
-            <w:pPr>
-              <w:keepNext/>
-              <w:jc w:val="left"/>
-            </w:pPr>
-            <w:r>
-              <w:rPr>
-                <w:rFonts w:ascii="Calibri" w:cs="Calibri" w:eastAsia="Calibri" w:hAnsi="Calibri"/>
-                <w:b w:val="false"/>
-                <w:bCs w:val="false"/>
-                <w:color w:val="000000"/>
-                <w:sz w:val="17"/>
-                <w:szCs w:val="17"/>
-              </w:rPr>
-              <w:t>Bolsas para los botes de basura de las habitaciones — falta el número de parte</w:t>
+              <w:t>117984</w:t>
+            </w:r>
+          </w:p>
+        </w:tc>
+        <w:tc>
+          <w:tcPr>
+            <w:tcW w:type="dxa" w:w="3800"/>
+            <w:shd w:fill="F5F7FA" w:color="auto" w:val="clear"/>
+            <w:tcMar>
+              <w:top w:type="dxa" w:w="60"/>
+              <w:left w:type="dxa" w:w="90"/>
+              <w:bottom w:type="dxa" w:w="60"/>
+              <w:right w:type="dxa" w:w="90"/>
+            </w:tcMar>
+          </w:tcPr>
+          <w:p>
+            <w:pPr>
+              <w:keepNext/>
+              <w:jc w:val="left"/>
+            </w:pPr>
+            <w:r>
+              <w:rPr>
+                <w:rFonts w:ascii="Calibri" w:cs="Calibri" w:eastAsia="Calibri" w:hAnsi="Calibri"/>
+                <w:b w:val="false"/>
+                <w:bCs w:val="false"/>
+                <w:color w:val="000000"/>
+                <w:sz w:val="17"/>
+                <w:szCs w:val="17"/>
+              </w:rPr>
+              <w:t>Paper Towel, White Roll, case</w:t>
+            </w:r>
+          </w:p>
+        </w:tc>
+        <w:tc>
+          <w:tcPr>
+            <w:tcW w:type="dxa" w:w="3800"/>
+            <w:shd w:fill="F5F7FA" w:color="auto" w:val="clear"/>
+            <w:tcMar>
+              <w:top w:type="dxa" w:w="60"/>
+              <w:left w:type="dxa" w:w="90"/>
+              <w:bottom w:type="dxa" w:w="60"/>
+              <w:right w:type="dxa" w:w="90"/>
+            </w:tcMar>
+          </w:tcPr>
+          <w:p>
+            <w:pPr>
+              <w:keepNext/>
+              <w:jc w:val="left"/>
+            </w:pPr>
+            <w:r>
+              <w:rPr>
+                <w:rFonts w:ascii="Calibri" w:cs="Calibri" w:eastAsia="Calibri" w:hAnsi="Calibri"/>
+                <w:b w:val="false"/>
+                <w:bCs w:val="false"/>
+                <w:color w:val="000000"/>
+                <w:sz w:val="17"/>
+                <w:szCs w:val="17"/>
+              </w:rPr>
+              <w:t>Toallas de papel en rollo, blancas, caja</w:t>
             </w:r>
           </w:p>
         </w:tc>
@@ -788,36 +790,36 @@
                 <w:sz w:val="17"/>
                 <w:szCs w:val="17"/>
               </w:rPr>
-              <w:t>Nitrile Powder-Free Gloves, Case Of 1,000 — Small</w:t>
-            </w:r>
-          </w:p>
-        </w:tc>
-        <w:tc>
-          <w:tcPr>
-            <w:tcW w:type="dxa" w:w="3800"/>
-            <w:shd w:fill="F5F7FA" w:color="auto" w:val="clear"/>
-            <w:tcMar>
-              <w:top w:type="dxa" w:w="60"/>
-              <w:left w:type="dxa" w:w="90"/>
-              <w:bottom w:type="dxa" w:w="60"/>
-              <w:right w:type="dxa" w:w="90"/>
-            </w:tcMar>
-          </w:tcPr>
-          <w:p>
-            <w:pPr>
-              <w:keepNext/>
-              <w:jc w:val="left"/>
-            </w:pPr>
-            <w:r>
-              <w:rPr>
-                <w:rFonts w:ascii="Calibri" w:cs="Calibri" w:eastAsia="Calibri" w:hAnsi="Calibri"/>
-                <w:b w:val="false"/>
-                <w:bCs w:val="false"/>
-                <w:color w:val="000000"/>
-                <w:sz w:val="17"/>
-                <w:szCs w:val="17"/>
-              </w:rPr>
-              <w:t>Guantes de nitrilo sin polvo, caja de 1,000 — chico (S)</w:t>
+              <w:t>Multi-Fold Paper Towels, case</w:t>
+            </w:r>
+          </w:p>
+        </w:tc>
+        <w:tc>
+          <w:tcPr>
+            <w:tcW w:type="dxa" w:w="3800"/>
+            <w:shd w:fill="F5F7FA" w:color="auto" w:val="clear"/>
+            <w:tcMar>
+              <w:top w:type="dxa" w:w="60"/>
+              <w:left w:type="dxa" w:w="90"/>
+              <w:bottom w:type="dxa" w:w="60"/>
+              <w:right w:type="dxa" w:w="90"/>
+            </w:tcMar>
+          </w:tcPr>
+          <w:p>
+            <w:pPr>
+              <w:keepNext/>
+              <w:jc w:val="left"/>
+            </w:pPr>
+            <w:r>
+              <w:rPr>
+                <w:rFonts w:ascii="Calibri" w:cs="Calibri" w:eastAsia="Calibri" w:hAnsi="Calibri"/>
+                <w:b w:val="false"/>
+                <w:bCs w:val="false"/>
+                <w:color w:val="000000"/>
+                <w:sz w:val="17"/>
+                <w:szCs w:val="17"/>
+              </w:rPr>
+              <w:t>Toallas de papel dobladas (multi-fold), caja</w:t>
             </w:r>
           </w:p>
         </w:tc>
@@ -907,64 +909,65 @@
                 <w:sz w:val="17"/>
                 <w:szCs w:val="17"/>
               </w:rPr>
-            </w:r>
-          </w:p>
-        </w:tc>
-        <w:tc>
-          <w:tcPr>
-            <w:tcW w:type="dxa" w:w="3800"/>
-            <w:shd w:fill="F5F7FA" w:color="auto" w:val="clear"/>
-            <w:tcMar>
-              <w:top w:type="dxa" w:w="60"/>
-              <w:left w:type="dxa" w:w="90"/>
-              <w:bottom w:type="dxa" w:w="60"/>
-              <w:right w:type="dxa" w:w="90"/>
-            </w:tcMar>
-          </w:tcPr>
-          <w:p>
-            <w:pPr>
-              <w:keepNext/>
-              <w:jc w:val="left"/>
-            </w:pPr>
-            <w:r>
-              <w:rPr>
-                <w:rFonts w:ascii="Calibri" w:cs="Calibri" w:eastAsia="Calibri" w:hAnsi="Calibri"/>
-                <w:b w:val="false"/>
-                <w:bCs w:val="false"/>
-                <w:color w:val="000000"/>
-                <w:sz w:val="17"/>
-                <w:szCs w:val="17"/>
-              </w:rPr>
-              <w:t>Nitrile Powder-Free Gloves, Case Of 1,000 — Medium</w:t>
-            </w:r>
-          </w:p>
-        </w:tc>
-        <w:tc>
-          <w:tcPr>
-            <w:tcW w:type="dxa" w:w="3800"/>
-            <w:shd w:fill="F5F7FA" w:color="auto" w:val="clear"/>
-            <w:tcMar>
-              <w:top w:type="dxa" w:w="60"/>
-              <w:left w:type="dxa" w:w="90"/>
-              <w:bottom w:type="dxa" w:w="60"/>
-              <w:right w:type="dxa" w:w="90"/>
-            </w:tcMar>
-          </w:tcPr>
-          <w:p>
-            <w:pPr>
-              <w:keepNext/>
-              <w:jc w:val="left"/>
-            </w:pPr>
-            <w:r>
-              <w:rPr>
-                <w:rFonts w:ascii="Calibri" w:cs="Calibri" w:eastAsia="Calibri" w:hAnsi="Calibri"/>
-                <w:b w:val="false"/>
-                <w:bCs w:val="false"/>
-                <w:color w:val="000000"/>
-                <w:sz w:val="17"/>
-                <w:szCs w:val="17"/>
-              </w:rPr>
-              <w:t>Guantes de nitrilo sin polvo, caja de 1,000 — mediano (M)</w:t>
+              <w:t>119101</w:t>
+            </w:r>
+          </w:p>
+        </w:tc>
+        <w:tc>
+          <w:tcPr>
+            <w:tcW w:type="dxa" w:w="3800"/>
+            <w:shd w:fill="F5F7FA" w:color="auto" w:val="clear"/>
+            <w:tcMar>
+              <w:top w:type="dxa" w:w="60"/>
+              <w:left w:type="dxa" w:w="90"/>
+              <w:bottom w:type="dxa" w:w="60"/>
+              <w:right w:type="dxa" w:w="90"/>
+            </w:tcMar>
+          </w:tcPr>
+          <w:p>
+            <w:pPr>
+              <w:keepNext/>
+              <w:jc w:val="left"/>
+            </w:pPr>
+            <w:r>
+              <w:rPr>
+                <w:rFonts w:ascii="Calibri" w:cs="Calibri" w:eastAsia="Calibri" w:hAnsi="Calibri"/>
+                <w:b w:val="false"/>
+                <w:bCs w:val="false"/>
+                <w:color w:val="000000"/>
+                <w:sz w:val="17"/>
+                <w:szCs w:val="17"/>
+              </w:rPr>
+              <w:t>Trash Bags — Guest Room liners, case</w:t>
+            </w:r>
+          </w:p>
+        </w:tc>
+        <w:tc>
+          <w:tcPr>
+            <w:tcW w:type="dxa" w:w="3800"/>
+            <w:shd w:fill="F5F7FA" w:color="auto" w:val="clear"/>
+            <w:tcMar>
+              <w:top w:type="dxa" w:w="60"/>
+              <w:left w:type="dxa" w:w="90"/>
+              <w:bottom w:type="dxa" w:w="60"/>
+              <w:right w:type="dxa" w:w="90"/>
+            </w:tcMar>
+          </w:tcPr>
+          <w:p>
+            <w:pPr>
+              <w:keepNext/>
+              <w:jc w:val="left"/>
+            </w:pPr>
+            <w:r>
+              <w:rPr>
+                <w:rFonts w:ascii="Calibri" w:cs="Calibri" w:eastAsia="Calibri" w:hAnsi="Calibri"/>
+                <w:b w:val="false"/>
+                <w:bCs w:val="false"/>
+                <w:color w:val="000000"/>
+                <w:sz w:val="17"/>
+                <w:szCs w:val="17"/>
+              </w:rPr>
+              <w:t>Bolsas de basura — botes de las habitaciones, caja</w:t>
             </w:r>
           </w:p>
         </w:tc>
@@ -1054,64 +1057,65 @@
                 <w:sz w:val="17"/>
                 <w:szCs w:val="17"/>
               </w:rPr>
-            </w:r>
-          </w:p>
-        </w:tc>
-        <w:tc>
-          <w:tcPr>
-            <w:tcW w:type="dxa" w:w="3800"/>
-            <w:shd w:fill="F5F7FA" w:color="auto" w:val="clear"/>
-            <w:tcMar>
-              <w:top w:type="dxa" w:w="60"/>
-              <w:left w:type="dxa" w:w="90"/>
-              <w:bottom w:type="dxa" w:w="60"/>
-              <w:right w:type="dxa" w:w="90"/>
-            </w:tcMar>
-          </w:tcPr>
-          <w:p>
-            <w:pPr>
-              <w:keepNext/>
-              <w:jc w:val="left"/>
-            </w:pPr>
-            <w:r>
-              <w:rPr>
-                <w:rFonts w:ascii="Calibri" w:cs="Calibri" w:eastAsia="Calibri" w:hAnsi="Calibri"/>
-                <w:b w:val="false"/>
-                <w:bCs w:val="false"/>
-                <w:color w:val="000000"/>
-                <w:sz w:val="17"/>
-                <w:szCs w:val="17"/>
-              </w:rPr>
-              <w:t>Nitrile Powder-Free Gloves, Case Of 1,000 — Large</w:t>
-            </w:r>
-          </w:p>
-        </w:tc>
-        <w:tc>
-          <w:tcPr>
-            <w:tcW w:type="dxa" w:w="3800"/>
-            <w:shd w:fill="F5F7FA" w:color="auto" w:val="clear"/>
-            <w:tcMar>
-              <w:top w:type="dxa" w:w="60"/>
-              <w:left w:type="dxa" w:w="90"/>
-              <w:bottom w:type="dxa" w:w="60"/>
-              <w:right w:type="dxa" w:w="90"/>
-            </w:tcMar>
-          </w:tcPr>
-          <w:p>
-            <w:pPr>
-              <w:keepNext/>
-              <w:jc w:val="left"/>
-            </w:pPr>
-            <w:r>
-              <w:rPr>
-                <w:rFonts w:ascii="Calibri" w:cs="Calibri" w:eastAsia="Calibri" w:hAnsi="Calibri"/>
-                <w:b w:val="false"/>
-                <w:bCs w:val="false"/>
-                <w:color w:val="000000"/>
-                <w:sz w:val="17"/>
-                <w:szCs w:val="17"/>
-              </w:rPr>
-              <w:t>Guantes de nitrilo sin polvo, caja de 1,000 — grande (L)</w:t>
+              <w:t>119060</w:t>
+            </w:r>
+          </w:p>
+        </w:tc>
+        <w:tc>
+          <w:tcPr>
+            <w:tcW w:type="dxa" w:w="3800"/>
+            <w:shd w:fill="F5F7FA" w:color="auto" w:val="clear"/>
+            <w:tcMar>
+              <w:top w:type="dxa" w:w="60"/>
+              <w:left w:type="dxa" w:w="90"/>
+              <w:bottom w:type="dxa" w:w="60"/>
+              <w:right w:type="dxa" w:w="90"/>
+            </w:tcMar>
+          </w:tcPr>
+          <w:p>
+            <w:pPr>
+              <w:keepNext/>
+              <w:jc w:val="left"/>
+            </w:pPr>
+            <w:r>
+              <w:rPr>
+                <w:rFonts w:ascii="Calibri" w:cs="Calibri" w:eastAsia="Calibri" w:hAnsi="Calibri"/>
+                <w:b w:val="false"/>
+                <w:bCs w:val="false"/>
+                <w:color w:val="000000"/>
+                <w:sz w:val="17"/>
+                <w:szCs w:val="17"/>
+              </w:rPr>
+              <w:t>Trash Bags — 40-45 Gal, case  (kitchen and housekeeping carts)</w:t>
+            </w:r>
+          </w:p>
+        </w:tc>
+        <w:tc>
+          <w:tcPr>
+            <w:tcW w:type="dxa" w:w="3800"/>
+            <w:shd w:fill="F5F7FA" w:color="auto" w:val="clear"/>
+            <w:tcMar>
+              <w:top w:type="dxa" w:w="60"/>
+              <w:left w:type="dxa" w:w="90"/>
+              <w:bottom w:type="dxa" w:w="60"/>
+              <w:right w:type="dxa" w:w="90"/>
+            </w:tcMar>
+          </w:tcPr>
+          <w:p>
+            <w:pPr>
+              <w:keepNext/>
+              <w:jc w:val="left"/>
+            </w:pPr>
+            <w:r>
+              <w:rPr>
+                <w:rFonts w:ascii="Calibri" w:cs="Calibri" w:eastAsia="Calibri" w:hAnsi="Calibri"/>
+                <w:b w:val="false"/>
+                <w:bCs w:val="false"/>
+                <w:color w:val="000000"/>
+                <w:sz w:val="17"/>
+                <w:szCs w:val="17"/>
+              </w:rPr>
+              <w:t>Bolsas de basura — 40-45 galones, caja (cocina y carritos de limpieza)</w:t>
             </w:r>
           </w:p>
         </w:tc>
@@ -1229,36 +1233,36 @@
                 <w:sz w:val="17"/>
                 <w:szCs w:val="17"/>
               </w:rPr>
-              <w:t>Nitrile Powder-Free Gloves, Case Of 1,000 — X-Large</w:t>
-            </w:r>
-          </w:p>
-        </w:tc>
-        <w:tc>
-          <w:tcPr>
-            <w:tcW w:type="dxa" w:w="3800"/>
-            <w:shd w:fill="F5F7FA" w:color="auto" w:val="clear"/>
-            <w:tcMar>
-              <w:top w:type="dxa" w:w="60"/>
-              <w:left w:type="dxa" w:w="90"/>
-              <w:bottom w:type="dxa" w:w="60"/>
-              <w:right w:type="dxa" w:w="90"/>
-            </w:tcMar>
-          </w:tcPr>
-          <w:p>
-            <w:pPr>
-              <w:keepNext/>
-              <w:jc w:val="left"/>
-            </w:pPr>
-            <w:r>
-              <w:rPr>
-                <w:rFonts w:ascii="Calibri" w:cs="Calibri" w:eastAsia="Calibri" w:hAnsi="Calibri"/>
-                <w:b w:val="false"/>
-                <w:bCs w:val="false"/>
-                <w:color w:val="000000"/>
-                <w:sz w:val="17"/>
-                <w:szCs w:val="17"/>
-              </w:rPr>
-              <w:t>Guantes de nitrilo sin polvo, caja de 1,000 — extra grande (XL)</w:t>
+              <w:t>Nitrile Powder-Free Gloves, Case Of 1,000 — Small</w:t>
+            </w:r>
+          </w:p>
+        </w:tc>
+        <w:tc>
+          <w:tcPr>
+            <w:tcW w:type="dxa" w:w="3800"/>
+            <w:shd w:fill="F5F7FA" w:color="auto" w:val="clear"/>
+            <w:tcMar>
+              <w:top w:type="dxa" w:w="60"/>
+              <w:left w:type="dxa" w:w="90"/>
+              <w:bottom w:type="dxa" w:w="60"/>
+              <w:right w:type="dxa" w:w="90"/>
+            </w:tcMar>
+          </w:tcPr>
+          <w:p>
+            <w:pPr>
+              <w:keepNext/>
+              <w:jc w:val="left"/>
+            </w:pPr>
+            <w:r>
+              <w:rPr>
+                <w:rFonts w:ascii="Calibri" w:cs="Calibri" w:eastAsia="Calibri" w:hAnsi="Calibri"/>
+                <w:b w:val="false"/>
+                <w:bCs w:val="false"/>
+                <w:color w:val="000000"/>
+                <w:sz w:val="17"/>
+                <w:szCs w:val="17"/>
+              </w:rPr>
+              <w:t>Guantes de nitrilo sin polvo, caja de 1,000 — chico (S)</w:t>
             </w:r>
           </w:p>
         </w:tc>
@@ -1376,36 +1380,36 @@
                 <w:sz w:val="17"/>
                 <w:szCs w:val="17"/>
               </w:rPr>
-              <w:t>Microfiber Cleaning Towels 12 X 12, 24-Pack</w:t>
-            </w:r>
-          </w:p>
-        </w:tc>
-        <w:tc>
-          <w:tcPr>
-            <w:tcW w:type="dxa" w:w="3800"/>
-            <w:shd w:fill="F5F7FA" w:color="auto" w:val="clear"/>
-            <w:tcMar>
-              <w:top w:type="dxa" w:w="60"/>
-              <w:left w:type="dxa" w:w="90"/>
-              <w:bottom w:type="dxa" w:w="60"/>
-              <w:right w:type="dxa" w:w="90"/>
-            </w:tcMar>
-          </w:tcPr>
-          <w:p>
-            <w:pPr>
-              <w:keepNext/>
-              <w:jc w:val="left"/>
-            </w:pPr>
-            <w:r>
-              <w:rPr>
-                <w:rFonts w:ascii="Calibri" w:cs="Calibri" w:eastAsia="Calibri" w:hAnsi="Calibri"/>
-                <w:b w:val="false"/>
-                <w:bCs w:val="false"/>
-                <w:color w:val="000000"/>
-                <w:sz w:val="17"/>
-                <w:szCs w:val="17"/>
-              </w:rPr>
-              <w:t>Toallas de microfibra 12 x 12, paquete de 24</w:t>
+              <w:t>Nitrile Powder-Free Gloves, Case Of 1,000 — Medium</w:t>
+            </w:r>
+          </w:p>
+        </w:tc>
+        <w:tc>
+          <w:tcPr>
+            <w:tcW w:type="dxa" w:w="3800"/>
+            <w:shd w:fill="F5F7FA" w:color="auto" w:val="clear"/>
+            <w:tcMar>
+              <w:top w:type="dxa" w:w="60"/>
+              <w:left w:type="dxa" w:w="90"/>
+              <w:bottom w:type="dxa" w:w="60"/>
+              <w:right w:type="dxa" w:w="90"/>
+            </w:tcMar>
+          </w:tcPr>
+          <w:p>
+            <w:pPr>
+              <w:keepNext/>
+              <w:jc w:val="left"/>
+            </w:pPr>
+            <w:r>
+              <w:rPr>
+                <w:rFonts w:ascii="Calibri" w:cs="Calibri" w:eastAsia="Calibri" w:hAnsi="Calibri"/>
+                <w:b w:val="false"/>
+                <w:bCs w:val="false"/>
+                <w:color w:val="000000"/>
+                <w:sz w:val="17"/>
+                <w:szCs w:val="17"/>
+              </w:rPr>
+              <w:t>Guantes de nitrilo sin polvo, caja de 1,000 — mediano (M)</w:t>
             </w:r>
           </w:p>
         </w:tc>
@@ -1483,73 +1487,1845 @@
           </w:tcPr>
           <w:p>
             <w:pPr>
-              <w:jc w:val="left"/>
-            </w:pPr>
-            <w:r>
-              <w:rPr>
-                <w:rFonts w:ascii="Calibri" w:cs="Calibri" w:eastAsia="Calibri" w:hAnsi="Calibri"/>
-                <w:b w:val="false"/>
-                <w:bCs w:val="false"/>
-                <w:color w:val="000000"/>
-                <w:sz w:val="17"/>
-                <w:szCs w:val="17"/>
-              </w:rPr>
-            </w:r>
-          </w:p>
-        </w:tc>
-        <w:tc>
-          <w:tcPr>
-            <w:tcW w:type="dxa" w:w="3800"/>
-            <w:shd w:fill="F5F7FA" w:color="auto" w:val="clear"/>
-            <w:tcMar>
-              <w:top w:type="dxa" w:w="60"/>
-              <w:left w:type="dxa" w:w="90"/>
-              <w:bottom w:type="dxa" w:w="60"/>
-              <w:right w:type="dxa" w:w="90"/>
-            </w:tcMar>
-          </w:tcPr>
-          <w:p>
-            <w:pPr>
-              <w:jc w:val="left"/>
-            </w:pPr>
-            <w:r>
-              <w:rPr>
-                <w:rFonts w:ascii="Calibri" w:cs="Calibri" w:eastAsia="Calibri" w:hAnsi="Calibri"/>
-                <w:b w:val="false"/>
-                <w:bCs w:val="false"/>
-                <w:color w:val="000000"/>
-                <w:sz w:val="17"/>
-                <w:szCs w:val="17"/>
-              </w:rPr>
-              <w:t>Multi-Fold Paper Towels, 1 Case</w:t>
-            </w:r>
-          </w:p>
-        </w:tc>
-        <w:tc>
-          <w:tcPr>
-            <w:tcW w:type="dxa" w:w="3800"/>
-            <w:shd w:fill="F5F7FA" w:color="auto" w:val="clear"/>
-            <w:tcMar>
-              <w:top w:type="dxa" w:w="60"/>
-              <w:left w:type="dxa" w:w="90"/>
-              <w:bottom w:type="dxa" w:w="60"/>
-              <w:right w:type="dxa" w:w="90"/>
-            </w:tcMar>
-          </w:tcPr>
-          <w:p>
-            <w:pPr>
-              <w:jc w:val="left"/>
-            </w:pPr>
-            <w:r>
-              <w:rPr>
-                <w:rFonts w:ascii="Calibri" w:cs="Calibri" w:eastAsia="Calibri" w:hAnsi="Calibri"/>
-                <w:b w:val="false"/>
-                <w:bCs w:val="false"/>
-                <w:color w:val="000000"/>
-                <w:sz w:val="17"/>
-                <w:szCs w:val="17"/>
-              </w:rPr>
-              <w:t>Toallas de papel dobladas (multi-fold), 1 caja</w:t>
+              <w:keepNext/>
+              <w:jc w:val="left"/>
+            </w:pPr>
+            <w:r>
+              <w:rPr>
+                <w:rFonts w:ascii="Calibri" w:cs="Calibri" w:eastAsia="Calibri" w:hAnsi="Calibri"/>
+                <w:b w:val="false"/>
+                <w:bCs w:val="false"/>
+                <w:color w:val="000000"/>
+                <w:sz w:val="17"/>
+                <w:szCs w:val="17"/>
+              </w:rPr>
+            </w:r>
+          </w:p>
+        </w:tc>
+        <w:tc>
+          <w:tcPr>
+            <w:tcW w:type="dxa" w:w="3800"/>
+            <w:shd w:fill="F5F7FA" w:color="auto" w:val="clear"/>
+            <w:tcMar>
+              <w:top w:type="dxa" w:w="60"/>
+              <w:left w:type="dxa" w:w="90"/>
+              <w:bottom w:type="dxa" w:w="60"/>
+              <w:right w:type="dxa" w:w="90"/>
+            </w:tcMar>
+          </w:tcPr>
+          <w:p>
+            <w:pPr>
+              <w:keepNext/>
+              <w:jc w:val="left"/>
+            </w:pPr>
+            <w:r>
+              <w:rPr>
+                <w:rFonts w:ascii="Calibri" w:cs="Calibri" w:eastAsia="Calibri" w:hAnsi="Calibri"/>
+                <w:b w:val="false"/>
+                <w:bCs w:val="false"/>
+                <w:color w:val="000000"/>
+                <w:sz w:val="17"/>
+                <w:szCs w:val="17"/>
+              </w:rPr>
+              <w:t>Nitrile Powder-Free Gloves, Case Of 1,000 — Large</w:t>
+            </w:r>
+          </w:p>
+        </w:tc>
+        <w:tc>
+          <w:tcPr>
+            <w:tcW w:type="dxa" w:w="3800"/>
+            <w:shd w:fill="F5F7FA" w:color="auto" w:val="clear"/>
+            <w:tcMar>
+              <w:top w:type="dxa" w:w="60"/>
+              <w:left w:type="dxa" w:w="90"/>
+              <w:bottom w:type="dxa" w:w="60"/>
+              <w:right w:type="dxa" w:w="90"/>
+            </w:tcMar>
+          </w:tcPr>
+          <w:p>
+            <w:pPr>
+              <w:keepNext/>
+              <w:jc w:val="left"/>
+            </w:pPr>
+            <w:r>
+              <w:rPr>
+                <w:rFonts w:ascii="Calibri" w:cs="Calibri" w:eastAsia="Calibri" w:hAnsi="Calibri"/>
+                <w:b w:val="false"/>
+                <w:bCs w:val="false"/>
+                <w:color w:val="000000"/>
+                <w:sz w:val="17"/>
+                <w:szCs w:val="17"/>
+              </w:rPr>
+              <w:t>Guantes de nitrilo sin polvo, caja de 1,000 — grande (L)</w:t>
+            </w:r>
+          </w:p>
+        </w:tc>
+        <w:tc>
+          <w:tcPr>
+            <w:tcW w:type="dxa" w:w="800"/>
+            <w:shd w:fill="F5F7FA" w:color="auto" w:val="clear"/>
+            <w:tcMar>
+              <w:top w:type="dxa" w:w="60"/>
+              <w:left w:type="dxa" w:w="90"/>
+              <w:bottom w:type="dxa" w:w="60"/>
+              <w:right w:type="dxa" w:w="90"/>
+            </w:tcMar>
+          </w:tcPr>
+          <w:p>
+            <w:pPr>
+              <w:keepNext/>
+              <w:jc w:val="left"/>
+            </w:pPr>
+            <w:r>
+              <w:rPr>
+                <w:rFonts w:ascii="Calibri" w:cs="Calibri" w:eastAsia="Calibri" w:hAnsi="Calibri"/>
+                <w:b w:val="false"/>
+                <w:bCs w:val="false"/>
+                <w:color w:val="000000"/>
+                <w:sz w:val="18"/>
+                <w:szCs w:val="18"/>
+              </w:rPr>
+            </w:r>
+          </w:p>
+        </w:tc>
+        <w:tc>
+          <w:tcPr>
+            <w:tcW w:type="dxa" w:w="800"/>
+            <w:shd w:fill="F5F7FA" w:color="auto" w:val="clear"/>
+            <w:tcMar>
+              <w:top w:type="dxa" w:w="60"/>
+              <w:left w:type="dxa" w:w="90"/>
+              <w:bottom w:type="dxa" w:w="60"/>
+              <w:right w:type="dxa" w:w="90"/>
+            </w:tcMar>
+          </w:tcPr>
+          <w:p>
+            <w:pPr>
+              <w:keepNext/>
+              <w:jc w:val="left"/>
+            </w:pPr>
+            <w:r>
+              <w:rPr>
+                <w:rFonts w:ascii="Calibri" w:cs="Calibri" w:eastAsia="Calibri" w:hAnsi="Calibri"/>
+                <w:b w:val="false"/>
+                <w:bCs w:val="false"/>
+                <w:color w:val="000000"/>
+                <w:sz w:val="18"/>
+                <w:szCs w:val="18"/>
+              </w:rPr>
+            </w:r>
+          </w:p>
+        </w:tc>
+      </w:tr>
+      <w:tr>
+        <w:trPr>
+          <w:cantSplit/>
+        </w:trPr>
+        <w:tc>
+          <w:tcPr>
+            <w:tcW w:type="dxa" w:w="1200"/>
+            <w:shd w:fill="F5F7FA" w:color="auto" w:val="clear"/>
+            <w:tcMar>
+              <w:top w:type="dxa" w:w="60"/>
+              <w:left w:type="dxa" w:w="90"/>
+              <w:bottom w:type="dxa" w:w="60"/>
+              <w:right w:type="dxa" w:w="90"/>
+            </w:tcMar>
+          </w:tcPr>
+          <w:p>
+            <w:pPr>
+              <w:keepNext/>
+              <w:jc w:val="left"/>
+            </w:pPr>
+            <w:r>
+              <w:rPr>
+                <w:rFonts w:ascii="Calibri" w:cs="Calibri" w:eastAsia="Calibri" w:hAnsi="Calibri"/>
+                <w:b w:val="false"/>
+                <w:bCs w:val="false"/>
+                <w:color w:val="000000"/>
+                <w:sz w:val="17"/>
+                <w:szCs w:val="17"/>
+              </w:rPr>
+            </w:r>
+          </w:p>
+        </w:tc>
+        <w:tc>
+          <w:tcPr>
+            <w:tcW w:type="dxa" w:w="3800"/>
+            <w:shd w:fill="F5F7FA" w:color="auto" w:val="clear"/>
+            <w:tcMar>
+              <w:top w:type="dxa" w:w="60"/>
+              <w:left w:type="dxa" w:w="90"/>
+              <w:bottom w:type="dxa" w:w="60"/>
+              <w:right w:type="dxa" w:w="90"/>
+            </w:tcMar>
+          </w:tcPr>
+          <w:p>
+            <w:pPr>
+              <w:keepNext/>
+              <w:jc w:val="left"/>
+            </w:pPr>
+            <w:r>
+              <w:rPr>
+                <w:rFonts w:ascii="Calibri" w:cs="Calibri" w:eastAsia="Calibri" w:hAnsi="Calibri"/>
+                <w:b w:val="false"/>
+                <w:bCs w:val="false"/>
+                <w:color w:val="000000"/>
+                <w:sz w:val="17"/>
+                <w:szCs w:val="17"/>
+              </w:rPr>
+              <w:t>Nitrile Powder-Free Gloves, Case Of 1,000 — X-Large</w:t>
+            </w:r>
+          </w:p>
+        </w:tc>
+        <w:tc>
+          <w:tcPr>
+            <w:tcW w:type="dxa" w:w="3800"/>
+            <w:shd w:fill="F5F7FA" w:color="auto" w:val="clear"/>
+            <w:tcMar>
+              <w:top w:type="dxa" w:w="60"/>
+              <w:left w:type="dxa" w:w="90"/>
+              <w:bottom w:type="dxa" w:w="60"/>
+              <w:right w:type="dxa" w:w="90"/>
+            </w:tcMar>
+          </w:tcPr>
+          <w:p>
+            <w:pPr>
+              <w:keepNext/>
+              <w:jc w:val="left"/>
+            </w:pPr>
+            <w:r>
+              <w:rPr>
+                <w:rFonts w:ascii="Calibri" w:cs="Calibri" w:eastAsia="Calibri" w:hAnsi="Calibri"/>
+                <w:b w:val="false"/>
+                <w:bCs w:val="false"/>
+                <w:color w:val="000000"/>
+                <w:sz w:val="17"/>
+                <w:szCs w:val="17"/>
+              </w:rPr>
+              <w:t>Guantes de nitrilo sin polvo, caja de 1,000 — extra grande (XL)</w:t>
+            </w:r>
+          </w:p>
+        </w:tc>
+        <w:tc>
+          <w:tcPr>
+            <w:tcW w:type="dxa" w:w="800"/>
+            <w:shd w:fill="F5F7FA" w:color="auto" w:val="clear"/>
+            <w:tcMar>
+              <w:top w:type="dxa" w:w="60"/>
+              <w:left w:type="dxa" w:w="90"/>
+              <w:bottom w:type="dxa" w:w="60"/>
+              <w:right w:type="dxa" w:w="90"/>
+            </w:tcMar>
+          </w:tcPr>
+          <w:p>
+            <w:pPr>
+              <w:keepNext/>
+              <w:jc w:val="left"/>
+            </w:pPr>
+            <w:r>
+              <w:rPr>
+                <w:rFonts w:ascii="Calibri" w:cs="Calibri" w:eastAsia="Calibri" w:hAnsi="Calibri"/>
+                <w:b w:val="false"/>
+                <w:bCs w:val="false"/>
+                <w:color w:val="000000"/>
+                <w:sz w:val="18"/>
+                <w:szCs w:val="18"/>
+              </w:rPr>
+            </w:r>
+          </w:p>
+        </w:tc>
+        <w:tc>
+          <w:tcPr>
+            <w:tcW w:type="dxa" w:w="800"/>
+            <w:shd w:fill="F5F7FA" w:color="auto" w:val="clear"/>
+            <w:tcMar>
+              <w:top w:type="dxa" w:w="60"/>
+              <w:left w:type="dxa" w:w="90"/>
+              <w:bottom w:type="dxa" w:w="60"/>
+              <w:right w:type="dxa" w:w="90"/>
+            </w:tcMar>
+          </w:tcPr>
+          <w:p>
+            <w:pPr>
+              <w:keepNext/>
+              <w:jc w:val="left"/>
+            </w:pPr>
+            <w:r>
+              <w:rPr>
+                <w:rFonts w:ascii="Calibri" w:cs="Calibri" w:eastAsia="Calibri" w:hAnsi="Calibri"/>
+                <w:b w:val="false"/>
+                <w:bCs w:val="false"/>
+                <w:color w:val="000000"/>
+                <w:sz w:val="18"/>
+                <w:szCs w:val="18"/>
+              </w:rPr>
+            </w:r>
+          </w:p>
+        </w:tc>
+      </w:tr>
+      <w:tr>
+        <w:trPr>
+          <w:cantSplit/>
+        </w:trPr>
+        <w:tc>
+          <w:tcPr>
+            <w:tcW w:type="dxa" w:w="1200"/>
+            <w:shd w:fill="F5F7FA" w:color="auto" w:val="clear"/>
+            <w:tcMar>
+              <w:top w:type="dxa" w:w="60"/>
+              <w:left w:type="dxa" w:w="90"/>
+              <w:bottom w:type="dxa" w:w="60"/>
+              <w:right w:type="dxa" w:w="90"/>
+            </w:tcMar>
+          </w:tcPr>
+          <w:p>
+            <w:pPr>
+              <w:keepNext/>
+              <w:jc w:val="left"/>
+            </w:pPr>
+            <w:r>
+              <w:rPr>
+                <w:rFonts w:ascii="Calibri" w:cs="Calibri" w:eastAsia="Calibri" w:hAnsi="Calibri"/>
+                <w:b w:val="false"/>
+                <w:bCs w:val="false"/>
+                <w:color w:val="000000"/>
+                <w:sz w:val="17"/>
+                <w:szCs w:val="17"/>
+              </w:rPr>
+            </w:r>
+          </w:p>
+        </w:tc>
+        <w:tc>
+          <w:tcPr>
+            <w:tcW w:type="dxa" w:w="3800"/>
+            <w:shd w:fill="F5F7FA" w:color="auto" w:val="clear"/>
+            <w:tcMar>
+              <w:top w:type="dxa" w:w="60"/>
+              <w:left w:type="dxa" w:w="90"/>
+              <w:bottom w:type="dxa" w:w="60"/>
+              <w:right w:type="dxa" w:w="90"/>
+            </w:tcMar>
+          </w:tcPr>
+          <w:p>
+            <w:pPr>
+              <w:keepNext/>
+              <w:jc w:val="left"/>
+            </w:pPr>
+            <w:r>
+              <w:rPr>
+                <w:rFonts w:ascii="Calibri" w:cs="Calibri" w:eastAsia="Calibri" w:hAnsi="Calibri"/>
+                <w:b w:val="false"/>
+                <w:bCs w:val="false"/>
+                <w:color w:val="000000"/>
+                <w:sz w:val="17"/>
+                <w:szCs w:val="17"/>
+              </w:rPr>
+              <w:t>Microfiber Cleaning Towels 12 X 12, 24-Pack</w:t>
+            </w:r>
+          </w:p>
+        </w:tc>
+        <w:tc>
+          <w:tcPr>
+            <w:tcW w:type="dxa" w:w="3800"/>
+            <w:shd w:fill="F5F7FA" w:color="auto" w:val="clear"/>
+            <w:tcMar>
+              <w:top w:type="dxa" w:w="60"/>
+              <w:left w:type="dxa" w:w="90"/>
+              <w:bottom w:type="dxa" w:w="60"/>
+              <w:right w:type="dxa" w:w="90"/>
+            </w:tcMar>
+          </w:tcPr>
+          <w:p>
+            <w:pPr>
+              <w:keepNext/>
+              <w:jc w:val="left"/>
+            </w:pPr>
+            <w:r>
+              <w:rPr>
+                <w:rFonts w:ascii="Calibri" w:cs="Calibri" w:eastAsia="Calibri" w:hAnsi="Calibri"/>
+                <w:b w:val="false"/>
+                <w:bCs w:val="false"/>
+                <w:color w:val="000000"/>
+                <w:sz w:val="17"/>
+                <w:szCs w:val="17"/>
+              </w:rPr>
+              <w:t>Toallas de microfibra 12 x 12, paquete de 24</w:t>
+            </w:r>
+          </w:p>
+        </w:tc>
+        <w:tc>
+          <w:tcPr>
+            <w:tcW w:type="dxa" w:w="800"/>
+            <w:shd w:fill="F5F7FA" w:color="auto" w:val="clear"/>
+            <w:tcMar>
+              <w:top w:type="dxa" w:w="60"/>
+              <w:left w:type="dxa" w:w="90"/>
+              <w:bottom w:type="dxa" w:w="60"/>
+              <w:right w:type="dxa" w:w="90"/>
+            </w:tcMar>
+          </w:tcPr>
+          <w:p>
+            <w:pPr>
+              <w:keepNext/>
+              <w:jc w:val="left"/>
+            </w:pPr>
+            <w:r>
+              <w:rPr>
+                <w:rFonts w:ascii="Calibri" w:cs="Calibri" w:eastAsia="Calibri" w:hAnsi="Calibri"/>
+                <w:b w:val="false"/>
+                <w:bCs w:val="false"/>
+                <w:color w:val="000000"/>
+                <w:sz w:val="18"/>
+                <w:szCs w:val="18"/>
+              </w:rPr>
+            </w:r>
+          </w:p>
+        </w:tc>
+        <w:tc>
+          <w:tcPr>
+            <w:tcW w:type="dxa" w:w="800"/>
+            <w:shd w:fill="F5F7FA" w:color="auto" w:val="clear"/>
+            <w:tcMar>
+              <w:top w:type="dxa" w:w="60"/>
+              <w:left w:type="dxa" w:w="90"/>
+              <w:bottom w:type="dxa" w:w="60"/>
+              <w:right w:type="dxa" w:w="90"/>
+            </w:tcMar>
+          </w:tcPr>
+          <w:p>
+            <w:pPr>
+              <w:keepNext/>
+              <w:jc w:val="left"/>
+            </w:pPr>
+            <w:r>
+              <w:rPr>
+                <w:rFonts w:ascii="Calibri" w:cs="Calibri" w:eastAsia="Calibri" w:hAnsi="Calibri"/>
+                <w:b w:val="false"/>
+                <w:bCs w:val="false"/>
+                <w:color w:val="000000"/>
+                <w:sz w:val="18"/>
+                <w:szCs w:val="18"/>
+              </w:rPr>
+            </w:r>
+          </w:p>
+        </w:tc>
+      </w:tr>
+      <w:tr>
+        <w:trPr>
+          <w:cantSplit/>
+        </w:trPr>
+        <w:tc>
+          <w:tcPr>
+            <w:tcW w:type="dxa" w:w="1200"/>
+            <w:shd w:fill="F5F7FA" w:color="auto" w:val="clear"/>
+            <w:tcMar>
+              <w:top w:type="dxa" w:w="60"/>
+              <w:left w:type="dxa" w:w="90"/>
+              <w:bottom w:type="dxa" w:w="60"/>
+              <w:right w:type="dxa" w:w="90"/>
+            </w:tcMar>
+          </w:tcPr>
+          <w:p>
+            <w:pPr>
+              <w:keepNext/>
+              <w:jc w:val="left"/>
+            </w:pPr>
+            <w:r>
+              <w:rPr>
+                <w:rFonts w:ascii="Calibri" w:cs="Calibri" w:eastAsia="Calibri" w:hAnsi="Calibri"/>
+                <w:b w:val="false"/>
+                <w:bCs w:val="false"/>
+                <w:color w:val="000000"/>
+                <w:sz w:val="17"/>
+                <w:szCs w:val="17"/>
+              </w:rPr>
+              <w:t>503061</w:t>
+            </w:r>
+          </w:p>
+        </w:tc>
+        <w:tc>
+          <w:tcPr>
+            <w:tcW w:type="dxa" w:w="3800"/>
+            <w:shd w:fill="F5F7FA" w:color="auto" w:val="clear"/>
+            <w:tcMar>
+              <w:top w:type="dxa" w:w="60"/>
+              <w:left w:type="dxa" w:w="90"/>
+              <w:bottom w:type="dxa" w:w="60"/>
+              <w:right w:type="dxa" w:w="90"/>
+            </w:tcMar>
+          </w:tcPr>
+          <w:p>
+            <w:pPr>
+              <w:keepNext/>
+              <w:jc w:val="left"/>
+            </w:pPr>
+            <w:r>
+              <w:rPr>
+                <w:rFonts w:ascii="Calibri" w:cs="Calibri" w:eastAsia="Calibri" w:hAnsi="Calibri"/>
+                <w:b w:val="false"/>
+                <w:bCs w:val="false"/>
+                <w:color w:val="000000"/>
+                <w:sz w:val="17"/>
+                <w:szCs w:val="17"/>
+              </w:rPr>
+              <w:t>Bathroom Sponges, case</w:t>
+            </w:r>
+          </w:p>
+        </w:tc>
+        <w:tc>
+          <w:tcPr>
+            <w:tcW w:type="dxa" w:w="3800"/>
+            <w:shd w:fill="F5F7FA" w:color="auto" w:val="clear"/>
+            <w:tcMar>
+              <w:top w:type="dxa" w:w="60"/>
+              <w:left w:type="dxa" w:w="90"/>
+              <w:bottom w:type="dxa" w:w="60"/>
+              <w:right w:type="dxa" w:w="90"/>
+            </w:tcMar>
+          </w:tcPr>
+          <w:p>
+            <w:pPr>
+              <w:keepNext/>
+              <w:jc w:val="left"/>
+            </w:pPr>
+            <w:r>
+              <w:rPr>
+                <w:rFonts w:ascii="Calibri" w:cs="Calibri" w:eastAsia="Calibri" w:hAnsi="Calibri"/>
+                <w:b w:val="false"/>
+                <w:bCs w:val="false"/>
+                <w:color w:val="000000"/>
+                <w:sz w:val="17"/>
+                <w:szCs w:val="17"/>
+              </w:rPr>
+              <w:t>Esponjas para el baño, caja</w:t>
+            </w:r>
+          </w:p>
+        </w:tc>
+        <w:tc>
+          <w:tcPr>
+            <w:tcW w:type="dxa" w:w="800"/>
+            <w:shd w:fill="F5F7FA" w:color="auto" w:val="clear"/>
+            <w:tcMar>
+              <w:top w:type="dxa" w:w="60"/>
+              <w:left w:type="dxa" w:w="90"/>
+              <w:bottom w:type="dxa" w:w="60"/>
+              <w:right w:type="dxa" w:w="90"/>
+            </w:tcMar>
+          </w:tcPr>
+          <w:p>
+            <w:pPr>
+              <w:keepNext/>
+              <w:jc w:val="left"/>
+            </w:pPr>
+            <w:r>
+              <w:rPr>
+                <w:rFonts w:ascii="Calibri" w:cs="Calibri" w:eastAsia="Calibri" w:hAnsi="Calibri"/>
+                <w:b w:val="false"/>
+                <w:bCs w:val="false"/>
+                <w:color w:val="000000"/>
+                <w:sz w:val="18"/>
+                <w:szCs w:val="18"/>
+              </w:rPr>
+            </w:r>
+          </w:p>
+        </w:tc>
+        <w:tc>
+          <w:tcPr>
+            <w:tcW w:type="dxa" w:w="800"/>
+            <w:shd w:fill="F5F7FA" w:color="auto" w:val="clear"/>
+            <w:tcMar>
+              <w:top w:type="dxa" w:w="60"/>
+              <w:left w:type="dxa" w:w="90"/>
+              <w:bottom w:type="dxa" w:w="60"/>
+              <w:right w:type="dxa" w:w="90"/>
+            </w:tcMar>
+          </w:tcPr>
+          <w:p>
+            <w:pPr>
+              <w:keepNext/>
+              <w:jc w:val="left"/>
+            </w:pPr>
+            <w:r>
+              <w:rPr>
+                <w:rFonts w:ascii="Calibri" w:cs="Calibri" w:eastAsia="Calibri" w:hAnsi="Calibri"/>
+                <w:b w:val="false"/>
+                <w:bCs w:val="false"/>
+                <w:color w:val="000000"/>
+                <w:sz w:val="18"/>
+                <w:szCs w:val="18"/>
+              </w:rPr>
+            </w:r>
+          </w:p>
+        </w:tc>
+      </w:tr>
+      <w:tr>
+        <w:trPr>
+          <w:cantSplit/>
+        </w:trPr>
+        <w:tc>
+          <w:tcPr>
+            <w:tcW w:type="dxa" w:w="1200"/>
+            <w:shd w:fill="F5F7FA" w:color="auto" w:val="clear"/>
+            <w:tcMar>
+              <w:top w:type="dxa" w:w="60"/>
+              <w:left w:type="dxa" w:w="90"/>
+              <w:bottom w:type="dxa" w:w="60"/>
+              <w:right w:type="dxa" w:w="90"/>
+            </w:tcMar>
+          </w:tcPr>
+          <w:p>
+            <w:pPr>
+              <w:keepNext/>
+              <w:jc w:val="left"/>
+            </w:pPr>
+            <w:r>
+              <w:rPr>
+                <w:rFonts w:ascii="Calibri" w:cs="Calibri" w:eastAsia="Calibri" w:hAnsi="Calibri"/>
+                <w:b w:val="false"/>
+                <w:bCs w:val="false"/>
+                <w:color w:val="000000"/>
+                <w:sz w:val="17"/>
+                <w:szCs w:val="17"/>
+              </w:rPr>
+            </w:r>
+          </w:p>
+        </w:tc>
+        <w:tc>
+          <w:tcPr>
+            <w:tcW w:type="dxa" w:w="3800"/>
+            <w:shd w:fill="F5F7FA" w:color="auto" w:val="clear"/>
+            <w:tcMar>
+              <w:top w:type="dxa" w:w="60"/>
+              <w:left w:type="dxa" w:w="90"/>
+              <w:bottom w:type="dxa" w:w="60"/>
+              <w:right w:type="dxa" w:w="90"/>
+            </w:tcMar>
+          </w:tcPr>
+          <w:p>
+            <w:pPr>
+              <w:keepNext/>
+              <w:jc w:val="left"/>
+            </w:pPr>
+            <w:r>
+              <w:rPr>
+                <w:rFonts w:ascii="Calibri" w:cs="Calibri" w:eastAsia="Calibri" w:hAnsi="Calibri"/>
+                <w:b w:val="false"/>
+                <w:bCs w:val="false"/>
+                <w:color w:val="000000"/>
+                <w:sz w:val="17"/>
+                <w:szCs w:val="17"/>
+              </w:rPr>
+              <w:t>Glass Cleaner  (Ecolab MFG 6100289 — confirm HD Supply part #)</w:t>
+            </w:r>
+          </w:p>
+        </w:tc>
+        <w:tc>
+          <w:tcPr>
+            <w:tcW w:type="dxa" w:w="3800"/>
+            <w:shd w:fill="F5F7FA" w:color="auto" w:val="clear"/>
+            <w:tcMar>
+              <w:top w:type="dxa" w:w="60"/>
+              <w:left w:type="dxa" w:w="90"/>
+              <w:bottom w:type="dxa" w:w="60"/>
+              <w:right w:type="dxa" w:w="90"/>
+            </w:tcMar>
+          </w:tcPr>
+          <w:p>
+            <w:pPr>
+              <w:keepNext/>
+              <w:jc w:val="left"/>
+            </w:pPr>
+            <w:r>
+              <w:rPr>
+                <w:rFonts w:ascii="Calibri" w:cs="Calibri" w:eastAsia="Calibri" w:hAnsi="Calibri"/>
+                <w:b w:val="false"/>
+                <w:bCs w:val="false"/>
+                <w:color w:val="000000"/>
+                <w:sz w:val="17"/>
+                <w:szCs w:val="17"/>
+              </w:rPr>
+              <w:t>Limpiavidrios (Ecolab MFG 6100289 — confirmar el número de parte)</w:t>
+            </w:r>
+          </w:p>
+        </w:tc>
+        <w:tc>
+          <w:tcPr>
+            <w:tcW w:type="dxa" w:w="800"/>
+            <w:shd w:fill="F5F7FA" w:color="auto" w:val="clear"/>
+            <w:tcMar>
+              <w:top w:type="dxa" w:w="60"/>
+              <w:left w:type="dxa" w:w="90"/>
+              <w:bottom w:type="dxa" w:w="60"/>
+              <w:right w:type="dxa" w:w="90"/>
+            </w:tcMar>
+          </w:tcPr>
+          <w:p>
+            <w:pPr>
+              <w:keepNext/>
+              <w:jc w:val="left"/>
+            </w:pPr>
+            <w:r>
+              <w:rPr>
+                <w:rFonts w:ascii="Calibri" w:cs="Calibri" w:eastAsia="Calibri" w:hAnsi="Calibri"/>
+                <w:b w:val="false"/>
+                <w:bCs w:val="false"/>
+                <w:color w:val="000000"/>
+                <w:sz w:val="18"/>
+                <w:szCs w:val="18"/>
+              </w:rPr>
+            </w:r>
+          </w:p>
+        </w:tc>
+        <w:tc>
+          <w:tcPr>
+            <w:tcW w:type="dxa" w:w="800"/>
+            <w:shd w:fill="F5F7FA" w:color="auto" w:val="clear"/>
+            <w:tcMar>
+              <w:top w:type="dxa" w:w="60"/>
+              <w:left w:type="dxa" w:w="90"/>
+              <w:bottom w:type="dxa" w:w="60"/>
+              <w:right w:type="dxa" w:w="90"/>
+            </w:tcMar>
+          </w:tcPr>
+          <w:p>
+            <w:pPr>
+              <w:keepNext/>
+              <w:jc w:val="left"/>
+            </w:pPr>
+            <w:r>
+              <w:rPr>
+                <w:rFonts w:ascii="Calibri" w:cs="Calibri" w:eastAsia="Calibri" w:hAnsi="Calibri"/>
+                <w:b w:val="false"/>
+                <w:bCs w:val="false"/>
+                <w:color w:val="000000"/>
+                <w:sz w:val="18"/>
+                <w:szCs w:val="18"/>
+              </w:rPr>
+            </w:r>
+          </w:p>
+        </w:tc>
+      </w:tr>
+      <w:tr>
+        <w:trPr>
+          <w:cantSplit/>
+        </w:trPr>
+        <w:tc>
+          <w:tcPr>
+            <w:tcW w:type="dxa" w:w="1200"/>
+            <w:shd w:fill="F5F7FA" w:color="auto" w:val="clear"/>
+            <w:tcMar>
+              <w:top w:type="dxa" w:w="60"/>
+              <w:left w:type="dxa" w:w="90"/>
+              <w:bottom w:type="dxa" w:w="60"/>
+              <w:right w:type="dxa" w:w="90"/>
+            </w:tcMar>
+          </w:tcPr>
+          <w:p>
+            <w:pPr>
+              <w:keepNext/>
+              <w:jc w:val="left"/>
+            </w:pPr>
+            <w:r>
+              <w:rPr>
+                <w:rFonts w:ascii="Calibri" w:cs="Calibri" w:eastAsia="Calibri" w:hAnsi="Calibri"/>
+                <w:b w:val="false"/>
+                <w:bCs w:val="false"/>
+                <w:color w:val="000000"/>
+                <w:sz w:val="17"/>
+                <w:szCs w:val="17"/>
+              </w:rPr>
+            </w:r>
+          </w:p>
+        </w:tc>
+        <w:tc>
+          <w:tcPr>
+            <w:tcW w:type="dxa" w:w="3800"/>
+            <w:shd w:fill="F5F7FA" w:color="auto" w:val="clear"/>
+            <w:tcMar>
+              <w:top w:type="dxa" w:w="60"/>
+              <w:left w:type="dxa" w:w="90"/>
+              <w:bottom w:type="dxa" w:w="60"/>
+              <w:right w:type="dxa" w:w="90"/>
+            </w:tcMar>
+          </w:tcPr>
+          <w:p>
+            <w:pPr>
+              <w:keepNext/>
+              <w:jc w:val="left"/>
+            </w:pPr>
+            <w:r>
+              <w:rPr>
+                <w:rFonts w:ascii="Calibri" w:cs="Calibri" w:eastAsia="Calibri" w:hAnsi="Calibri"/>
+                <w:b w:val="false"/>
+                <w:bCs w:val="false"/>
+                <w:color w:val="000000"/>
+                <w:sz w:val="17"/>
+                <w:szCs w:val="17"/>
+              </w:rPr>
+              <w:t>Bath Cleaner  (Ecolab MFG 6110158 — confirm HD Supply part #)</w:t>
+            </w:r>
+          </w:p>
+        </w:tc>
+        <w:tc>
+          <w:tcPr>
+            <w:tcW w:type="dxa" w:w="3800"/>
+            <w:shd w:fill="F5F7FA" w:color="auto" w:val="clear"/>
+            <w:tcMar>
+              <w:top w:type="dxa" w:w="60"/>
+              <w:left w:type="dxa" w:w="90"/>
+              <w:bottom w:type="dxa" w:w="60"/>
+              <w:right w:type="dxa" w:w="90"/>
+            </w:tcMar>
+          </w:tcPr>
+          <w:p>
+            <w:pPr>
+              <w:keepNext/>
+              <w:jc w:val="left"/>
+            </w:pPr>
+            <w:r>
+              <w:rPr>
+                <w:rFonts w:ascii="Calibri" w:cs="Calibri" w:eastAsia="Calibri" w:hAnsi="Calibri"/>
+                <w:b w:val="false"/>
+                <w:bCs w:val="false"/>
+                <w:color w:val="000000"/>
+                <w:sz w:val="17"/>
+                <w:szCs w:val="17"/>
+              </w:rPr>
+              <w:t>Limpiador para el baño (Ecolab MFG 6110158 — confirmar el número de parte)</w:t>
+            </w:r>
+          </w:p>
+        </w:tc>
+        <w:tc>
+          <w:tcPr>
+            <w:tcW w:type="dxa" w:w="800"/>
+            <w:shd w:fill="F5F7FA" w:color="auto" w:val="clear"/>
+            <w:tcMar>
+              <w:top w:type="dxa" w:w="60"/>
+              <w:left w:type="dxa" w:w="90"/>
+              <w:bottom w:type="dxa" w:w="60"/>
+              <w:right w:type="dxa" w:w="90"/>
+            </w:tcMar>
+          </w:tcPr>
+          <w:p>
+            <w:pPr>
+              <w:keepNext/>
+              <w:jc w:val="left"/>
+            </w:pPr>
+            <w:r>
+              <w:rPr>
+                <w:rFonts w:ascii="Calibri" w:cs="Calibri" w:eastAsia="Calibri" w:hAnsi="Calibri"/>
+                <w:b w:val="false"/>
+                <w:bCs w:val="false"/>
+                <w:color w:val="000000"/>
+                <w:sz w:val="18"/>
+                <w:szCs w:val="18"/>
+              </w:rPr>
+            </w:r>
+          </w:p>
+        </w:tc>
+        <w:tc>
+          <w:tcPr>
+            <w:tcW w:type="dxa" w:w="800"/>
+            <w:shd w:fill="F5F7FA" w:color="auto" w:val="clear"/>
+            <w:tcMar>
+              <w:top w:type="dxa" w:w="60"/>
+              <w:left w:type="dxa" w:w="90"/>
+              <w:bottom w:type="dxa" w:w="60"/>
+              <w:right w:type="dxa" w:w="90"/>
+            </w:tcMar>
+          </w:tcPr>
+          <w:p>
+            <w:pPr>
+              <w:keepNext/>
+              <w:jc w:val="left"/>
+            </w:pPr>
+            <w:r>
+              <w:rPr>
+                <w:rFonts w:ascii="Calibri" w:cs="Calibri" w:eastAsia="Calibri" w:hAnsi="Calibri"/>
+                <w:b w:val="false"/>
+                <w:bCs w:val="false"/>
+                <w:color w:val="000000"/>
+                <w:sz w:val="18"/>
+                <w:szCs w:val="18"/>
+              </w:rPr>
+            </w:r>
+          </w:p>
+        </w:tc>
+      </w:tr>
+      <w:tr>
+        <w:trPr>
+          <w:cantSplit/>
+        </w:trPr>
+        <w:tc>
+          <w:tcPr>
+            <w:tcW w:type="dxa" w:w="1200"/>
+            <w:shd w:fill="F5F7FA" w:color="auto" w:val="clear"/>
+            <w:tcMar>
+              <w:top w:type="dxa" w:w="60"/>
+              <w:left w:type="dxa" w:w="90"/>
+              <w:bottom w:type="dxa" w:w="60"/>
+              <w:right w:type="dxa" w:w="90"/>
+            </w:tcMar>
+          </w:tcPr>
+          <w:p>
+            <w:pPr>
+              <w:keepNext/>
+              <w:jc w:val="left"/>
+            </w:pPr>
+            <w:r>
+              <w:rPr>
+                <w:rFonts w:ascii="Calibri" w:cs="Calibri" w:eastAsia="Calibri" w:hAnsi="Calibri"/>
+                <w:b w:val="false"/>
+                <w:bCs w:val="false"/>
+                <w:color w:val="000000"/>
+                <w:sz w:val="17"/>
+                <w:szCs w:val="17"/>
+              </w:rPr>
+              <w:t>159008</w:t>
+            </w:r>
+          </w:p>
+        </w:tc>
+        <w:tc>
+          <w:tcPr>
+            <w:tcW w:type="dxa" w:w="3800"/>
+            <w:shd w:fill="F5F7FA" w:color="auto" w:val="clear"/>
+            <w:tcMar>
+              <w:top w:type="dxa" w:w="60"/>
+              <w:left w:type="dxa" w:w="90"/>
+              <w:bottom w:type="dxa" w:w="60"/>
+              <w:right w:type="dxa" w:w="90"/>
+            </w:tcMar>
+          </w:tcPr>
+          <w:p>
+            <w:pPr>
+              <w:keepNext/>
+              <w:jc w:val="left"/>
+            </w:pPr>
+            <w:r>
+              <w:rPr>
+                <w:rFonts w:ascii="Calibri" w:cs="Calibri" w:eastAsia="Calibri" w:hAnsi="Calibri"/>
+                <w:b w:val="false"/>
+                <w:bCs w:val="false"/>
+                <w:color w:val="000000"/>
+                <w:sz w:val="17"/>
+                <w:szCs w:val="17"/>
+              </w:rPr>
+              <w:t>Lint Rollers</w:t>
+            </w:r>
+          </w:p>
+        </w:tc>
+        <w:tc>
+          <w:tcPr>
+            <w:tcW w:type="dxa" w:w="3800"/>
+            <w:shd w:fill="F5F7FA" w:color="auto" w:val="clear"/>
+            <w:tcMar>
+              <w:top w:type="dxa" w:w="60"/>
+              <w:left w:type="dxa" w:w="90"/>
+              <w:bottom w:type="dxa" w:w="60"/>
+              <w:right w:type="dxa" w:w="90"/>
+            </w:tcMar>
+          </w:tcPr>
+          <w:p>
+            <w:pPr>
+              <w:keepNext/>
+              <w:jc w:val="left"/>
+            </w:pPr>
+            <w:r>
+              <w:rPr>
+                <w:rFonts w:ascii="Calibri" w:cs="Calibri" w:eastAsia="Calibri" w:hAnsi="Calibri"/>
+                <w:b w:val="false"/>
+                <w:bCs w:val="false"/>
+                <w:color w:val="000000"/>
+                <w:sz w:val="17"/>
+                <w:szCs w:val="17"/>
+              </w:rPr>
+              <w:t>Rodillos quita-pelusa</w:t>
+            </w:r>
+          </w:p>
+        </w:tc>
+        <w:tc>
+          <w:tcPr>
+            <w:tcW w:type="dxa" w:w="800"/>
+            <w:shd w:fill="F5F7FA" w:color="auto" w:val="clear"/>
+            <w:tcMar>
+              <w:top w:type="dxa" w:w="60"/>
+              <w:left w:type="dxa" w:w="90"/>
+              <w:bottom w:type="dxa" w:w="60"/>
+              <w:right w:type="dxa" w:w="90"/>
+            </w:tcMar>
+          </w:tcPr>
+          <w:p>
+            <w:pPr>
+              <w:keepNext/>
+              <w:jc w:val="left"/>
+            </w:pPr>
+            <w:r>
+              <w:rPr>
+                <w:rFonts w:ascii="Calibri" w:cs="Calibri" w:eastAsia="Calibri" w:hAnsi="Calibri"/>
+                <w:b w:val="false"/>
+                <w:bCs w:val="false"/>
+                <w:color w:val="000000"/>
+                <w:sz w:val="18"/>
+                <w:szCs w:val="18"/>
+              </w:rPr>
+            </w:r>
+          </w:p>
+        </w:tc>
+        <w:tc>
+          <w:tcPr>
+            <w:tcW w:type="dxa" w:w="800"/>
+            <w:shd w:fill="F5F7FA" w:color="auto" w:val="clear"/>
+            <w:tcMar>
+              <w:top w:type="dxa" w:w="60"/>
+              <w:left w:type="dxa" w:w="90"/>
+              <w:bottom w:type="dxa" w:w="60"/>
+              <w:right w:type="dxa" w:w="90"/>
+            </w:tcMar>
+          </w:tcPr>
+          <w:p>
+            <w:pPr>
+              <w:keepNext/>
+              <w:jc w:val="left"/>
+            </w:pPr>
+            <w:r>
+              <w:rPr>
+                <w:rFonts w:ascii="Calibri" w:cs="Calibri" w:eastAsia="Calibri" w:hAnsi="Calibri"/>
+                <w:b w:val="false"/>
+                <w:bCs w:val="false"/>
+                <w:color w:val="000000"/>
+                <w:sz w:val="18"/>
+                <w:szCs w:val="18"/>
+              </w:rPr>
+            </w:r>
+          </w:p>
+        </w:tc>
+      </w:tr>
+      <w:tr>
+        <w:trPr>
+          <w:cantSplit/>
+        </w:trPr>
+        <w:tc>
+          <w:tcPr>
+            <w:tcW w:type="dxa" w:w="1200"/>
+            <w:shd w:fill="F5F7FA" w:color="auto" w:val="clear"/>
+            <w:tcMar>
+              <w:top w:type="dxa" w:w="60"/>
+              <w:left w:type="dxa" w:w="90"/>
+              <w:bottom w:type="dxa" w:w="60"/>
+              <w:right w:type="dxa" w:w="90"/>
+            </w:tcMar>
+          </w:tcPr>
+          <w:p>
+            <w:pPr>
+              <w:keepNext/>
+              <w:jc w:val="left"/>
+            </w:pPr>
+            <w:r>
+              <w:rPr>
+                <w:rFonts w:ascii="Calibri" w:cs="Calibri" w:eastAsia="Calibri" w:hAnsi="Calibri"/>
+                <w:b w:val="false"/>
+                <w:bCs w:val="false"/>
+                <w:color w:val="000000"/>
+                <w:sz w:val="17"/>
+                <w:szCs w:val="17"/>
+              </w:rPr>
+              <w:t>159009</w:t>
+            </w:r>
+          </w:p>
+        </w:tc>
+        <w:tc>
+          <w:tcPr>
+            <w:tcW w:type="dxa" w:w="3800"/>
+            <w:shd w:fill="F5F7FA" w:color="auto" w:val="clear"/>
+            <w:tcMar>
+              <w:top w:type="dxa" w:w="60"/>
+              <w:left w:type="dxa" w:w="90"/>
+              <w:bottom w:type="dxa" w:w="60"/>
+              <w:right w:type="dxa" w:w="90"/>
+            </w:tcMar>
+          </w:tcPr>
+          <w:p>
+            <w:pPr>
+              <w:keepNext/>
+              <w:jc w:val="left"/>
+            </w:pPr>
+            <w:r>
+              <w:rPr>
+                <w:rFonts w:ascii="Calibri" w:cs="Calibri" w:eastAsia="Calibri" w:hAnsi="Calibri"/>
+                <w:b w:val="false"/>
+                <w:bCs w:val="false"/>
+                <w:color w:val="000000"/>
+                <w:sz w:val="17"/>
+                <w:szCs w:val="17"/>
+              </w:rPr>
+              <w:t>Lint Roller Refills</w:t>
+            </w:r>
+          </w:p>
+        </w:tc>
+        <w:tc>
+          <w:tcPr>
+            <w:tcW w:type="dxa" w:w="3800"/>
+            <w:shd w:fill="F5F7FA" w:color="auto" w:val="clear"/>
+            <w:tcMar>
+              <w:top w:type="dxa" w:w="60"/>
+              <w:left w:type="dxa" w:w="90"/>
+              <w:bottom w:type="dxa" w:w="60"/>
+              <w:right w:type="dxa" w:w="90"/>
+            </w:tcMar>
+          </w:tcPr>
+          <w:p>
+            <w:pPr>
+              <w:keepNext/>
+              <w:jc w:val="left"/>
+            </w:pPr>
+            <w:r>
+              <w:rPr>
+                <w:rFonts w:ascii="Calibri" w:cs="Calibri" w:eastAsia="Calibri" w:hAnsi="Calibri"/>
+                <w:b w:val="false"/>
+                <w:bCs w:val="false"/>
+                <w:color w:val="000000"/>
+                <w:sz w:val="17"/>
+                <w:szCs w:val="17"/>
+              </w:rPr>
+              <w:t>Repuestos para el rodillo quita-pelusa</w:t>
+            </w:r>
+          </w:p>
+        </w:tc>
+        <w:tc>
+          <w:tcPr>
+            <w:tcW w:type="dxa" w:w="800"/>
+            <w:shd w:fill="F5F7FA" w:color="auto" w:val="clear"/>
+            <w:tcMar>
+              <w:top w:type="dxa" w:w="60"/>
+              <w:left w:type="dxa" w:w="90"/>
+              <w:bottom w:type="dxa" w:w="60"/>
+              <w:right w:type="dxa" w:w="90"/>
+            </w:tcMar>
+          </w:tcPr>
+          <w:p>
+            <w:pPr>
+              <w:keepNext/>
+              <w:jc w:val="left"/>
+            </w:pPr>
+            <w:r>
+              <w:rPr>
+                <w:rFonts w:ascii="Calibri" w:cs="Calibri" w:eastAsia="Calibri" w:hAnsi="Calibri"/>
+                <w:b w:val="false"/>
+                <w:bCs w:val="false"/>
+                <w:color w:val="000000"/>
+                <w:sz w:val="18"/>
+                <w:szCs w:val="18"/>
+              </w:rPr>
+            </w:r>
+          </w:p>
+        </w:tc>
+        <w:tc>
+          <w:tcPr>
+            <w:tcW w:type="dxa" w:w="800"/>
+            <w:shd w:fill="F5F7FA" w:color="auto" w:val="clear"/>
+            <w:tcMar>
+              <w:top w:type="dxa" w:w="60"/>
+              <w:left w:type="dxa" w:w="90"/>
+              <w:bottom w:type="dxa" w:w="60"/>
+              <w:right w:type="dxa" w:w="90"/>
+            </w:tcMar>
+          </w:tcPr>
+          <w:p>
+            <w:pPr>
+              <w:keepNext/>
+              <w:jc w:val="left"/>
+            </w:pPr>
+            <w:r>
+              <w:rPr>
+                <w:rFonts w:ascii="Calibri" w:cs="Calibri" w:eastAsia="Calibri" w:hAnsi="Calibri"/>
+                <w:b w:val="false"/>
+                <w:bCs w:val="false"/>
+                <w:color w:val="000000"/>
+                <w:sz w:val="18"/>
+                <w:szCs w:val="18"/>
+              </w:rPr>
+            </w:r>
+          </w:p>
+        </w:tc>
+      </w:tr>
+      <w:tr>
+        <w:trPr>
+          <w:cantSplit/>
+        </w:trPr>
+        <w:tc>
+          <w:tcPr>
+            <w:tcW w:type="dxa" w:w="1200"/>
+            <w:shd w:fill="F5F7FA" w:color="auto" w:val="clear"/>
+            <w:tcMar>
+              <w:top w:type="dxa" w:w="60"/>
+              <w:left w:type="dxa" w:w="90"/>
+              <w:bottom w:type="dxa" w:w="60"/>
+              <w:right w:type="dxa" w:w="90"/>
+            </w:tcMar>
+          </w:tcPr>
+          <w:p>
+            <w:pPr>
+              <w:keepNext/>
+              <w:jc w:val="left"/>
+            </w:pPr>
+            <w:r>
+              <w:rPr>
+                <w:rFonts w:ascii="Calibri" w:cs="Calibri" w:eastAsia="Calibri" w:hAnsi="Calibri"/>
+                <w:b w:val="false"/>
+                <w:bCs w:val="false"/>
+                <w:color w:val="000000"/>
+                <w:sz w:val="17"/>
+                <w:szCs w:val="17"/>
+              </w:rPr>
+              <w:t>908636</w:t>
+            </w:r>
+          </w:p>
+        </w:tc>
+        <w:tc>
+          <w:tcPr>
+            <w:tcW w:type="dxa" w:w="3800"/>
+            <w:shd w:fill="F5F7FA" w:color="auto" w:val="clear"/>
+            <w:tcMar>
+              <w:top w:type="dxa" w:w="60"/>
+              <w:left w:type="dxa" w:w="90"/>
+              <w:bottom w:type="dxa" w:w="60"/>
+              <w:right w:type="dxa" w:w="90"/>
+            </w:tcMar>
+          </w:tcPr>
+          <w:p>
+            <w:pPr>
+              <w:keepNext/>
+              <w:jc w:val="left"/>
+            </w:pPr>
+            <w:r>
+              <w:rPr>
+                <w:rFonts w:ascii="Calibri" w:cs="Calibri" w:eastAsia="Calibri" w:hAnsi="Calibri"/>
+                <w:b w:val="false"/>
+                <w:bCs w:val="false"/>
+                <w:color w:val="000000"/>
+                <w:sz w:val="17"/>
+                <w:szCs w:val="17"/>
+              </w:rPr>
+              <w:t>Toilet Brush</w:t>
+            </w:r>
+          </w:p>
+        </w:tc>
+        <w:tc>
+          <w:tcPr>
+            <w:tcW w:type="dxa" w:w="3800"/>
+            <w:shd w:fill="F5F7FA" w:color="auto" w:val="clear"/>
+            <w:tcMar>
+              <w:top w:type="dxa" w:w="60"/>
+              <w:left w:type="dxa" w:w="90"/>
+              <w:bottom w:type="dxa" w:w="60"/>
+              <w:right w:type="dxa" w:w="90"/>
+            </w:tcMar>
+          </w:tcPr>
+          <w:p>
+            <w:pPr>
+              <w:keepNext/>
+              <w:jc w:val="left"/>
+            </w:pPr>
+            <w:r>
+              <w:rPr>
+                <w:rFonts w:ascii="Calibri" w:cs="Calibri" w:eastAsia="Calibri" w:hAnsi="Calibri"/>
+                <w:b w:val="false"/>
+                <w:bCs w:val="false"/>
+                <w:color w:val="000000"/>
+                <w:sz w:val="17"/>
+                <w:szCs w:val="17"/>
+              </w:rPr>
+              <w:t>Cepillo para el inodoro</w:t>
+            </w:r>
+          </w:p>
+        </w:tc>
+        <w:tc>
+          <w:tcPr>
+            <w:tcW w:type="dxa" w:w="800"/>
+            <w:shd w:fill="F5F7FA" w:color="auto" w:val="clear"/>
+            <w:tcMar>
+              <w:top w:type="dxa" w:w="60"/>
+              <w:left w:type="dxa" w:w="90"/>
+              <w:bottom w:type="dxa" w:w="60"/>
+              <w:right w:type="dxa" w:w="90"/>
+            </w:tcMar>
+          </w:tcPr>
+          <w:p>
+            <w:pPr>
+              <w:keepNext/>
+              <w:jc w:val="left"/>
+            </w:pPr>
+            <w:r>
+              <w:rPr>
+                <w:rFonts w:ascii="Calibri" w:cs="Calibri" w:eastAsia="Calibri" w:hAnsi="Calibri"/>
+                <w:b w:val="false"/>
+                <w:bCs w:val="false"/>
+                <w:color w:val="000000"/>
+                <w:sz w:val="18"/>
+                <w:szCs w:val="18"/>
+              </w:rPr>
+            </w:r>
+          </w:p>
+        </w:tc>
+        <w:tc>
+          <w:tcPr>
+            <w:tcW w:type="dxa" w:w="800"/>
+            <w:shd w:fill="F5F7FA" w:color="auto" w:val="clear"/>
+            <w:tcMar>
+              <w:top w:type="dxa" w:w="60"/>
+              <w:left w:type="dxa" w:w="90"/>
+              <w:bottom w:type="dxa" w:w="60"/>
+              <w:right w:type="dxa" w:w="90"/>
+            </w:tcMar>
+          </w:tcPr>
+          <w:p>
+            <w:pPr>
+              <w:keepNext/>
+              <w:jc w:val="left"/>
+            </w:pPr>
+            <w:r>
+              <w:rPr>
+                <w:rFonts w:ascii="Calibri" w:cs="Calibri" w:eastAsia="Calibri" w:hAnsi="Calibri"/>
+                <w:b w:val="false"/>
+                <w:bCs w:val="false"/>
+                <w:color w:val="000000"/>
+                <w:sz w:val="18"/>
+                <w:szCs w:val="18"/>
+              </w:rPr>
+            </w:r>
+          </w:p>
+        </w:tc>
+      </w:tr>
+      <w:tr>
+        <w:trPr>
+          <w:cantSplit/>
+        </w:trPr>
+        <w:tc>
+          <w:tcPr>
+            <w:tcW w:type="dxa" w:w="1200"/>
+            <w:shd w:fill="F5F7FA" w:color="auto" w:val="clear"/>
+            <w:tcMar>
+              <w:top w:type="dxa" w:w="60"/>
+              <w:left w:type="dxa" w:w="90"/>
+              <w:bottom w:type="dxa" w:w="60"/>
+              <w:right w:type="dxa" w:w="90"/>
+            </w:tcMar>
+          </w:tcPr>
+          <w:p>
+            <w:pPr>
+              <w:keepNext/>
+              <w:jc w:val="left"/>
+            </w:pPr>
+            <w:r>
+              <w:rPr>
+                <w:rFonts w:ascii="Calibri" w:cs="Calibri" w:eastAsia="Calibri" w:hAnsi="Calibri"/>
+                <w:b w:val="false"/>
+                <w:bCs w:val="false"/>
+                <w:color w:val="000000"/>
+                <w:sz w:val="17"/>
+                <w:szCs w:val="17"/>
+              </w:rPr>
+              <w:t>908824</w:t>
+            </w:r>
+          </w:p>
+        </w:tc>
+        <w:tc>
+          <w:tcPr>
+            <w:tcW w:type="dxa" w:w="3800"/>
+            <w:shd w:fill="F5F7FA" w:color="auto" w:val="clear"/>
+            <w:tcMar>
+              <w:top w:type="dxa" w:w="60"/>
+              <w:left w:type="dxa" w:w="90"/>
+              <w:bottom w:type="dxa" w:w="60"/>
+              <w:right w:type="dxa" w:w="90"/>
+            </w:tcMar>
+          </w:tcPr>
+          <w:p>
+            <w:pPr>
+              <w:keepNext/>
+              <w:jc w:val="left"/>
+            </w:pPr>
+            <w:r>
+              <w:rPr>
+                <w:rFonts w:ascii="Calibri" w:cs="Calibri" w:eastAsia="Calibri" w:hAnsi="Calibri"/>
+                <w:b w:val="false"/>
+                <w:bCs w:val="false"/>
+                <w:color w:val="000000"/>
+                <w:sz w:val="17"/>
+                <w:szCs w:val="17"/>
+              </w:rPr>
+              <w:t>Dusters</w:t>
+            </w:r>
+          </w:p>
+        </w:tc>
+        <w:tc>
+          <w:tcPr>
+            <w:tcW w:type="dxa" w:w="3800"/>
+            <w:shd w:fill="F5F7FA" w:color="auto" w:val="clear"/>
+            <w:tcMar>
+              <w:top w:type="dxa" w:w="60"/>
+              <w:left w:type="dxa" w:w="90"/>
+              <w:bottom w:type="dxa" w:w="60"/>
+              <w:right w:type="dxa" w:w="90"/>
+            </w:tcMar>
+          </w:tcPr>
+          <w:p>
+            <w:pPr>
+              <w:keepNext/>
+              <w:jc w:val="left"/>
+            </w:pPr>
+            <w:r>
+              <w:rPr>
+                <w:rFonts w:ascii="Calibri" w:cs="Calibri" w:eastAsia="Calibri" w:hAnsi="Calibri"/>
+                <w:b w:val="false"/>
+                <w:bCs w:val="false"/>
+                <w:color w:val="000000"/>
+                <w:sz w:val="17"/>
+                <w:szCs w:val="17"/>
+              </w:rPr>
+              <w:t>Plumeros / sacudidores</w:t>
+            </w:r>
+          </w:p>
+        </w:tc>
+        <w:tc>
+          <w:tcPr>
+            <w:tcW w:type="dxa" w:w="800"/>
+            <w:shd w:fill="F5F7FA" w:color="auto" w:val="clear"/>
+            <w:tcMar>
+              <w:top w:type="dxa" w:w="60"/>
+              <w:left w:type="dxa" w:w="90"/>
+              <w:bottom w:type="dxa" w:w="60"/>
+              <w:right w:type="dxa" w:w="90"/>
+            </w:tcMar>
+          </w:tcPr>
+          <w:p>
+            <w:pPr>
+              <w:keepNext/>
+              <w:jc w:val="left"/>
+            </w:pPr>
+            <w:r>
+              <w:rPr>
+                <w:rFonts w:ascii="Calibri" w:cs="Calibri" w:eastAsia="Calibri" w:hAnsi="Calibri"/>
+                <w:b w:val="false"/>
+                <w:bCs w:val="false"/>
+                <w:color w:val="000000"/>
+                <w:sz w:val="18"/>
+                <w:szCs w:val="18"/>
+              </w:rPr>
+            </w:r>
+          </w:p>
+        </w:tc>
+        <w:tc>
+          <w:tcPr>
+            <w:tcW w:type="dxa" w:w="800"/>
+            <w:shd w:fill="F5F7FA" w:color="auto" w:val="clear"/>
+            <w:tcMar>
+              <w:top w:type="dxa" w:w="60"/>
+              <w:left w:type="dxa" w:w="90"/>
+              <w:bottom w:type="dxa" w:w="60"/>
+              <w:right w:type="dxa" w:w="90"/>
+            </w:tcMar>
+          </w:tcPr>
+          <w:p>
+            <w:pPr>
+              <w:keepNext/>
+              <w:jc w:val="left"/>
+            </w:pPr>
+            <w:r>
+              <w:rPr>
+                <w:rFonts w:ascii="Calibri" w:cs="Calibri" w:eastAsia="Calibri" w:hAnsi="Calibri"/>
+                <w:b w:val="false"/>
+                <w:bCs w:val="false"/>
+                <w:color w:val="000000"/>
+                <w:sz w:val="18"/>
+                <w:szCs w:val="18"/>
+              </w:rPr>
+            </w:r>
+          </w:p>
+        </w:tc>
+      </w:tr>
+      <w:tr>
+        <w:trPr>
+          <w:cantSplit/>
+        </w:trPr>
+        <w:tc>
+          <w:tcPr>
+            <w:tcW w:type="dxa" w:w="1200"/>
+            <w:shd w:fill="F5F7FA" w:color="auto" w:val="clear"/>
+            <w:tcMar>
+              <w:top w:type="dxa" w:w="60"/>
+              <w:left w:type="dxa" w:w="90"/>
+              <w:bottom w:type="dxa" w:w="60"/>
+              <w:right w:type="dxa" w:w="90"/>
+            </w:tcMar>
+          </w:tcPr>
+          <w:p>
+            <w:pPr>
+              <w:keepNext/>
+              <w:jc w:val="left"/>
+            </w:pPr>
+            <w:r>
+              <w:rPr>
+                <w:rFonts w:ascii="Calibri" w:cs="Calibri" w:eastAsia="Calibri" w:hAnsi="Calibri"/>
+                <w:b w:val="false"/>
+                <w:bCs w:val="false"/>
+                <w:color w:val="000000"/>
+                <w:sz w:val="17"/>
+                <w:szCs w:val="17"/>
+              </w:rPr>
+              <w:t>118335</w:t>
+            </w:r>
+          </w:p>
+        </w:tc>
+        <w:tc>
+          <w:tcPr>
+            <w:tcW w:type="dxa" w:w="3800"/>
+            <w:shd w:fill="F5F7FA" w:color="auto" w:val="clear"/>
+            <w:tcMar>
+              <w:top w:type="dxa" w:w="60"/>
+              <w:left w:type="dxa" w:w="90"/>
+              <w:bottom w:type="dxa" w:w="60"/>
+              <w:right w:type="dxa" w:w="90"/>
+            </w:tcMar>
+          </w:tcPr>
+          <w:p>
+            <w:pPr>
+              <w:keepNext/>
+              <w:jc w:val="left"/>
+            </w:pPr>
+            <w:r>
+              <w:rPr>
+                <w:rFonts w:ascii="Calibri" w:cs="Calibri" w:eastAsia="Calibri" w:hAnsi="Calibri"/>
+                <w:b w:val="false"/>
+                <w:bCs w:val="false"/>
+                <w:color w:val="000000"/>
+                <w:sz w:val="17"/>
+                <w:szCs w:val="17"/>
+              </w:rPr>
+              <w:t>Brooms</w:t>
+            </w:r>
+          </w:p>
+        </w:tc>
+        <w:tc>
+          <w:tcPr>
+            <w:tcW w:type="dxa" w:w="3800"/>
+            <w:shd w:fill="F5F7FA" w:color="auto" w:val="clear"/>
+            <w:tcMar>
+              <w:top w:type="dxa" w:w="60"/>
+              <w:left w:type="dxa" w:w="90"/>
+              <w:bottom w:type="dxa" w:w="60"/>
+              <w:right w:type="dxa" w:w="90"/>
+            </w:tcMar>
+          </w:tcPr>
+          <w:p>
+            <w:pPr>
+              <w:keepNext/>
+              <w:jc w:val="left"/>
+            </w:pPr>
+            <w:r>
+              <w:rPr>
+                <w:rFonts w:ascii="Calibri" w:cs="Calibri" w:eastAsia="Calibri" w:hAnsi="Calibri"/>
+                <w:b w:val="false"/>
+                <w:bCs w:val="false"/>
+                <w:color w:val="000000"/>
+                <w:sz w:val="17"/>
+                <w:szCs w:val="17"/>
+              </w:rPr>
+              <w:t>Escobas</w:t>
+            </w:r>
+          </w:p>
+        </w:tc>
+        <w:tc>
+          <w:tcPr>
+            <w:tcW w:type="dxa" w:w="800"/>
+            <w:shd w:fill="F5F7FA" w:color="auto" w:val="clear"/>
+            <w:tcMar>
+              <w:top w:type="dxa" w:w="60"/>
+              <w:left w:type="dxa" w:w="90"/>
+              <w:bottom w:type="dxa" w:w="60"/>
+              <w:right w:type="dxa" w:w="90"/>
+            </w:tcMar>
+          </w:tcPr>
+          <w:p>
+            <w:pPr>
+              <w:keepNext/>
+              <w:jc w:val="left"/>
+            </w:pPr>
+            <w:r>
+              <w:rPr>
+                <w:rFonts w:ascii="Calibri" w:cs="Calibri" w:eastAsia="Calibri" w:hAnsi="Calibri"/>
+                <w:b w:val="false"/>
+                <w:bCs w:val="false"/>
+                <w:color w:val="000000"/>
+                <w:sz w:val="18"/>
+                <w:szCs w:val="18"/>
+              </w:rPr>
+            </w:r>
+          </w:p>
+        </w:tc>
+        <w:tc>
+          <w:tcPr>
+            <w:tcW w:type="dxa" w:w="800"/>
+            <w:shd w:fill="F5F7FA" w:color="auto" w:val="clear"/>
+            <w:tcMar>
+              <w:top w:type="dxa" w:w="60"/>
+              <w:left w:type="dxa" w:w="90"/>
+              <w:bottom w:type="dxa" w:w="60"/>
+              <w:right w:type="dxa" w:w="90"/>
+            </w:tcMar>
+          </w:tcPr>
+          <w:p>
+            <w:pPr>
+              <w:keepNext/>
+              <w:jc w:val="left"/>
+            </w:pPr>
+            <w:r>
+              <w:rPr>
+                <w:rFonts w:ascii="Calibri" w:cs="Calibri" w:eastAsia="Calibri" w:hAnsi="Calibri"/>
+                <w:b w:val="false"/>
+                <w:bCs w:val="false"/>
+                <w:color w:val="000000"/>
+                <w:sz w:val="18"/>
+                <w:szCs w:val="18"/>
+              </w:rPr>
+            </w:r>
+          </w:p>
+        </w:tc>
+      </w:tr>
+      <w:tr>
+        <w:trPr>
+          <w:cantSplit/>
+        </w:trPr>
+        <w:tc>
+          <w:tcPr>
+            <w:tcW w:type="dxa" w:w="1200"/>
+            <w:shd w:fill="F5F7FA" w:color="auto" w:val="clear"/>
+            <w:tcMar>
+              <w:top w:type="dxa" w:w="60"/>
+              <w:left w:type="dxa" w:w="90"/>
+              <w:bottom w:type="dxa" w:w="60"/>
+              <w:right w:type="dxa" w:w="90"/>
+            </w:tcMar>
+          </w:tcPr>
+          <w:p>
+            <w:pPr>
+              <w:keepNext/>
+              <w:jc w:val="left"/>
+            </w:pPr>
+            <w:r>
+              <w:rPr>
+                <w:rFonts w:ascii="Calibri" w:cs="Calibri" w:eastAsia="Calibri" w:hAnsi="Calibri"/>
+                <w:b w:val="false"/>
+                <w:bCs w:val="false"/>
+                <w:color w:val="000000"/>
+                <w:sz w:val="17"/>
+                <w:szCs w:val="17"/>
+              </w:rPr>
+              <w:t>180883</w:t>
+            </w:r>
+          </w:p>
+        </w:tc>
+        <w:tc>
+          <w:tcPr>
+            <w:tcW w:type="dxa" w:w="3800"/>
+            <w:shd w:fill="F5F7FA" w:color="auto" w:val="clear"/>
+            <w:tcMar>
+              <w:top w:type="dxa" w:w="60"/>
+              <w:left w:type="dxa" w:w="90"/>
+              <w:bottom w:type="dxa" w:w="60"/>
+              <w:right w:type="dxa" w:w="90"/>
+            </w:tcMar>
+          </w:tcPr>
+          <w:p>
+            <w:pPr>
+              <w:keepNext/>
+              <w:jc w:val="left"/>
+            </w:pPr>
+            <w:r>
+              <w:rPr>
+                <w:rFonts w:ascii="Calibri" w:cs="Calibri" w:eastAsia="Calibri" w:hAnsi="Calibri"/>
+                <w:b w:val="false"/>
+                <w:bCs w:val="false"/>
+                <w:color w:val="000000"/>
+                <w:sz w:val="17"/>
+                <w:szCs w:val="17"/>
+              </w:rPr>
+              <w:t>Vacuum Bags — Oreck XL</w:t>
+            </w:r>
+          </w:p>
+        </w:tc>
+        <w:tc>
+          <w:tcPr>
+            <w:tcW w:type="dxa" w:w="3800"/>
+            <w:shd w:fill="F5F7FA" w:color="auto" w:val="clear"/>
+            <w:tcMar>
+              <w:top w:type="dxa" w:w="60"/>
+              <w:left w:type="dxa" w:w="90"/>
+              <w:bottom w:type="dxa" w:w="60"/>
+              <w:right w:type="dxa" w:w="90"/>
+            </w:tcMar>
+          </w:tcPr>
+          <w:p>
+            <w:pPr>
+              <w:keepNext/>
+              <w:jc w:val="left"/>
+            </w:pPr>
+            <w:r>
+              <w:rPr>
+                <w:rFonts w:ascii="Calibri" w:cs="Calibri" w:eastAsia="Calibri" w:hAnsi="Calibri"/>
+                <w:b w:val="false"/>
+                <w:bCs w:val="false"/>
+                <w:color w:val="000000"/>
+                <w:sz w:val="17"/>
+                <w:szCs w:val="17"/>
+              </w:rPr>
+              <w:t>Bolsas para la aspiradora Oreck XL</w:t>
+            </w:r>
+          </w:p>
+        </w:tc>
+        <w:tc>
+          <w:tcPr>
+            <w:tcW w:type="dxa" w:w="800"/>
+            <w:shd w:fill="F5F7FA" w:color="auto" w:val="clear"/>
+            <w:tcMar>
+              <w:top w:type="dxa" w:w="60"/>
+              <w:left w:type="dxa" w:w="90"/>
+              <w:bottom w:type="dxa" w:w="60"/>
+              <w:right w:type="dxa" w:w="90"/>
+            </w:tcMar>
+          </w:tcPr>
+          <w:p>
+            <w:pPr>
+              <w:keepNext/>
+              <w:jc w:val="left"/>
+            </w:pPr>
+            <w:r>
+              <w:rPr>
+                <w:rFonts w:ascii="Calibri" w:cs="Calibri" w:eastAsia="Calibri" w:hAnsi="Calibri"/>
+                <w:b w:val="false"/>
+                <w:bCs w:val="false"/>
+                <w:color w:val="000000"/>
+                <w:sz w:val="18"/>
+                <w:szCs w:val="18"/>
+              </w:rPr>
+            </w:r>
+          </w:p>
+        </w:tc>
+        <w:tc>
+          <w:tcPr>
+            <w:tcW w:type="dxa" w:w="800"/>
+            <w:shd w:fill="F5F7FA" w:color="auto" w:val="clear"/>
+            <w:tcMar>
+              <w:top w:type="dxa" w:w="60"/>
+              <w:left w:type="dxa" w:w="90"/>
+              <w:bottom w:type="dxa" w:w="60"/>
+              <w:right w:type="dxa" w:w="90"/>
+            </w:tcMar>
+          </w:tcPr>
+          <w:p>
+            <w:pPr>
+              <w:keepNext/>
+              <w:jc w:val="left"/>
+            </w:pPr>
+            <w:r>
+              <w:rPr>
+                <w:rFonts w:ascii="Calibri" w:cs="Calibri" w:eastAsia="Calibri" w:hAnsi="Calibri"/>
+                <w:b w:val="false"/>
+                <w:bCs w:val="false"/>
+                <w:color w:val="000000"/>
+                <w:sz w:val="18"/>
+                <w:szCs w:val="18"/>
+              </w:rPr>
+            </w:r>
+          </w:p>
+        </w:tc>
+      </w:tr>
+      <w:tr>
+        <w:trPr>
+          <w:cantSplit/>
+        </w:trPr>
+        <w:tc>
+          <w:tcPr>
+            <w:tcW w:type="dxa" w:w="1200"/>
+            <w:shd w:fill="F5F7FA" w:color="auto" w:val="clear"/>
+            <w:tcMar>
+              <w:top w:type="dxa" w:w="60"/>
+              <w:left w:type="dxa" w:w="90"/>
+              <w:bottom w:type="dxa" w:w="60"/>
+              <w:right w:type="dxa" w:w="90"/>
+            </w:tcMar>
+          </w:tcPr>
+          <w:p>
+            <w:pPr>
+              <w:jc w:val="left"/>
+            </w:pPr>
+            <w:r>
+              <w:rPr>
+                <w:rFonts w:ascii="Calibri" w:cs="Calibri" w:eastAsia="Calibri" w:hAnsi="Calibri"/>
+                <w:b w:val="false"/>
+                <w:bCs w:val="false"/>
+                <w:color w:val="000000"/>
+                <w:sz w:val="17"/>
+                <w:szCs w:val="17"/>
+              </w:rPr>
+              <w:t>700174</w:t>
+            </w:r>
+          </w:p>
+        </w:tc>
+        <w:tc>
+          <w:tcPr>
+            <w:tcW w:type="dxa" w:w="3800"/>
+            <w:shd w:fill="F5F7FA" w:color="auto" w:val="clear"/>
+            <w:tcMar>
+              <w:top w:type="dxa" w:w="60"/>
+              <w:left w:type="dxa" w:w="90"/>
+              <w:bottom w:type="dxa" w:w="60"/>
+              <w:right w:type="dxa" w:w="90"/>
+            </w:tcMar>
+          </w:tcPr>
+          <w:p>
+            <w:pPr>
+              <w:jc w:val="left"/>
+            </w:pPr>
+            <w:r>
+              <w:rPr>
+                <w:rFonts w:ascii="Calibri" w:cs="Calibri" w:eastAsia="Calibri" w:hAnsi="Calibri"/>
+                <w:b w:val="false"/>
+                <w:bCs w:val="false"/>
+                <w:color w:val="000000"/>
+                <w:sz w:val="17"/>
+                <w:szCs w:val="17"/>
+              </w:rPr>
+              <w:t>Shower Curtains</w:t>
+            </w:r>
+          </w:p>
+        </w:tc>
+        <w:tc>
+          <w:tcPr>
+            <w:tcW w:type="dxa" w:w="3800"/>
+            <w:shd w:fill="F5F7FA" w:color="auto" w:val="clear"/>
+            <w:tcMar>
+              <w:top w:type="dxa" w:w="60"/>
+              <w:left w:type="dxa" w:w="90"/>
+              <w:bottom w:type="dxa" w:w="60"/>
+              <w:right w:type="dxa" w:w="90"/>
+            </w:tcMar>
+          </w:tcPr>
+          <w:p>
+            <w:pPr>
+              <w:jc w:val="left"/>
+            </w:pPr>
+            <w:r>
+              <w:rPr>
+                <w:rFonts w:ascii="Calibri" w:cs="Calibri" w:eastAsia="Calibri" w:hAnsi="Calibri"/>
+                <w:b w:val="false"/>
+                <w:bCs w:val="false"/>
+                <w:color w:val="000000"/>
+                <w:sz w:val="17"/>
+                <w:szCs w:val="17"/>
+              </w:rPr>
+              <w:t>Cortinas de baño</w:t>
             </w:r>
           </w:p>
         </w:tc>
@@ -10165,62 +11941,63 @@
                 <w:sz w:val="17"/>
                 <w:szCs w:val="17"/>
               </w:rPr>
-            </w:r>
-          </w:p>
-        </w:tc>
-        <w:tc>
-          <w:tcPr>
-            <w:tcW w:type="dxa" w:w="3800"/>
-            <w:tcMar>
-              <w:top w:type="dxa" w:w="60"/>
-              <w:left w:type="dxa" w:w="90"/>
-              <w:bottom w:type="dxa" w:w="60"/>
-              <w:right w:type="dxa" w:w="90"/>
-            </w:tcMar>
-          </w:tcPr>
-          <w:p>
-            <w:pPr>
-              <w:keepNext/>
-              <w:jc w:val="left"/>
-            </w:pPr>
-            <w:r>
-              <w:rPr>
-                <w:rFonts w:ascii="Calibri" w:cs="Calibri" w:eastAsia="Calibri" w:hAnsi="Calibri"/>
-                <w:b w:val="false"/>
-                <w:bCs w:val="false"/>
-                <w:color w:val="000000"/>
-                <w:sz w:val="17"/>
-                <w:szCs w:val="17"/>
-              </w:rPr>
-              <w:t>ADA accessible ironing board  — part # TBD</w:t>
-            </w:r>
-          </w:p>
-        </w:tc>
-        <w:tc>
-          <w:tcPr>
-            <w:tcW w:type="dxa" w:w="3800"/>
-            <w:tcMar>
-              <w:top w:type="dxa" w:w="60"/>
-              <w:left w:type="dxa" w:w="90"/>
-              <w:bottom w:type="dxa" w:w="60"/>
-              <w:right w:type="dxa" w:w="90"/>
-            </w:tcMar>
-          </w:tcPr>
-          <w:p>
-            <w:pPr>
-              <w:keepNext/>
-              <w:jc w:val="left"/>
-            </w:pPr>
-            <w:r>
-              <w:rPr>
-                <w:rFonts w:ascii="Calibri" w:cs="Calibri" w:eastAsia="Calibri" w:hAnsi="Calibri"/>
-                <w:b w:val="false"/>
-                <w:bCs w:val="false"/>
-                <w:color w:val="000000"/>
-                <w:sz w:val="17"/>
-                <w:szCs w:val="17"/>
-              </w:rPr>
-              <w:t>Tabla de planchar ADA (accesible, más baja) — falta el número de parte</w:t>
+              <w:t>504125</w:t>
+            </w:r>
+          </w:p>
+        </w:tc>
+        <w:tc>
+          <w:tcPr>
+            <w:tcW w:type="dxa" w:w="3800"/>
+            <w:tcMar>
+              <w:top w:type="dxa" w:w="60"/>
+              <w:left w:type="dxa" w:w="90"/>
+              <w:bottom w:type="dxa" w:w="60"/>
+              <w:right w:type="dxa" w:w="90"/>
+            </w:tcMar>
+          </w:tcPr>
+          <w:p>
+            <w:pPr>
+              <w:keepNext/>
+              <w:jc w:val="left"/>
+            </w:pPr>
+            <w:r>
+              <w:rPr>
+                <w:rFonts w:ascii="Calibri" w:cs="Calibri" w:eastAsia="Calibri" w:hAnsi="Calibri"/>
+                <w:b w:val="false"/>
+                <w:bCs w:val="false"/>
+                <w:color w:val="000000"/>
+                <w:sz w:val="17"/>
+                <w:szCs w:val="17"/>
+              </w:rPr>
+              <w:t>ADA Accessible Ironing Board</w:t>
+            </w:r>
+          </w:p>
+        </w:tc>
+        <w:tc>
+          <w:tcPr>
+            <w:tcW w:type="dxa" w:w="3800"/>
+            <w:tcMar>
+              <w:top w:type="dxa" w:w="60"/>
+              <w:left w:type="dxa" w:w="90"/>
+              <w:bottom w:type="dxa" w:w="60"/>
+              <w:right w:type="dxa" w:w="90"/>
+            </w:tcMar>
+          </w:tcPr>
+          <w:p>
+            <w:pPr>
+              <w:keepNext/>
+              <w:jc w:val="left"/>
+            </w:pPr>
+            <w:r>
+              <w:rPr>
+                <w:rFonts w:ascii="Calibri" w:cs="Calibri" w:eastAsia="Calibri" w:hAnsi="Calibri"/>
+                <w:b w:val="false"/>
+                <w:bCs w:val="false"/>
+                <w:color w:val="000000"/>
+                <w:sz w:val="17"/>
+                <w:szCs w:val="17"/>
+              </w:rPr>
+              <w:t>Tabla de planchar ADA (accesible, más baja)</w:t>
             </w:r>
           </w:p>
         </w:tc>

</xml_diff>

<commit_message>
Fill the remaining part numbers and fix three catalog discrepancies
From the Elm's own HD Supply saved list and order history:
- Toilet paper is 531343 (Pacific Blue Basic, 80 rolls/case), not the
  19885 carried over from the other property's sheet
- Facial tissue is 117979 (Pacific Blue Basic cube, 36 boxes/case)
- Gloves 147688 (Large) and 147689 (X-Large)
- Added 132552, the clear condiment kit

From the catalog lookups: glass cleaner 161107, bath cleaner 137156,
Do Not Disturb hanger 360056, pet-in-room sign 115551, garment steamer
346737.

Three discrepancies flagged in the rows themselves rather than silently
changed: shower brackets list as case of 48 not 43, the 10oz wrapped cup
calls for lid 412263, and the towel hanger card appears as 206622 and
shows unavailable.

Co-Authored-By: Claude Opus 5 <noreply@anthropic.com>
Claude-Session: https://claude.ai/code/session_0138rT731u9moyu7f3GNkj4g
</commit_message>
<xml_diff>
--- a/Elm_Housekeeping_Inventory.docx
+++ b/Elm_Housekeeping_Inventory.docx
@@ -319,65 +319,65 @@
                 <w:sz w:val="17"/>
                 <w:szCs w:val="17"/>
               </w:rPr>
-              <w:t>19885</w:t>
-            </w:r>
-          </w:p>
-        </w:tc>
-        <w:tc>
-          <w:tcPr>
-            <w:tcW w:type="dxa" w:w="3800"/>
-            <w:shd w:fill="F5F7FA" w:color="auto" w:val="clear"/>
-            <w:tcMar>
-              <w:top w:type="dxa" w:w="60"/>
-              <w:left w:type="dxa" w:w="90"/>
-              <w:bottom w:type="dxa" w:w="60"/>
-              <w:right w:type="dxa" w:w="90"/>
-            </w:tcMar>
-          </w:tcPr>
-          <w:p>
-            <w:pPr>
-              <w:keepNext/>
-              <w:jc w:val="left"/>
-            </w:pPr>
-            <w:r>
-              <w:rPr>
-                <w:rFonts w:ascii="Calibri" w:cs="Calibri" w:eastAsia="Calibri" w:hAnsi="Calibri"/>
-                <w:b w:val="false"/>
-                <w:bCs w:val="false"/>
-                <w:color w:val="000000"/>
-                <w:sz w:val="17"/>
-                <w:szCs w:val="17"/>
-              </w:rPr>
-              <w:t>Toilet Paper, case</w:t>
-            </w:r>
-          </w:p>
-        </w:tc>
-        <w:tc>
-          <w:tcPr>
-            <w:tcW w:type="dxa" w:w="3800"/>
-            <w:shd w:fill="F5F7FA" w:color="auto" w:val="clear"/>
-            <w:tcMar>
-              <w:top w:type="dxa" w:w="60"/>
-              <w:left w:type="dxa" w:w="90"/>
-              <w:bottom w:type="dxa" w:w="60"/>
-              <w:right w:type="dxa" w:w="90"/>
-            </w:tcMar>
-          </w:tcPr>
-          <w:p>
-            <w:pPr>
-              <w:keepNext/>
-              <w:jc w:val="left"/>
-            </w:pPr>
-            <w:r>
-              <w:rPr>
-                <w:rFonts w:ascii="Calibri" w:cs="Calibri" w:eastAsia="Calibri" w:hAnsi="Calibri"/>
-                <w:b w:val="false"/>
-                <w:bCs w:val="false"/>
-                <w:color w:val="000000"/>
-                <w:sz w:val="17"/>
-                <w:szCs w:val="17"/>
-              </w:rPr>
-              <w:t>Papel higiénico, caja</w:t>
+              <w:t>531343</w:t>
+            </w:r>
+          </w:p>
+        </w:tc>
+        <w:tc>
+          <w:tcPr>
+            <w:tcW w:type="dxa" w:w="3800"/>
+            <w:shd w:fill="F5F7FA" w:color="auto" w:val="clear"/>
+            <w:tcMar>
+              <w:top w:type="dxa" w:w="60"/>
+              <w:left w:type="dxa" w:w="90"/>
+              <w:bottom w:type="dxa" w:w="60"/>
+              <w:right w:type="dxa" w:w="90"/>
+            </w:tcMar>
+          </w:tcPr>
+          <w:p>
+            <w:pPr>
+              <w:keepNext/>
+              <w:jc w:val="left"/>
+            </w:pPr>
+            <w:r>
+              <w:rPr>
+                <w:rFonts w:ascii="Calibri" w:cs="Calibri" w:eastAsia="Calibri" w:hAnsi="Calibri"/>
+                <w:b w:val="false"/>
+                <w:bCs w:val="false"/>
+                <w:color w:val="000000"/>
+                <w:sz w:val="17"/>
+                <w:szCs w:val="17"/>
+              </w:rPr>
+              <w:t>Toilet Paper — Pacific Blue Basic 2-Ply Embossed, 80 Rolls/Case</w:t>
+            </w:r>
+          </w:p>
+        </w:tc>
+        <w:tc>
+          <w:tcPr>
+            <w:tcW w:type="dxa" w:w="3800"/>
+            <w:shd w:fill="F5F7FA" w:color="auto" w:val="clear"/>
+            <w:tcMar>
+              <w:top w:type="dxa" w:w="60"/>
+              <w:left w:type="dxa" w:w="90"/>
+              <w:bottom w:type="dxa" w:w="60"/>
+              <w:right w:type="dxa" w:w="90"/>
+            </w:tcMar>
+          </w:tcPr>
+          <w:p>
+            <w:pPr>
+              <w:keepNext/>
+              <w:jc w:val="left"/>
+            </w:pPr>
+            <w:r>
+              <w:rPr>
+                <w:rFonts w:ascii="Calibri" w:cs="Calibri" w:eastAsia="Calibri" w:hAnsi="Calibri"/>
+                <w:b w:val="false"/>
+                <w:bCs w:val="false"/>
+                <w:color w:val="000000"/>
+                <w:sz w:val="17"/>
+                <w:szCs w:val="17"/>
+              </w:rPr>
+              <w:t>Papel higiénico — Pacific Blue Basic, 2 capas, 80 rollos por caja</w:t>
             </w:r>
           </w:p>
         </w:tc>
@@ -467,64 +467,65 @@
                 <w:sz w:val="17"/>
                 <w:szCs w:val="17"/>
               </w:rPr>
-            </w:r>
-          </w:p>
-        </w:tc>
-        <w:tc>
-          <w:tcPr>
-            <w:tcW w:type="dxa" w:w="3800"/>
-            <w:shd w:fill="F5F7FA" w:color="auto" w:val="clear"/>
-            <w:tcMar>
-              <w:top w:type="dxa" w:w="60"/>
-              <w:left w:type="dxa" w:w="90"/>
-              <w:bottom w:type="dxa" w:w="60"/>
-              <w:right w:type="dxa" w:w="90"/>
-            </w:tcMar>
-          </w:tcPr>
-          <w:p>
-            <w:pPr>
-              <w:keepNext/>
-              <w:jc w:val="left"/>
-            </w:pPr>
-            <w:r>
-              <w:rPr>
-                <w:rFonts w:ascii="Calibri" w:cs="Calibri" w:eastAsia="Calibri" w:hAnsi="Calibri"/>
-                <w:b w:val="false"/>
-                <w:bCs w:val="false"/>
-                <w:color w:val="000000"/>
-                <w:sz w:val="17"/>
-                <w:szCs w:val="17"/>
-              </w:rPr>
-              <w:t>Facial Tissue, case  — part # TBD</w:t>
-            </w:r>
-          </w:p>
-        </w:tc>
-        <w:tc>
-          <w:tcPr>
-            <w:tcW w:type="dxa" w:w="3800"/>
-            <w:shd w:fill="F5F7FA" w:color="auto" w:val="clear"/>
-            <w:tcMar>
-              <w:top w:type="dxa" w:w="60"/>
-              <w:left w:type="dxa" w:w="90"/>
-              <w:bottom w:type="dxa" w:w="60"/>
-              <w:right w:type="dxa" w:w="90"/>
-            </w:tcMar>
-          </w:tcPr>
-          <w:p>
-            <w:pPr>
-              <w:keepNext/>
-              <w:jc w:val="left"/>
-            </w:pPr>
-            <w:r>
-              <w:rPr>
-                <w:rFonts w:ascii="Calibri" w:cs="Calibri" w:eastAsia="Calibri" w:hAnsi="Calibri"/>
-                <w:b w:val="false"/>
-                <w:bCs w:val="false"/>
-                <w:color w:val="000000"/>
-                <w:sz w:val="17"/>
-                <w:szCs w:val="17"/>
-              </w:rPr>
-              <w:t>Pañuelos faciales (tipo Kleenex), caja — falta el número de parte</w:t>
+              <w:t>117979</w:t>
+            </w:r>
+          </w:p>
+        </w:tc>
+        <w:tc>
+          <w:tcPr>
+            <w:tcW w:type="dxa" w:w="3800"/>
+            <w:shd w:fill="F5F7FA" w:color="auto" w:val="clear"/>
+            <w:tcMar>
+              <w:top w:type="dxa" w:w="60"/>
+              <w:left w:type="dxa" w:w="90"/>
+              <w:bottom w:type="dxa" w:w="60"/>
+              <w:right w:type="dxa" w:w="90"/>
+            </w:tcMar>
+          </w:tcPr>
+          <w:p>
+            <w:pPr>
+              <w:keepNext/>
+              <w:jc w:val="left"/>
+            </w:pPr>
+            <w:r>
+              <w:rPr>
+                <w:rFonts w:ascii="Calibri" w:cs="Calibri" w:eastAsia="Calibri" w:hAnsi="Calibri"/>
+                <w:b w:val="false"/>
+                <w:bCs w:val="false"/>
+                <w:color w:val="000000"/>
+                <w:sz w:val="17"/>
+                <w:szCs w:val="17"/>
+              </w:rPr>
+              <w:t>Facial Tissue — Pacific Blue Basic 2-Ply Cube, 36 Boxes/Case</w:t>
+            </w:r>
+          </w:p>
+        </w:tc>
+        <w:tc>
+          <w:tcPr>
+            <w:tcW w:type="dxa" w:w="3800"/>
+            <w:shd w:fill="F5F7FA" w:color="auto" w:val="clear"/>
+            <w:tcMar>
+              <w:top w:type="dxa" w:w="60"/>
+              <w:left w:type="dxa" w:w="90"/>
+              <w:bottom w:type="dxa" w:w="60"/>
+              <w:right w:type="dxa" w:w="90"/>
+            </w:tcMar>
+          </w:tcPr>
+          <w:p>
+            <w:pPr>
+              <w:keepNext/>
+              <w:jc w:val="left"/>
+            </w:pPr>
+            <w:r>
+              <w:rPr>
+                <w:rFonts w:ascii="Calibri" w:cs="Calibri" w:eastAsia="Calibri" w:hAnsi="Calibri"/>
+                <w:b w:val="false"/>
+                <w:bCs w:val="false"/>
+                <w:color w:val="000000"/>
+                <w:sz w:val="17"/>
+                <w:szCs w:val="17"/>
+              </w:rPr>
+              <w:t>Pañuelos faciales — Pacific Blue Basic, 2 capas, caja con 36 cajitas</w:t>
             </w:r>
           </w:p>
         </w:tc>
@@ -1697,6 +1698,7 @@
                 <w:sz w:val="17"/>
                 <w:szCs w:val="17"/>
               </w:rPr>
+              <w:t>147688</w:t>
             </w:r>
           </w:p>
         </w:tc>
@@ -1844,6 +1846,7 @@
                 <w:sz w:val="17"/>
                 <w:szCs w:val="17"/>
               </w:rPr>
+              <w:t>147689</w:t>
             </w:r>
           </w:p>
         </w:tc>
@@ -2286,64 +2289,65 @@
                 <w:sz w:val="17"/>
                 <w:szCs w:val="17"/>
               </w:rPr>
-            </w:r>
-          </w:p>
-        </w:tc>
-        <w:tc>
-          <w:tcPr>
-            <w:tcW w:type="dxa" w:w="3800"/>
-            <w:shd w:fill="F5F7FA" w:color="auto" w:val="clear"/>
-            <w:tcMar>
-              <w:top w:type="dxa" w:w="60"/>
-              <w:left w:type="dxa" w:w="90"/>
-              <w:bottom w:type="dxa" w:w="60"/>
-              <w:right w:type="dxa" w:w="90"/>
-            </w:tcMar>
-          </w:tcPr>
-          <w:p>
-            <w:pPr>
-              <w:keepNext/>
-              <w:jc w:val="left"/>
-            </w:pPr>
-            <w:r>
-              <w:rPr>
-                <w:rFonts w:ascii="Calibri" w:cs="Calibri" w:eastAsia="Calibri" w:hAnsi="Calibri"/>
-                <w:b w:val="false"/>
-                <w:bCs w:val="false"/>
-                <w:color w:val="000000"/>
-                <w:sz w:val="17"/>
-                <w:szCs w:val="17"/>
-              </w:rPr>
-              <w:t>Glass Cleaner  (Ecolab MFG 6100289 — confirm HD Supply part #)</w:t>
-            </w:r>
-          </w:p>
-        </w:tc>
-        <w:tc>
-          <w:tcPr>
-            <w:tcW w:type="dxa" w:w="3800"/>
-            <w:shd w:fill="F5F7FA" w:color="auto" w:val="clear"/>
-            <w:tcMar>
-              <w:top w:type="dxa" w:w="60"/>
-              <w:left w:type="dxa" w:w="90"/>
-              <w:bottom w:type="dxa" w:w="60"/>
-              <w:right w:type="dxa" w:w="90"/>
-            </w:tcMar>
-          </w:tcPr>
-          <w:p>
-            <w:pPr>
-              <w:keepNext/>
-              <w:jc w:val="left"/>
-            </w:pPr>
-            <w:r>
-              <w:rPr>
-                <w:rFonts w:ascii="Calibri" w:cs="Calibri" w:eastAsia="Calibri" w:hAnsi="Calibri"/>
-                <w:b w:val="false"/>
-                <w:bCs w:val="false"/>
-                <w:color w:val="000000"/>
-                <w:sz w:val="17"/>
-                <w:szCs w:val="17"/>
-              </w:rPr>
-              <w:t>Limpiavidrios (Ecolab MFG 6100289 — falta confirmar el número de parte)</w:t>
+              <w:t>161107</w:t>
+            </w:r>
+          </w:p>
+        </w:tc>
+        <w:tc>
+          <w:tcPr>
+            <w:tcW w:type="dxa" w:w="3800"/>
+            <w:shd w:fill="F5F7FA" w:color="auto" w:val="clear"/>
+            <w:tcMar>
+              <w:top w:type="dxa" w:w="60"/>
+              <w:left w:type="dxa" w:w="90"/>
+              <w:bottom w:type="dxa" w:w="60"/>
+              <w:right w:type="dxa" w:w="90"/>
+            </w:tcMar>
+          </w:tcPr>
+          <w:p>
+            <w:pPr>
+              <w:keepNext/>
+              <w:jc w:val="left"/>
+            </w:pPr>
+            <w:r>
+              <w:rPr>
+                <w:rFonts w:ascii="Calibri" w:cs="Calibri" w:eastAsia="Calibri" w:hAnsi="Calibri"/>
+                <w:b w:val="false"/>
+                <w:bCs w:val="false"/>
+                <w:color w:val="000000"/>
+                <w:sz w:val="17"/>
+                <w:szCs w:val="17"/>
+              </w:rPr>
+              <w:t>Glass Cleaner — Ecolab 2L, Case Of 2  (MFG 6100289)</w:t>
+            </w:r>
+          </w:p>
+        </w:tc>
+        <w:tc>
+          <w:tcPr>
+            <w:tcW w:type="dxa" w:w="3800"/>
+            <w:shd w:fill="F5F7FA" w:color="auto" w:val="clear"/>
+            <w:tcMar>
+              <w:top w:type="dxa" w:w="60"/>
+              <w:left w:type="dxa" w:w="90"/>
+              <w:bottom w:type="dxa" w:w="60"/>
+              <w:right w:type="dxa" w:w="90"/>
+            </w:tcMar>
+          </w:tcPr>
+          <w:p>
+            <w:pPr>
+              <w:keepNext/>
+              <w:jc w:val="left"/>
+            </w:pPr>
+            <w:r>
+              <w:rPr>
+                <w:rFonts w:ascii="Calibri" w:cs="Calibri" w:eastAsia="Calibri" w:hAnsi="Calibri"/>
+                <w:b w:val="false"/>
+                <w:bCs w:val="false"/>
+                <w:color w:val="000000"/>
+                <w:sz w:val="17"/>
+                <w:szCs w:val="17"/>
+              </w:rPr>
+              <w:t>Limpiavidrios — Ecolab 2 L, caja de 2 (MFG 6100289)</w:t>
             </w:r>
           </w:p>
         </w:tc>
@@ -2433,64 +2437,65 @@
                 <w:sz w:val="17"/>
                 <w:szCs w:val="17"/>
               </w:rPr>
-            </w:r>
-          </w:p>
-        </w:tc>
-        <w:tc>
-          <w:tcPr>
-            <w:tcW w:type="dxa" w:w="3800"/>
-            <w:shd w:fill="F5F7FA" w:color="auto" w:val="clear"/>
-            <w:tcMar>
-              <w:top w:type="dxa" w:w="60"/>
-              <w:left w:type="dxa" w:w="90"/>
-              <w:bottom w:type="dxa" w:w="60"/>
-              <w:right w:type="dxa" w:w="90"/>
-            </w:tcMar>
-          </w:tcPr>
-          <w:p>
-            <w:pPr>
-              <w:keepNext/>
-              <w:jc w:val="left"/>
-            </w:pPr>
-            <w:r>
-              <w:rPr>
-                <w:rFonts w:ascii="Calibri" w:cs="Calibri" w:eastAsia="Calibri" w:hAnsi="Calibri"/>
-                <w:b w:val="false"/>
-                <w:bCs w:val="false"/>
-                <w:color w:val="000000"/>
-                <w:sz w:val="17"/>
-                <w:szCs w:val="17"/>
-              </w:rPr>
-              <w:t>Bath Cleaner  (Ecolab MFG 6110158 — confirm HD Supply part #)</w:t>
-            </w:r>
-          </w:p>
-        </w:tc>
-        <w:tc>
-          <w:tcPr>
-            <w:tcW w:type="dxa" w:w="3800"/>
-            <w:shd w:fill="F5F7FA" w:color="auto" w:val="clear"/>
-            <w:tcMar>
-              <w:top w:type="dxa" w:w="60"/>
-              <w:left w:type="dxa" w:w="90"/>
-              <w:bottom w:type="dxa" w:w="60"/>
-              <w:right w:type="dxa" w:w="90"/>
-            </w:tcMar>
-          </w:tcPr>
-          <w:p>
-            <w:pPr>
-              <w:keepNext/>
-              <w:jc w:val="left"/>
-            </w:pPr>
-            <w:r>
-              <w:rPr>
-                <w:rFonts w:ascii="Calibri" w:cs="Calibri" w:eastAsia="Calibri" w:hAnsi="Calibri"/>
-                <w:b w:val="false"/>
-                <w:bCs w:val="false"/>
-                <w:color w:val="000000"/>
-                <w:sz w:val="17"/>
-                <w:szCs w:val="17"/>
-              </w:rPr>
-              <w:t>Limpiador para el baño (Ecolab MFG 6110158 — falta confirmar el número de parte)</w:t>
+              <w:t>137156</w:t>
+            </w:r>
+          </w:p>
+        </w:tc>
+        <w:tc>
+          <w:tcPr>
+            <w:tcW w:type="dxa" w:w="3800"/>
+            <w:shd w:fill="F5F7FA" w:color="auto" w:val="clear"/>
+            <w:tcMar>
+              <w:top w:type="dxa" w:w="60"/>
+              <w:left w:type="dxa" w:w="90"/>
+              <w:bottom w:type="dxa" w:w="60"/>
+              <w:right w:type="dxa" w:w="90"/>
+            </w:tcMar>
+          </w:tcPr>
+          <w:p>
+            <w:pPr>
+              <w:keepNext/>
+              <w:jc w:val="left"/>
+            </w:pPr>
+            <w:r>
+              <w:rPr>
+                <w:rFonts w:ascii="Calibri" w:cs="Calibri" w:eastAsia="Calibri" w:hAnsi="Calibri"/>
+                <w:b w:val="false"/>
+                <w:bCs w:val="false"/>
+                <w:color w:val="000000"/>
+                <w:sz w:val="17"/>
+                <w:szCs w:val="17"/>
+              </w:rPr>
+              <w:t>Bath Cleaner — Ecolab 66 HD Alkaline Bathroom Disinfectant, 2L, Case Of 2  (MFG 6110158)</w:t>
+            </w:r>
+          </w:p>
+        </w:tc>
+        <w:tc>
+          <w:tcPr>
+            <w:tcW w:type="dxa" w:w="3800"/>
+            <w:shd w:fill="F5F7FA" w:color="auto" w:val="clear"/>
+            <w:tcMar>
+              <w:top w:type="dxa" w:w="60"/>
+              <w:left w:type="dxa" w:w="90"/>
+              <w:bottom w:type="dxa" w:w="60"/>
+              <w:right w:type="dxa" w:w="90"/>
+            </w:tcMar>
+          </w:tcPr>
+          <w:p>
+            <w:pPr>
+              <w:keepNext/>
+              <w:jc w:val="left"/>
+            </w:pPr>
+            <w:r>
+              <w:rPr>
+                <w:rFonts w:ascii="Calibri" w:cs="Calibri" w:eastAsia="Calibri" w:hAnsi="Calibri"/>
+                <w:b w:val="false"/>
+                <w:bCs w:val="false"/>
+                <w:color w:val="000000"/>
+                <w:sz w:val="17"/>
+                <w:szCs w:val="17"/>
+              </w:rPr>
+              <w:t>Limpiador para el baño — Ecolab 66, 2 L, caja de 2 (MFG 6110158)</w:t>
             </w:r>
           </w:p>
         </w:tc>
@@ -7761,6 +7766,154 @@
                 <w:sz w:val="17"/>
                 <w:szCs w:val="17"/>
               </w:rPr>
+              <w:t>132552</w:t>
+            </w:r>
+          </w:p>
+        </w:tc>
+        <w:tc>
+          <w:tcPr>
+            <w:tcW w:type="dxa" w:w="3800"/>
+            <w:shd w:fill="F5F7FA" w:color="auto" w:val="clear"/>
+            <w:tcMar>
+              <w:top w:type="dxa" w:w="60"/>
+              <w:left w:type="dxa" w:w="90"/>
+              <w:bottom w:type="dxa" w:w="60"/>
+              <w:right w:type="dxa" w:w="90"/>
+            </w:tcMar>
+          </w:tcPr>
+          <w:p>
+            <w:pPr>
+              <w:keepNext/>
+              <w:jc w:val="left"/>
+            </w:pPr>
+            <w:r>
+              <w:rPr>
+                <w:rFonts w:ascii="Calibri" w:cs="Calibri" w:eastAsia="Calibri" w:hAnsi="Calibri"/>
+                <w:b w:val="false"/>
+                <w:bCs w:val="false"/>
+                <w:color w:val="000000"/>
+                <w:sz w:val="17"/>
+                <w:szCs w:val="17"/>
+              </w:rPr>
+              <w:t>Clear Condiment Kit, Case Of 500 — 2 sugar, 1 substitute, 1 creamer, 1 stirrer</w:t>
+            </w:r>
+          </w:p>
+        </w:tc>
+        <w:tc>
+          <w:tcPr>
+            <w:tcW w:type="dxa" w:w="3800"/>
+            <w:shd w:fill="F5F7FA" w:color="auto" w:val="clear"/>
+            <w:tcMar>
+              <w:top w:type="dxa" w:w="60"/>
+              <w:left w:type="dxa" w:w="90"/>
+              <w:bottom w:type="dxa" w:w="60"/>
+              <w:right w:type="dxa" w:w="90"/>
+            </w:tcMar>
+          </w:tcPr>
+          <w:p>
+            <w:pPr>
+              <w:keepNext/>
+              <w:jc w:val="left"/>
+            </w:pPr>
+            <w:r>
+              <w:rPr>
+                <w:rFonts w:ascii="Calibri" w:cs="Calibri" w:eastAsia="Calibri" w:hAnsi="Calibri"/>
+                <w:b w:val="false"/>
+                <w:bCs w:val="false"/>
+                <w:color w:val="000000"/>
+                <w:sz w:val="17"/>
+                <w:szCs w:val="17"/>
+              </w:rPr>
+              <w:t>Kit de condimentos transparente, caja de 500 — 2 azúcar, 1 sustituto, 1 crema, 1 paleta</w:t>
+            </w:r>
+          </w:p>
+        </w:tc>
+        <w:tc>
+          <w:tcPr>
+            <w:tcW w:type="dxa" w:w="800"/>
+            <w:shd w:fill="F5F7FA" w:color="auto" w:val="clear"/>
+            <w:tcMar>
+              <w:top w:type="dxa" w:w="60"/>
+              <w:left w:type="dxa" w:w="90"/>
+              <w:bottom w:type="dxa" w:w="60"/>
+              <w:right w:type="dxa" w:w="90"/>
+            </w:tcMar>
+          </w:tcPr>
+          <w:p>
+            <w:pPr>
+              <w:keepNext/>
+              <w:jc w:val="left"/>
+            </w:pPr>
+            <w:r>
+              <w:rPr>
+                <w:rFonts w:ascii="Calibri" w:cs="Calibri" w:eastAsia="Calibri" w:hAnsi="Calibri"/>
+                <w:b w:val="false"/>
+                <w:bCs w:val="false"/>
+                <w:color w:val="000000"/>
+                <w:sz w:val="18"/>
+                <w:szCs w:val="18"/>
+              </w:rPr>
+            </w:r>
+          </w:p>
+        </w:tc>
+        <w:tc>
+          <w:tcPr>
+            <w:tcW w:type="dxa" w:w="800"/>
+            <w:shd w:fill="F5F7FA" w:color="auto" w:val="clear"/>
+            <w:tcMar>
+              <w:top w:type="dxa" w:w="60"/>
+              <w:left w:type="dxa" w:w="90"/>
+              <w:bottom w:type="dxa" w:w="60"/>
+              <w:right w:type="dxa" w:w="90"/>
+            </w:tcMar>
+          </w:tcPr>
+          <w:p>
+            <w:pPr>
+              <w:keepNext/>
+              <w:jc w:val="left"/>
+            </w:pPr>
+            <w:r>
+              <w:rPr>
+                <w:rFonts w:ascii="Calibri" w:cs="Calibri" w:eastAsia="Calibri" w:hAnsi="Calibri"/>
+                <w:b w:val="false"/>
+                <w:bCs w:val="false"/>
+                <w:color w:val="000000"/>
+                <w:sz w:val="18"/>
+                <w:szCs w:val="18"/>
+              </w:rPr>
+            </w:r>
+          </w:p>
+        </w:tc>
+      </w:tr>
+      <w:tr>
+        <w:trPr>
+          <w:cantSplit/>
+        </w:trPr>
+        <w:tc>
+          <w:tcPr>
+            <w:tcW w:type="dxa" w:w="1200"/>
+            <w:shd w:fill="F5F7FA" w:color="auto" w:val="clear"/>
+            <w:tcMar>
+              <w:top w:type="dxa" w:w="60"/>
+              <w:left w:type="dxa" w:w="90"/>
+              <w:bottom w:type="dxa" w:w="60"/>
+              <w:right w:type="dxa" w:w="90"/>
+            </w:tcMar>
+          </w:tcPr>
+          <w:p>
+            <w:pPr>
+              <w:keepNext/>
+              <w:jc w:val="left"/>
+            </w:pPr>
+            <w:r>
+              <w:rPr>
+                <w:rFonts w:ascii="Calibri" w:cs="Calibri" w:eastAsia="Calibri" w:hAnsi="Calibri"/>
+                <w:b w:val="false"/>
+                <w:bCs w:val="false"/>
+                <w:color w:val="000000"/>
+                <w:sz w:val="17"/>
+                <w:szCs w:val="17"/>
+              </w:rPr>
               <w:t>120213</w:t>
             </w:r>
           </w:p>
@@ -7790,36 +7943,36 @@
                 <w:sz w:val="17"/>
                 <w:szCs w:val="17"/>
               </w:rPr>
-              <w:t>10oz Wrapped Double Wall Cup, Case Of 500</w:t>
-            </w:r>
-          </w:p>
-        </w:tc>
-        <w:tc>
-          <w:tcPr>
-            <w:tcW w:type="dxa" w:w="3800"/>
-            <w:shd w:fill="F5F7FA" w:color="auto" w:val="clear"/>
-            <w:tcMar>
-              <w:top w:type="dxa" w:w="60"/>
-              <w:left w:type="dxa" w:w="90"/>
-              <w:bottom w:type="dxa" w:w="60"/>
-              <w:right w:type="dxa" w:w="90"/>
-            </w:tcMar>
-          </w:tcPr>
-          <w:p>
-            <w:pPr>
-              <w:keepNext/>
-              <w:jc w:val="left"/>
-            </w:pPr>
-            <w:r>
-              <w:rPr>
-                <w:rFonts w:ascii="Calibri" w:cs="Calibri" w:eastAsia="Calibri" w:hAnsi="Calibri"/>
-                <w:b w:val="false"/>
-                <w:bCs w:val="false"/>
-                <w:color w:val="000000"/>
-                <w:sz w:val="17"/>
-                <w:szCs w:val="17"/>
-              </w:rPr>
-              <w:t>Vaso de papel de doble pared, envuelto, 10 oz, caja de 500</w:t>
+              <w:t>10oz Wrapped Double Wall Cup, Case Of 500  (HD Supply note: use lid 412263)</w:t>
+            </w:r>
+          </w:p>
+        </w:tc>
+        <w:tc>
+          <w:tcPr>
+            <w:tcW w:type="dxa" w:w="3800"/>
+            <w:shd w:fill="F5F7FA" w:color="auto" w:val="clear"/>
+            <w:tcMar>
+              <w:top w:type="dxa" w:w="60"/>
+              <w:left w:type="dxa" w:w="90"/>
+              <w:bottom w:type="dxa" w:w="60"/>
+              <w:right w:type="dxa" w:w="90"/>
+            </w:tcMar>
+          </w:tcPr>
+          <w:p>
+            <w:pPr>
+              <w:keepNext/>
+              <w:jc w:val="left"/>
+            </w:pPr>
+            <w:r>
+              <w:rPr>
+                <w:rFonts w:ascii="Calibri" w:cs="Calibri" w:eastAsia="Calibri" w:hAnsi="Calibri"/>
+                <w:b w:val="false"/>
+                <w:bCs w:val="false"/>
+                <w:color w:val="000000"/>
+                <w:sz w:val="17"/>
+                <w:szCs w:val="17"/>
+              </w:rPr>
+              <w:t>Vaso de papel de doble pared, envuelto, 10 oz, caja de 500 (HD Supply: usar la tapa 412263)</w:t>
             </w:r>
           </w:p>
         </w:tc>
@@ -10549,36 +10702,36 @@
                 <w:sz w:val="17"/>
                 <w:szCs w:val="17"/>
               </w:rPr>
-              <w:t>Towel Hanger Card 4 X 10, Case Of 100</w:t>
-            </w:r>
-          </w:p>
-        </w:tc>
-        <w:tc>
-          <w:tcPr>
-            <w:tcW w:type="dxa" w:w="3800"/>
-            <w:shd w:fill="F5F7FA" w:color="auto" w:val="clear"/>
-            <w:tcMar>
-              <w:top w:type="dxa" w:w="60"/>
-              <w:left w:type="dxa" w:w="90"/>
-              <w:bottom w:type="dxa" w:w="60"/>
-              <w:right w:type="dxa" w:w="90"/>
-            </w:tcMar>
-          </w:tcPr>
-          <w:p>
-            <w:pPr>
-              <w:keepNext/>
-              <w:jc w:val="left"/>
-            </w:pPr>
-            <w:r>
-              <w:rPr>
-                <w:rFonts w:ascii="Calibri" w:cs="Calibri" w:eastAsia="Calibri" w:hAnsi="Calibri"/>
-                <w:b w:val="false"/>
-                <w:bCs w:val="false"/>
-                <w:color w:val="000000"/>
-                <w:sz w:val="17"/>
-                <w:szCs w:val="17"/>
-              </w:rPr>
-              <w:t>Tarjeta para colgar las toallas, 4 x 10, caja de 100</w:t>
+              <w:t>Towel Hanger Card 4 X 10, Case Of 100  (HD Supply lists this as 206622 and shows it unavailable — confirm the number)</w:t>
+            </w:r>
+          </w:p>
+        </w:tc>
+        <w:tc>
+          <w:tcPr>
+            <w:tcW w:type="dxa" w:w="3800"/>
+            <w:shd w:fill="F5F7FA" w:color="auto" w:val="clear"/>
+            <w:tcMar>
+              <w:top w:type="dxa" w:w="60"/>
+              <w:left w:type="dxa" w:w="90"/>
+              <w:bottom w:type="dxa" w:w="60"/>
+              <w:right w:type="dxa" w:w="90"/>
+            </w:tcMar>
+          </w:tcPr>
+          <w:p>
+            <w:pPr>
+              <w:keepNext/>
+              <w:jc w:val="left"/>
+            </w:pPr>
+            <w:r>
+              <w:rPr>
+                <w:rFonts w:ascii="Calibri" w:cs="Calibri" w:eastAsia="Calibri" w:hAnsi="Calibri"/>
+                <w:b w:val="false"/>
+                <w:bCs w:val="false"/>
+                <w:color w:val="000000"/>
+                <w:sz w:val="17"/>
+                <w:szCs w:val="17"/>
+              </w:rPr>
+              <w:t>Tarjeta para colgar las toallas, 4 x 10, caja de 100 (HD Supply lo tiene como 206622 y aparece agotado — confirmar el número)</w:t>
             </w:r>
           </w:p>
         </w:tc>
@@ -10668,64 +10821,65 @@
                 <w:sz w:val="17"/>
                 <w:szCs w:val="17"/>
               </w:rPr>
-            </w:r>
-          </w:p>
-        </w:tc>
-        <w:tc>
-          <w:tcPr>
-            <w:tcW w:type="dxa" w:w="3800"/>
-            <w:shd w:fill="F5F7FA" w:color="auto" w:val="clear"/>
-            <w:tcMar>
-              <w:top w:type="dxa" w:w="60"/>
-              <w:left w:type="dxa" w:w="90"/>
-              <w:bottom w:type="dxa" w:w="60"/>
-              <w:right w:type="dxa" w:w="90"/>
-            </w:tcMar>
-          </w:tcPr>
-          <w:p>
-            <w:pPr>
-              <w:keepNext/>
-              <w:jc w:val="left"/>
-            </w:pPr>
-            <w:r>
-              <w:rPr>
-                <w:rFonts w:ascii="Calibri" w:cs="Calibri" w:eastAsia="Calibri" w:hAnsi="Calibri"/>
-                <w:b w:val="false"/>
-                <w:bCs w:val="false"/>
-                <w:color w:val="000000"/>
-                <w:sz w:val="17"/>
-                <w:szCs w:val="17"/>
-              </w:rPr>
-              <w:t>Do Not Disturb door hanger  — part # TBD</w:t>
-            </w:r>
-          </w:p>
-        </w:tc>
-        <w:tc>
-          <w:tcPr>
-            <w:tcW w:type="dxa" w:w="3800"/>
-            <w:shd w:fill="F5F7FA" w:color="auto" w:val="clear"/>
-            <w:tcMar>
-              <w:top w:type="dxa" w:w="60"/>
-              <w:left w:type="dxa" w:w="90"/>
-              <w:bottom w:type="dxa" w:w="60"/>
-              <w:right w:type="dxa" w:w="90"/>
-            </w:tcMar>
-          </w:tcPr>
-          <w:p>
-            <w:pPr>
-              <w:keepNext/>
-              <w:jc w:val="left"/>
-            </w:pPr>
-            <w:r>
-              <w:rPr>
-                <w:rFonts w:ascii="Calibri" w:cs="Calibri" w:eastAsia="Calibri" w:hAnsi="Calibri"/>
-                <w:b w:val="false"/>
-                <w:bCs w:val="false"/>
-                <w:color w:val="000000"/>
-                <w:sz w:val="17"/>
-                <w:szCs w:val="17"/>
-              </w:rPr>
-              <w:t>Letrero de "No Molestar" para la puerta — falta el número de parte</w:t>
+              <w:t>360056</w:t>
+            </w:r>
+          </w:p>
+        </w:tc>
+        <w:tc>
+          <w:tcPr>
+            <w:tcW w:type="dxa" w:w="3800"/>
+            <w:shd w:fill="F5F7FA" w:color="auto" w:val="clear"/>
+            <w:tcMar>
+              <w:top w:type="dxa" w:w="60"/>
+              <w:left w:type="dxa" w:w="90"/>
+              <w:bottom w:type="dxa" w:w="60"/>
+              <w:right w:type="dxa" w:w="90"/>
+            </w:tcMar>
+          </w:tcPr>
+          <w:p>
+            <w:pPr>
+              <w:keepNext/>
+              <w:jc w:val="left"/>
+            </w:pPr>
+            <w:r>
+              <w:rPr>
+                <w:rFonts w:ascii="Calibri" w:cs="Calibri" w:eastAsia="Calibri" w:hAnsi="Calibri"/>
+                <w:b w:val="false"/>
+                <w:bCs w:val="false"/>
+                <w:color w:val="000000"/>
+                <w:sz w:val="17"/>
+                <w:szCs w:val="17"/>
+              </w:rPr>
+              <w:t>Do Not Disturb Door Hanger — Wyndham Rewards, Case Of 100</w:t>
+            </w:r>
+          </w:p>
+        </w:tc>
+        <w:tc>
+          <w:tcPr>
+            <w:tcW w:type="dxa" w:w="3800"/>
+            <w:shd w:fill="F5F7FA" w:color="auto" w:val="clear"/>
+            <w:tcMar>
+              <w:top w:type="dxa" w:w="60"/>
+              <w:left w:type="dxa" w:w="90"/>
+              <w:bottom w:type="dxa" w:w="60"/>
+              <w:right w:type="dxa" w:w="90"/>
+            </w:tcMar>
+          </w:tcPr>
+          <w:p>
+            <w:pPr>
+              <w:keepNext/>
+              <w:jc w:val="left"/>
+            </w:pPr>
+            <w:r>
+              <w:rPr>
+                <w:rFonts w:ascii="Calibri" w:cs="Calibri" w:eastAsia="Calibri" w:hAnsi="Calibri"/>
+                <w:b w:val="false"/>
+                <w:bCs w:val="false"/>
+                <w:color w:val="000000"/>
+                <w:sz w:val="17"/>
+                <w:szCs w:val="17"/>
+              </w:rPr>
+              <w:t>Letrero de "No Molestar" para la puerta — Wyndham Rewards, caja de 100</w:t>
             </w:r>
           </w:p>
         </w:tc>
@@ -10814,62 +10968,63 @@
                 <w:sz w:val="17"/>
                 <w:szCs w:val="17"/>
               </w:rPr>
-            </w:r>
-          </w:p>
-        </w:tc>
-        <w:tc>
-          <w:tcPr>
-            <w:tcW w:type="dxa" w:w="3800"/>
-            <w:shd w:fill="F5F7FA" w:color="auto" w:val="clear"/>
-            <w:tcMar>
-              <w:top w:type="dxa" w:w="60"/>
-              <w:left w:type="dxa" w:w="90"/>
-              <w:bottom w:type="dxa" w:w="60"/>
-              <w:right w:type="dxa" w:w="90"/>
-            </w:tcMar>
-          </w:tcPr>
-          <w:p>
-            <w:pPr>
-              <w:jc w:val="left"/>
-            </w:pPr>
-            <w:r>
-              <w:rPr>
-                <w:rFonts w:ascii="Calibri" w:cs="Calibri" w:eastAsia="Calibri" w:hAnsi="Calibri"/>
-                <w:b w:val="false"/>
-                <w:bCs w:val="false"/>
-                <w:color w:val="000000"/>
-                <w:sz w:val="17"/>
-                <w:szCs w:val="17"/>
-              </w:rPr>
-              <w:t>Pet-in-room door sign  — part # TBD</w:t>
-            </w:r>
-          </w:p>
-        </w:tc>
-        <w:tc>
-          <w:tcPr>
-            <w:tcW w:type="dxa" w:w="3800"/>
-            <w:shd w:fill="F5F7FA" w:color="auto" w:val="clear"/>
-            <w:tcMar>
-              <w:top w:type="dxa" w:w="60"/>
-              <w:left w:type="dxa" w:w="90"/>
-              <w:bottom w:type="dxa" w:w="60"/>
-              <w:right w:type="dxa" w:w="90"/>
-            </w:tcMar>
-          </w:tcPr>
-          <w:p>
-            <w:pPr>
-              <w:jc w:val="left"/>
-            </w:pPr>
-            <w:r>
-              <w:rPr>
-                <w:rFonts w:ascii="Calibri" w:cs="Calibri" w:eastAsia="Calibri" w:hAnsi="Calibri"/>
-                <w:b w:val="false"/>
-                <w:bCs w:val="false"/>
-                <w:color w:val="000000"/>
-                <w:sz w:val="17"/>
-                <w:szCs w:val="17"/>
-              </w:rPr>
-              <w:t>Letrero de "Mascota en la habitación" — falta el número de parte</w:t>
+              <w:t>115551</w:t>
+            </w:r>
+          </w:p>
+        </w:tc>
+        <w:tc>
+          <w:tcPr>
+            <w:tcW w:type="dxa" w:w="3800"/>
+            <w:shd w:fill="F5F7FA" w:color="auto" w:val="clear"/>
+            <w:tcMar>
+              <w:top w:type="dxa" w:w="60"/>
+              <w:left w:type="dxa" w:w="90"/>
+              <w:bottom w:type="dxa" w:w="60"/>
+              <w:right w:type="dxa" w:w="90"/>
+            </w:tcMar>
+          </w:tcPr>
+          <w:p>
+            <w:pPr>
+              <w:jc w:val="left"/>
+            </w:pPr>
+            <w:r>
+              <w:rPr>
+                <w:rFonts w:ascii="Calibri" w:cs="Calibri" w:eastAsia="Calibri" w:hAnsi="Calibri"/>
+                <w:b w:val="false"/>
+                <w:bCs w:val="false"/>
+                <w:color w:val="000000"/>
+                <w:sz w:val="17"/>
+                <w:szCs w:val="17"/>
+              </w:rPr>
+              <w:t>Pet-In-Room Door Sign — spindle, lock-insert style, Pkg Of 50</w:t>
+            </w:r>
+          </w:p>
+        </w:tc>
+        <w:tc>
+          <w:tcPr>
+            <w:tcW w:type="dxa" w:w="3800"/>
+            <w:shd w:fill="F5F7FA" w:color="auto" w:val="clear"/>
+            <w:tcMar>
+              <w:top w:type="dxa" w:w="60"/>
+              <w:left w:type="dxa" w:w="90"/>
+              <w:bottom w:type="dxa" w:w="60"/>
+              <w:right w:type="dxa" w:w="90"/>
+            </w:tcMar>
+          </w:tcPr>
+          <w:p>
+            <w:pPr>
+              <w:jc w:val="left"/>
+            </w:pPr>
+            <w:r>
+              <w:rPr>
+                <w:rFonts w:ascii="Calibri" w:cs="Calibri" w:eastAsia="Calibri" w:hAnsi="Calibri"/>
+                <w:b w:val="false"/>
+                <w:bCs w:val="false"/>
+                <w:color w:val="000000"/>
+                <w:sz w:val="17"/>
+                <w:szCs w:val="17"/>
+              </w:rPr>
+              <w:t>Letrero de "Mascota en la habitación" — tipo insertable, paquete de 50</w:t>
             </w:r>
           </w:p>
         </w:tc>
@@ -11491,64 +11646,65 @@
                 <w:sz w:val="17"/>
                 <w:szCs w:val="17"/>
               </w:rPr>
-            </w:r>
-          </w:p>
-        </w:tc>
-        <w:tc>
-          <w:tcPr>
-            <w:tcW w:type="dxa" w:w="3800"/>
-            <w:shd w:fill="F5F7FA" w:color="auto" w:val="clear"/>
-            <w:tcMar>
-              <w:top w:type="dxa" w:w="60"/>
-              <w:left w:type="dxa" w:w="90"/>
-              <w:bottom w:type="dxa" w:w="60"/>
-              <w:right w:type="dxa" w:w="90"/>
-            </w:tcMar>
-          </w:tcPr>
-          <w:p>
-            <w:pPr>
-              <w:keepNext/>
-              <w:jc w:val="left"/>
-            </w:pPr>
-            <w:r>
-              <w:rPr>
-                <w:rFonts w:ascii="Calibri" w:cs="Calibri" w:eastAsia="Calibri" w:hAnsi="Calibri"/>
-                <w:b w:val="false"/>
-                <w:bCs w:val="false"/>
-                <w:color w:val="000000"/>
-                <w:sz w:val="17"/>
-                <w:szCs w:val="17"/>
-              </w:rPr>
-              <w:t>Garment steamer  — part # TBD</w:t>
-            </w:r>
-          </w:p>
-        </w:tc>
-        <w:tc>
-          <w:tcPr>
-            <w:tcW w:type="dxa" w:w="3800"/>
-            <w:shd w:fill="F5F7FA" w:color="auto" w:val="clear"/>
-            <w:tcMar>
-              <w:top w:type="dxa" w:w="60"/>
-              <w:left w:type="dxa" w:w="90"/>
-              <w:bottom w:type="dxa" w:w="60"/>
-              <w:right w:type="dxa" w:w="90"/>
-            </w:tcMar>
-          </w:tcPr>
-          <w:p>
-            <w:pPr>
-              <w:keepNext/>
-              <w:jc w:val="left"/>
-            </w:pPr>
-            <w:r>
-              <w:rPr>
-                <w:rFonts w:ascii="Calibri" w:cs="Calibri" w:eastAsia="Calibri" w:hAnsi="Calibri"/>
-                <w:b w:val="false"/>
-                <w:bCs w:val="false"/>
-                <w:color w:val="000000"/>
-                <w:sz w:val="17"/>
-                <w:szCs w:val="17"/>
-              </w:rPr>
-              <w:t>Vaporizador de ropa — falta el número de parte</w:t>
+              <w:t>346737</w:t>
+            </w:r>
+          </w:p>
+        </w:tc>
+        <w:tc>
+          <w:tcPr>
+            <w:tcW w:type="dxa" w:w="3800"/>
+            <w:shd w:fill="F5F7FA" w:color="auto" w:val="clear"/>
+            <w:tcMar>
+              <w:top w:type="dxa" w:w="60"/>
+              <w:left w:type="dxa" w:w="90"/>
+              <w:bottom w:type="dxa" w:w="60"/>
+              <w:right w:type="dxa" w:w="90"/>
+            </w:tcMar>
+          </w:tcPr>
+          <w:p>
+            <w:pPr>
+              <w:keepNext/>
+              <w:jc w:val="left"/>
+            </w:pPr>
+            <w:r>
+              <w:rPr>
+                <w:rFonts w:ascii="Calibri" w:cs="Calibri" w:eastAsia="Calibri" w:hAnsi="Calibri"/>
+                <w:b w:val="false"/>
+                <w:bCs w:val="false"/>
+                <w:color w:val="000000"/>
+                <w:sz w:val="17"/>
+                <w:szCs w:val="17"/>
+              </w:rPr>
+              <w:t>Handheld Garment Steamer, dual-heat</w:t>
+            </w:r>
+          </w:p>
+        </w:tc>
+        <w:tc>
+          <w:tcPr>
+            <w:tcW w:type="dxa" w:w="3800"/>
+            <w:shd w:fill="F5F7FA" w:color="auto" w:val="clear"/>
+            <w:tcMar>
+              <w:top w:type="dxa" w:w="60"/>
+              <w:left w:type="dxa" w:w="90"/>
+              <w:bottom w:type="dxa" w:w="60"/>
+              <w:right w:type="dxa" w:w="90"/>
+            </w:tcMar>
+          </w:tcPr>
+          <w:p>
+            <w:pPr>
+              <w:keepNext/>
+              <w:jc w:val="left"/>
+            </w:pPr>
+            <w:r>
+              <w:rPr>
+                <w:rFonts w:ascii="Calibri" w:cs="Calibri" w:eastAsia="Calibri" w:hAnsi="Calibri"/>
+                <w:b w:val="false"/>
+                <w:bCs w:val="false"/>
+                <w:color w:val="000000"/>
+                <w:sz w:val="17"/>
+                <w:szCs w:val="17"/>
+              </w:rPr>
+              <w:t>Vaporizador de ropa de mano, dos temperaturas</w:t>
             </w:r>
           </w:p>
         </w:tc>
@@ -13491,35 +13647,35 @@
                 <w:sz w:val="17"/>
                 <w:szCs w:val="17"/>
               </w:rPr>
-              <w:t>Shower Brackets, Case Of 43</w:t>
-            </w:r>
-          </w:p>
-        </w:tc>
-        <w:tc>
-          <w:tcPr>
-            <w:tcW w:type="dxa" w:w="3800"/>
-            <w:shd w:fill="F5F7FA" w:color="auto" w:val="clear"/>
-            <w:tcMar>
-              <w:top w:type="dxa" w:w="60"/>
-              <w:left w:type="dxa" w:w="90"/>
-              <w:bottom w:type="dxa" w:w="60"/>
-              <w:right w:type="dxa" w:w="90"/>
-            </w:tcMar>
-          </w:tcPr>
-          <w:p>
-            <w:pPr>
-              <w:jc w:val="left"/>
-            </w:pPr>
-            <w:r>
-              <w:rPr>
-                <w:rFonts w:ascii="Calibri" w:cs="Calibri" w:eastAsia="Calibri" w:hAnsi="Calibri"/>
-                <w:b w:val="false"/>
-                <w:bCs w:val="false"/>
-                <w:color w:val="000000"/>
-                <w:sz w:val="17"/>
-                <w:szCs w:val="17"/>
-              </w:rPr>
-              <w:t>Soportes de pared para los dispensadores de la ducha, caja de 43</w:t>
+              <w:t>Shower Brackets, Case Of 48  (HD Supply shows 48, not 43 — confirm when ordering)</w:t>
+            </w:r>
+          </w:p>
+        </w:tc>
+        <w:tc>
+          <w:tcPr>
+            <w:tcW w:type="dxa" w:w="3800"/>
+            <w:shd w:fill="F5F7FA" w:color="auto" w:val="clear"/>
+            <w:tcMar>
+              <w:top w:type="dxa" w:w="60"/>
+              <w:left w:type="dxa" w:w="90"/>
+              <w:bottom w:type="dxa" w:w="60"/>
+              <w:right w:type="dxa" w:w="90"/>
+            </w:tcMar>
+          </w:tcPr>
+          <w:p>
+            <w:pPr>
+              <w:jc w:val="left"/>
+            </w:pPr>
+            <w:r>
+              <w:rPr>
+                <w:rFonts w:ascii="Calibri" w:cs="Calibri" w:eastAsia="Calibri" w:hAnsi="Calibri"/>
+                <w:b w:val="false"/>
+                <w:bCs w:val="false"/>
+                <w:color w:val="000000"/>
+                <w:sz w:val="17"/>
+                <w:szCs w:val="17"/>
+              </w:rPr>
+              <w:t>Soportes de pared para los dispensadores de la ducha, caja de 48 (HD Supply dice 48, no 43 — confirmar al pedir)</w:t>
             </w:r>
           </w:p>
         </w:tc>

</xml_diff>

<commit_message>
Move the guest laundry bag out of the middle of the chemical run
772224 sat between the Foca powder and the wall dispensers, breaking the
pails-then-dispensers reading order. It now follows the dispensers, with
the optional Enzyme Boost still last.

Co-Authored-By: Claude Opus 5 <noreply@anthropic.com>
Claude-Session: https://claude.ai/code/session_0138rT731u9moyu7f3GNkj4g
</commit_message>
<xml_diff>
--- a/Elm_Housekeeping_Inventory.docx
+++ b/Elm_Housekeeping_Inventory.docx
@@ -5002,65 +5002,65 @@
                 <w:sz w:val="17"/>
                 <w:szCs w:val="17"/>
               </w:rPr>
-              <w:t>772224</w:t>
-            </w:r>
-          </w:p>
-        </w:tc>
-        <w:tc>
-          <w:tcPr>
-            <w:tcW w:type="dxa" w:w="3800"/>
-            <w:shd w:fill="F5F7FA" w:color="auto" w:val="clear"/>
-            <w:tcMar>
-              <w:top w:type="dxa" w:w="60"/>
-              <w:left w:type="dxa" w:w="90"/>
-              <w:bottom w:type="dxa" w:w="60"/>
-              <w:right w:type="dxa" w:w="90"/>
-            </w:tcMar>
-          </w:tcPr>
-          <w:p>
-            <w:pPr>
-              <w:keepNext/>
-              <w:jc w:val="left"/>
-            </w:pPr>
-            <w:r>
-              <w:rPr>
-                <w:rFonts w:ascii="Calibri" w:cs="Calibri" w:eastAsia="Calibri" w:hAnsi="Calibri"/>
-                <w:b w:val="false"/>
-                <w:bCs w:val="false"/>
-                <w:color w:val="000000"/>
-                <w:sz w:val="17"/>
-                <w:szCs w:val="17"/>
-              </w:rPr>
-              <w:t>Laundry Bag 14 X 20, Case Of 1000</w:t>
-            </w:r>
-          </w:p>
-        </w:tc>
-        <w:tc>
-          <w:tcPr>
-            <w:tcW w:type="dxa" w:w="3800"/>
-            <w:shd w:fill="F5F7FA" w:color="auto" w:val="clear"/>
-            <w:tcMar>
-              <w:top w:type="dxa" w:w="60"/>
-              <w:left w:type="dxa" w:w="90"/>
-              <w:bottom w:type="dxa" w:w="60"/>
-              <w:right w:type="dxa" w:w="90"/>
-            </w:tcMar>
-          </w:tcPr>
-          <w:p>
-            <w:pPr>
-              <w:keepNext/>
-              <w:jc w:val="left"/>
-            </w:pPr>
-            <w:r>
-              <w:rPr>
-                <w:rFonts w:ascii="Calibri" w:cs="Calibri" w:eastAsia="Calibri" w:hAnsi="Calibri"/>
-                <w:b w:val="false"/>
-                <w:bCs w:val="false"/>
-                <w:color w:val="000000"/>
-                <w:sz w:val="17"/>
-                <w:szCs w:val="17"/>
-              </w:rPr>
-              <w:t>Bolsa de plástico para la ropa sucia del huésped, 14 x 20, caja de 1000</w:t>
+              <w:t>161073</w:t>
+            </w:r>
+          </w:p>
+        </w:tc>
+        <w:tc>
+          <w:tcPr>
+            <w:tcW w:type="dxa" w:w="3800"/>
+            <w:shd w:fill="F5F7FA" w:color="auto" w:val="clear"/>
+            <w:tcMar>
+              <w:top w:type="dxa" w:w="60"/>
+              <w:left w:type="dxa" w:w="90"/>
+              <w:bottom w:type="dxa" w:w="60"/>
+              <w:right w:type="dxa" w:w="90"/>
+            </w:tcMar>
+          </w:tcPr>
+          <w:p>
+            <w:pPr>
+              <w:keepNext/>
+              <w:jc w:val="left"/>
+            </w:pPr>
+            <w:r>
+              <w:rPr>
+                <w:rFonts w:ascii="Calibri" w:cs="Calibri" w:eastAsia="Calibri" w:hAnsi="Calibri"/>
+                <w:b w:val="false"/>
+                <w:bCs w:val="false"/>
+                <w:color w:val="000000"/>
+                <w:sz w:val="17"/>
+                <w:szCs w:val="17"/>
+              </w:rPr>
+              <w:t>No-Rinse Alkaline Floor Cleaner - 2.5 Gal  (wall dispenser, GREEN label)</w:t>
+            </w:r>
+          </w:p>
+        </w:tc>
+        <w:tc>
+          <w:tcPr>
+            <w:tcW w:type="dxa" w:w="3800"/>
+            <w:shd w:fill="F5F7FA" w:color="auto" w:val="clear"/>
+            <w:tcMar>
+              <w:top w:type="dxa" w:w="60"/>
+              <w:left w:type="dxa" w:w="90"/>
+              <w:bottom w:type="dxa" w:w="60"/>
+              <w:right w:type="dxa" w:w="90"/>
+            </w:tcMar>
+          </w:tcPr>
+          <w:p>
+            <w:pPr>
+              <w:keepNext/>
+              <w:jc w:val="left"/>
+            </w:pPr>
+            <w:r>
+              <w:rPr>
+                <w:rFonts w:ascii="Calibri" w:cs="Calibri" w:eastAsia="Calibri" w:hAnsi="Calibri"/>
+                <w:b w:val="false"/>
+                <w:bCs w:val="false"/>
+                <w:color w:val="000000"/>
+                <w:sz w:val="17"/>
+                <w:szCs w:val="17"/>
+              </w:rPr>
+              <w:t>No-Rinse Alkaline Floor Cleaner - 2.5 gal (dispensador de pared, etiqueta VERDE) — pisos</w:t>
             </w:r>
           </w:p>
         </w:tc>
@@ -5150,65 +5150,65 @@
                 <w:sz w:val="17"/>
                 <w:szCs w:val="17"/>
               </w:rPr>
-              <w:t>161073</w:t>
-            </w:r>
-          </w:p>
-        </w:tc>
-        <w:tc>
-          <w:tcPr>
-            <w:tcW w:type="dxa" w:w="3800"/>
-            <w:shd w:fill="F5F7FA" w:color="auto" w:val="clear"/>
-            <w:tcMar>
-              <w:top w:type="dxa" w:w="60"/>
-              <w:left w:type="dxa" w:w="90"/>
-              <w:bottom w:type="dxa" w:w="60"/>
-              <w:right w:type="dxa" w:w="90"/>
-            </w:tcMar>
-          </w:tcPr>
-          <w:p>
-            <w:pPr>
-              <w:keepNext/>
-              <w:jc w:val="left"/>
-            </w:pPr>
-            <w:r>
-              <w:rPr>
-                <w:rFonts w:ascii="Calibri" w:cs="Calibri" w:eastAsia="Calibri" w:hAnsi="Calibri"/>
-                <w:b w:val="false"/>
-                <w:bCs w:val="false"/>
-                <w:color w:val="000000"/>
-                <w:sz w:val="17"/>
-                <w:szCs w:val="17"/>
-              </w:rPr>
-              <w:t>No-Rinse Alkaline Floor Cleaner - 2.5 Gal  (wall dispenser, GREEN label)</w:t>
-            </w:r>
-          </w:p>
-        </w:tc>
-        <w:tc>
-          <w:tcPr>
-            <w:tcW w:type="dxa" w:w="3800"/>
-            <w:shd w:fill="F5F7FA" w:color="auto" w:val="clear"/>
-            <w:tcMar>
-              <w:top w:type="dxa" w:w="60"/>
-              <w:left w:type="dxa" w:w="90"/>
-              <w:bottom w:type="dxa" w:w="60"/>
-              <w:right w:type="dxa" w:w="90"/>
-            </w:tcMar>
-          </w:tcPr>
-          <w:p>
-            <w:pPr>
-              <w:keepNext/>
-              <w:jc w:val="left"/>
-            </w:pPr>
-            <w:r>
-              <w:rPr>
-                <w:rFonts w:ascii="Calibri" w:cs="Calibri" w:eastAsia="Calibri" w:hAnsi="Calibri"/>
-                <w:b w:val="false"/>
-                <w:bCs w:val="false"/>
-                <w:color w:val="000000"/>
-                <w:sz w:val="17"/>
-                <w:szCs w:val="17"/>
-              </w:rPr>
-              <w:t>No-Rinse Alkaline Floor Cleaner - 2.5 gal (dispensador de pared, etiqueta VERDE) — pisos</w:t>
+              <w:t>204166</w:t>
+            </w:r>
+          </w:p>
+        </w:tc>
+        <w:tc>
+          <w:tcPr>
+            <w:tcW w:type="dxa" w:w="3800"/>
+            <w:shd w:fill="F5F7FA" w:color="auto" w:val="clear"/>
+            <w:tcMar>
+              <w:top w:type="dxa" w:w="60"/>
+              <w:left w:type="dxa" w:w="90"/>
+              <w:bottom w:type="dxa" w:w="60"/>
+              <w:right w:type="dxa" w:w="90"/>
+            </w:tcMar>
+          </w:tcPr>
+          <w:p>
+            <w:pPr>
+              <w:keepNext/>
+              <w:jc w:val="left"/>
+            </w:pPr>
+            <w:r>
+              <w:rPr>
+                <w:rFonts w:ascii="Calibri" w:cs="Calibri" w:eastAsia="Calibri" w:hAnsi="Calibri"/>
+                <w:b w:val="false"/>
+                <w:bCs w:val="false"/>
+                <w:color w:val="000000"/>
+                <w:sz w:val="17"/>
+                <w:szCs w:val="17"/>
+              </w:rPr>
+              <w:t>73 Disinfecting Acid Bathroom Cleaner - 2.5 Gal  (wall dispenser, PINK label)</w:t>
+            </w:r>
+          </w:p>
+        </w:tc>
+        <w:tc>
+          <w:tcPr>
+            <w:tcW w:type="dxa" w:w="3800"/>
+            <w:shd w:fill="F5F7FA" w:color="auto" w:val="clear"/>
+            <w:tcMar>
+              <w:top w:type="dxa" w:w="60"/>
+              <w:left w:type="dxa" w:w="90"/>
+              <w:bottom w:type="dxa" w:w="60"/>
+              <w:right w:type="dxa" w:w="90"/>
+            </w:tcMar>
+          </w:tcPr>
+          <w:p>
+            <w:pPr>
+              <w:keepNext/>
+              <w:jc w:val="left"/>
+            </w:pPr>
+            <w:r>
+              <w:rPr>
+                <w:rFonts w:ascii="Calibri" w:cs="Calibri" w:eastAsia="Calibri" w:hAnsi="Calibri"/>
+                <w:b w:val="false"/>
+                <w:bCs w:val="false"/>
+                <w:color w:val="000000"/>
+                <w:sz w:val="17"/>
+                <w:szCs w:val="17"/>
+              </w:rPr>
+              <w:t>73 Disinfecting Acid Bathroom Cleaner - 2.5 gal (dispensador, etiqueta ROSADA) — baños</w:t>
             </w:r>
           </w:p>
         </w:tc>
@@ -5298,65 +5298,65 @@
                 <w:sz w:val="17"/>
                 <w:szCs w:val="17"/>
               </w:rPr>
-              <w:t>204166</w:t>
-            </w:r>
-          </w:p>
-        </w:tc>
-        <w:tc>
-          <w:tcPr>
-            <w:tcW w:type="dxa" w:w="3800"/>
-            <w:shd w:fill="F5F7FA" w:color="auto" w:val="clear"/>
-            <w:tcMar>
-              <w:top w:type="dxa" w:w="60"/>
-              <w:left w:type="dxa" w:w="90"/>
-              <w:bottom w:type="dxa" w:w="60"/>
-              <w:right w:type="dxa" w:w="90"/>
-            </w:tcMar>
-          </w:tcPr>
-          <w:p>
-            <w:pPr>
-              <w:keepNext/>
-              <w:jc w:val="left"/>
-            </w:pPr>
-            <w:r>
-              <w:rPr>
-                <w:rFonts w:ascii="Calibri" w:cs="Calibri" w:eastAsia="Calibri" w:hAnsi="Calibri"/>
-                <w:b w:val="false"/>
-                <w:bCs w:val="false"/>
-                <w:color w:val="000000"/>
-                <w:sz w:val="17"/>
-                <w:szCs w:val="17"/>
-              </w:rPr>
-              <w:t>73 Disinfecting Acid Bathroom Cleaner - 2.5 Gal  (wall dispenser, PINK label)</w:t>
-            </w:r>
-          </w:p>
-        </w:tc>
-        <w:tc>
-          <w:tcPr>
-            <w:tcW w:type="dxa" w:w="3800"/>
-            <w:shd w:fill="F5F7FA" w:color="auto" w:val="clear"/>
-            <w:tcMar>
-              <w:top w:type="dxa" w:w="60"/>
-              <w:left w:type="dxa" w:w="90"/>
-              <w:bottom w:type="dxa" w:w="60"/>
-              <w:right w:type="dxa" w:w="90"/>
-            </w:tcMar>
-          </w:tcPr>
-          <w:p>
-            <w:pPr>
-              <w:keepNext/>
-              <w:jc w:val="left"/>
-            </w:pPr>
-            <w:r>
-              <w:rPr>
-                <w:rFonts w:ascii="Calibri" w:cs="Calibri" w:eastAsia="Calibri" w:hAnsi="Calibri"/>
-                <w:b w:val="false"/>
-                <w:bCs w:val="false"/>
-                <w:color w:val="000000"/>
-                <w:sz w:val="17"/>
-                <w:szCs w:val="17"/>
-              </w:rPr>
-              <w:t>73 Disinfecting Acid Bathroom Cleaner - 2.5 gal (dispensador, etiqueta ROSADA) — baños</w:t>
+              <w:t>204167</w:t>
+            </w:r>
+          </w:p>
+        </w:tc>
+        <w:tc>
+          <w:tcPr>
+            <w:tcW w:type="dxa" w:w="3800"/>
+            <w:shd w:fill="F5F7FA" w:color="auto" w:val="clear"/>
+            <w:tcMar>
+              <w:top w:type="dxa" w:w="60"/>
+              <w:left w:type="dxa" w:w="90"/>
+              <w:bottom w:type="dxa" w:w="60"/>
+              <w:right w:type="dxa" w:w="90"/>
+            </w:tcMar>
+          </w:tcPr>
+          <w:p>
+            <w:pPr>
+              <w:keepNext/>
+              <w:jc w:val="left"/>
+            </w:pPr>
+            <w:r>
+              <w:rPr>
+                <w:rFonts w:ascii="Calibri" w:cs="Calibri" w:eastAsia="Calibri" w:hAnsi="Calibri"/>
+                <w:b w:val="false"/>
+                <w:bCs w:val="false"/>
+                <w:color w:val="000000"/>
+                <w:sz w:val="17"/>
+                <w:szCs w:val="17"/>
+              </w:rPr>
+              <w:t>66 Heavy Duty Alkaline Bathroom Cleaner - 2.5 Gal  (wall dispenser)</w:t>
+            </w:r>
+          </w:p>
+        </w:tc>
+        <w:tc>
+          <w:tcPr>
+            <w:tcW w:type="dxa" w:w="3800"/>
+            <w:shd w:fill="F5F7FA" w:color="auto" w:val="clear"/>
+            <w:tcMar>
+              <w:top w:type="dxa" w:w="60"/>
+              <w:left w:type="dxa" w:w="90"/>
+              <w:bottom w:type="dxa" w:w="60"/>
+              <w:right w:type="dxa" w:w="90"/>
+            </w:tcMar>
+          </w:tcPr>
+          <w:p>
+            <w:pPr>
+              <w:keepNext/>
+              <w:jc w:val="left"/>
+            </w:pPr>
+            <w:r>
+              <w:rPr>
+                <w:rFonts w:ascii="Calibri" w:cs="Calibri" w:eastAsia="Calibri" w:hAnsi="Calibri"/>
+                <w:b w:val="false"/>
+                <w:bCs w:val="false"/>
+                <w:color w:val="000000"/>
+                <w:sz w:val="17"/>
+                <w:szCs w:val="17"/>
+              </w:rPr>
+              <w:t>66 Heavy Duty Alkaline Bathroom Cleaner - 2.5 gal (dispensador de pared) — baños, limpieza fuerte</w:t>
             </w:r>
           </w:p>
         </w:tc>
@@ -5446,65 +5446,65 @@
                 <w:sz w:val="17"/>
                 <w:szCs w:val="17"/>
               </w:rPr>
-              <w:t>204167</w:t>
-            </w:r>
-          </w:p>
-        </w:tc>
-        <w:tc>
-          <w:tcPr>
-            <w:tcW w:type="dxa" w:w="3800"/>
-            <w:shd w:fill="F5F7FA" w:color="auto" w:val="clear"/>
-            <w:tcMar>
-              <w:top w:type="dxa" w:w="60"/>
-              <w:left w:type="dxa" w:w="90"/>
-              <w:bottom w:type="dxa" w:w="60"/>
-              <w:right w:type="dxa" w:w="90"/>
-            </w:tcMar>
-          </w:tcPr>
-          <w:p>
-            <w:pPr>
-              <w:keepNext/>
-              <w:jc w:val="left"/>
-            </w:pPr>
-            <w:r>
-              <w:rPr>
-                <w:rFonts w:ascii="Calibri" w:cs="Calibri" w:eastAsia="Calibri" w:hAnsi="Calibri"/>
-                <w:b w:val="false"/>
-                <w:bCs w:val="false"/>
-                <w:color w:val="000000"/>
-                <w:sz w:val="17"/>
-                <w:szCs w:val="17"/>
-              </w:rPr>
-              <w:t>66 Heavy Duty Alkaline Bathroom Cleaner - 2.5 Gal  (wall dispenser)</w:t>
-            </w:r>
-          </w:p>
-        </w:tc>
-        <w:tc>
-          <w:tcPr>
-            <w:tcW w:type="dxa" w:w="3800"/>
-            <w:shd w:fill="F5F7FA" w:color="auto" w:val="clear"/>
-            <w:tcMar>
-              <w:top w:type="dxa" w:w="60"/>
-              <w:left w:type="dxa" w:w="90"/>
-              <w:bottom w:type="dxa" w:w="60"/>
-              <w:right w:type="dxa" w:w="90"/>
-            </w:tcMar>
-          </w:tcPr>
-          <w:p>
-            <w:pPr>
-              <w:keepNext/>
-              <w:jc w:val="left"/>
-            </w:pPr>
-            <w:r>
-              <w:rPr>
-                <w:rFonts w:ascii="Calibri" w:cs="Calibri" w:eastAsia="Calibri" w:hAnsi="Calibri"/>
-                <w:b w:val="false"/>
-                <w:bCs w:val="false"/>
-                <w:color w:val="000000"/>
-                <w:sz w:val="17"/>
-                <w:szCs w:val="17"/>
-              </w:rPr>
-              <w:t>66 Heavy Duty Alkaline Bathroom Cleaner - 2.5 gal (dispensador de pared) — baños, limpieza fuerte</w:t>
+              <w:t>273713</w:t>
+            </w:r>
+          </w:p>
+        </w:tc>
+        <w:tc>
+          <w:tcPr>
+            <w:tcW w:type="dxa" w:w="3800"/>
+            <w:shd w:fill="F5F7FA" w:color="auto" w:val="clear"/>
+            <w:tcMar>
+              <w:top w:type="dxa" w:w="60"/>
+              <w:left w:type="dxa" w:w="90"/>
+              <w:bottom w:type="dxa" w:w="60"/>
+              <w:right w:type="dxa" w:w="90"/>
+            </w:tcMar>
+          </w:tcPr>
+          <w:p>
+            <w:pPr>
+              <w:keepNext/>
+              <w:jc w:val="left"/>
+            </w:pPr>
+            <w:r>
+              <w:rPr>
+                <w:rFonts w:ascii="Calibri" w:cs="Calibri" w:eastAsia="Calibri" w:hAnsi="Calibri"/>
+                <w:b w:val="false"/>
+                <w:bCs w:val="false"/>
+                <w:color w:val="000000"/>
+                <w:sz w:val="17"/>
+                <w:szCs w:val="17"/>
+              </w:rPr>
+              <w:t>Rapid Multi Surface Disinfectant Cleaner - 2.5 Gal  (wall dispenser, BLUE label)</w:t>
+            </w:r>
+          </w:p>
+        </w:tc>
+        <w:tc>
+          <w:tcPr>
+            <w:tcW w:type="dxa" w:w="3800"/>
+            <w:shd w:fill="F5F7FA" w:color="auto" w:val="clear"/>
+            <w:tcMar>
+              <w:top w:type="dxa" w:w="60"/>
+              <w:left w:type="dxa" w:w="90"/>
+              <w:bottom w:type="dxa" w:w="60"/>
+              <w:right w:type="dxa" w:w="90"/>
+            </w:tcMar>
+          </w:tcPr>
+          <w:p>
+            <w:pPr>
+              <w:keepNext/>
+              <w:jc w:val="left"/>
+            </w:pPr>
+            <w:r>
+              <w:rPr>
+                <w:rFonts w:ascii="Calibri" w:cs="Calibri" w:eastAsia="Calibri" w:hAnsi="Calibri"/>
+                <w:b w:val="false"/>
+                <w:bCs w:val="false"/>
+                <w:color w:val="000000"/>
+                <w:sz w:val="17"/>
+                <w:szCs w:val="17"/>
+              </w:rPr>
+              <w:t>Rapid Multi Surface Disinfectant Cleaner - 2.5 gal (dispensador, etiqueta AZUL) — desinfectante</w:t>
             </w:r>
           </w:p>
         </w:tc>
@@ -5594,65 +5594,65 @@
                 <w:sz w:val="17"/>
                 <w:szCs w:val="17"/>
               </w:rPr>
-              <w:t>273713</w:t>
-            </w:r>
-          </w:p>
-        </w:tc>
-        <w:tc>
-          <w:tcPr>
-            <w:tcW w:type="dxa" w:w="3800"/>
-            <w:shd w:fill="F5F7FA" w:color="auto" w:val="clear"/>
-            <w:tcMar>
-              <w:top w:type="dxa" w:w="60"/>
-              <w:left w:type="dxa" w:w="90"/>
-              <w:bottom w:type="dxa" w:w="60"/>
-              <w:right w:type="dxa" w:w="90"/>
-            </w:tcMar>
-          </w:tcPr>
-          <w:p>
-            <w:pPr>
-              <w:keepNext/>
-              <w:jc w:val="left"/>
-            </w:pPr>
-            <w:r>
-              <w:rPr>
-                <w:rFonts w:ascii="Calibri" w:cs="Calibri" w:eastAsia="Calibri" w:hAnsi="Calibri"/>
-                <w:b w:val="false"/>
-                <w:bCs w:val="false"/>
-                <w:color w:val="000000"/>
-                <w:sz w:val="17"/>
-                <w:szCs w:val="17"/>
-              </w:rPr>
-              <w:t>Rapid Multi Surface Disinfectant Cleaner - 2.5 Gal  (wall dispenser, BLUE label)</w:t>
-            </w:r>
-          </w:p>
-        </w:tc>
-        <w:tc>
-          <w:tcPr>
-            <w:tcW w:type="dxa" w:w="3800"/>
-            <w:shd w:fill="F5F7FA" w:color="auto" w:val="clear"/>
-            <w:tcMar>
-              <w:top w:type="dxa" w:w="60"/>
-              <w:left w:type="dxa" w:w="90"/>
-              <w:bottom w:type="dxa" w:w="60"/>
-              <w:right w:type="dxa" w:w="90"/>
-            </w:tcMar>
-          </w:tcPr>
-          <w:p>
-            <w:pPr>
-              <w:keepNext/>
-              <w:jc w:val="left"/>
-            </w:pPr>
-            <w:r>
-              <w:rPr>
-                <w:rFonts w:ascii="Calibri" w:cs="Calibri" w:eastAsia="Calibri" w:hAnsi="Calibri"/>
-                <w:b w:val="false"/>
-                <w:bCs w:val="false"/>
-                <w:color w:val="000000"/>
-                <w:sz w:val="17"/>
-                <w:szCs w:val="17"/>
-              </w:rPr>
-              <w:t>Rapid Multi Surface Disinfectant Cleaner - 2.5 gal (dispensador, etiqueta AZUL) — desinfectante</w:t>
+              <w:t>161069</w:t>
+            </w:r>
+          </w:p>
+        </w:tc>
+        <w:tc>
+          <w:tcPr>
+            <w:tcW w:type="dxa" w:w="3800"/>
+            <w:shd w:fill="F5F7FA" w:color="auto" w:val="clear"/>
+            <w:tcMar>
+              <w:top w:type="dxa" w:w="60"/>
+              <w:left w:type="dxa" w:w="90"/>
+              <w:bottom w:type="dxa" w:w="60"/>
+              <w:right w:type="dxa" w:w="90"/>
+            </w:tcMar>
+          </w:tcPr>
+          <w:p>
+            <w:pPr>
+              <w:keepNext/>
+              <w:jc w:val="left"/>
+            </w:pPr>
+            <w:r>
+              <w:rPr>
+                <w:rFonts w:ascii="Calibri" w:cs="Calibri" w:eastAsia="Calibri" w:hAnsi="Calibri"/>
+                <w:b w:val="false"/>
+                <w:bCs w:val="false"/>
+                <w:color w:val="000000"/>
+                <w:sz w:val="17"/>
+                <w:szCs w:val="17"/>
+              </w:rPr>
+              <w:t>Laundry Fresh Room Air Refresher - 2.5 Gal  (wall dispenser)</w:t>
+            </w:r>
+          </w:p>
+        </w:tc>
+        <w:tc>
+          <w:tcPr>
+            <w:tcW w:type="dxa" w:w="3800"/>
+            <w:shd w:fill="F5F7FA" w:color="auto" w:val="clear"/>
+            <w:tcMar>
+              <w:top w:type="dxa" w:w="60"/>
+              <w:left w:type="dxa" w:w="90"/>
+              <w:bottom w:type="dxa" w:w="60"/>
+              <w:right w:type="dxa" w:w="90"/>
+            </w:tcMar>
+          </w:tcPr>
+          <w:p>
+            <w:pPr>
+              <w:keepNext/>
+              <w:jc w:val="left"/>
+            </w:pPr>
+            <w:r>
+              <w:rPr>
+                <w:rFonts w:ascii="Calibri" w:cs="Calibri" w:eastAsia="Calibri" w:hAnsi="Calibri"/>
+                <w:b w:val="false"/>
+                <w:bCs w:val="false"/>
+                <w:color w:val="000000"/>
+                <w:sz w:val="17"/>
+                <w:szCs w:val="17"/>
+              </w:rPr>
+              <w:t>Laundry Fresh - 2.5 gal (dispensador de pared) — ambientador</w:t>
             </w:r>
           </w:p>
         </w:tc>
@@ -5742,65 +5742,65 @@
                 <w:sz w:val="17"/>
                 <w:szCs w:val="17"/>
               </w:rPr>
-              <w:t>161069</w:t>
-            </w:r>
-          </w:p>
-        </w:tc>
-        <w:tc>
-          <w:tcPr>
-            <w:tcW w:type="dxa" w:w="3800"/>
-            <w:shd w:fill="F5F7FA" w:color="auto" w:val="clear"/>
-            <w:tcMar>
-              <w:top w:type="dxa" w:w="60"/>
-              <w:left w:type="dxa" w:w="90"/>
-              <w:bottom w:type="dxa" w:w="60"/>
-              <w:right w:type="dxa" w:w="90"/>
-            </w:tcMar>
-          </w:tcPr>
-          <w:p>
-            <w:pPr>
-              <w:keepNext/>
-              <w:jc w:val="left"/>
-            </w:pPr>
-            <w:r>
-              <w:rPr>
-                <w:rFonts w:ascii="Calibri" w:cs="Calibri" w:eastAsia="Calibri" w:hAnsi="Calibri"/>
-                <w:b w:val="false"/>
-                <w:bCs w:val="false"/>
-                <w:color w:val="000000"/>
-                <w:sz w:val="17"/>
-                <w:szCs w:val="17"/>
-              </w:rPr>
-              <w:t>Laundry Fresh Room Air Refresher - 2.5 Gal  (wall dispenser)</w:t>
-            </w:r>
-          </w:p>
-        </w:tc>
-        <w:tc>
-          <w:tcPr>
-            <w:tcW w:type="dxa" w:w="3800"/>
-            <w:shd w:fill="F5F7FA" w:color="auto" w:val="clear"/>
-            <w:tcMar>
-              <w:top w:type="dxa" w:w="60"/>
-              <w:left w:type="dxa" w:w="90"/>
-              <w:bottom w:type="dxa" w:w="60"/>
-              <w:right w:type="dxa" w:w="90"/>
-            </w:tcMar>
-          </w:tcPr>
-          <w:p>
-            <w:pPr>
-              <w:keepNext/>
-              <w:jc w:val="left"/>
-            </w:pPr>
-            <w:r>
-              <w:rPr>
-                <w:rFonts w:ascii="Calibri" w:cs="Calibri" w:eastAsia="Calibri" w:hAnsi="Calibri"/>
-                <w:b w:val="false"/>
-                <w:bCs w:val="false"/>
-                <w:color w:val="000000"/>
-                <w:sz w:val="17"/>
-                <w:szCs w:val="17"/>
-              </w:rPr>
-              <w:t>Laundry Fresh - 2.5 gal (dispensador de pared) — ambientador</w:t>
+              <w:t>772224</w:t>
+            </w:r>
+          </w:p>
+        </w:tc>
+        <w:tc>
+          <w:tcPr>
+            <w:tcW w:type="dxa" w:w="3800"/>
+            <w:shd w:fill="F5F7FA" w:color="auto" w:val="clear"/>
+            <w:tcMar>
+              <w:top w:type="dxa" w:w="60"/>
+              <w:left w:type="dxa" w:w="90"/>
+              <w:bottom w:type="dxa" w:w="60"/>
+              <w:right w:type="dxa" w:w="90"/>
+            </w:tcMar>
+          </w:tcPr>
+          <w:p>
+            <w:pPr>
+              <w:keepNext/>
+              <w:jc w:val="left"/>
+            </w:pPr>
+            <w:r>
+              <w:rPr>
+                <w:rFonts w:ascii="Calibri" w:cs="Calibri" w:eastAsia="Calibri" w:hAnsi="Calibri"/>
+                <w:b w:val="false"/>
+                <w:bCs w:val="false"/>
+                <w:color w:val="000000"/>
+                <w:sz w:val="17"/>
+                <w:szCs w:val="17"/>
+              </w:rPr>
+              <w:t>Laundry Bag 14 X 20, Case Of 1000</w:t>
+            </w:r>
+          </w:p>
+        </w:tc>
+        <w:tc>
+          <w:tcPr>
+            <w:tcW w:type="dxa" w:w="3800"/>
+            <w:shd w:fill="F5F7FA" w:color="auto" w:val="clear"/>
+            <w:tcMar>
+              <w:top w:type="dxa" w:w="60"/>
+              <w:left w:type="dxa" w:w="90"/>
+              <w:bottom w:type="dxa" w:w="60"/>
+              <w:right w:type="dxa" w:w="90"/>
+            </w:tcMar>
+          </w:tcPr>
+          <w:p>
+            <w:pPr>
+              <w:keepNext/>
+              <w:jc w:val="left"/>
+            </w:pPr>
+            <w:r>
+              <w:rPr>
+                <w:rFonts w:ascii="Calibri" w:cs="Calibri" w:eastAsia="Calibri" w:hAnsi="Calibri"/>
+                <w:b w:val="false"/>
+                <w:bCs w:val="false"/>
+                <w:color w:val="000000"/>
+                <w:sz w:val="17"/>
+                <w:szCs w:val="17"/>
+              </w:rPr>
+              <w:t>Bolsa de plástico para la ropa sucia del huésped, 14 x 20, caja de 1000</w:t>
             </w:r>
           </w:p>
         </w:tc>

</xml_diff>

<commit_message>
Move shower curtains to Part 2
700174 leaves Cleaning Supplies and joins the room fixtures, next to the
shower brackets on the Elm sheets and at the end of room equipment on
the La Quinta sheet.

Co-Authored-By: Claude Opus 5 <noreply@anthropic.com>
Claude-Session: https://claude.ai/code/session_0138rT731u9moyu7f3GNkj4g
</commit_message>
<xml_diff>
--- a/Elm_Housekeeping_Inventory.docx
+++ b/Elm_Housekeeping_Inventory.docx
@@ -3609,7 +3609,6 @@
           </w:tcPr>
           <w:p>
             <w:pPr>
-              <w:keepNext/>
               <w:jc w:val="left"/>
             </w:pPr>
             <w:r>
@@ -3638,7 +3637,6 @@
           </w:tcPr>
           <w:p>
             <w:pPr>
-              <w:keepNext/>
               <w:jc w:val="left"/>
             </w:pPr>
             <w:r>
@@ -3667,7 +3665,6 @@
           </w:tcPr>
           <w:p>
             <w:pPr>
-              <w:keepNext/>
               <w:jc w:val="left"/>
             </w:pPr>
             <w:r>
@@ -3680,151 +3677,6 @@
                 <w:szCs w:val="17"/>
               </w:rPr>
               <w:t>Bolsas para la aspiradora Oreck XL</w:t>
-            </w:r>
-          </w:p>
-        </w:tc>
-        <w:tc>
-          <w:tcPr>
-            <w:tcW w:type="dxa" w:w="800"/>
-            <w:shd w:fill="F5F7FA" w:color="auto" w:val="clear"/>
-            <w:tcMar>
-              <w:top w:type="dxa" w:w="60"/>
-              <w:left w:type="dxa" w:w="90"/>
-              <w:bottom w:type="dxa" w:w="60"/>
-              <w:right w:type="dxa" w:w="90"/>
-            </w:tcMar>
-          </w:tcPr>
-          <w:p>
-            <w:pPr>
-              <w:keepNext/>
-              <w:jc w:val="left"/>
-            </w:pPr>
-            <w:r>
-              <w:rPr>
-                <w:rFonts w:ascii="Calibri" w:cs="Calibri" w:eastAsia="Calibri" w:hAnsi="Calibri"/>
-                <w:b w:val="false"/>
-                <w:bCs w:val="false"/>
-                <w:color w:val="000000"/>
-                <w:sz w:val="18"/>
-                <w:szCs w:val="18"/>
-              </w:rPr>
-            </w:r>
-          </w:p>
-        </w:tc>
-        <w:tc>
-          <w:tcPr>
-            <w:tcW w:type="dxa" w:w="800"/>
-            <w:shd w:fill="F5F7FA" w:color="auto" w:val="clear"/>
-            <w:tcMar>
-              <w:top w:type="dxa" w:w="60"/>
-              <w:left w:type="dxa" w:w="90"/>
-              <w:bottom w:type="dxa" w:w="60"/>
-              <w:right w:type="dxa" w:w="90"/>
-            </w:tcMar>
-          </w:tcPr>
-          <w:p>
-            <w:pPr>
-              <w:keepNext/>
-              <w:jc w:val="left"/>
-            </w:pPr>
-            <w:r>
-              <w:rPr>
-                <w:rFonts w:ascii="Calibri" w:cs="Calibri" w:eastAsia="Calibri" w:hAnsi="Calibri"/>
-                <w:b w:val="false"/>
-                <w:bCs w:val="false"/>
-                <w:color w:val="000000"/>
-                <w:sz w:val="18"/>
-                <w:szCs w:val="18"/>
-              </w:rPr>
-            </w:r>
-          </w:p>
-        </w:tc>
-      </w:tr>
-      <w:tr>
-        <w:trPr>
-          <w:cantSplit/>
-        </w:trPr>
-        <w:tc>
-          <w:tcPr>
-            <w:tcW w:type="dxa" w:w="1200"/>
-            <w:shd w:fill="F5F7FA" w:color="auto" w:val="clear"/>
-            <w:tcMar>
-              <w:top w:type="dxa" w:w="60"/>
-              <w:left w:type="dxa" w:w="90"/>
-              <w:bottom w:type="dxa" w:w="60"/>
-              <w:right w:type="dxa" w:w="90"/>
-            </w:tcMar>
-          </w:tcPr>
-          <w:p>
-            <w:pPr>
-              <w:jc w:val="left"/>
-            </w:pPr>
-            <w:r>
-              <w:rPr>
-                <w:rFonts w:ascii="Calibri" w:cs="Calibri" w:eastAsia="Calibri" w:hAnsi="Calibri"/>
-                <w:b w:val="false"/>
-                <w:bCs w:val="false"/>
-                <w:color w:val="000000"/>
-                <w:sz w:val="17"/>
-                <w:szCs w:val="17"/>
-              </w:rPr>
-              <w:t>700174</w:t>
-            </w:r>
-          </w:p>
-        </w:tc>
-        <w:tc>
-          <w:tcPr>
-            <w:tcW w:type="dxa" w:w="3800"/>
-            <w:shd w:fill="F5F7FA" w:color="auto" w:val="clear"/>
-            <w:tcMar>
-              <w:top w:type="dxa" w:w="60"/>
-              <w:left w:type="dxa" w:w="90"/>
-              <w:bottom w:type="dxa" w:w="60"/>
-              <w:right w:type="dxa" w:w="90"/>
-            </w:tcMar>
-          </w:tcPr>
-          <w:p>
-            <w:pPr>
-              <w:jc w:val="left"/>
-            </w:pPr>
-            <w:r>
-              <w:rPr>
-                <w:rFonts w:ascii="Calibri" w:cs="Calibri" w:eastAsia="Calibri" w:hAnsi="Calibri"/>
-                <w:b w:val="false"/>
-                <w:bCs w:val="false"/>
-                <w:color w:val="000000"/>
-                <w:sz w:val="17"/>
-                <w:szCs w:val="17"/>
-              </w:rPr>
-              <w:t>Shower Curtains</w:t>
-            </w:r>
-          </w:p>
-        </w:tc>
-        <w:tc>
-          <w:tcPr>
-            <w:tcW w:type="dxa" w:w="3800"/>
-            <w:shd w:fill="F5F7FA" w:color="auto" w:val="clear"/>
-            <w:tcMar>
-              <w:top w:type="dxa" w:w="60"/>
-              <w:left w:type="dxa" w:w="90"/>
-              <w:bottom w:type="dxa" w:w="60"/>
-              <w:right w:type="dxa" w:w="90"/>
-            </w:tcMar>
-          </w:tcPr>
-          <w:p>
-            <w:pPr>
-              <w:jc w:val="left"/>
-            </w:pPr>
-            <w:r>
-              <w:rPr>
-                <w:rFonts w:ascii="Calibri" w:cs="Calibri" w:eastAsia="Calibri" w:hAnsi="Calibri"/>
-                <w:b w:val="false"/>
-                <w:bCs w:val="false"/>
-                <w:color w:val="000000"/>
-                <w:sz w:val="17"/>
-                <w:szCs w:val="17"/>
-              </w:rPr>
-              <w:t>Cortinas de baño</w:t>
             </w:r>
           </w:p>
         </w:tc>
@@ -13608,6 +13460,7 @@
           </w:tcPr>
           <w:p>
             <w:pPr>
+              <w:keepNext/>
               <w:jc w:val="left"/>
             </w:pPr>
             <w:r>
@@ -13636,6 +13489,7 @@
           </w:tcPr>
           <w:p>
             <w:pPr>
+              <w:keepNext/>
               <w:jc w:val="left"/>
             </w:pPr>
             <w:r>
@@ -13664,6 +13518,7 @@
           </w:tcPr>
           <w:p>
             <w:pPr>
+              <w:keepNext/>
               <w:jc w:val="left"/>
             </w:pPr>
             <w:r>
@@ -13676,6 +13531,151 @@
                 <w:szCs w:val="17"/>
               </w:rPr>
               <w:t>Soportes de pared para los dispensadores de la ducha, caja de 48 (HD Supply dice 48, no 43 — confirmar al pedir)</w:t>
+            </w:r>
+          </w:p>
+        </w:tc>
+        <w:tc>
+          <w:tcPr>
+            <w:tcW w:type="dxa" w:w="800"/>
+            <w:shd w:fill="F5F7FA" w:color="auto" w:val="clear"/>
+            <w:tcMar>
+              <w:top w:type="dxa" w:w="60"/>
+              <w:left w:type="dxa" w:w="90"/>
+              <w:bottom w:type="dxa" w:w="60"/>
+              <w:right w:type="dxa" w:w="90"/>
+            </w:tcMar>
+          </w:tcPr>
+          <w:p>
+            <w:pPr>
+              <w:keepNext/>
+              <w:jc w:val="left"/>
+            </w:pPr>
+            <w:r>
+              <w:rPr>
+                <w:rFonts w:ascii="Calibri" w:cs="Calibri" w:eastAsia="Calibri" w:hAnsi="Calibri"/>
+                <w:b w:val="false"/>
+                <w:bCs w:val="false"/>
+                <w:color w:val="000000"/>
+                <w:sz w:val="18"/>
+                <w:szCs w:val="18"/>
+              </w:rPr>
+            </w:r>
+          </w:p>
+        </w:tc>
+        <w:tc>
+          <w:tcPr>
+            <w:tcW w:type="dxa" w:w="800"/>
+            <w:shd w:fill="F5F7FA" w:color="auto" w:val="clear"/>
+            <w:tcMar>
+              <w:top w:type="dxa" w:w="60"/>
+              <w:left w:type="dxa" w:w="90"/>
+              <w:bottom w:type="dxa" w:w="60"/>
+              <w:right w:type="dxa" w:w="90"/>
+            </w:tcMar>
+          </w:tcPr>
+          <w:p>
+            <w:pPr>
+              <w:keepNext/>
+              <w:jc w:val="left"/>
+            </w:pPr>
+            <w:r>
+              <w:rPr>
+                <w:rFonts w:ascii="Calibri" w:cs="Calibri" w:eastAsia="Calibri" w:hAnsi="Calibri"/>
+                <w:b w:val="false"/>
+                <w:bCs w:val="false"/>
+                <w:color w:val="000000"/>
+                <w:sz w:val="18"/>
+                <w:szCs w:val="18"/>
+              </w:rPr>
+            </w:r>
+          </w:p>
+        </w:tc>
+      </w:tr>
+      <w:tr>
+        <w:trPr>
+          <w:cantSplit/>
+        </w:trPr>
+        <w:tc>
+          <w:tcPr>
+            <w:tcW w:type="dxa" w:w="1200"/>
+            <w:shd w:fill="F5F7FA" w:color="auto" w:val="clear"/>
+            <w:tcMar>
+              <w:top w:type="dxa" w:w="60"/>
+              <w:left w:type="dxa" w:w="90"/>
+              <w:bottom w:type="dxa" w:w="60"/>
+              <w:right w:type="dxa" w:w="90"/>
+            </w:tcMar>
+          </w:tcPr>
+          <w:p>
+            <w:pPr>
+              <w:jc w:val="left"/>
+            </w:pPr>
+            <w:r>
+              <w:rPr>
+                <w:rFonts w:ascii="Calibri" w:cs="Calibri" w:eastAsia="Calibri" w:hAnsi="Calibri"/>
+                <w:b w:val="false"/>
+                <w:bCs w:val="false"/>
+                <w:color w:val="000000"/>
+                <w:sz w:val="17"/>
+                <w:szCs w:val="17"/>
+              </w:rPr>
+              <w:t>700174</w:t>
+            </w:r>
+          </w:p>
+        </w:tc>
+        <w:tc>
+          <w:tcPr>
+            <w:tcW w:type="dxa" w:w="3800"/>
+            <w:shd w:fill="F5F7FA" w:color="auto" w:val="clear"/>
+            <w:tcMar>
+              <w:top w:type="dxa" w:w="60"/>
+              <w:left w:type="dxa" w:w="90"/>
+              <w:bottom w:type="dxa" w:w="60"/>
+              <w:right w:type="dxa" w:w="90"/>
+            </w:tcMar>
+          </w:tcPr>
+          <w:p>
+            <w:pPr>
+              <w:jc w:val="left"/>
+            </w:pPr>
+            <w:r>
+              <w:rPr>
+                <w:rFonts w:ascii="Calibri" w:cs="Calibri" w:eastAsia="Calibri" w:hAnsi="Calibri"/>
+                <w:b w:val="false"/>
+                <w:bCs w:val="false"/>
+                <w:color w:val="000000"/>
+                <w:sz w:val="17"/>
+                <w:szCs w:val="17"/>
+              </w:rPr>
+              <w:t>Shower Curtains</w:t>
+            </w:r>
+          </w:p>
+        </w:tc>
+        <w:tc>
+          <w:tcPr>
+            <w:tcW w:type="dxa" w:w="3800"/>
+            <w:shd w:fill="F5F7FA" w:color="auto" w:val="clear"/>
+            <w:tcMar>
+              <w:top w:type="dxa" w:w="60"/>
+              <w:left w:type="dxa" w:w="90"/>
+              <w:bottom w:type="dxa" w:w="60"/>
+              <w:right w:type="dxa" w:w="90"/>
+            </w:tcMar>
+          </w:tcPr>
+          <w:p>
+            <w:pPr>
+              <w:jc w:val="left"/>
+            </w:pPr>
+            <w:r>
+              <w:rPr>
+                <w:rFonts w:ascii="Calibri" w:cs="Calibri" w:eastAsia="Calibri" w:hAnsi="Calibri"/>
+                <w:b w:val="false"/>
+                <w:bCs w:val="false"/>
+                <w:color w:val="000000"/>
+                <w:sz w:val="17"/>
+                <w:szCs w:val="17"/>
+              </w:rPr>
+              <w:t>Cortinas de baño</w:t>
             </w:r>
           </w:p>
         </w:tc>

</xml_diff>

<commit_message>
Move key folders to the top of Front Desk
757774 is desk stock rather than a guest consumable, so it leads the
section instead of sitting between the cups and the amenities.

Co-Authored-By: Claude Opus 5 <noreply@anthropic.com>
Claude-Session: https://claude.ai/code/session_0138rT731u9moyu7f3GNkj4g
</commit_message>
<xml_diff>
--- a/Elm_Housekeeping_Inventory.docx
+++ b/Elm_Housekeeping_Inventory.docx
@@ -8704,65 +8704,65 @@
                 <w:sz w:val="17"/>
                 <w:szCs w:val="17"/>
               </w:rPr>
-              <w:t>355292</w:t>
-            </w:r>
-          </w:p>
-        </w:tc>
-        <w:tc>
-          <w:tcPr>
-            <w:tcW w:type="dxa" w:w="3800"/>
-            <w:shd w:fill="F5F7FA" w:color="auto" w:val="clear"/>
-            <w:tcMar>
-              <w:top w:type="dxa" w:w="60"/>
-              <w:left w:type="dxa" w:w="90"/>
-              <w:bottom w:type="dxa" w:w="60"/>
-              <w:right w:type="dxa" w:w="90"/>
-            </w:tcMar>
-          </w:tcPr>
-          <w:p>
-            <w:pPr>
-              <w:keepNext/>
-              <w:jc w:val="left"/>
-            </w:pPr>
-            <w:r>
-              <w:rPr>
-                <w:rFonts w:ascii="Calibri" w:cs="Calibri" w:eastAsia="Calibri" w:hAnsi="Calibri"/>
-                <w:b w:val="false"/>
-                <w:bCs w:val="false"/>
-                <w:color w:val="000000"/>
-                <w:sz w:val="17"/>
-                <w:szCs w:val="17"/>
-              </w:rPr>
-              <w:t>Medium Breakfast Coffee Pack 2.5oz, Case Of 100</w:t>
-            </w:r>
-          </w:p>
-        </w:tc>
-        <w:tc>
-          <w:tcPr>
-            <w:tcW w:type="dxa" w:w="3800"/>
-            <w:shd w:fill="F5F7FA" w:color="auto" w:val="clear"/>
-            <w:tcMar>
-              <w:top w:type="dxa" w:w="60"/>
-              <w:left w:type="dxa" w:w="90"/>
-              <w:bottom w:type="dxa" w:w="60"/>
-              <w:right w:type="dxa" w:w="90"/>
-            </w:tcMar>
-          </w:tcPr>
-          <w:p>
-            <w:pPr>
-              <w:keepNext/>
-              <w:jc w:val="left"/>
-            </w:pPr>
-            <w:r>
-              <w:rPr>
-                <w:rFonts w:ascii="Calibri" w:cs="Calibri" w:eastAsia="Calibri" w:hAnsi="Calibri"/>
-                <w:b w:val="false"/>
-                <w:bCs w:val="false"/>
-                <w:color w:val="000000"/>
-                <w:sz w:val="17"/>
-                <w:szCs w:val="17"/>
-              </w:rPr>
-              <w:t>Paquete de café tostado medio, 2.5 oz, caja de 100</w:t>
+              <w:t>757774</w:t>
+            </w:r>
+          </w:p>
+        </w:tc>
+        <w:tc>
+          <w:tcPr>
+            <w:tcW w:type="dxa" w:w="3800"/>
+            <w:shd w:fill="F5F7FA" w:color="auto" w:val="clear"/>
+            <w:tcMar>
+              <w:top w:type="dxa" w:w="60"/>
+              <w:left w:type="dxa" w:w="90"/>
+              <w:bottom w:type="dxa" w:w="60"/>
+              <w:right w:type="dxa" w:w="90"/>
+            </w:tcMar>
+          </w:tcPr>
+          <w:p>
+            <w:pPr>
+              <w:keepNext/>
+              <w:jc w:val="left"/>
+            </w:pPr>
+            <w:r>
+              <w:rPr>
+                <w:rFonts w:ascii="Calibri" w:cs="Calibri" w:eastAsia="Calibri" w:hAnsi="Calibri"/>
+                <w:b w:val="false"/>
+                <w:bCs w:val="false"/>
+                <w:color w:val="000000"/>
+                <w:sz w:val="17"/>
+                <w:szCs w:val="17"/>
+              </w:rPr>
+              <w:t>Key Folders, Case Of 500</w:t>
+            </w:r>
+          </w:p>
+        </w:tc>
+        <w:tc>
+          <w:tcPr>
+            <w:tcW w:type="dxa" w:w="3800"/>
+            <w:shd w:fill="F5F7FA" w:color="auto" w:val="clear"/>
+            <w:tcMar>
+              <w:top w:type="dxa" w:w="60"/>
+              <w:left w:type="dxa" w:w="90"/>
+              <w:bottom w:type="dxa" w:w="60"/>
+              <w:right w:type="dxa" w:w="90"/>
+            </w:tcMar>
+          </w:tcPr>
+          <w:p>
+            <w:pPr>
+              <w:keepNext/>
+              <w:jc w:val="left"/>
+            </w:pPr>
+            <w:r>
+              <w:rPr>
+                <w:rFonts w:ascii="Calibri" w:cs="Calibri" w:eastAsia="Calibri" w:hAnsi="Calibri"/>
+                <w:b w:val="false"/>
+                <w:bCs w:val="false"/>
+                <w:color w:val="000000"/>
+                <w:sz w:val="17"/>
+                <w:szCs w:val="17"/>
+              </w:rPr>
+              <w:t>Sobres porta-llaves, caja de 500</w:t>
             </w:r>
           </w:p>
         </w:tc>
@@ -8852,65 +8852,65 @@
                 <w:sz w:val="17"/>
                 <w:szCs w:val="17"/>
               </w:rPr>
-              <w:t>497380</w:t>
-            </w:r>
-          </w:p>
-        </w:tc>
-        <w:tc>
-          <w:tcPr>
-            <w:tcW w:type="dxa" w:w="3800"/>
-            <w:shd w:fill="F5F7FA" w:color="auto" w:val="clear"/>
-            <w:tcMar>
-              <w:top w:type="dxa" w:w="60"/>
-              <w:left w:type="dxa" w:w="90"/>
-              <w:bottom w:type="dxa" w:w="60"/>
-              <w:right w:type="dxa" w:w="90"/>
-            </w:tcMar>
-          </w:tcPr>
-          <w:p>
-            <w:pPr>
-              <w:keepNext/>
-              <w:jc w:val="left"/>
-            </w:pPr>
-            <w:r>
-              <w:rPr>
-                <w:rFonts w:ascii="Calibri" w:cs="Calibri" w:eastAsia="Calibri" w:hAnsi="Calibri"/>
-                <w:b w:val="false"/>
-                <w:bCs w:val="false"/>
-                <w:color w:val="000000"/>
-                <w:sz w:val="17"/>
-                <w:szCs w:val="17"/>
-              </w:rPr>
-              <w:t>Coffee-Mate Original Mini Cup Liquid Coffee Creamer, 360-Pack</w:t>
-            </w:r>
-          </w:p>
-        </w:tc>
-        <w:tc>
-          <w:tcPr>
-            <w:tcW w:type="dxa" w:w="3800"/>
-            <w:shd w:fill="F5F7FA" w:color="auto" w:val="clear"/>
-            <w:tcMar>
-              <w:top w:type="dxa" w:w="60"/>
-              <w:left w:type="dxa" w:w="90"/>
-              <w:bottom w:type="dxa" w:w="60"/>
-              <w:right w:type="dxa" w:w="90"/>
-            </w:tcMar>
-          </w:tcPr>
-          <w:p>
-            <w:pPr>
-              <w:keepNext/>
-              <w:jc w:val="left"/>
-            </w:pPr>
-            <w:r>
-              <w:rPr>
-                <w:rFonts w:ascii="Calibri" w:cs="Calibri" w:eastAsia="Calibri" w:hAnsi="Calibri"/>
-                <w:b w:val="false"/>
-                <w:bCs w:val="false"/>
-                <w:color w:val="000000"/>
-                <w:sz w:val="17"/>
-                <w:szCs w:val="17"/>
-              </w:rPr>
-              <w:t>Crema líquida Coffee-Mate original, vasitos, paquete de 360</w:t>
+              <w:t>355292</w:t>
+            </w:r>
+          </w:p>
+        </w:tc>
+        <w:tc>
+          <w:tcPr>
+            <w:tcW w:type="dxa" w:w="3800"/>
+            <w:shd w:fill="F5F7FA" w:color="auto" w:val="clear"/>
+            <w:tcMar>
+              <w:top w:type="dxa" w:w="60"/>
+              <w:left w:type="dxa" w:w="90"/>
+              <w:bottom w:type="dxa" w:w="60"/>
+              <w:right w:type="dxa" w:w="90"/>
+            </w:tcMar>
+          </w:tcPr>
+          <w:p>
+            <w:pPr>
+              <w:keepNext/>
+              <w:jc w:val="left"/>
+            </w:pPr>
+            <w:r>
+              <w:rPr>
+                <w:rFonts w:ascii="Calibri" w:cs="Calibri" w:eastAsia="Calibri" w:hAnsi="Calibri"/>
+                <w:b w:val="false"/>
+                <w:bCs w:val="false"/>
+                <w:color w:val="000000"/>
+                <w:sz w:val="17"/>
+                <w:szCs w:val="17"/>
+              </w:rPr>
+              <w:t>Medium Breakfast Coffee Pack 2.5oz, Case Of 100</w:t>
+            </w:r>
+          </w:p>
+        </w:tc>
+        <w:tc>
+          <w:tcPr>
+            <w:tcW w:type="dxa" w:w="3800"/>
+            <w:shd w:fill="F5F7FA" w:color="auto" w:val="clear"/>
+            <w:tcMar>
+              <w:top w:type="dxa" w:w="60"/>
+              <w:left w:type="dxa" w:w="90"/>
+              <w:bottom w:type="dxa" w:w="60"/>
+              <w:right w:type="dxa" w:w="90"/>
+            </w:tcMar>
+          </w:tcPr>
+          <w:p>
+            <w:pPr>
+              <w:keepNext/>
+              <w:jc w:val="left"/>
+            </w:pPr>
+            <w:r>
+              <w:rPr>
+                <w:rFonts w:ascii="Calibri" w:cs="Calibri" w:eastAsia="Calibri" w:hAnsi="Calibri"/>
+                <w:b w:val="false"/>
+                <w:bCs w:val="false"/>
+                <w:color w:val="000000"/>
+                <w:sz w:val="17"/>
+                <w:szCs w:val="17"/>
+              </w:rPr>
+              <w:t>Paquete de café tostado medio, 2.5 oz, caja de 100</w:t>
             </w:r>
           </w:p>
         </w:tc>
@@ -9000,65 +9000,65 @@
                 <w:sz w:val="17"/>
                 <w:szCs w:val="17"/>
               </w:rPr>
-              <w:t>759558</w:t>
-            </w:r>
-          </w:p>
-        </w:tc>
-        <w:tc>
-          <w:tcPr>
-            <w:tcW w:type="dxa" w:w="3800"/>
-            <w:shd w:fill="F5F7FA" w:color="auto" w:val="clear"/>
-            <w:tcMar>
-              <w:top w:type="dxa" w:w="60"/>
-              <w:left w:type="dxa" w:w="90"/>
-              <w:bottom w:type="dxa" w:w="60"/>
-              <w:right w:type="dxa" w:w="90"/>
-            </w:tcMar>
-          </w:tcPr>
-          <w:p>
-            <w:pPr>
-              <w:keepNext/>
-              <w:jc w:val="left"/>
-            </w:pPr>
-            <w:r>
-              <w:rPr>
-                <w:rFonts w:ascii="Calibri" w:cs="Calibri" w:eastAsia="Calibri" w:hAnsi="Calibri"/>
-                <w:b w:val="false"/>
-                <w:bCs w:val="false"/>
-                <w:color w:val="000000"/>
-                <w:sz w:val="17"/>
-                <w:szCs w:val="17"/>
-              </w:rPr>
-              <w:t>Coffee-Mate French Vanilla Mini Cup Liquid Creamer, Case Of 180</w:t>
-            </w:r>
-          </w:p>
-        </w:tc>
-        <w:tc>
-          <w:tcPr>
-            <w:tcW w:type="dxa" w:w="3800"/>
-            <w:shd w:fill="F5F7FA" w:color="auto" w:val="clear"/>
-            <w:tcMar>
-              <w:top w:type="dxa" w:w="60"/>
-              <w:left w:type="dxa" w:w="90"/>
-              <w:bottom w:type="dxa" w:w="60"/>
-              <w:right w:type="dxa" w:w="90"/>
-            </w:tcMar>
-          </w:tcPr>
-          <w:p>
-            <w:pPr>
-              <w:keepNext/>
-              <w:jc w:val="left"/>
-            </w:pPr>
-            <w:r>
-              <w:rPr>
-                <w:rFonts w:ascii="Calibri" w:cs="Calibri" w:eastAsia="Calibri" w:hAnsi="Calibri"/>
-                <w:b w:val="false"/>
-                <w:bCs w:val="false"/>
-                <w:color w:val="000000"/>
-                <w:sz w:val="17"/>
-                <w:szCs w:val="17"/>
-              </w:rPr>
-              <w:t>Crema líquida Coffee-Mate de vainilla francesa, vasitos, caja de 180</w:t>
+              <w:t>497380</w:t>
+            </w:r>
+          </w:p>
+        </w:tc>
+        <w:tc>
+          <w:tcPr>
+            <w:tcW w:type="dxa" w:w="3800"/>
+            <w:shd w:fill="F5F7FA" w:color="auto" w:val="clear"/>
+            <w:tcMar>
+              <w:top w:type="dxa" w:w="60"/>
+              <w:left w:type="dxa" w:w="90"/>
+              <w:bottom w:type="dxa" w:w="60"/>
+              <w:right w:type="dxa" w:w="90"/>
+            </w:tcMar>
+          </w:tcPr>
+          <w:p>
+            <w:pPr>
+              <w:keepNext/>
+              <w:jc w:val="left"/>
+            </w:pPr>
+            <w:r>
+              <w:rPr>
+                <w:rFonts w:ascii="Calibri" w:cs="Calibri" w:eastAsia="Calibri" w:hAnsi="Calibri"/>
+                <w:b w:val="false"/>
+                <w:bCs w:val="false"/>
+                <w:color w:val="000000"/>
+                <w:sz w:val="17"/>
+                <w:szCs w:val="17"/>
+              </w:rPr>
+              <w:t>Coffee-Mate Original Mini Cup Liquid Coffee Creamer, 360-Pack</w:t>
+            </w:r>
+          </w:p>
+        </w:tc>
+        <w:tc>
+          <w:tcPr>
+            <w:tcW w:type="dxa" w:w="3800"/>
+            <w:shd w:fill="F5F7FA" w:color="auto" w:val="clear"/>
+            <w:tcMar>
+              <w:top w:type="dxa" w:w="60"/>
+              <w:left w:type="dxa" w:w="90"/>
+              <w:bottom w:type="dxa" w:w="60"/>
+              <w:right w:type="dxa" w:w="90"/>
+            </w:tcMar>
+          </w:tcPr>
+          <w:p>
+            <w:pPr>
+              <w:keepNext/>
+              <w:jc w:val="left"/>
+            </w:pPr>
+            <w:r>
+              <w:rPr>
+                <w:rFonts w:ascii="Calibri" w:cs="Calibri" w:eastAsia="Calibri" w:hAnsi="Calibri"/>
+                <w:b w:val="false"/>
+                <w:bCs w:val="false"/>
+                <w:color w:val="000000"/>
+                <w:sz w:val="17"/>
+                <w:szCs w:val="17"/>
+              </w:rPr>
+              <w:t>Crema líquida Coffee-Mate original, vasitos, paquete de 360</w:t>
             </w:r>
           </w:p>
         </w:tc>
@@ -9148,65 +9148,65 @@
                 <w:sz w:val="17"/>
                 <w:szCs w:val="17"/>
               </w:rPr>
-              <w:t>208267</w:t>
-            </w:r>
-          </w:p>
-        </w:tc>
-        <w:tc>
-          <w:tcPr>
-            <w:tcW w:type="dxa" w:w="3800"/>
-            <w:shd w:fill="F5F7FA" w:color="auto" w:val="clear"/>
-            <w:tcMar>
-              <w:top w:type="dxa" w:w="60"/>
-              <w:left w:type="dxa" w:w="90"/>
-              <w:bottom w:type="dxa" w:w="60"/>
-              <w:right w:type="dxa" w:w="90"/>
-            </w:tcMar>
-          </w:tcPr>
-          <w:p>
-            <w:pPr>
-              <w:keepNext/>
-              <w:jc w:val="left"/>
-            </w:pPr>
-            <w:r>
-              <w:rPr>
-                <w:rFonts w:ascii="Calibri" w:cs="Calibri" w:eastAsia="Calibri" w:hAnsi="Calibri"/>
-                <w:b w:val="false"/>
-                <w:bCs w:val="false"/>
-                <w:color w:val="000000"/>
-                <w:sz w:val="17"/>
-                <w:szCs w:val="17"/>
-              </w:rPr>
-              <w:t>Unwrapped 9 Oz Plastic Cup, Case Of 2500</w:t>
-            </w:r>
-          </w:p>
-        </w:tc>
-        <w:tc>
-          <w:tcPr>
-            <w:tcW w:type="dxa" w:w="3800"/>
-            <w:shd w:fill="F5F7FA" w:color="auto" w:val="clear"/>
-            <w:tcMar>
-              <w:top w:type="dxa" w:w="60"/>
-              <w:left w:type="dxa" w:w="90"/>
-              <w:bottom w:type="dxa" w:w="60"/>
-              <w:right w:type="dxa" w:w="90"/>
-            </w:tcMar>
-          </w:tcPr>
-          <w:p>
-            <w:pPr>
-              <w:keepNext/>
-              <w:jc w:val="left"/>
-            </w:pPr>
-            <w:r>
-              <w:rPr>
-                <w:rFonts w:ascii="Calibri" w:cs="Calibri" w:eastAsia="Calibri" w:hAnsi="Calibri"/>
-                <w:b w:val="false"/>
-                <w:bCs w:val="false"/>
-                <w:color w:val="000000"/>
-                <w:sz w:val="17"/>
-                <w:szCs w:val="17"/>
-              </w:rPr>
-              <w:t>Vaso de plástico sin envoltura, 9 oz, caja de 2500</w:t>
+              <w:t>759558</w:t>
+            </w:r>
+          </w:p>
+        </w:tc>
+        <w:tc>
+          <w:tcPr>
+            <w:tcW w:type="dxa" w:w="3800"/>
+            <w:shd w:fill="F5F7FA" w:color="auto" w:val="clear"/>
+            <w:tcMar>
+              <w:top w:type="dxa" w:w="60"/>
+              <w:left w:type="dxa" w:w="90"/>
+              <w:bottom w:type="dxa" w:w="60"/>
+              <w:right w:type="dxa" w:w="90"/>
+            </w:tcMar>
+          </w:tcPr>
+          <w:p>
+            <w:pPr>
+              <w:keepNext/>
+              <w:jc w:val="left"/>
+            </w:pPr>
+            <w:r>
+              <w:rPr>
+                <w:rFonts w:ascii="Calibri" w:cs="Calibri" w:eastAsia="Calibri" w:hAnsi="Calibri"/>
+                <w:b w:val="false"/>
+                <w:bCs w:val="false"/>
+                <w:color w:val="000000"/>
+                <w:sz w:val="17"/>
+                <w:szCs w:val="17"/>
+              </w:rPr>
+              <w:t>Coffee-Mate French Vanilla Mini Cup Liquid Creamer, Case Of 180</w:t>
+            </w:r>
+          </w:p>
+        </w:tc>
+        <w:tc>
+          <w:tcPr>
+            <w:tcW w:type="dxa" w:w="3800"/>
+            <w:shd w:fill="F5F7FA" w:color="auto" w:val="clear"/>
+            <w:tcMar>
+              <w:top w:type="dxa" w:w="60"/>
+              <w:left w:type="dxa" w:w="90"/>
+              <w:bottom w:type="dxa" w:w="60"/>
+              <w:right w:type="dxa" w:w="90"/>
+            </w:tcMar>
+          </w:tcPr>
+          <w:p>
+            <w:pPr>
+              <w:keepNext/>
+              <w:jc w:val="left"/>
+            </w:pPr>
+            <w:r>
+              <w:rPr>
+                <w:rFonts w:ascii="Calibri" w:cs="Calibri" w:eastAsia="Calibri" w:hAnsi="Calibri"/>
+                <w:b w:val="false"/>
+                <w:bCs w:val="false"/>
+                <w:color w:val="000000"/>
+                <w:sz w:val="17"/>
+                <w:szCs w:val="17"/>
+              </w:rPr>
+              <w:t>Crema líquida Coffee-Mate de vainilla francesa, vasitos, caja de 180</w:t>
             </w:r>
           </w:p>
         </w:tc>
@@ -9296,65 +9296,65 @@
                 <w:sz w:val="17"/>
                 <w:szCs w:val="17"/>
               </w:rPr>
-              <w:t>757774</w:t>
-            </w:r>
-          </w:p>
-        </w:tc>
-        <w:tc>
-          <w:tcPr>
-            <w:tcW w:type="dxa" w:w="3800"/>
-            <w:shd w:fill="F5F7FA" w:color="auto" w:val="clear"/>
-            <w:tcMar>
-              <w:top w:type="dxa" w:w="60"/>
-              <w:left w:type="dxa" w:w="90"/>
-              <w:bottom w:type="dxa" w:w="60"/>
-              <w:right w:type="dxa" w:w="90"/>
-            </w:tcMar>
-          </w:tcPr>
-          <w:p>
-            <w:pPr>
-              <w:keepNext/>
-              <w:jc w:val="left"/>
-            </w:pPr>
-            <w:r>
-              <w:rPr>
-                <w:rFonts w:ascii="Calibri" w:cs="Calibri" w:eastAsia="Calibri" w:hAnsi="Calibri"/>
-                <w:b w:val="false"/>
-                <w:bCs w:val="false"/>
-                <w:color w:val="000000"/>
-                <w:sz w:val="17"/>
-                <w:szCs w:val="17"/>
-              </w:rPr>
-              <w:t>Key Folders, Case Of 500</w:t>
-            </w:r>
-          </w:p>
-        </w:tc>
-        <w:tc>
-          <w:tcPr>
-            <w:tcW w:type="dxa" w:w="3800"/>
-            <w:shd w:fill="F5F7FA" w:color="auto" w:val="clear"/>
-            <w:tcMar>
-              <w:top w:type="dxa" w:w="60"/>
-              <w:left w:type="dxa" w:w="90"/>
-              <w:bottom w:type="dxa" w:w="60"/>
-              <w:right w:type="dxa" w:w="90"/>
-            </w:tcMar>
-          </w:tcPr>
-          <w:p>
-            <w:pPr>
-              <w:keepNext/>
-              <w:jc w:val="left"/>
-            </w:pPr>
-            <w:r>
-              <w:rPr>
-                <w:rFonts w:ascii="Calibri" w:cs="Calibri" w:eastAsia="Calibri" w:hAnsi="Calibri"/>
-                <w:b w:val="false"/>
-                <w:bCs w:val="false"/>
-                <w:color w:val="000000"/>
-                <w:sz w:val="17"/>
-                <w:szCs w:val="17"/>
-              </w:rPr>
-              <w:t>Sobres porta-llaves, caja de 500</w:t>
+              <w:t>208267</w:t>
+            </w:r>
+          </w:p>
+        </w:tc>
+        <w:tc>
+          <w:tcPr>
+            <w:tcW w:type="dxa" w:w="3800"/>
+            <w:shd w:fill="F5F7FA" w:color="auto" w:val="clear"/>
+            <w:tcMar>
+              <w:top w:type="dxa" w:w="60"/>
+              <w:left w:type="dxa" w:w="90"/>
+              <w:bottom w:type="dxa" w:w="60"/>
+              <w:right w:type="dxa" w:w="90"/>
+            </w:tcMar>
+          </w:tcPr>
+          <w:p>
+            <w:pPr>
+              <w:keepNext/>
+              <w:jc w:val="left"/>
+            </w:pPr>
+            <w:r>
+              <w:rPr>
+                <w:rFonts w:ascii="Calibri" w:cs="Calibri" w:eastAsia="Calibri" w:hAnsi="Calibri"/>
+                <w:b w:val="false"/>
+                <w:bCs w:val="false"/>
+                <w:color w:val="000000"/>
+                <w:sz w:val="17"/>
+                <w:szCs w:val="17"/>
+              </w:rPr>
+              <w:t>Unwrapped 9 Oz Plastic Cup, Case Of 2500</w:t>
+            </w:r>
+          </w:p>
+        </w:tc>
+        <w:tc>
+          <w:tcPr>
+            <w:tcW w:type="dxa" w:w="3800"/>
+            <w:shd w:fill="F5F7FA" w:color="auto" w:val="clear"/>
+            <w:tcMar>
+              <w:top w:type="dxa" w:w="60"/>
+              <w:left w:type="dxa" w:w="90"/>
+              <w:bottom w:type="dxa" w:w="60"/>
+              <w:right w:type="dxa" w:w="90"/>
+            </w:tcMar>
+          </w:tcPr>
+          <w:p>
+            <w:pPr>
+              <w:keepNext/>
+              <w:jc w:val="left"/>
+            </w:pPr>
+            <w:r>
+              <w:rPr>
+                <w:rFonts w:ascii="Calibri" w:cs="Calibri" w:eastAsia="Calibri" w:hAnsi="Calibri"/>
+                <w:b w:val="false"/>
+                <w:bCs w:val="false"/>
+                <w:color w:val="000000"/>
+                <w:sz w:val="17"/>
+                <w:szCs w:val="17"/>
+              </w:rPr>
+              <w:t>Vaso de plástico sin envoltura, 9 oz, caja de 2500</w:t>
             </w:r>
           </w:p>
         </w:tc>

</xml_diff>

<commit_message>
Label the Degree packs by gender and finish the Amazon suffixes
Carries over the (Men) and (Women) labels from the updated copy, since
Cool Rush and Shower Clean do not say who they are for, and extends the
"— Amazon" suffix to the 72-pack variety so all five non-catalog buys
read the same. Their Part # cells stay empty: Amazon items have no HD
Supply number to type.

Co-Authored-By: Claude Opus 5 <noreply@anthropic.com>
Claude-Session: https://claude.ai/code/session_0138rT731u9moyu7f3GNkj4g
</commit_message>
<xml_diff>
--- a/Elm_Housekeeping_Inventory.docx
+++ b/Elm_Housekeeping_Inventory.docx
@@ -10524,7 +10524,7 @@
                 <w:szCs w:val="17"/>
                 <w:rtl w:val="0"/>
               </w:rPr>
-              <w:t>Degree Men Cool Rush Travel Deodorant, 0.5 oz, 36-Pack  — Amazon</w:t>
+              <w:t>Degree Men Cool Rush Travel Deodorant (Men), 0.5 oz, 36-Pack  — Amazon</w:t>
             </w:r>
           </w:p>
         </w:tc>
@@ -10659,7 +10659,7 @@
                 <w:szCs w:val="17"/>
                 <w:rtl w:val="0"/>
               </w:rPr>
-              <w:t>Degree Advanced Shower Clean Antiperspirant, 0.5 oz, 36-Count  — Amazon</w:t>
+              <w:t>Degree Advanced Shower Clean Antiperspirant (Women), 0.5 oz, 36-Count  — Amazon</w:t>
             </w:r>
           </w:p>
         </w:tc>
@@ -10792,46 +10792,36 @@
                 <w:szCs w:val="17"/>
                 <w:rtl w:val="0"/>
               </w:rPr>
-              <w:t xml:space="preserve">Degree Advanced Travel Variety 72-Pack, 0.5 oz — 36 Cool Rush (men) + 36 Shower Clean (women)  — OPTIONAL. One order covers both; runs about $6 more than buying the two 36-packs separately.</w:t>
-            </w:r>
-            <w:r>
-              <w:rPr>
-                <w:rtl w:val="0"/>
-              </w:rPr>
-            </w:r>
-          </w:p>
-        </w:tc>
-        <w:tc>
-          <w:tcPr>
-            <w:shd w:fill="f5f7fa" w:val="clear"/>
-            <w:tcMar>
-              <w:top w:w="60.0" w:type="dxa"/>
-              <w:left w:w="90.0" w:type="dxa"/>
-              <w:bottom w:w="60.0" w:type="dxa"/>
-              <w:right w:w="90.0" w:type="dxa"/>
-            </w:tcMar>
-          </w:tcPr>
-          <w:p>
-            <w:pPr>
-              <w:jc w:val="left"/>
-              <w:rPr/>
-            </w:pPr>
-            <w:r>
-              <w:rPr>
-                <w:rFonts w:ascii="Calibri" w:cs="Calibri" w:eastAsia="Calibri" w:hAnsi="Calibri"/>
-                <w:b w:val="0"/>
-                <w:bCs w:val="0"/>
-                <w:color w:val="000000"/>
-                <w:sz w:val="17"/>
-                <w:szCs w:val="17"/>
-                <w:rtl w:val="0"/>
-              </w:rPr>
-              <w:t xml:space="preserve">Desodorante Degree Advanced, paquete variado de 72 de 0.5 oz — 36 Cool Rush (hombre) + 36 Shower Clean (mujer) — OPCIONAL. Un solo pedido cubre los dos; cuesta como $6 más que comprar los dos paquetes de 36 por separado.</w:t>
-            </w:r>
-            <w:r>
-              <w:rPr>
-                <w:rtl w:val="0"/>
-              </w:rPr>
+              <w:t>Degree Advanced Travel Variety 72-Pack, 0.5 oz — 36 Cool Rush (Men) + 36 Shower Clean (Women)  — Amazon.  OPTIONAL. One order covers both; runs about $6 more than buying the two 36-packs separately.</w:t>
+            </w:r>
+          </w:p>
+        </w:tc>
+        <w:tc>
+          <w:tcPr>
+            <w:shd w:fill="f5f7fa" w:val="clear"/>
+            <w:tcMar>
+              <w:top w:w="60.0" w:type="dxa"/>
+              <w:left w:w="90.0" w:type="dxa"/>
+              <w:bottom w:w="60.0" w:type="dxa"/>
+              <w:right w:w="90.0" w:type="dxa"/>
+            </w:tcMar>
+          </w:tcPr>
+          <w:p>
+            <w:pPr>
+              <w:jc w:val="left"/>
+              <w:rPr/>
+            </w:pPr>
+            <w:r>
+              <w:rPr>
+                <w:rFonts w:ascii="Calibri" w:cs="Calibri" w:eastAsia="Calibri" w:hAnsi="Calibri"/>
+                <w:b w:val="0"/>
+                <w:bCs w:val="0"/>
+                <w:color w:val="000000"/>
+                <w:sz w:val="17"/>
+                <w:szCs w:val="17"/>
+                <w:rtl w:val="0"/>
+              </w:rPr>
+              <w:t>Desodorante Degree Advanced, paquete variado de 72 de 0.5 oz — 36 Cool Rush (hombre) + 36 Shower Clean (mujer) — Amazon.  OPCIONAL. Un solo pedido cubre los dos; cuesta como $6 más que comprar los dos paquetes de 36 por separado.</w:t>
             </w:r>
           </w:p>
         </w:tc>

</xml_diff>